<commit_message>
Kunci/buka tanggal dikeluarkan SPD dari Administrasi Sistem (v2.5.1)
- Pengaturan tanggal_spd_terbuka (bawaan terkunci): selama dibuka super
  administrator, seluruh peran dapat menetapkan tanggal dikeluarkan SPD
  sendiri untuk kasus tanggal mundur; terkunci kembali, peran selain
  pimpinan mengikuti tanggal pembuatan. User::bolehMengubahTanggalSpd()
  dipakai pengontrol dan formulir SPD.
- Kartu "Tanggal Dikeluarkan SPD" di Administrasi Sistem — hanya super
  administrator (Tim SDM tidak melihatnya), dengan popup konfirmasi dan
  status Terkunci/Terbuka; tiap perubahan tercatat pada jejak audit.
- Formulir SPD menyebut bila tanggal sedang dibuka administrator.
- Riwayat perubahan v2.5.1 di aplikasi dan buku panduan; VERSION 2.5.1.

Co-Authored-By: Claude Opus 5 <noreply@anthropic.com>
</commit_message>
<xml_diff>
--- a/resources/panduan/Buku-Panduan-PANGI-v2.5.docx
+++ b/resources/panduan/Buku-Panduan-PANGI-v2.5.docx
@@ -10559,6 +10559,58 @@
           </w:p>
         </w:tc>
       </w:tr>
+      <w:tr>
+        <w:tc>
+          <w:tcPr>
+            <w:tcW w:type="dxa" w:w="3249"/>
+            <w:tcMar>
+              <w:top w:type="dxa" w:w="80"/>
+              <w:left w:type="dxa" w:w="120"/>
+              <w:bottom w:type="dxa" w:w="80"/>
+              <w:right w:type="dxa" w:w="120"/>
+            </w:tcMar>
+          </w:tcPr>
+          <w:p>
+            <w:pPr>
+              <w:spacing w:after="0"/>
+            </w:pPr>
+            <w:r>
+              <w:rPr>
+                <w:b w:val="false"/>
+                <w:bCs w:val="false"/>
+                <w:sz w:val="19"/>
+                <w:szCs w:val="19"/>
+              </w:rPr>
+              <w:t xml:space="preserve">Perlu SPD bertanggal mundur</w:t>
+            </w:r>
+          </w:p>
+        </w:tc>
+        <w:tc>
+          <w:tcPr>
+            <w:tcW w:type="dxa" w:w="5777"/>
+            <w:tcMar>
+              <w:top w:type="dxa" w:w="80"/>
+              <w:left w:type="dxa" w:w="120"/>
+              <w:bottom w:type="dxa" w:w="80"/>
+              <w:right w:type="dxa" w:w="120"/>
+            </w:tcMar>
+          </w:tcPr>
+          <w:p>
+            <w:pPr>
+              <w:spacing w:after="0"/>
+            </w:pPr>
+            <w:r>
+              <w:rPr>
+                <w:b w:val="false"/>
+                <w:bCs w:val="false"/>
+                <w:sz w:val="19"/>
+                <w:szCs w:val="19"/>
+              </w:rPr>
+              <w:t xml:space="preserve">Tanggal dikeluarkan mengikuti hari pembuatan bagi peran selain pimpinan. Minta super administrator membuka kuncinya sementara di Administrasi Sistem, lalu terbitkan SPD-nya.</w:t>
+            </w:r>
+          </w:p>
+        </w:tc>
+      </w:tr>
     </w:tbl>
     <w:p>
       <w:pPr>
@@ -10642,6 +10694,26 @@
       </w:pPr>
       <w:r>
         <w:t xml:space="preserve">Yang berubah dari versi ke versi, supaya pembaca versi lama tahu bagian mana yang perlu dibaca ulang.</w:t>
+      </w:r>
+    </w:p>
+    <w:p>
+      <w:pPr>
+        <w:pStyle w:val="Heading2"/>
+      </w:pPr>
+      <w:r>
+        <w:t xml:space="preserve">Versi 2.5.1 — 15 September 2026</w:t>
+      </w:r>
+    </w:p>
+    <w:p>
+      <w:pPr>
+        <w:pStyle w:val="ListParagraph"/>
+        <w:numPr>
+          <w:ilvl w:val="0"/>
+          <w:numId w:val="2"/>
+        </w:numPr>
+      </w:pPr>
+      <w:r>
+        <w:t xml:space="preserve">Administrasi Sistem: super administrator dapat membuka atau mengunci tanggal dikeluarkan SPD bagi seluruh peran untuk kasus tanggal mundur (backdate); bawaannya terkunci, tiap perubahan tercatat pada jejak audit.</w:t>
       </w:r>
     </w:p>
     <w:p>

</xml_diff>

<commit_message>
Pecah Administrasi Sistem menjadi tiga halaman bermenu
- Pengguna (/administrasi): daftar akun, saringan peran & kehadiran,
  statistik, tambah/sunting/sandi/hapus.
- Impor & Ekspor (/administrasi/impor-ekspor): data pengguna massal CSV;
  hasil impor kembali ke halaman ini.
- Pengaturan Sistem (/administrasi/pengaturan): pengingat kelengkapan
  berkas dan kunci tanggal dikeluarkan SPD (super administrator).
- Sidebar: Administrasi Sistem menjadi menu bertingkat dengan tiga submenu;
  tiap halaman memakai kepala bersama dengan navigasi antarbagian.
- Rute simpan pengaturan diberi nama administrasi.pengaturan.simpan;
  panduan aplikasi dan riwayat perubahan (aplikasi & buku) diperbarui.

Co-Authored-By: Claude Opus 5 <noreply@anthropic.com>
</commit_message>
<xml_diff>
--- a/resources/panduan/Buku-Panduan-PANGI-v2.5.docx
+++ b/resources/panduan/Buku-Panduan-PANGI-v2.5.docx
@@ -10714,6 +10714,18 @@
       </w:pPr>
       <w:r>
         <w:t xml:space="preserve">Administrasi Sistem: super administrator dapat membuka atau mengunci tanggal dikeluarkan SPD bagi seluruh peran untuk kasus tanggal mundur (backdate); bawaannya terkunci, tiap perubahan tercatat pada jejak audit.</w:t>
+      </w:r>
+    </w:p>
+    <w:p>
+      <w:pPr>
+        <w:pStyle w:val="ListParagraph"/>
+        <w:numPr>
+          <w:ilvl w:val="0"/>
+          <w:numId w:val="2"/>
+        </w:numPr>
+      </w:pPr>
+      <w:r>
+        <w:t xml:space="preserve">Administrasi Sistem dipecah menjadi tiga halaman bermenu — Pengguna, Impor &amp; Ekspor, Pengaturan Sistem — dengan submenu di sidebar dan navigasi di kepala halaman.</w:t>
       </w:r>
     </w:p>
     <w:p>

</xml_diff>

<commit_message>
Tambah Wakil Direktur II ke data pegawai; seeder aman dijalankan ulang (v2.5.2)
- pegawai-poltekkes.csv: Junita Elvira Ratela (pimpinan, Wakil Direktur II,
  unit DIR); sandi awal = NIP, wajib diganti lewat Profil.
- ImporPengguna: sel kosong tidak lagi mengosongkan kolom akun yang sudah
  ada; mode hanyaMelengkapi hanya mengisi kolom yang masih kosong.
- PegawaiPoltekkesSeeder memakai mode hanyaMelengkapi dan menyusun garis
  atasan hanya bagi yang belum punya, sehingga aman dijalankan ulang di
  produksi untuk menambah pegawai tanpa menimpa nomor HP, rekening, sandi,
  maupun atasan yang sudah diubah.
- Versi 2.5.2; riwayat perubahan di panduan aplikasi dan buku panduan.

Co-Authored-By: Claude Opus 5 <noreply@anthropic.com>
</commit_message>
<xml_diff>
--- a/resources/panduan/Buku-Panduan-PANGI-v2.5.docx
+++ b/resources/panduan/Buku-Panduan-PANGI-v2.5.docx
@@ -10694,6 +10694,26 @@
       </w:pPr>
       <w:r>
         <w:t xml:space="preserve">Yang berubah dari versi ke versi, supaya pembaca versi lama tahu bagian mana yang perlu dibaca ulang.</w:t>
+      </w:r>
+    </w:p>
+    <w:p>
+      <w:pPr>
+        <w:pStyle w:val="Heading2"/>
+      </w:pPr>
+      <w:r>
+        <w:t xml:space="preserve">Versi 2.5.2 — 15 September 2026</w:t>
+      </w:r>
+    </w:p>
+    <w:p>
+      <w:pPr>
+        <w:pStyle w:val="ListParagraph"/>
+        <w:numPr>
+          <w:ilvl w:val="0"/>
+          <w:numId w:val="2"/>
+        </w:numPr>
+      </w:pPr>
+      <w:r>
+        <w:t xml:space="preserve">Impor pengguna: sel yang kosong pada berkas CSV tidak lagi menghapus surel, nomor HP, dan rekening yang sudah diisi pengguna, sehingga data pegawai aman diimpor ulang untuk menambah orang. Wakil Direktur II ditambahkan ke data pegawai bawaan.</w:t>
       </w:r>
     </w:p>
     <w:p>

</xml_diff>

<commit_message>
Token API di Pengaturan Sistem dan konfirmasi kunci tanggal SPD lewat popup
- Token API dashboard eksekutif tersimpan di pengaturan (mengalahkan
  PANGI_API_TOKEN di .env): super administrator membuat, mengganti, atau
  mencabutnya dari Administrasi Sistem → Pengaturan Sistem; token yang
  berlaku ditampilkan tersamar, dapat ditampilkan dan disalin, beserta
  alamat, header, jalur API, dan asal CORS yang diizinkan.
- Middleware TokenApi membaca Pengaturan::tokenApi(); tanpa token dari
  mana pun API tetap tertutup.
- Buka/kunci tanggal dikeluarkan SPD serta buat/ganti/cabut token API
  memakai kotak konfirmasi (x-modal-konfirmasi), bukan confirm() peramban.
- Tes: TokenApiAdministrasiTest; TanggalTerbitSpdTest memeriksa popup;
  seeder memastikan Wakil Direktur II bergolongan III/c (Penata).
- Panduan aplikasi, riwayat perubahan 2.5.2, dan buku panduan diperbarui.

Co-Authored-By: Claude Opus 5 <noreply@anthropic.com>
</commit_message>
<xml_diff>
--- a/resources/panduan/Buku-Panduan-PANGI-v2.5.docx
+++ b/resources/panduan/Buku-Panduan-PANGI-v2.5.docx
@@ -6986,7 +6986,19 @@
         </w:numPr>
       </w:pPr>
       <w:r>
-        <w:t xml:space="preserve">Tenggang hari, jeda antar pengingat, dan batas jumlahnya diatur pada Administrasi Sistem. Angka tenggang inilah yang dipakai dashboard saat menghitung batas penyerahan laporan.</w:t>
+        <w:t xml:space="preserve">Tenggang hari, jeda antar pengingat, dan batas jumlahnya diatur pada Administrasi Sistem → Pengaturan Sistem. Angka tenggang inilah yang dipakai dashboard saat menghitung batas penyerahan laporan.</w:t>
+      </w:r>
+    </w:p>
+    <w:p>
+      <w:pPr>
+        <w:pStyle w:val="ListParagraph"/>
+        <w:numPr>
+          <w:ilvl w:val="0"/>
+          <w:numId w:val="2"/>
+        </w:numPr>
+      </w:pPr>
+      <w:r>
+        <w:t xml:space="preserve">Di halaman yang sama, super administrator dapat membuka atau mengunci tanggal dikeluarkan SPD untuk kasus tanggal mundur, serta membuat, mengganti, atau mencabut token API dashboard eksekutif — token yang berlaku dapat ditampilkan dan disalin untuk diberikan kepada pengembang aplikasi dashboard. Setiap perubahan dikonfirmasi lewat kotak dialog dan tercatat pada jejak audit.</w:t>
       </w:r>
     </w:p>
     <w:p>
@@ -10714,6 +10726,30 @@
       </w:pPr>
       <w:r>
         <w:t xml:space="preserve">Impor pengguna: sel yang kosong pada berkas CSV tidak lagi menghapus surel, nomor HP, dan rekening yang sudah diisi pengguna, sehingga data pegawai aman diimpor ulang untuk menambah orang. Wakil Direktur II ditambahkan ke data pegawai bawaan.</w:t>
+      </w:r>
+    </w:p>
+    <w:p>
+      <w:pPr>
+        <w:pStyle w:val="ListParagraph"/>
+        <w:numPr>
+          <w:ilvl w:val="0"/>
+          <w:numId w:val="2"/>
+        </w:numPr>
+      </w:pPr>
+      <w:r>
+        <w:t xml:space="preserve">Pengaturan Sistem: token API dashboard eksekutif dibuat, diganti, atau dicabut langsung dari aplikasi tanpa menyunting .env di server, lengkap dengan alamat dan jalur API-nya; token yang berlaku dapat ditampilkan dan disalin.</w:t>
+      </w:r>
+    </w:p>
+    <w:p>
+      <w:pPr>
+        <w:pStyle w:val="ListParagraph"/>
+        <w:numPr>
+          <w:ilvl w:val="0"/>
+          <w:numId w:val="2"/>
+        </w:numPr>
+      </w:pPr>
+      <w:r>
+        <w:t xml:space="preserve">Membuka atau mengunci tanggal dikeluarkan SPD serta mengelola token API kini melalui kotak konfirmasi.</w:t>
       </w:r>
     </w:p>
     <w:p>

</xml_diff>

<commit_message>
Kunci API Anthropic dipasang dari Pengaturan Sistem, tersimpan terenkripsi
- Pengaturan::KUNCI_ANTHROPIC disimpan lewat simpanRahasia() (Crypt) dan
  dibaca kunciAnthropic(); nilai yang tak terdekripsi dianggap kosong.
  Kunci dari pengaturan mengalahkan ANTHROPIC_API_KEY di .env.
- AsistenAi memakai kunci yang berlaku; hasil wawasan yang gagal tidak lagi
  di-cache supaya kunci yang baru dibetulkan langsung terasa. Pesan
  nonaktif mengarah ke Administrasi Sistem, bukan .env.
- Kartu "Kunci API Anthropic — Asisten AI Dashboard" (super administrator):
  status, kunci tersamar (awal + akhir saja), kotak pemasangan dengan
  masukan tersembunyi dan validasi format sk-ant-, hapus lewat konfirmasi;
  tercatat pada jejak audit.
- Tes: KunciAnthropicAdministrasiTest; panduan, riwayat 2.5.2, dan buku
  panduan diperbarui.

Co-Authored-By: Claude Opus 5 <noreply@anthropic.com>
</commit_message>
<xml_diff>
--- a/resources/panduan/Buku-Panduan-PANGI-v2.5.docx
+++ b/resources/panduan/Buku-Panduan-PANGI-v2.5.docx
@@ -6998,7 +6998,7 @@
         </w:numPr>
       </w:pPr>
       <w:r>
-        <w:t xml:space="preserve">Di halaman yang sama, super administrator dapat membuka atau mengunci tanggal dikeluarkan SPD untuk kasus tanggal mundur, serta membuat, mengganti, atau mencabut token API dashboard eksekutif — token yang berlaku dapat ditampilkan dan disalin untuk diberikan kepada pengembang aplikasi dashboard. Setiap perubahan dikonfirmasi lewat kotak dialog dan tercatat pada jejak audit.</w:t>
+        <w:t xml:space="preserve">Di halaman yang sama, super administrator dapat membuka atau mengunci tanggal dikeluarkan SPD untuk kasus tanggal mundur; membuat, mengganti, atau mencabut token API dashboard eksekutif — token yang berlaku dapat ditampilkan dan disalin untuk diberikan kepada pengembang aplikasi dashboard; serta memasang kunci API Anthropic yang menghidupkan Wawasan AI di Dashboard Eksekutif (tersimpan terenkripsi, tidak ditampilkan kembali). Setiap perubahan dikonfirmasi lewat kotak dialog dan tercatat pada jejak audit.</w:t>
       </w:r>
     </w:p>
     <w:p>
@@ -10749,7 +10749,19 @@
         </w:numPr>
       </w:pPr>
       <w:r>
-        <w:t xml:space="preserve">Membuka atau mengunci tanggal dikeluarkan SPD serta mengelola token API kini melalui kotak konfirmasi.</w:t>
+        <w:t xml:space="preserve">Pengaturan Sistem: kunci API Anthropic untuk Wawasan AI dan agen tanya-jawab Dashboard Eksekutif dipasang, diganti, atau dihapus dari aplikasi — tersimpan terenkripsi, tanpa menyunting .env di server.</w:t>
+      </w:r>
+    </w:p>
+    <w:p>
+      <w:pPr>
+        <w:pStyle w:val="ListParagraph"/>
+        <w:numPr>
+          <w:ilvl w:val="0"/>
+          <w:numId w:val="2"/>
+        </w:numPr>
+      </w:pPr>
+      <w:r>
+        <w:t xml:space="preserve">Membuka atau mengunci tanggal dikeluarkan SPD serta mengelola token API dan kunci AI kini melalui kotak konfirmasi.</w:t>
       </w:r>
     </w:p>
     <w:p>

</xml_diff>

<commit_message>
Buku panduan: sampul 2.5.2, catatan Wawasan AI pada bab pimpinan
Co-Authored-By: Claude Opus 5 <noreply@anthropic.com>
</commit_message>
<xml_diff>
--- a/resources/panduan/Buku-Panduan-PANGI-v2.5.docx
+++ b/resources/panduan/Buku-Panduan-PANGI-v2.5.docx
@@ -188,7 +188,7 @@
                 <w:sz w:val="19"/>
                 <w:szCs w:val="19"/>
               </w:rPr>
-              <w:t xml:space="preserve">2.5</w:t>
+              <w:t xml:space="preserve">2.5.2</w:t>
             </w:r>
           </w:p>
         </w:tc>
@@ -213,7 +213,7 @@
                 <w:sz w:val="19"/>
                 <w:szCs w:val="19"/>
               </w:rPr>
-              <w:t xml:space="preserve">12 September 2026</w:t>
+              <w:t xml:space="preserve">16 September 2026</w:t>
             </w:r>
           </w:p>
         </w:tc>
@@ -7038,7 +7038,7 @@
         </w:numPr>
       </w:pPr>
       <w:r>
-        <w:t xml:space="preserve">Dashboard Eksekutif — realisasi anggaran per kategori dan per bulan, pergerakan pegawai per unit kerja, serta siapa yang akan berangkat, sedang berjalan, dan belum melapor. Tahun anggarannya dapat dipilih.</w:t>
+        <w:t xml:space="preserve">Dashboard Eksekutif — realisasi anggaran per kategori dan per bulan, pergerakan pegawai per unit kerja, serta siapa yang akan berangkat, sedang berjalan, dan belum melapor. Tahun anggarannya dapat dipilih. Bila super administrator sudah memasang kunci API Anthropic di Pengaturan Sistem, panel Wawasan AI dan agen tanya-jawab ikut aktif di halaman ini.</w:t>
       </w:r>
     </w:p>
     <w:p>
@@ -10974,7 +10974,7 @@
           <w:sz w:val="17"/>
           <w:szCs w:val="17"/>
         </w:rPr>
-        <w:t xml:space="preserve">Buku Panduan PANGI v2.5 — Politeknik Kesehatan Kemenkes Manado. Isi buku ini mengikuti sistem sebagaimana berjalan pada 12 September 2026; bila tampilan di layar berbeda, yang berlaku adalah sistemnya, dan mohon laporkan selisihnya lewat menu Bantuan.</w:t>
+        <w:t xml:space="preserve">Buku Panduan PANGI v2.5 — Politeknik Kesehatan Kemenkes Manado. Isi buku ini mengikuti sistem sebagaimana berjalan pada 16 September 2026 (versi 2.5.2); bila tampilan di layar berbeda, yang berlaku adalah sistemnya, dan mohon laporkan selisihnya lewat menu Bantuan.</w:t>
       </w:r>
     </w:p>
     <w:sectPr>

</xml_diff>

<commit_message>
Panel Pemantauan Berkas pada Rincian Saya: seluruh tanda tangan dan pembayaran
- PemantauBerkas menyusun keadaan tiap berkas pelaksana: dicek tim
  keuangan, dikirim, tanda tangan pelaksana & PPK pada rincian biaya dan
  daftar riil, konfirmasi Direktur atas laporan, daftar nominatif (terbit,
  PPK, diterima keuangan), serta uang muka, pelunasan, dan transport lokal
  (dibayar terpisah atau bersama pelunasan) — dengan waktu, pelaku, kode,
  dan nominal; sanggahan/pengembalian ditandai perhatian, transport lokal
  yang tidak ada ditandai tidak perlu.
- Komponen pantau-berkas tampil pada tiap kartu kedua submenu Rincian Saya;
  relasi dan nominatif dimuat sekali per halaman.
- Tes RincianSayaTest (4 skenario); panduan, riwayat 2.5.2, buku panduan.

Co-Authored-By: Claude Opus 5 <noreply@anthropic.com>
</commit_message>
<xml_diff>
--- a/resources/panduan/Buku-Panduan-PANGI-v2.5.docx
+++ b/resources/panduan/Buku-Panduan-PANGI-v2.5.docx
@@ -5737,6 +5737,28 @@
           <w:b/>
           <w:bCs/>
         </w:rPr>
+        <w:t xml:space="preserve">Pantau berkasnya.</w:t>
+      </w:r>
+      <w:r>
+        <w:rPr>
+          <w:color w:val="55616F"/>
+        </w:rPr>
+        <w:t xml:space="preserve">  Panel Pemantauan Berkas pada tiap kartu menyebut seluruh tanda tangan — tim keuangan, Anda, PPK, konfirmasi Direktur atas laporan, daftar nominatif — dan pembayaran uang muka, pelunasan, serta transport lokal, lengkap dengan tanggal dan kodenya.</w:t>
+      </w:r>
+    </w:p>
+    <w:p>
+      <w:pPr>
+        <w:pStyle w:val="ListParagraph"/>
+        <w:numPr>
+          <w:ilvl w:val="0"/>
+          <w:numId w:val="8"/>
+        </w:numPr>
+      </w:pPr>
+      <w:r>
+        <w:rPr>
+          <w:b/>
+          <w:bCs/>
+        </w:rPr>
         <w:t xml:space="preserve">Setujui, atau ajukan sanggahan.</w:t>
       </w:r>
       <w:r>
@@ -10762,6 +10784,18 @@
       </w:pPr>
       <w:r>
         <w:t xml:space="preserve">Membuka atau mengunci tanggal dikeluarkan SPD serta mengelola token API dan kunci AI kini melalui kotak konfirmasi.</w:t>
+      </w:r>
+    </w:p>
+    <w:p>
+      <w:pPr>
+        <w:pStyle w:val="ListParagraph"/>
+        <w:numPr>
+          <w:ilvl w:val="0"/>
+          <w:numId w:val="2"/>
+        </w:numPr>
+      </w:pPr>
+      <w:r>
+        <w:t xml:space="preserve">Rincian Saya: tiap berkas memuat panel Pemantauan Berkas — status seluruh tanda tangan (tim keuangan, pelaksana, PPK, konfirmasi Direktur, daftar nominatif) dan status pembayaran (uang muka, pelunasan, transport lokal) beserta tanggal dan kodenya.</w:t>
       </w:r>
     </w:p>
     <w:p>

</xml_diff>

<commit_message>
Hapus syarat SPD dari aplikasi sebelum usulan perjadin
- Formulir dan penyimpanan usulan tidak lagi dialihkan ke Buat SPD bila
  pengguna belum tercantum pada SPD mana pun; id_spd menjadi opsional
  (tetap harus milik pengguna bila dipilih) dan hanya menyalin isian.
- SPD bertanda tangan beserta nomornya tetap wajib diunggah sebagai dasar
  persetujuan PPK.
- Aksi cepat dashboard "Buat Usulan Perjadin" selalu terbuka; panduan,
  buku panduan (langkah pelaksana, tabel kendala), dan riwayat 2.5.2
  diperbarui; tes disesuaikan (UsulanTanpaSpdAplikasiTest).

Co-Authored-By: Claude Opus 5 <noreply@anthropic.com>
</commit_message>
<xml_diff>
--- a/resources/panduan/Buku-Panduan-PANGI-v2.5.docx
+++ b/resources/panduan/Buku-Panduan-PANGI-v2.5.docx
@@ -4204,7 +4204,7 @@
     </w:p>
     <w:p>
       <w:r>
-        <w:t xml:space="preserve">SPD adalah dasar penugasannya, dan harus ada lebih dulu. Selama Anda belum tercantum pada satu SPD pun, tombol Buat Usulan akan menolak.</w:t>
+        <w:t xml:space="preserve">SPD yang dibuat lewat aplikasi menyalin isiannya ke formulir usulan dan memberi tahu pelaksana yang tercantum — tetapi tidak wajib. Bila SPD diterbitkan di luar aplikasi, usulan tetap dapat langsung diajukan; yang wajib adalah SPD bertanda tangan beserta nomornya.</w:t>
       </w:r>
     </w:p>
     <w:p>
@@ -4360,13 +4360,13 @@
           <w:b/>
           <w:bCs/>
         </w:rPr>
-        <w:t xml:space="preserve">Pilih SPD yang mendasari.</w:t>
+        <w:t xml:space="preserve">Pilih SPD dari aplikasi (opsional).</w:t>
       </w:r>
       <w:r>
         <w:rPr>
           <w:color w:val="55616F"/>
         </w:rPr>
-        <w:t xml:space="preserve">  Tujuan, tanggal, dan maksud terisi sendiri dari SPD yang dipilih.</w:t>
+        <w:t xml:space="preserve">  Bila ada, tujuan, tanggal, dan maksud terisi sendiri dari SPD yang dipilih; bila tidak ada, lewati dan isi data perjalanan secara manual.</w:t>
       </w:r>
     </w:p>
     <w:p>
@@ -10043,7 +10043,7 @@
                 <w:sz w:val="19"/>
                 <w:szCs w:val="19"/>
               </w:rPr>
-              <w:t xml:space="preserve">Tombol Buat Usulan menolak</w:t>
+              <w:t xml:space="preserve">Data perjalanan tidak terisi otomatis</w:t>
             </w:r>
           </w:p>
         </w:tc>
@@ -10068,7 +10068,7 @@
                 <w:sz w:val="19"/>
                 <w:szCs w:val="19"/>
               </w:rPr>
-              <w:t xml:space="preserve">Anda belum tercantum pada satu SPD pun. Terbitkan SPD lebih dulu, atau minta pembuat SPD mencantumkan nama Anda.</w:t>
+              <w:t xml:space="preserve">SPD-nya tidak dibuat lewat aplikasi, jadi tidak ada yang disalin. Isi tujuan, tanggal, dan uraian secara manual; usulan tetap dapat diajukan.</w:t>
             </w:r>
           </w:p>
         </w:tc>
@@ -10796,6 +10796,18 @@
       </w:pPr>
       <w:r>
         <w:t xml:space="preserve">Membuka atau mengunci tanggal dikeluarkan SPD serta mengelola token API dan kunci AI kini melalui kotak konfirmasi.</w:t>
+      </w:r>
+    </w:p>
+    <w:p>
+      <w:pPr>
+        <w:pStyle w:val="ListParagraph"/>
+        <w:numPr>
+          <w:ilvl w:val="0"/>
+          <w:numId w:val="2"/>
+        </w:numPr>
+      </w:pPr>
+      <w:r>
+        <w:t xml:space="preserve">Usulan perjadin tidak lagi mensyaratkan SPD dibuat lewat aplikasi lebih dulu: formulir usulan terbuka bagi semua, memilih SPD dari aplikasi hanya untuk mengisi otomatis. SPD bertanda tangan beserta nomornya tetap wajib diunggah sebagai dasar persetujuan PPK.</w:t>
       </w:r>
     </w:p>
     <w:p>

</xml_diff>

<commit_message>
Nomor SPD pada usulan bersifat unik
- Aturan NomorSpdUnik: nomor yang sudah dipakai usulan lain (milik siapa
  pun) ditolak saat mengajukan maupun menyunting — dibandingkan tanpa
  peduli huruf besar-kecil dan spasi tepi — dengan pesan yang menyebut
  usulan dan pemilik yang memakainya; nomor disimpan sudah dirapikan.
- Petunjuk pada formulir, panduan, riwayat 2.5.2, dan buku panduan
  (tabel kendala) diperbarui; tes NomorSpdUnikTest.

Co-Authored-By: Claude Opus 5 <noreply@anthropic.com>
</commit_message>
<xml_diff>
--- a/resources/panduan/Buku-Panduan-PANGI-v2.5.docx
+++ b/resources/panduan/Buku-Panduan-PANGI-v2.5.docx
@@ -10147,6 +10147,58 @@
                 <w:sz w:val="19"/>
                 <w:szCs w:val="19"/>
               </w:rPr>
+              <w:t xml:space="preserve">Nomor SPD ditolak: sudah dipakai</w:t>
+            </w:r>
+          </w:p>
+        </w:tc>
+        <w:tc>
+          <w:tcPr>
+            <w:tcW w:type="dxa" w:w="5777"/>
+            <w:tcMar>
+              <w:top w:type="dxa" w:w="80"/>
+              <w:left w:type="dxa" w:w="120"/>
+              <w:bottom w:type="dxa" w:w="80"/>
+              <w:right w:type="dxa" w:w="120"/>
+            </w:tcMar>
+          </w:tcPr>
+          <w:p>
+            <w:pPr>
+              <w:spacing w:after="0"/>
+            </w:pPr>
+            <w:r>
+              <w:rPr>
+                <w:b w:val="false"/>
+                <w:bCs w:val="false"/>
+                <w:sz w:val="19"/>
+                <w:szCs w:val="19"/>
+              </w:rPr>
+              <w:t xml:space="preserve">Nomor itu sudah tercatat pada usulan lain (pesannya menyebut nomor usulan dan pemiliknya). Periksa kembali salinan nomor dari dokumen SPD; bila memang usulan Anda, buka usulan yang sudah ada alih-alih membuat baru.</w:t>
+            </w:r>
+          </w:p>
+        </w:tc>
+      </w:tr>
+      <w:tr>
+        <w:tc>
+          <w:tcPr>
+            <w:tcW w:type="dxa" w:w="3249"/>
+            <w:tcMar>
+              <w:top w:type="dxa" w:w="80"/>
+              <w:left w:type="dxa" w:w="120"/>
+              <w:bottom w:type="dxa" w:w="80"/>
+              <w:right w:type="dxa" w:w="120"/>
+            </w:tcMar>
+          </w:tcPr>
+          <w:p>
+            <w:pPr>
+              <w:spacing w:after="0"/>
+            </w:pPr>
+            <w:r>
+              <w:rPr>
+                <w:b w:val="false"/>
+                <w:bCs w:val="false"/>
+                <w:sz w:val="19"/>
+                <w:szCs w:val="19"/>
+              </w:rPr>
               <w:t xml:space="preserve">Nomor surat SPD ditolak</w:t>
             </w:r>
           </w:p>
@@ -10796,6 +10848,18 @@
       </w:pPr>
       <w:r>
         <w:t xml:space="preserve">Membuka atau mengunci tanggal dikeluarkan SPD serta mengelola token API dan kunci AI kini melalui kotak konfirmasi.</w:t>
+      </w:r>
+    </w:p>
+    <w:p>
+      <w:pPr>
+        <w:pStyle w:val="ListParagraph"/>
+        <w:numPr>
+          <w:ilvl w:val="0"/>
+          <w:numId w:val="2"/>
+        </w:numPr>
+      </w:pPr>
+      <w:r>
+        <w:t xml:space="preserve">Nomor SPD pada usulan bersifat unik: nomor yang sudah dipakai usulan lain — milik siapa pun — ditolak saat mengajukan maupun menyunting, dengan pesan yang menyebut usulan mana yang memakainya, sehingga tidak ada usulan ganda atas SPD yang sama.</w:t>
       </w:r>
     </w:p>
     <w:p>

</xml_diff>

<commit_message>
Surat tugas dilampirkan pada SPD, akun diisi PPK, kuitansi penyelenggara/hotel, peran eksternal ditahan (2.5.3)
- Formulir SPD: kartu Surat Tugas (nomor + berkas, tidak wajib); kolom Akun
  pembebanan dihapus karena diisi PPK saat verifikasi dan tanda tangan.
- Usulan perjadin yang memilih SPD bersurat tugas mengambil berkas (disalin)
  dan nomornya otomatis — tidak diminta lagi; tanpa itu keduanya tetap wajib.
- Label "Kuitansi" menjadi "Kuitansi penyelenggara / hotel" pada formulir
  dokumen, ceklist, laporan, master data, dan pesan validasi.
- Pegawai eksternal dan outsourcing (mahasiswa) ditahan pada halaman
  "fitur masih dikembangkan" dengan tombol keluar; peran lain tidak berubah.
- Panduan, riwayat perubahan, dan Buku Panduan diperbarui; versi 2.5.3.

Co-Authored-By: Claude Opus 5 <noreply@anthropic.com>
</commit_message>
<xml_diff>
--- a/resources/panduan/Buku-Panduan-PANGI-v2.5.docx
+++ b/resources/panduan/Buku-Panduan-PANGI-v2.5.docx
@@ -188,7 +188,7 @@
                 <w:sz w:val="19"/>
                 <w:szCs w:val="19"/>
               </w:rPr>
-              <w:t xml:space="preserve">2.5.2</w:t>
+              <w:t xml:space="preserve">2.5.3</w:t>
             </w:r>
           </w:p>
         </w:tc>
@@ -213,7 +213,7 @@
                 <w:sz w:val="19"/>
                 <w:szCs w:val="19"/>
               </w:rPr>
-              <w:t xml:space="preserve">16 September 2026</w:t>
+              <w:t xml:space="preserve">21 September 2026</w:t>
             </w:r>
           </w:p>
         </w:tc>
@@ -1101,7 +1101,7 @@
     </w:p>
     <w:p>
       <w:r>
-        <w:t xml:space="preserve">Seluruh peran berhak mengajukan perjalanan dinas untuk dirinya sendiri. Yang membedakan adalah kewenangan di atasnya.</w:t>
+        <w:t xml:space="preserve">Seluruh peran berhak mengajukan perjalanan dinas untuk dirinya sendiri. Yang membedakan adalah kewenangan di atasnya. Modul bagi Pegawai Kemenkes Eksternal dan mahasiswa/outsourcing dikembangkan terpisah dan belum tersedia: setelah masuk, mereka melihat halaman pemberitahuan "fitur masih dikembangkan" dengan tombol keluar, tanpa menu lain.</w:t>
       </w:r>
     </w:p>
     <w:tbl>
@@ -4270,7 +4270,7 @@
         <w:rPr>
           <w:color w:val="55616F"/>
         </w:rPr>
-        <w:t xml:space="preserve">  Isian ini tersalin sendiri ke formulir usulan, sehingga tanggal pada SPD dan pada usulan tidak berselisih.</w:t>
+        <w:t xml:space="preserve">  Isian ini tersalin sendiri ke formulir usulan, sehingga tanggal pada SPD dan pada usulan tidak berselisih. Kolom akun pembebanan tidak ada di formulir ini — akunnya diisi PPK saat verifikasi dan tanda tangan.</w:t>
       </w:r>
     </w:p>
     <w:p>
@@ -4286,13 +4286,13 @@
           <w:b/>
           <w:bCs/>
         </w:rPr>
-        <w:t xml:space="preserve">Tambahkan pengikut bila ada.</w:t>
+        <w:t xml:space="preserve">Lampirkan surat tugas dan nomornya.</w:t>
       </w:r>
       <w:r>
         <w:rPr>
           <w:color w:val="55616F"/>
         </w:rPr>
-        <w:t xml:space="preserve">  Pengikut ikut berangkat dan namanya tercantum pada SPD, tetapi ia tidak mengajukan usulan sendiri.</w:t>
+        <w:t xml:space="preserve">  Pada kartu Surat Tugas, unggah berkasnya (PDF, JPG, atau PNG, maks. 5 MB) dan salin nomornya persis seperti tertulis. Tidak wajib, tetapi bila diisi di sini, usulan perjadin yang memilih SPD ini tidak perlu mengunggah dan menyalin nomornya lagi — keduanya diambil dari SPD. Saat menyunting, biarkan kolom berkasnya kosong untuk mempertahankan yang sudah ada.</w:t>
       </w:r>
     </w:p>
     <w:p>
@@ -4308,6 +4308,28 @@
           <w:b/>
           <w:bCs/>
         </w:rPr>
+        <w:t xml:space="preserve">Tambahkan pengikut bila ada.</w:t>
+      </w:r>
+      <w:r>
+        <w:rPr>
+          <w:color w:val="55616F"/>
+        </w:rPr>
+        <w:t xml:space="preserve">  Pengikut ikut berangkat dan namanya tercantum pada SPD, tetapi ia tidak mengajukan usulan sendiri.</w:t>
+      </w:r>
+    </w:p>
+    <w:p>
+      <w:pPr>
+        <w:pStyle w:val="ListParagraph"/>
+        <w:numPr>
+          <w:ilvl w:val="0"/>
+          <w:numId w:val="5"/>
+        </w:numPr>
+      </w:pPr>
+      <w:r>
+        <w:rPr>
+          <w:b/>
+          <w:bCs/>
+        </w:rPr>
         <w:t xml:space="preserve">Pratinjau, lalu simpan.</w:t>
       </w:r>
       <w:r>
@@ -4366,7 +4388,7 @@
         <w:rPr>
           <w:color w:val="55616F"/>
         </w:rPr>
-        <w:t xml:space="preserve">  Bila ada, tujuan, tanggal, dan maksud terisi sendiri dari SPD yang dipilih; bila tidak ada, lewati dan isi data perjalanan secara manual.</w:t>
+        <w:t xml:space="preserve">  Bila ada, tujuan, tanggal, maksud, dan nomor SPD Anda terisi sendiri dari SPD yang dipilih. Bila SPD itu sudah melampirkan surat tugas, berkas dan nomor surat tugasnya ikut diambil — tidak perlu diunggah maupun disalin lagi. Bila tidak ada, lewati dan isi data perjalanan secara manual, termasuk mengunggah surat tugas beserta nomornya.</w:t>
       </w:r>
     </w:p>
     <w:p>
@@ -4410,7 +4432,7 @@
         <w:rPr>
           <w:color w:val="55616F"/>
         </w:rPr>
-        <w:t xml:space="preserve">  Kategori menentukan berkas apa yang nanti ditagih. Dalam kota tidak diminta tiket, penginapan, maupun kuitansi. Salah memilih berarti ditagih berkas yang tidak pernah ada.</w:t>
+        <w:t xml:space="preserve">  Kategori menentukan berkas apa yang nanti ditagih. Dalam kota tidak diminta tiket, penginapan, maupun kuitansi penyelenggara / hotel. Salah memilih berarti ditagih berkas yang tidak pernah ada.</w:t>
       </w:r>
     </w:p>
     <w:p>
@@ -5045,7 +5067,7 @@
                 <w:sz w:val="19"/>
                 <w:szCs w:val="19"/>
               </w:rPr>
-              <w:t xml:space="preserve">Kuitansi</w:t>
+              <w:t xml:space="preserve">Kuitansi penyelenggara / hotel</w:t>
             </w:r>
           </w:p>
         </w:tc>
@@ -10780,6 +10802,62 @@
       </w:pPr>
       <w:r>
         <w:t xml:space="preserve">Yang berubah dari versi ke versi, supaya pembaca versi lama tahu bagian mana yang perlu dibaca ulang.</w:t>
+      </w:r>
+    </w:p>
+    <w:p>
+      <w:pPr>
+        <w:pStyle w:val="Heading2"/>
+      </w:pPr>
+      <w:r>
+        <w:t xml:space="preserve">Versi 2.5.3 — 21 September 2026</w:t>
+      </w:r>
+    </w:p>
+    <w:p>
+      <w:pPr>
+        <w:pStyle w:val="ListParagraph"/>
+        <w:numPr>
+          <w:ilvl w:val="0"/>
+          <w:numId w:val="2"/>
+        </w:numPr>
+      </w:pPr>
+      <w:r>
+        <w:t xml:space="preserve">Formulir SPD: surat tugas dilampirkan sejak SPD dibuat — nomor dan berkasnya diisi pada kartu Surat Tugas (tidak wajib). Usulan perjadin yang memilih SPD itu mengambil keduanya secara otomatis; berkas surat tugas tidak diunggah lagi dan nomornya tidak disalin ulang.</w:t>
+      </w:r>
+    </w:p>
+    <w:p>
+      <w:pPr>
+        <w:pStyle w:val="ListParagraph"/>
+        <w:numPr>
+          <w:ilvl w:val="0"/>
+          <w:numId w:val="2"/>
+        </w:numPr>
+      </w:pPr>
+      <w:r>
+        <w:t xml:space="preserve">Formulir SPD: kolom Akun pembebanan dihapus — akun diisi PPK saat verifikasi dan tanda tangan, bukan oleh pembuat SPD.</w:t>
+      </w:r>
+    </w:p>
+    <w:p>
+      <w:pPr>
+        <w:pStyle w:val="ListParagraph"/>
+        <w:numPr>
+          <w:ilvl w:val="0"/>
+          <w:numId w:val="2"/>
+        </w:numPr>
+      </w:pPr>
+      <w:r>
+        <w:t xml:space="preserve">Berkas pertanggungjawaban: unggahan dan ceklist "Kuitansi" kini disebut "Kuitansi penyelenggara / hotel" agar jelas kuitansi mana yang dimaksud — dari penyelenggara kegiatan atau dari hotel tempat menginap.</w:t>
+      </w:r>
+    </w:p>
+    <w:p>
+      <w:pPr>
+        <w:pStyle w:val="ListParagraph"/>
+        <w:numPr>
+          <w:ilvl w:val="0"/>
+          <w:numId w:val="2"/>
+        </w:numPr>
+      </w:pPr>
+      <w:r>
+        <w:t xml:space="preserve">Pegawai eksternal dan mahasiswa/outsourcing: modul perjalanan dinasnya dikembangkan terpisah. Sementara itu, setelah masuk mereka melihat halaman pemberitahuan "fitur masih dikembangkan" dengan tombol keluar; menu lain belum dapat dibuka.</w:t>
       </w:r>
     </w:p>
     <w:p>

</xml_diff>

<commit_message>
Peran Mahasiswa serta menu Peran & Hak Akses pada Administrasi Sistem
- Peran baru Mahasiswa (kode "mahasiswa"); modulnya ditahan seperti pegawai
  eksternal dan outsourcing.
- Peran & Hak Akses (super administrator): tabel peran dan hak_akses_peran;
  peran bawaan disalin dari enum saat halaman pertama dibuka, peran baru
  ditambahkan dari nama; matriks menu × Lihat/Ubah/Hapus per peran; Super
  Administrator selalu penuh; peran buatan dihapus bila tak dipakai.
- Kemampuan dibaca lewat PenentuHakAkses (tabel bila ada, enum bila belum);
  label peran dan pilihan peran pada formulir pengguna ikut tabel.
- Kemampuan baru: menghapus-master-data, menghapus-pengguna (rute destroy
  dijaga terpisah), mengelola-peran.
- Panduan, riwayat 2.5.3, dan Buku Panduan diperbarui.

Co-Authored-By: Claude Opus 5 <noreply@anthropic.com>
</commit_message>
<xml_diff>
--- a/resources/panduan/Buku-Panduan-PANGI-v2.5.docx
+++ b/resources/panduan/Buku-Panduan-PANGI-v2.5.docx
@@ -263,7 +263,7 @@
                 <w:sz w:val="19"/>
                 <w:szCs w:val="19"/>
               </w:rPr>
-              <w:t xml:space="preserve">9</w:t>
+              <w:t xml:space="preserve">10 bawaan + buatan</w:t>
             </w:r>
           </w:p>
         </w:tc>
@@ -1101,7 +1101,7 @@
     </w:p>
     <w:p>
       <w:r>
-        <w:t xml:space="preserve">Seluruh peran berhak mengajukan perjalanan dinas untuk dirinya sendiri. Yang membedakan adalah kewenangan di atasnya. Modul bagi Pegawai Kemenkes Eksternal dan mahasiswa/outsourcing dikembangkan terpisah dan belum tersedia: setelah masuk, mereka melihat halaman pemberitahuan "fitur masih dikembangkan" dengan tombol keluar, tanpa menu lain.</w:t>
+        <w:t xml:space="preserve">Seluruh peran berhak mengajukan perjalanan dinas untuk dirinya sendiri. Yang membedakan adalah kewenangan di atasnya. Modul bagi Pegawai Kemenkes Eksternal dan mahasiswa/outsourcing dikembangkan terpisah dan belum tersedia: setelah masuk, mereka melihat halaman pemberitahuan "fitur masih dikembangkan" dengan tombol keluar, tanpa menu lain. Tabel ini memuat hak akses bawaan; super administrator dapat mengubahnya per peran — atau menambah peran baru — lewat Administrasi Sistem → Peran &amp; Hak Akses (Bab 9.4).</w:t>
       </w:r>
     </w:p>
     <w:tbl>
@@ -1967,7 +1967,7 @@
                 <w:sz w:val="19"/>
                 <w:szCs w:val="19"/>
               </w:rPr>
-              <w:t xml:space="preserve">Tim Keuangan</w:t>
+              <w:t xml:space="preserve">Mahasiswa</w:t>
             </w:r>
           </w:p>
         </w:tc>
@@ -2017,7 +2017,7 @@
                 <w:sz w:val="19"/>
                 <w:szCs w:val="19"/>
               </w:rPr>
-              <w:t xml:space="preserve">Ya</w:t>
+              <w:t xml:space="preserve">–</w:t>
             </w:r>
           </w:p>
         </w:tc>
@@ -2042,7 +2042,7 @@
                 <w:sz w:val="19"/>
                 <w:szCs w:val="19"/>
               </w:rPr>
-              <w:t xml:space="preserve">Ya</w:t>
+              <w:t xml:space="preserve">–</w:t>
             </w:r>
           </w:p>
         </w:tc>
@@ -2117,7 +2117,7 @@
                 <w:sz w:val="19"/>
                 <w:szCs w:val="19"/>
               </w:rPr>
-              <w:t xml:space="preserve">Ya</w:t>
+              <w:t xml:space="preserve">–</w:t>
             </w:r>
           </w:p>
         </w:tc>
@@ -2169,7 +2169,7 @@
                 <w:sz w:val="19"/>
                 <w:szCs w:val="19"/>
               </w:rPr>
-              <w:t xml:space="preserve">Bendahara</w:t>
+              <w:t xml:space="preserve">Tim Keuangan</w:t>
             </w:r>
           </w:p>
         </w:tc>
@@ -2244,13 +2244,38 @@
                 <w:sz w:val="19"/>
                 <w:szCs w:val="19"/>
               </w:rPr>
+              <w:t xml:space="preserve">Ya</w:t>
+            </w:r>
+          </w:p>
+        </w:tc>
+        <w:tc>
+          <w:tcPr>
+            <w:tcW w:type="dxa" w:w="1145"/>
+            <w:tcMar>
+              <w:top w:type="dxa" w:w="80"/>
+              <w:left w:type="dxa" w:w="120"/>
+              <w:bottom w:type="dxa" w:w="80"/>
+              <w:right w:type="dxa" w:w="120"/>
+            </w:tcMar>
+          </w:tcPr>
+          <w:p>
+            <w:pPr>
+              <w:spacing w:after="0"/>
+            </w:pPr>
+            <w:r>
+              <w:rPr>
+                <w:b w:val="false"/>
+                <w:bCs w:val="false"/>
+                <w:sz w:val="19"/>
+                <w:szCs w:val="19"/>
+              </w:rPr>
               <w:t xml:space="preserve">–</w:t>
             </w:r>
           </w:p>
         </w:tc>
         <w:tc>
           <w:tcPr>
-            <w:tcW w:type="dxa" w:w="1145"/>
+            <w:tcW w:type="dxa" w:w="881"/>
             <w:tcMar>
               <w:top w:type="dxa" w:w="80"/>
               <w:left w:type="dxa" w:w="120"/>
@@ -2270,31 +2295,6 @@
                 <w:szCs w:val="19"/>
               </w:rPr>
               <w:t xml:space="preserve">–</w:t>
-            </w:r>
-          </w:p>
-        </w:tc>
-        <w:tc>
-          <w:tcPr>
-            <w:tcW w:type="dxa" w:w="881"/>
-            <w:tcMar>
-              <w:top w:type="dxa" w:w="80"/>
-              <w:left w:type="dxa" w:w="120"/>
-              <w:bottom w:type="dxa" w:w="80"/>
-              <w:right w:type="dxa" w:w="120"/>
-            </w:tcMar>
-          </w:tcPr>
-          <w:p>
-            <w:pPr>
-              <w:spacing w:after="0"/>
-            </w:pPr>
-            <w:r>
-              <w:rPr>
-                <w:b w:val="false"/>
-                <w:bCs w:val="false"/>
-                <w:sz w:val="19"/>
-                <w:szCs w:val="19"/>
-              </w:rPr>
-              <w:t xml:space="preserve">Ya</w:t>
             </w:r>
           </w:p>
         </w:tc>
@@ -2371,7 +2371,7 @@
                 <w:sz w:val="19"/>
                 <w:szCs w:val="19"/>
               </w:rPr>
-              <w:t xml:space="preserve">PPK</w:t>
+              <w:t xml:space="preserve">Bendahara</w:t>
             </w:r>
           </w:p>
         </w:tc>
@@ -2421,12 +2421,87 @@
                 <w:sz w:val="19"/>
                 <w:szCs w:val="19"/>
               </w:rPr>
+              <w:t xml:space="preserve">Ya</w:t>
+            </w:r>
+          </w:p>
+        </w:tc>
+        <w:tc>
+          <w:tcPr>
+            <w:tcW w:type="dxa" w:w="925"/>
+            <w:tcMar>
+              <w:top w:type="dxa" w:w="80"/>
+              <w:left w:type="dxa" w:w="120"/>
+              <w:bottom w:type="dxa" w:w="80"/>
+              <w:right w:type="dxa" w:w="120"/>
+            </w:tcMar>
+          </w:tcPr>
+          <w:p>
+            <w:pPr>
+              <w:spacing w:after="0"/>
+            </w:pPr>
+            <w:r>
+              <w:rPr>
+                <w:b w:val="false"/>
+                <w:bCs w:val="false"/>
+                <w:sz w:val="19"/>
+                <w:szCs w:val="19"/>
+              </w:rPr>
+              <w:t xml:space="preserve">Ya</w:t>
+            </w:r>
+          </w:p>
+        </w:tc>
+        <w:tc>
+          <w:tcPr>
+            <w:tcW w:type="dxa" w:w="1145"/>
+            <w:tcMar>
+              <w:top w:type="dxa" w:w="80"/>
+              <w:left w:type="dxa" w:w="120"/>
+              <w:bottom w:type="dxa" w:w="80"/>
+              <w:right w:type="dxa" w:w="120"/>
+            </w:tcMar>
+          </w:tcPr>
+          <w:p>
+            <w:pPr>
+              <w:spacing w:after="0"/>
+            </w:pPr>
+            <w:r>
+              <w:rPr>
+                <w:b w:val="false"/>
+                <w:bCs w:val="false"/>
+                <w:sz w:val="19"/>
+                <w:szCs w:val="19"/>
+              </w:rPr>
               <w:t xml:space="preserve">–</w:t>
             </w:r>
           </w:p>
         </w:tc>
         <w:tc>
           <w:tcPr>
+            <w:tcW w:type="dxa" w:w="881"/>
+            <w:tcMar>
+              <w:top w:type="dxa" w:w="80"/>
+              <w:left w:type="dxa" w:w="120"/>
+              <w:bottom w:type="dxa" w:w="80"/>
+              <w:right w:type="dxa" w:w="120"/>
+            </w:tcMar>
+          </w:tcPr>
+          <w:p>
+            <w:pPr>
+              <w:spacing w:after="0"/>
+            </w:pPr>
+            <w:r>
+              <w:rPr>
+                <w:b w:val="false"/>
+                <w:bCs w:val="false"/>
+                <w:sz w:val="19"/>
+                <w:szCs w:val="19"/>
+              </w:rPr>
+              <w:t xml:space="preserve">Ya</w:t>
+            </w:r>
+          </w:p>
+        </w:tc>
+        <w:tc>
+          <w:tcPr>
             <w:tcW w:type="dxa" w:w="925"/>
             <w:tcMar>
               <w:top w:type="dxa" w:w="80"/>
@@ -2447,81 +2522,6 @@
                 <w:szCs w:val="19"/>
               </w:rPr>
               <w:t xml:space="preserve">–</w:t>
-            </w:r>
-          </w:p>
-        </w:tc>
-        <w:tc>
-          <w:tcPr>
-            <w:tcW w:type="dxa" w:w="1145"/>
-            <w:tcMar>
-              <w:top w:type="dxa" w:w="80"/>
-              <w:left w:type="dxa" w:w="120"/>
-              <w:bottom w:type="dxa" w:w="80"/>
-              <w:right w:type="dxa" w:w="120"/>
-            </w:tcMar>
-          </w:tcPr>
-          <w:p>
-            <w:pPr>
-              <w:spacing w:after="0"/>
-            </w:pPr>
-            <w:r>
-              <w:rPr>
-                <w:b w:val="false"/>
-                <w:bCs w:val="false"/>
-                <w:sz w:val="19"/>
-                <w:szCs w:val="19"/>
-              </w:rPr>
-              <w:t xml:space="preserve">Ya</w:t>
-            </w:r>
-          </w:p>
-        </w:tc>
-        <w:tc>
-          <w:tcPr>
-            <w:tcW w:type="dxa" w:w="881"/>
-            <w:tcMar>
-              <w:top w:type="dxa" w:w="80"/>
-              <w:left w:type="dxa" w:w="120"/>
-              <w:bottom w:type="dxa" w:w="80"/>
-              <w:right w:type="dxa" w:w="120"/>
-            </w:tcMar>
-          </w:tcPr>
-          <w:p>
-            <w:pPr>
-              <w:spacing w:after="0"/>
-            </w:pPr>
-            <w:r>
-              <w:rPr>
-                <w:b w:val="false"/>
-                <w:bCs w:val="false"/>
-                <w:sz w:val="19"/>
-                <w:szCs w:val="19"/>
-              </w:rPr>
-              <w:t xml:space="preserve">–</w:t>
-            </w:r>
-          </w:p>
-        </w:tc>
-        <w:tc>
-          <w:tcPr>
-            <w:tcW w:type="dxa" w:w="925"/>
-            <w:tcMar>
-              <w:top w:type="dxa" w:w="80"/>
-              <w:left w:type="dxa" w:w="120"/>
-              <w:bottom w:type="dxa" w:w="80"/>
-              <w:right w:type="dxa" w:w="120"/>
-            </w:tcMar>
-          </w:tcPr>
-          <w:p>
-            <w:pPr>
-              <w:spacing w:after="0"/>
-            </w:pPr>
-            <w:r>
-              <w:rPr>
-                <w:b w:val="false"/>
-                <w:bCs w:val="false"/>
-                <w:sz w:val="19"/>
-                <w:szCs w:val="19"/>
-              </w:rPr>
-              <w:t xml:space="preserve">Ya</w:t>
             </w:r>
           </w:p>
         </w:tc>
@@ -2573,7 +2573,7 @@
                 <w:sz w:val="19"/>
                 <w:szCs w:val="19"/>
               </w:rPr>
-              <w:t xml:space="preserve">Tim SDM</w:t>
+              <w:t xml:space="preserve">PPK</w:t>
             </w:r>
           </w:p>
         </w:tc>
@@ -2648,13 +2648,63 @@
                 <w:sz w:val="19"/>
                 <w:szCs w:val="19"/>
               </w:rPr>
+              <w:t xml:space="preserve">Ya</w:t>
+            </w:r>
+          </w:p>
+        </w:tc>
+        <w:tc>
+          <w:tcPr>
+            <w:tcW w:type="dxa" w:w="1145"/>
+            <w:tcMar>
+              <w:top w:type="dxa" w:w="80"/>
+              <w:left w:type="dxa" w:w="120"/>
+              <w:bottom w:type="dxa" w:w="80"/>
+              <w:right w:type="dxa" w:w="120"/>
+            </w:tcMar>
+          </w:tcPr>
+          <w:p>
+            <w:pPr>
+              <w:spacing w:after="0"/>
+            </w:pPr>
+            <w:r>
+              <w:rPr>
+                <w:b w:val="false"/>
+                <w:bCs w:val="false"/>
+                <w:sz w:val="19"/>
+                <w:szCs w:val="19"/>
+              </w:rPr>
+              <w:t xml:space="preserve">Ya</w:t>
+            </w:r>
+          </w:p>
+        </w:tc>
+        <w:tc>
+          <w:tcPr>
+            <w:tcW w:type="dxa" w:w="881"/>
+            <w:tcMar>
+              <w:top w:type="dxa" w:w="80"/>
+              <w:left w:type="dxa" w:w="120"/>
+              <w:bottom w:type="dxa" w:w="80"/>
+              <w:right w:type="dxa" w:w="120"/>
+            </w:tcMar>
+          </w:tcPr>
+          <w:p>
+            <w:pPr>
+              <w:spacing w:after="0"/>
+            </w:pPr>
+            <w:r>
+              <w:rPr>
+                <w:b w:val="false"/>
+                <w:bCs w:val="false"/>
+                <w:sz w:val="19"/>
+                <w:szCs w:val="19"/>
+              </w:rPr>
               <w:t xml:space="preserve">–</w:t>
             </w:r>
           </w:p>
         </w:tc>
         <w:tc>
           <w:tcPr>
-            <w:tcW w:type="dxa" w:w="1145"/>
+            <w:tcW w:type="dxa" w:w="925"/>
             <w:tcMar>
               <w:top w:type="dxa" w:w="80"/>
               <w:left w:type="dxa" w:w="120"/>
@@ -2679,7 +2729,7 @@
         </w:tc>
         <w:tc>
           <w:tcPr>
-            <w:tcW w:type="dxa" w:w="881"/>
+            <w:tcW w:type="dxa" w:w="966"/>
             <w:tcMar>
               <w:top w:type="dxa" w:w="80"/>
               <w:left w:type="dxa" w:w="120"/>
@@ -2699,56 +2749,6 @@
                 <w:szCs w:val="19"/>
               </w:rPr>
               <w:t xml:space="preserve">–</w:t>
-            </w:r>
-          </w:p>
-        </w:tc>
-        <w:tc>
-          <w:tcPr>
-            <w:tcW w:type="dxa" w:w="925"/>
-            <w:tcMar>
-              <w:top w:type="dxa" w:w="80"/>
-              <w:left w:type="dxa" w:w="120"/>
-              <w:bottom w:type="dxa" w:w="80"/>
-              <w:right w:type="dxa" w:w="120"/>
-            </w:tcMar>
-          </w:tcPr>
-          <w:p>
-            <w:pPr>
-              <w:spacing w:after="0"/>
-            </w:pPr>
-            <w:r>
-              <w:rPr>
-                <w:b w:val="false"/>
-                <w:bCs w:val="false"/>
-                <w:sz w:val="19"/>
-                <w:szCs w:val="19"/>
-              </w:rPr>
-              <w:t xml:space="preserve">–</w:t>
-            </w:r>
-          </w:p>
-        </w:tc>
-        <w:tc>
-          <w:tcPr>
-            <w:tcW w:type="dxa" w:w="966"/>
-            <w:tcMar>
-              <w:top w:type="dxa" w:w="80"/>
-              <w:left w:type="dxa" w:w="120"/>
-              <w:bottom w:type="dxa" w:w="80"/>
-              <w:right w:type="dxa" w:w="120"/>
-            </w:tcMar>
-          </w:tcPr>
-          <w:p>
-            <w:pPr>
-              <w:spacing w:after="0"/>
-            </w:pPr>
-            <w:r>
-              <w:rPr>
-                <w:b w:val="false"/>
-                <w:bCs w:val="false"/>
-                <w:sz w:val="19"/>
-                <w:szCs w:val="19"/>
-              </w:rPr>
-              <w:t xml:space="preserve">Ya</w:t>
             </w:r>
           </w:p>
         </w:tc>
@@ -2775,6 +2775,208 @@
                 <w:sz w:val="19"/>
                 <w:szCs w:val="19"/>
               </w:rPr>
+              <w:t xml:space="preserve">Tim SDM</w:t>
+            </w:r>
+          </w:p>
+        </w:tc>
+        <w:tc>
+          <w:tcPr>
+            <w:tcW w:type="dxa" w:w="881"/>
+            <w:tcMar>
+              <w:top w:type="dxa" w:w="80"/>
+              <w:left w:type="dxa" w:w="120"/>
+              <w:bottom w:type="dxa" w:w="80"/>
+              <w:right w:type="dxa" w:w="120"/>
+            </w:tcMar>
+          </w:tcPr>
+          <w:p>
+            <w:pPr>
+              <w:spacing w:after="0"/>
+            </w:pPr>
+            <w:r>
+              <w:rPr>
+                <w:b w:val="false"/>
+                <w:bCs w:val="false"/>
+                <w:sz w:val="19"/>
+                <w:szCs w:val="19"/>
+              </w:rPr>
+              <w:t xml:space="preserve">Ya</w:t>
+            </w:r>
+          </w:p>
+        </w:tc>
+        <w:tc>
+          <w:tcPr>
+            <w:tcW w:type="dxa" w:w="1013"/>
+            <w:tcMar>
+              <w:top w:type="dxa" w:w="80"/>
+              <w:left w:type="dxa" w:w="120"/>
+              <w:bottom w:type="dxa" w:w="80"/>
+              <w:right w:type="dxa" w:w="120"/>
+            </w:tcMar>
+          </w:tcPr>
+          <w:p>
+            <w:pPr>
+              <w:spacing w:after="0"/>
+            </w:pPr>
+            <w:r>
+              <w:rPr>
+                <w:b w:val="false"/>
+                <w:bCs w:val="false"/>
+                <w:sz w:val="19"/>
+                <w:szCs w:val="19"/>
+              </w:rPr>
+              <w:t xml:space="preserve">–</w:t>
+            </w:r>
+          </w:p>
+        </w:tc>
+        <w:tc>
+          <w:tcPr>
+            <w:tcW w:type="dxa" w:w="925"/>
+            <w:tcMar>
+              <w:top w:type="dxa" w:w="80"/>
+              <w:left w:type="dxa" w:w="120"/>
+              <w:bottom w:type="dxa" w:w="80"/>
+              <w:right w:type="dxa" w:w="120"/>
+            </w:tcMar>
+          </w:tcPr>
+          <w:p>
+            <w:pPr>
+              <w:spacing w:after="0"/>
+            </w:pPr>
+            <w:r>
+              <w:rPr>
+                <w:b w:val="false"/>
+                <w:bCs w:val="false"/>
+                <w:sz w:val="19"/>
+                <w:szCs w:val="19"/>
+              </w:rPr>
+              <w:t xml:space="preserve">–</w:t>
+            </w:r>
+          </w:p>
+        </w:tc>
+        <w:tc>
+          <w:tcPr>
+            <w:tcW w:type="dxa" w:w="1145"/>
+            <w:tcMar>
+              <w:top w:type="dxa" w:w="80"/>
+              <w:left w:type="dxa" w:w="120"/>
+              <w:bottom w:type="dxa" w:w="80"/>
+              <w:right w:type="dxa" w:w="120"/>
+            </w:tcMar>
+          </w:tcPr>
+          <w:p>
+            <w:pPr>
+              <w:spacing w:after="0"/>
+            </w:pPr>
+            <w:r>
+              <w:rPr>
+                <w:b w:val="false"/>
+                <w:bCs w:val="false"/>
+                <w:sz w:val="19"/>
+                <w:szCs w:val="19"/>
+              </w:rPr>
+              <w:t xml:space="preserve">–</w:t>
+            </w:r>
+          </w:p>
+        </w:tc>
+        <w:tc>
+          <w:tcPr>
+            <w:tcW w:type="dxa" w:w="881"/>
+            <w:tcMar>
+              <w:top w:type="dxa" w:w="80"/>
+              <w:left w:type="dxa" w:w="120"/>
+              <w:bottom w:type="dxa" w:w="80"/>
+              <w:right w:type="dxa" w:w="120"/>
+            </w:tcMar>
+          </w:tcPr>
+          <w:p>
+            <w:pPr>
+              <w:spacing w:after="0"/>
+            </w:pPr>
+            <w:r>
+              <w:rPr>
+                <w:b w:val="false"/>
+                <w:bCs w:val="false"/>
+                <w:sz w:val="19"/>
+                <w:szCs w:val="19"/>
+              </w:rPr>
+              <w:t xml:space="preserve">–</w:t>
+            </w:r>
+          </w:p>
+        </w:tc>
+        <w:tc>
+          <w:tcPr>
+            <w:tcW w:type="dxa" w:w="925"/>
+            <w:tcMar>
+              <w:top w:type="dxa" w:w="80"/>
+              <w:left w:type="dxa" w:w="120"/>
+              <w:bottom w:type="dxa" w:w="80"/>
+              <w:right w:type="dxa" w:w="120"/>
+            </w:tcMar>
+          </w:tcPr>
+          <w:p>
+            <w:pPr>
+              <w:spacing w:after="0"/>
+            </w:pPr>
+            <w:r>
+              <w:rPr>
+                <w:b w:val="false"/>
+                <w:bCs w:val="false"/>
+                <w:sz w:val="19"/>
+                <w:szCs w:val="19"/>
+              </w:rPr>
+              <w:t xml:space="preserve">–</w:t>
+            </w:r>
+          </w:p>
+        </w:tc>
+        <w:tc>
+          <w:tcPr>
+            <w:tcW w:type="dxa" w:w="966"/>
+            <w:tcMar>
+              <w:top w:type="dxa" w:w="80"/>
+              <w:left w:type="dxa" w:w="120"/>
+              <w:bottom w:type="dxa" w:w="80"/>
+              <w:right w:type="dxa" w:w="120"/>
+            </w:tcMar>
+          </w:tcPr>
+          <w:p>
+            <w:pPr>
+              <w:spacing w:after="0"/>
+            </w:pPr>
+            <w:r>
+              <w:rPr>
+                <w:b w:val="false"/>
+                <w:bCs w:val="false"/>
+                <w:sz w:val="19"/>
+                <w:szCs w:val="19"/>
+              </w:rPr>
+              <w:t xml:space="preserve">Ya</w:t>
+            </w:r>
+          </w:p>
+        </w:tc>
+      </w:tr>
+      <w:tr>
+        <w:tc>
+          <w:tcPr>
+            <w:tcW w:type="dxa" w:w="2290"/>
+            <w:tcMar>
+              <w:top w:type="dxa" w:w="80"/>
+              <w:left w:type="dxa" w:w="120"/>
+              <w:bottom w:type="dxa" w:w="80"/>
+              <w:right w:type="dxa" w:w="120"/>
+            </w:tcMar>
+          </w:tcPr>
+          <w:p>
+            <w:pPr>
+              <w:spacing w:after="0"/>
+            </w:pPr>
+            <w:r>
+              <w:rPr>
+                <w:b w:val="false"/>
+                <w:bCs w:val="false"/>
+                <w:sz w:val="19"/>
+                <w:szCs w:val="19"/>
+              </w:rPr>
               <w:t xml:space="preserve">Pimpinan</w:t>
             </w:r>
           </w:p>
@@ -2850,13 +3052,38 @@
                 <w:sz w:val="19"/>
                 <w:szCs w:val="19"/>
               </w:rPr>
+              <w:t xml:space="preserve">Ya</w:t>
+            </w:r>
+          </w:p>
+        </w:tc>
+        <w:tc>
+          <w:tcPr>
+            <w:tcW w:type="dxa" w:w="1145"/>
+            <w:tcMar>
+              <w:top w:type="dxa" w:w="80"/>
+              <w:left w:type="dxa" w:w="120"/>
+              <w:bottom w:type="dxa" w:w="80"/>
+              <w:right w:type="dxa" w:w="120"/>
+            </w:tcMar>
+          </w:tcPr>
+          <w:p>
+            <w:pPr>
+              <w:spacing w:after="0"/>
+            </w:pPr>
+            <w:r>
+              <w:rPr>
+                <w:b w:val="false"/>
+                <w:bCs w:val="false"/>
+                <w:sz w:val="19"/>
+                <w:szCs w:val="19"/>
+              </w:rPr>
               <w:t xml:space="preserve">–</w:t>
             </w:r>
           </w:p>
         </w:tc>
         <w:tc>
           <w:tcPr>
-            <w:tcW w:type="dxa" w:w="1145"/>
+            <w:tcW w:type="dxa" w:w="881"/>
             <w:tcMar>
               <w:top w:type="dxa" w:w="80"/>
               <w:left w:type="dxa" w:w="120"/>
@@ -2881,7 +3108,7 @@
         </w:tc>
         <w:tc>
           <w:tcPr>
-            <w:tcW w:type="dxa" w:w="881"/>
+            <w:tcW w:type="dxa" w:w="925"/>
             <w:tcMar>
               <w:top w:type="dxa" w:w="80"/>
               <w:left w:type="dxa" w:w="120"/>
@@ -2901,31 +3128,6 @@
                 <w:szCs w:val="19"/>
               </w:rPr>
               <w:t xml:space="preserve">–</w:t>
-            </w:r>
-          </w:p>
-        </w:tc>
-        <w:tc>
-          <w:tcPr>
-            <w:tcW w:type="dxa" w:w="925"/>
-            <w:tcMar>
-              <w:top w:type="dxa" w:w="80"/>
-              <w:left w:type="dxa" w:w="120"/>
-              <w:bottom w:type="dxa" w:w="80"/>
-              <w:right w:type="dxa" w:w="120"/>
-            </w:tcMar>
-          </w:tcPr>
-          <w:p>
-            <w:pPr>
-              <w:spacing w:after="0"/>
-            </w:pPr>
-            <w:r>
-              <w:rPr>
-                <w:b w:val="false"/>
-                <w:bCs w:val="false"/>
-                <w:sz w:val="19"/>
-                <w:szCs w:val="19"/>
-              </w:rPr>
-              <w:t xml:space="preserve">Ya</w:t>
             </w:r>
           </w:p>
         </w:tc>
@@ -7059,6 +7261,62 @@
     </w:p>
     <w:p>
       <w:pPr>
+        <w:pStyle w:val="Heading2"/>
+      </w:pPr>
+      <w:r>
+        <w:t xml:space="preserve">9.4 Peran dan hak akses — super administrator saja</w:t>
+      </w:r>
+    </w:p>
+    <w:p>
+      <w:pPr>
+        <w:pStyle w:val="ListParagraph"/>
+        <w:numPr>
+          <w:ilvl w:val="0"/>
+          <w:numId w:val="2"/>
+        </w:numPr>
+      </w:pPr>
+      <w:r>
+        <w:t xml:space="preserve">Administrasi Sistem → Peran &amp; Hak Akses memuat seluruh peran, bawaan maupun buatan, beserta matriks menu: tiap kemampuan berada pada kolom Lihat, Ubah, atau Hapus menunya. Centang yang diizinkan lalu simpan; perubahan berlaku seketika bagi semua pengguna berperan itu dan tercatat pada jejak audit.</w:t>
+      </w:r>
+    </w:p>
+    <w:p>
+      <w:pPr>
+        <w:pStyle w:val="ListParagraph"/>
+        <w:numPr>
+          <w:ilvl w:val="0"/>
+          <w:numId w:val="2"/>
+        </w:numPr>
+      </w:pPr>
+      <w:r>
+        <w:t xml:space="preserve">Tambah Peran membuat peran baru — kodenya dibuat otomatis dari nama, misalnya auditor_internal — yang langsung dapat dipilih pada formulir pengguna maupun kolom role saat impor. Peran baru mulai dengan hak mengajukan perjalanan dinas sendiri.</w:t>
+      </w:r>
+    </w:p>
+    <w:p>
+      <w:pPr>
+        <w:pStyle w:val="ListParagraph"/>
+        <w:numPr>
+          <w:ilvl w:val="0"/>
+          <w:numId w:val="2"/>
+        </w:numPr>
+      </w:pPr>
+      <w:r>
+        <w:t xml:space="preserve">Peran buatan dapat dihapus selama tidak ada pengguna yang memakainya; peran bawaan tidak dapat dihapus. Super Administrator selalu memegang seluruh akses dan tidak dapat dikurangi, supaya pengaturan ini tidak pernah terkunci dari dalam.</w:t>
+      </w:r>
+    </w:p>
+    <w:p>
+      <w:pPr>
+        <w:pStyle w:val="ListParagraph"/>
+        <w:numPr>
+          <w:ilvl w:val="0"/>
+          <w:numId w:val="2"/>
+        </w:numPr>
+      </w:pPr>
+      <w:r>
+        <w:t xml:space="preserve">Hak menghapus master data dan menghapus pengguna adalah kemampuan tersendiri pada kolom Hapus, sehingga sebuah peran dapat diberi hak menambah dan menyunting tanpa hak menghapus.</w:t>
+      </w:r>
+    </w:p>
+    <w:p>
+      <w:pPr>
         <w:pStyle w:val="Heading1"/>
       </w:pPr>
       <w:r>
@@ -10857,7 +11115,31 @@
         </w:numPr>
       </w:pPr>
       <w:r>
-        <w:t xml:space="preserve">Pegawai eksternal dan mahasiswa/outsourcing: modul perjalanan dinasnya dikembangkan terpisah. Sementara itu, setelah masuk mereka melihat halaman pemberitahuan "fitur masih dikembangkan" dengan tombol keluar; menu lain belum dapat dibuka.</w:t>
+        <w:t xml:space="preserve">Peran baru Mahasiswa, dapat dipilih saat membuat akun atau diimpor lewat kolom role bernilai "mahasiswa".</w:t>
+      </w:r>
+    </w:p>
+    <w:p>
+      <w:pPr>
+        <w:pStyle w:val="ListParagraph"/>
+        <w:numPr>
+          <w:ilvl w:val="0"/>
+          <w:numId w:val="2"/>
+        </w:numPr>
+      </w:pPr>
+      <w:r>
+        <w:t xml:space="preserve">Peran &amp; Hak Akses (submenu Administrasi Sistem, super administrator): menambah peran baru dan mengatur, per menu, kemampuan yang boleh dilihat, diubah, dan dihapus tiap peran — termasuk peran bawaan. Perubahan berlaku seketika dan tercatat pada jejak audit; Super Administrator selalu memegang seluruh akses. Hak menghapus master data dan menghapus pengguna kini kemampuan tersendiri.</w:t>
+      </w:r>
+    </w:p>
+    <w:p>
+      <w:pPr>
+        <w:pStyle w:val="ListParagraph"/>
+        <w:numPr>
+          <w:ilvl w:val="0"/>
+          <w:numId w:val="2"/>
+        </w:numPr>
+      </w:pPr>
+      <w:r>
+        <w:t xml:space="preserve">Pegawai eksternal, mahasiswa, dan outsourcing: modul perjalanan dinasnya dikembangkan terpisah. Sementara itu, setelah masuk mereka melihat halaman pemberitahuan "fitur masih dikembangkan" dengan tombol keluar; menu lain belum dapat dibuka.</w:t>
       </w:r>
     </w:p>
     <w:p>

</xml_diff>

<commit_message>
Peta kota perjalanan dinas pada menu Jadwal Perjalanan: dalam kota & sekitarnya dan luar kota
- Jadwal Perjalanan menjadi menu bersubmenu: Jadwal Keberangkatan, Peta
  Dalam Kota & Sekitarnya, Peta Luar Kota (Leaflet + OpenStreetMap).
- PemetaPerjalanan menyusun kota tujuan beserta jumlah perjalanan, pegawai
  yang berangkat, dan rincian per penanda; saringan tahun; draf dan yang
  ditolak tidak dipetakan. Dalam kota & sekitarnya = tujuan di Sulawesi
  Utara (master lokasi atau daftar kota bawaan); kota tak dikenal mengikuti
  kategori perjadin usulannya.
- KoordinatKota: koordinat bawaan ±120 kota Indonesia; kolom lintang/bujur
  pada Lokasi Tujuan untuk menimpa atau menambah kota.
- Panduan, riwayat 2.5.3, dan Buku Panduan diperbarui.

Co-Authored-By: Claude Opus 5 <noreply@anthropic.com>
</commit_message>
<xml_diff>
--- a/resources/panduan/Buku-Panduan-PANGI-v2.5.docx
+++ b/resources/panduan/Buku-Panduan-PANGI-v2.5.docx
@@ -7048,7 +7048,7 @@
                 <w:sz w:val="19"/>
                 <w:szCs w:val="19"/>
               </w:rPr>
-              <w:t xml:space="preserve">Rekapitulasi perjalanan per wilayah</w:t>
+              <w:t xml:space="preserve">Rekapitulasi perjalanan per wilayah; lintang-bujurnya menempatkan kota pada peta perjalanan dinas</w:t>
             </w:r>
           </w:p>
         </w:tc>
@@ -7376,7 +7376,7 @@
         </w:numPr>
       </w:pPr>
       <w:r>
-        <w:t xml:space="preserve">Jadwal Perjalanan — siapa berangkat kapan, tanpa nominal biaya.</w:t>
+        <w:t xml:space="preserve">Jadwal Perjalanan — siapa berangkat kapan, tanpa nominal biaya; beserta Peta Dalam Kota &amp; Sekitarnya (tujuan di Sulawesi Utara) dan Peta Luar Kota, yang memperlihatkan kota-kota tujuan pegawai dengan jumlah perjalanan dan orang yang berangkat, dapat disaring per tahun.</w:t>
       </w:r>
     </w:p>
     <w:p>
@@ -11104,6 +11104,18 @@
       </w:pPr>
       <w:r>
         <w:t xml:space="preserve">Berkas pertanggungjawaban: unggahan dan ceklist "Kuitansi" kini disebut "Kuitansi penyelenggara / hotel" agar jelas kuitansi mana yang dimaksud — dari penyelenggara kegiatan atau dari hotel tempat menginap.</w:t>
+      </w:r>
+    </w:p>
+    <w:p>
+      <w:pPr>
+        <w:pStyle w:val="ListParagraph"/>
+        <w:numPr>
+          <w:ilvl w:val="0"/>
+          <w:numId w:val="2"/>
+        </w:numPr>
+      </w:pPr>
+      <w:r>
+        <w:t xml:space="preserve">Jadwal Perjalanan kini bermenu: Jadwal Keberangkatan, Peta Dalam Kota &amp; Sekitarnya, dan Peta Luar Kota. Peta memperlihatkan kota-kota tujuan pegawai beserta jumlah perjalanan dan orang yang berangkat; klik penanda untuk rinciannya, saring per tahun. Dalam kota &amp; sekitarnya berarti tujuan di Sulawesi Utara. Kota-kota besar sudah dikenal sistem; kota lain diberi lintang-bujur pada Master Data → Lokasi Tujuan.</w:t>
       </w:r>
     </w:p>
     <w:p>

</xml_diff>

<commit_message>
Pratinjau dokumen pada pengaturan Dokumen Output
Elemen yang dicentang kini dapat dilihat langsung, bukan ditebak:

- Bingkai pratinjau di bawah formulir menampilkan dokumen contoh yang
  dirangkai di memori — tidak ada baris yang ditulis ke basis data dan
  tidak ada data perjalanan sungguhan yang ditampilkan.
- Tombol Lihat Pratinjau mengirimkan setelan yang masih di formulir,
  sehingga perubahan terlihat sebelum disimpan; tersedia pula buka di tab
  baru dan unduh contoh PDF.
- Jalur berkas gambar pada pratinjau diubah menjadi alamat web agar kop
  surat terbaca peramban; berkas cetak PDF tetap memakai jalur berkas.
- PengaturanDokumen menjadi singleton supaya setelan sementara pratinjau
  terbaca berkas cetak pada permintaan yang sama.

Co-Authored-By: Claude Opus 5 <noreply@anthropic.com>
</commit_message>
<xml_diff>
--- a/resources/panduan/Buku-Panduan-PANGI-v2.5.docx
+++ b/resources/panduan/Buku-Panduan-PANGI-v2.5.docx
@@ -7380,6 +7380,18 @@
         </w:numPr>
       </w:pPr>
       <w:r>
+        <w:t xml:space="preserve">Pratinjau di bawah formulir menampilkan dokumen contoh — bukan perjalanan dinas sungguhan — dan ikut berubah begitu centangan elemen diubah, sebelum pengaturannya disimpan. Tersedia pula tombol membuka pratinjau di tab baru dan mengunduh contoh PDF-nya.</w:t>
+      </w:r>
+    </w:p>
+    <w:p>
+      <w:pPr>
+        <w:pStyle w:val="ListParagraph"/>
+        <w:numPr>
+          <w:ilvl w:val="0"/>
+          <w:numId w:val="2"/>
+        </w:numPr>
+      </w:pPr>
+      <w:r>
         <w:t xml:space="preserve">Perubahan berlaku pada cetakan berikutnya, tercatat pada jejak audit, dan dapat dikembalikan ke bawaan dengan satu tombol. Penanda tanda tangan elektronik SRIKANDI beserta nomor naskah selalu tercetak dan tidak dapat dimatikan.</w:t>
       </w:r>
     </w:p>
@@ -11148,6 +11160,18 @@
       </w:pPr>
       <w:r>
         <w:t xml:space="preserve">Dokumen Output (submenu Administrasi Sistem): tampilan empat dokumen cetak diatur dari aplikasi — ukuran kertas dan huruf, elemen yang ikut tercetak, serta teks bakunya. Tiap perubahan tercatat pada jejak audit dan dapat dikembalikan ke bawaan.</w:t>
+      </w:r>
+    </w:p>
+    <w:p>
+      <w:pPr>
+        <w:pStyle w:val="ListParagraph"/>
+        <w:numPr>
+          <w:ilvl w:val="0"/>
+          <w:numId w:val="2"/>
+        </w:numPr>
+      </w:pPr>
+      <w:r>
+        <w:t xml:space="preserve">Dokumen Output memuat pratinjau dokumen contoh yang ikut berubah mengikuti centangan elemen, lengkap dengan tombol buka di tab baru dan unduh contoh PDF.</w:t>
       </w:r>
     </w:p>
     <w:p>

</xml_diff>

<commit_message>
Supervisi luar kota tetap memakai SPD (2.5.7)
Kebutuhan SPD pada jalur supervisi kerja praktek / magang ditentukan
kategorinya, bukan jalurnya: Supervisi Luar Kota menerbitkan SPD seperti
perjalanan biasa, sedangkan Supervisi Dalam Kota cukup surat tugas.

Formulir usulan memunculkan isian SPD beserta kewajibannya begitu kategori
luar kota dipilih, dan menyembunyikannya kembali bila diganti ke dalam
kota. Checklist, penagihan, dan formulir Dokumen Perdin ikut menyesuaikan:
SPPD bertanda tangan gugur sendiri pada perjalanan yang memang tidak
menerbitkan SPD, sekalipun jalurnya tetap mencentangnya.

Co-Authored-By: Claude Opus 5 <noreply@anthropic.com>
</commit_message>
<xml_diff>
--- a/resources/panduan/Buku-Panduan-PANGI-v2.5.docx
+++ b/resources/panduan/Buku-Panduan-PANGI-v2.5.docx
@@ -188,7 +188,7 @@
                 <w:sz w:val="19"/>
                 <w:szCs w:val="19"/>
               </w:rPr>
-              <w:t xml:space="preserve">2.5.6</w:t>
+              <w:t xml:space="preserve">2.5.7</w:t>
             </w:r>
           </w:p>
         </w:tc>
@@ -4568,7 +4568,7 @@
         <w:rPr>
           <w:color w:val="55616F"/>
         </w:rPr>
-        <w:t xml:space="preserve">  Pertanyaan pertama adalah jalurnya: Perjalanan Dalam Kota, Perjalanan Luar Kota, atau Supervisi Kerja Praktek / Magang. Pilihan itu menyaring kategori perjalanan dinas pada formulir dan menentukan berkas yang diminta. Jalur supervisi tidak memakai SPD — cukup surat tugas beserta nomornya, dan jenis kegiatannya terisi sendiri. Formulir menyimpan sendiri isian Anda di peramban.</w:t>
+        <w:t xml:space="preserve">  Pertanyaan pertama adalah jalurnya: Perjalanan Dalam Kota, Perjalanan Luar Kota, atau Supervisi Kerja Praktek / Magang. Pilihan itu menyaring kategori perjalanan dinas pada formulir dan menentukan berkas yang diminta. Pada jalur supervisi, kebutuhan SPD mengikuti kategorinya: Supervisi Luar Kota tetap memakai SPD bertanda tangan beserta nomornya, sedangkan Supervisi Dalam Kota cukup surat tugas. Jenis kegiatannya terisi sendiri, dan formulir menyimpan sendiri isian Anda di peramban.</w:t>
       </w:r>
     </w:p>
     <w:p>
@@ -4612,7 +4612,7 @@
         <w:rPr>
           <w:color w:val="55616F"/>
         </w:rPr>
-        <w:t xml:space="preserve">  Keduanya wajib sebelum usulan dikirim. Tanda tangan PPK pada SPD itulah persetujuannya — tidak ada tombol setuju lagi di aplikasi; persetujuan PPK tercatat sendiri pada jejak audit saat usulan terkirim.</w:t>
+        <w:t xml:space="preserve">  Keduanya wajib sebelum usulan dikirim — kecuali pada supervisi di dalam kota, yang memang tidak menerbitkan SPD sehingga isiannya tidak ditampilkan. Tanda tangan PPK pada SPD itulah persetujuannya: tidak ada tombol setuju lagi di aplikasi, dan persetujuan PPK tercatat sendiri pada jejak audit saat usulan terkirim.</w:t>
       </w:r>
     </w:p>
     <w:p>
@@ -7448,6 +7448,18 @@
         </w:numPr>
       </w:pPr>
       <w:r>
+        <w:t xml:space="preserve">SPPD bertanda tangan gugur sendiri pada perjalanan yang memang tidak menerbitkan SPD — supervisi di dalam kota, misalnya — sekalipun jalurnya tetap mencentangnya.</w:t>
+      </w:r>
+    </w:p>
+    <w:p>
+      <w:pPr>
+        <w:pStyle w:val="ListParagraph"/>
+        <w:numPr>
+          <w:ilvl w:val="0"/>
+          <w:numId w:val="2"/>
+        </w:numPr>
+      </w:pPr>
+      <w:r>
         <w:t xml:space="preserve">Perubahan berlaku pada cetakan berikutnya, tercatat pada jejak audit, dan dapat dikembalikan ke bawaan dengan satu tombol. Penanda tanda tangan elektronik SRIKANDI beserta nomor naskah selalu tercetak dan tidak dapat dimatikan.</w:t>
       </w:r>
     </w:p>
@@ -11203,7 +11215,7 @@
         <w:pStyle w:val="Heading2"/>
       </w:pPr>
       <w:r>
-        <w:t xml:space="preserve">Versi 2.5.6 — 1 Oktober 2026</w:t>
+        <w:t xml:space="preserve">Versi 2.5.7 — 1 Oktober 2026</w:t>
       </w:r>
     </w:p>
     <w:p>
@@ -11215,15 +11227,7 @@
         </w:numPr>
       </w:pPr>
       <w:r>
-        <w:t xml:space="preserve">Berkas Pertanggungjawaban (submenu Administrasi Sistem): berkas yang ditagih sesudah perjalanan dipilih sendiri untuk tiap jalur pengajuan, dan berlaku serentak pada formulir dokumen, checklist, serta penagihan.</w:t>
-      </w:r>
-    </w:p>
-    <w:p>
-      <w:pPr>
-        <w:pStyle w:val="Heading2"/>
-      </w:pPr>
-      <w:r>
-        <w:t xml:space="preserve">Versi 2.5.5 — 1 Oktober 2026</w:t>
+        <w:t xml:space="preserve">Supervisi kerja praktek / magang dibedakan menurut tujuannya: supervisi ke luar kota tetap menerbitkan SPD — berkas SPD bertanda tangan beserta nomornya wajib dilampirkan — sedangkan supervisi di dalam kota cukup surat tugas.</w:t>
       </w:r>
     </w:p>
     <w:p>
@@ -11235,7 +11239,15 @@
         </w:numPr>
       </w:pPr>
       <w:r>
-        <w:t xml:space="preserve">Pengajuan perjadin dimulai dengan memilih jalur: dalam kota, luar kota, atau supervisi kerja praktek / magang. Jalur itu menyaring kategori perjalanan dinas dari Master Data.</w:t>
+        <w:t xml:space="preserve">Isian SPD pada formulir usulan muncul dan menghilang sendiri mengikuti kategori yang dipilih; checklist kelengkapan dan formulir Dokumen Perdin ikut menyesuaikan.</w:t>
+      </w:r>
+    </w:p>
+    <w:p>
+      <w:pPr>
+        <w:pStyle w:val="Heading2"/>
+      </w:pPr>
+      <w:r>
+        <w:t xml:space="preserve">Versi 2.5.6 — 1 Oktober 2026</w:t>
       </w:r>
     </w:p>
     <w:p>
@@ -11247,7 +11259,15 @@
         </w:numPr>
       </w:pPr>
       <w:r>
-        <w:t xml:space="preserve">Jalur supervisi kerja praktek / magang tidak memakai Surat Perjalanan Dinas: cukup surat tugas beserta nomornya, dan jenis kegiatannya terisi sendiri.</w:t>
+        <w:t xml:space="preserve">Berkas Pertanggungjawaban (submenu Administrasi Sistem): berkas yang ditagih sesudah perjalanan dipilih sendiri untuk tiap jalur pengajuan, dan berlaku serentak pada formulir dokumen, checklist, serta penagihan.</w:t>
+      </w:r>
+    </w:p>
+    <w:p>
+      <w:pPr>
+        <w:pStyle w:val="Heading2"/>
+      </w:pPr>
+      <w:r>
+        <w:t xml:space="preserve">Versi 2.5.5 — 1 Oktober 2026</w:t>
       </w:r>
     </w:p>
     <w:p>
@@ -11259,7 +11279,7 @@
         </w:numPr>
       </w:pPr>
       <w:r>
-        <w:t xml:space="preserve">Kaki halaman SPD mengikuti cetakan terbaru — lambang Garuda Sertifikasi dilepas, alamat verifikasi menjadi tte.komdigi.go.id — dan butir V tidak lagi memuat penanda QR.</w:t>
+        <w:t xml:space="preserve">Pengajuan perjadin dimulai dengan memilih jalur: dalam kota, luar kota, atau supervisi kerja praktek / magang. Jalur itu menyaring kategori perjalanan dinas dari Master Data.</w:t>
       </w:r>
     </w:p>
     <w:p>
@@ -11271,15 +11291,7 @@
         </w:numPr>
       </w:pPr>
       <w:r>
-        <w:t xml:space="preserve">Daftar Usulan Perjadin menyebut pelaksana perjalanan pada kolom pertama, menggantikan kolom Pemohon yang selalu kosong.</w:t>
-      </w:r>
-    </w:p>
-    <w:p>
-      <w:pPr>
-        <w:pStyle w:val="Heading2"/>
-      </w:pPr>
-      <w:r>
-        <w:t xml:space="preserve">Versi 2.5.4 — 30 September 2026</w:t>
+        <w:t xml:space="preserve">Jalur supervisi kerja praktek / magang tidak memakai Surat Perjalanan Dinas: cukup surat tugas beserta nomornya, dan jenis kegiatannya terisi sendiri.</w:t>
       </w:r>
     </w:p>
     <w:p>
@@ -11291,7 +11303,7 @@
         </w:numPr>
       </w:pPr>
       <w:r>
-        <w:t xml:space="preserve">Dokumen Output (submenu Administrasi Sistem): tampilan empat dokumen cetak diatur dari aplikasi — ukuran kertas dan huruf, elemen yang ikut tercetak, serta teks bakunya. Tiap perubahan tercatat pada jejak audit dan dapat dikembalikan ke bawaan.</w:t>
+        <w:t xml:space="preserve">Kaki halaman SPD mengikuti cetakan terbaru — lambang Garuda Sertifikasi dilepas, alamat verifikasi menjadi tte.komdigi.go.id — dan butir V tidak lagi memuat penanda QR.</w:t>
       </w:r>
     </w:p>
     <w:p>
@@ -11303,7 +11315,15 @@
         </w:numPr>
       </w:pPr>
       <w:r>
-        <w:t xml:space="preserve">Dokumen Output memuat pratinjau dokumen contoh yang ikut berubah mengikuti centangan elemen, lengkap dengan tombol buka di tab baru dan unduh contoh PDF.</w:t>
+        <w:t xml:space="preserve">Daftar Usulan Perjadin menyebut pelaksana perjalanan pada kolom pertama, menggantikan kolom Pemohon yang selalu kosong.</w:t>
+      </w:r>
+    </w:p>
+    <w:p>
+      <w:pPr>
+        <w:pStyle w:val="Heading2"/>
+      </w:pPr>
+      <w:r>
+        <w:t xml:space="preserve">Versi 2.5.4 — 30 September 2026</w:t>
       </w:r>
     </w:p>
     <w:p>
@@ -11315,15 +11335,7 @@
         </w:numPr>
       </w:pPr>
       <w:r>
-        <w:t xml:space="preserve">Penanda tanda tangan elektronik SRIKANDI dan nomor naskah sengaja tidak dapat dimatikan, supaya surat tetap dapat ditandatangani secara elektronik.</w:t>
-      </w:r>
-    </w:p>
-    <w:p>
-      <w:pPr>
-        <w:pStyle w:val="Heading2"/>
-      </w:pPr>
-      <w:r>
-        <w:t xml:space="preserve">Versi 2.5.3 — 21 September 2026</w:t>
+        <w:t xml:space="preserve">Dokumen Output (submenu Administrasi Sistem): tampilan empat dokumen cetak diatur dari aplikasi — ukuran kertas dan huruf, elemen yang ikut tercetak, serta teks bakunya. Tiap perubahan tercatat pada jejak audit dan dapat dikembalikan ke bawaan.</w:t>
       </w:r>
     </w:p>
     <w:p>
@@ -11335,7 +11347,7 @@
         </w:numPr>
       </w:pPr>
       <w:r>
-        <w:t xml:space="preserve">Formulir SPD: surat tugas dilampirkan sejak SPD dibuat — nomor dan berkasnya diisi pada kartu Surat Tugas (tidak wajib). Usulan perjadin yang memilih SPD itu mengambil keduanya secara otomatis; berkas surat tugas tidak diunggah lagi dan nomornya tidak disalin ulang.</w:t>
+        <w:t xml:space="preserve">Dokumen Output memuat pratinjau dokumen contoh yang ikut berubah mengikuti centangan elemen, lengkap dengan tombol buka di tab baru dan unduh contoh PDF.</w:t>
       </w:r>
     </w:p>
     <w:p>
@@ -11347,7 +11359,15 @@
         </w:numPr>
       </w:pPr>
       <w:r>
-        <w:t xml:space="preserve">Formulir SPD: kolom Akun pembebanan dihapus — akun diisi PPK saat verifikasi dan tanda tangan, bukan oleh pembuat SPD.</w:t>
+        <w:t xml:space="preserve">Penanda tanda tangan elektronik SRIKANDI dan nomor naskah sengaja tidak dapat dimatikan, supaya surat tetap dapat ditandatangani secara elektronik.</w:t>
+      </w:r>
+    </w:p>
+    <w:p>
+      <w:pPr>
+        <w:pStyle w:val="Heading2"/>
+      </w:pPr>
+      <w:r>
+        <w:t xml:space="preserve">Versi 2.5.3 — 21 September 2026</w:t>
       </w:r>
     </w:p>
     <w:p>
@@ -11359,7 +11379,7 @@
         </w:numPr>
       </w:pPr>
       <w:r>
-        <w:t xml:space="preserve">Berkas pertanggungjawaban: unggahan dan ceklist "Kuitansi" kini disebut "Kuitansi penyelenggara / hotel" agar jelas kuitansi mana yang dimaksud — dari penyelenggara kegiatan atau dari hotel tempat menginap.</w:t>
+        <w:t xml:space="preserve">Formulir SPD: surat tugas dilampirkan sejak SPD dibuat — nomor dan berkasnya diisi pada kartu Surat Tugas (tidak wajib). Usulan perjadin yang memilih SPD itu mengambil keduanya secara otomatis; berkas surat tugas tidak diunggah lagi dan nomornya tidak disalin ulang.</w:t>
       </w:r>
     </w:p>
     <w:p>
@@ -11371,7 +11391,7 @@
         </w:numPr>
       </w:pPr>
       <w:r>
-        <w:t xml:space="preserve">Jadwal Perjalanan kini bermenu: Jadwal Keberangkatan, Peta Dalam Kota &amp; Sekitarnya, dan Peta Luar Kota. Peta memperlihatkan kota-kota tujuan pegawai beserta jumlah perjalanan dan orang yang berangkat; klik penanda untuk rinciannya, saring per tahun. Dalam kota &amp; sekitarnya berarti tujuan di Sulawesi Utara. Kota-kota besar sudah dikenal sistem; kota lain diberi lintang-bujur pada Master Data → Lokasi Tujuan.</w:t>
+        <w:t xml:space="preserve">Formulir SPD: kolom Akun pembebanan dihapus — akun diisi PPK saat verifikasi dan tanda tangan, bukan oleh pembuat SPD.</w:t>
       </w:r>
     </w:p>
     <w:p>
@@ -11383,7 +11403,7 @@
         </w:numPr>
       </w:pPr>
       <w:r>
-        <w:t xml:space="preserve">Peran baru Mahasiswa, dapat dipilih saat membuat akun atau diimpor lewat kolom role bernilai "mahasiswa".</w:t>
+        <w:t xml:space="preserve">Berkas pertanggungjawaban: unggahan dan ceklist "Kuitansi" kini disebut "Kuitansi penyelenggara / hotel" agar jelas kuitansi mana yang dimaksud — dari penyelenggara kegiatan atau dari hotel tempat menginap.</w:t>
       </w:r>
     </w:p>
     <w:p>
@@ -11395,7 +11415,7 @@
         </w:numPr>
       </w:pPr>
       <w:r>
-        <w:t xml:space="preserve">Peran &amp; Hak Akses (submenu Administrasi Sistem, super administrator): menambah peran baru dan mengatur, per menu, kemampuan yang boleh dilihat, diubah, dan dihapus tiap peran — termasuk peran bawaan. Perubahan berlaku seketika dan tercatat pada jejak audit; Super Administrator selalu memegang seluruh akses. Hak menghapus master data dan menghapus pengguna kini kemampuan tersendiri.</w:t>
+        <w:t xml:space="preserve">Jadwal Perjalanan kini bermenu: Jadwal Keberangkatan, Peta Dalam Kota &amp; Sekitarnya, dan Peta Luar Kota. Peta memperlihatkan kota-kota tujuan pegawai beserta jumlah perjalanan dan orang yang berangkat; klik penanda untuk rinciannya, saring per tahun. Dalam kota &amp; sekitarnya berarti tujuan di Sulawesi Utara. Kota-kota besar sudah dikenal sistem; kota lain diberi lintang-bujur pada Master Data → Lokasi Tujuan.</w:t>
       </w:r>
     </w:p>
     <w:p>
@@ -11407,15 +11427,7 @@
         </w:numPr>
       </w:pPr>
       <w:r>
-        <w:t xml:space="preserve">Pegawai eksternal, mahasiswa, dan outsourcing: modul perjalanan dinasnya dikembangkan terpisah. Sementara itu, setelah masuk mereka melihat halaman pemberitahuan "fitur masih dikembangkan" dengan tombol keluar; menu lain belum dapat dibuka.</w:t>
-      </w:r>
-    </w:p>
-    <w:p>
-      <w:pPr>
-        <w:pStyle w:val="Heading2"/>
-      </w:pPr>
-      <w:r>
-        <w:t xml:space="preserve">Versi 2.5.2 — 15 September 2026</w:t>
+        <w:t xml:space="preserve">Peran baru Mahasiswa, dapat dipilih saat membuat akun atau diimpor lewat kolom role bernilai "mahasiswa".</w:t>
       </w:r>
     </w:p>
     <w:p>
@@ -11427,7 +11439,7 @@
         </w:numPr>
       </w:pPr>
       <w:r>
-        <w:t xml:space="preserve">Impor pengguna: sel yang kosong pada berkas CSV tidak lagi menghapus surel, nomor HP, dan rekening yang sudah diisi pengguna, sehingga data pegawai aman diimpor ulang untuk menambah orang. Wakil Direktur II ditambahkan ke data pegawai bawaan.</w:t>
+        <w:t xml:space="preserve">Peran &amp; Hak Akses (submenu Administrasi Sistem, super administrator): menambah peran baru dan mengatur, per menu, kemampuan yang boleh dilihat, diubah, dan dihapus tiap peran — termasuk peran bawaan. Perubahan berlaku seketika dan tercatat pada jejak audit; Super Administrator selalu memegang seluruh akses. Hak menghapus master data dan menghapus pengguna kini kemampuan tersendiri.</w:t>
       </w:r>
     </w:p>
     <w:p>
@@ -11439,7 +11451,15 @@
         </w:numPr>
       </w:pPr>
       <w:r>
-        <w:t xml:space="preserve">Integrasi Data (submenu Administrasi Sistem): token API dashboard eksekutif dibuat, diganti, atau dicabut langsung dari aplikasi tanpa menyunting .env di server, lengkap dengan alamat dan jalur API-nya; token yang berlaku dapat ditampilkan dan disalin.</w:t>
+        <w:t xml:space="preserve">Pegawai eksternal, mahasiswa, dan outsourcing: modul perjalanan dinasnya dikembangkan terpisah. Sementara itu, setelah masuk mereka melihat halaman pemberitahuan "fitur masih dikembangkan" dengan tombol keluar; menu lain belum dapat dibuka.</w:t>
+      </w:r>
+    </w:p>
+    <w:p>
+      <w:pPr>
+        <w:pStyle w:val="Heading2"/>
+      </w:pPr>
+      <w:r>
+        <w:t xml:space="preserve">Versi 2.5.2 — 15 September 2026</w:t>
       </w:r>
     </w:p>
     <w:p>
@@ -11451,7 +11471,7 @@
         </w:numPr>
       </w:pPr>
       <w:r>
-        <w:t xml:space="preserve">Integrasi Data: pemantauan setiap permintaan API yang masuk (alamat IP, jalur, token yang dibawa — hanya ujung-ujungnya — diterima atau ditolak) dan pengiriman data dashboard eksekutif terjadwal (tiap jam, harian, atau mingguan) ke aplikasi tujuan memakai token, lengkap dengan riwayat pengirimannya dan tombol Kirim Sekarang.</w:t>
+        <w:t xml:space="preserve">Impor pengguna: sel yang kosong pada berkas CSV tidak lagi menghapus surel, nomor HP, dan rekening yang sudah diisi pengguna, sehingga data pegawai aman diimpor ulang untuk menambah orang. Wakil Direktur II ditambahkan ke data pegawai bawaan.</w:t>
       </w:r>
     </w:p>
     <w:p>
@@ -11463,7 +11483,7 @@
         </w:numPr>
       </w:pPr>
       <w:r>
-        <w:t xml:space="preserve">Pengaturan Sistem: kunci API Anthropic untuk Wawasan AI dan agen tanya-jawab Dashboard Eksekutif dipasang, diganti, atau dihapus dari aplikasi — tersimpan terenkripsi, tanpa menyunting .env di server.</w:t>
+        <w:t xml:space="preserve">Integrasi Data (submenu Administrasi Sistem): token API dashboard eksekutif dibuat, diganti, atau dicabut langsung dari aplikasi tanpa menyunting .env di server, lengkap dengan alamat dan jalur API-nya; token yang berlaku dapat ditampilkan dan disalin.</w:t>
       </w:r>
     </w:p>
     <w:p>
@@ -11475,7 +11495,7 @@
         </w:numPr>
       </w:pPr>
       <w:r>
-        <w:t xml:space="preserve">Membuka atau mengunci tanggal dikeluarkan SPD serta mengelola token API dan kunci AI kini melalui kotak konfirmasi.</w:t>
+        <w:t xml:space="preserve">Integrasi Data: pemantauan setiap permintaan API yang masuk (alamat IP, jalur, token yang dibawa — hanya ujung-ujungnya — diterima atau ditolak) dan pengiriman data dashboard eksekutif terjadwal (tiap jam, harian, atau mingguan) ke aplikasi tujuan memakai token, lengkap dengan riwayat pengirimannya dan tombol Kirim Sekarang.</w:t>
       </w:r>
     </w:p>
     <w:p>
@@ -11487,7 +11507,7 @@
         </w:numPr>
       </w:pPr>
       <w:r>
-        <w:t xml:space="preserve">Nomor SPD pada usulan bersifat unik: nomor yang sudah dipakai usulan lain — milik siapa pun — ditolak saat mengajukan maupun menyunting, dengan pesan yang menyebut usulan mana yang memakainya, sehingga tidak ada usulan ganda atas SPD yang sama.</w:t>
+        <w:t xml:space="preserve">Pengaturan Sistem: kunci API Anthropic untuk Wawasan AI dan agen tanya-jawab Dashboard Eksekutif dipasang, diganti, atau dihapus dari aplikasi — tersimpan terenkripsi, tanpa menyunting .env di server.</w:t>
       </w:r>
     </w:p>
     <w:p>
@@ -11499,7 +11519,7 @@
         </w:numPr>
       </w:pPr>
       <w:r>
-        <w:t xml:space="preserve">Usulan perjadin tidak lagi mensyaratkan SPD dibuat lewat aplikasi lebih dulu: formulir usulan terbuka bagi semua, memilih SPD dari aplikasi hanya untuk mengisi otomatis. SPD bertanda tangan beserta nomornya tetap wajib diunggah sebagai dasar persetujuan PPK.</w:t>
+        <w:t xml:space="preserve">Membuka atau mengunci tanggal dikeluarkan SPD serta mengelola token API dan kunci AI kini melalui kotak konfirmasi.</w:t>
       </w:r>
     </w:p>
     <w:p>
@@ -11511,15 +11531,7 @@
         </w:numPr>
       </w:pPr>
       <w:r>
-        <w:t xml:space="preserve">Rincian Saya: tiap berkas memuat panel Pemantauan Berkas — status seluruh tanda tangan (tim keuangan, pelaksana, PPK, konfirmasi Direktur, daftar nominatif) dan status pembayaran (uang muka, pelunasan, transport lokal) beserta tanggal dan kodenya.</w:t>
-      </w:r>
-    </w:p>
-    <w:p>
-      <w:pPr>
-        <w:pStyle w:val="Heading2"/>
-      </w:pPr>
-      <w:r>
-        <w:t xml:space="preserve">Versi 2.5.1 — 15 September 2026</w:t>
+        <w:t xml:space="preserve">Nomor SPD pada usulan bersifat unik: nomor yang sudah dipakai usulan lain — milik siapa pun — ditolak saat mengajukan maupun menyunting, dengan pesan yang menyebut usulan mana yang memakainya, sehingga tidak ada usulan ganda atas SPD yang sama.</w:t>
       </w:r>
     </w:p>
     <w:p>
@@ -11531,7 +11543,7 @@
         </w:numPr>
       </w:pPr>
       <w:r>
-        <w:t xml:space="preserve">Administrasi Sistem: super administrator dapat membuka atau mengunci tanggal dikeluarkan SPD bagi seluruh peran untuk kasus tanggal mundur (backdate); bawaannya terkunci, tiap perubahan tercatat pada jejak audit.</w:t>
+        <w:t xml:space="preserve">Usulan perjadin tidak lagi mensyaratkan SPD dibuat lewat aplikasi lebih dulu: formulir usulan terbuka bagi semua, memilih SPD dari aplikasi hanya untuk mengisi otomatis. SPD bertanda tangan beserta nomornya tetap wajib diunggah sebagai dasar persetujuan PPK.</w:t>
       </w:r>
     </w:p>
     <w:p>
@@ -11543,7 +11555,7 @@
         </w:numPr>
       </w:pPr>
       <w:r>
-        <w:t xml:space="preserve">Administrasi Sistem dipecah menjadi tiga halaman bermenu — Pengguna, Impor &amp; Ekspor, Pengaturan Sistem — dengan submenu di sidebar dan navigasi di kepala halaman.</w:t>
+        <w:t xml:space="preserve">Rincian Saya: tiap berkas memuat panel Pemantauan Berkas — status seluruh tanda tangan (tim keuangan, pelaksana, PPK, konfirmasi Direktur, daftar nominatif) dan status pembayaran (uang muka, pelunasan, transport lokal) beserta tanggal dan kodenya.</w:t>
       </w:r>
     </w:p>
     <w:p>
@@ -11551,7 +11563,7 @@
         <w:pStyle w:val="Heading2"/>
       </w:pPr>
       <w:r>
-        <w:t xml:space="preserve">Versi 2.5 — 12 September 2026</w:t>
+        <w:t xml:space="preserve">Versi 2.5.1 — 15 September 2026</w:t>
       </w:r>
     </w:p>
     <w:p>
@@ -11563,7 +11575,7 @@
         </w:numPr>
       </w:pPr>
       <w:r>
-        <w:t xml:space="preserve">Usulan wajib melampirkan SPD bertanda tangan beserta nomornya; persetujuan PPK tercatat otomatis. Pengajuan berkelompok dan tombol Salin dihapus.</w:t>
+        <w:t xml:space="preserve">Administrasi Sistem: super administrator dapat membuka atau mengunci tanggal dikeluarkan SPD bagi seluruh peran untuk kasus tanggal mundur (backdate); bawaannya terkunci, tiap perubahan tercatat pada jejak audit.</w:t>
       </w:r>
     </w:p>
     <w:p>
@@ -11575,7 +11587,15 @@
         </w:numPr>
       </w:pPr>
       <w:r>
-        <w:t xml:space="preserve">Menu Laporan Perjadin bagi pimpinan: daftar laporan, status konfirmasi, tindak lanjut. Laporan dikirim ke pimpinan saat disimpan dan dikonfirmasi Direktur lewat QR; tempat kegiatan per hari.</w:t>
+        <w:t xml:space="preserve">Administrasi Sistem dipecah menjadi tiga halaman bermenu — Pengguna, Impor &amp; Ekspor, Pengaturan Sistem — dengan submenu di sidebar dan navigasi di kepala halaman.</w:t>
+      </w:r>
+    </w:p>
+    <w:p>
+      <w:pPr>
+        <w:pStyle w:val="Heading2"/>
+      </w:pPr>
+      <w:r>
+        <w:t xml:space="preserve">Versi 2.5 — 12 September 2026</w:t>
       </w:r>
     </w:p>
     <w:p>
@@ -11587,7 +11607,7 @@
         </w:numPr>
       </w:pPr>
       <w:r>
-        <w:t xml:space="preserve">Pelunasan hanya menunggu konfirmasi laporan oleh Direktur — bukan tanda tangan PPK maupun daftar nominatif.</w:t>
+        <w:t xml:space="preserve">Usulan wajib melampirkan SPD bertanda tangan beserta nomornya; persetujuan PPK tercatat otomatis. Pengajuan berkelompok dan tombol Salin dihapus.</w:t>
       </w:r>
     </w:p>
     <w:p>
@@ -11599,7 +11619,7 @@
         </w:numPr>
       </w:pPr>
       <w:r>
-        <w:t xml:space="preserve">Daftar nominatif terbit per surat tugas begitu satu pelaksana tuntas; yang belum tercantum disebut dan bertambah sendiri. List Daftar Nominatif memuat seluruh daftar beserta status tanda tangan tiap pelaksana.</w:t>
+        <w:t xml:space="preserve">Menu Laporan Perjadin bagi pimpinan: daftar laporan, status konfirmasi, tindak lanjut. Laporan dikirim ke pimpinan saat disimpan dan dikonfirmasi Direktur lewat QR; tempat kegiatan per hari.</w:t>
       </w:r>
     </w:p>
     <w:p>
@@ -11611,7 +11631,7 @@
         </w:numPr>
       </w:pPr>
       <w:r>
-        <w:t xml:space="preserve">Berkas terkirim otomatis ke pelaksana setelah seluruh validasi rampung; status Sudah Dicek Tim Keuangan; tombol tanda tangan pelaksana tetap ada setelah masa sanggah; popup konfirmasi pada validasi dan pencabutannya.</w:t>
+        <w:t xml:space="preserve">Pelunasan hanya menunggu konfirmasi laporan oleh Direktur — bukan tanda tangan PPK maupun daftar nominatif.</w:t>
       </w:r>
     </w:p>
     <w:p>
@@ -11623,7 +11643,7 @@
         </w:numPr>
       </w:pPr>
       <w:r>
-        <w:t xml:space="preserve">Biaya penyelenggaraan: ditanya ada atau tidak; bila ada, nominal, bukti bayar, dan nomor invoice; tercetak di bawah uang penginapan.</w:t>
+        <w:t xml:space="preserve">Daftar nominatif terbit per surat tugas begitu satu pelaksana tuntas; yang belum tercantum disebut dan bertambah sendiri. List Daftar Nominatif memuat seluruh daftar beserta status tanda tangan tiap pelaksana.</w:t>
       </w:r>
     </w:p>
     <w:p>
@@ -11635,7 +11655,7 @@
         </w:numPr>
       </w:pPr>
       <w:r>
-        <w:t xml:space="preserve">Tiket membawa invoice; nota transport lokal hanya untuk ruas bernominal (transport lokal boleh tidak ada); dalam kota satu baris transport lokal; checklist kelengkapan mengikuti formulir.</w:t>
+        <w:t xml:space="preserve">Berkas terkirim otomatis ke pelaksana setelah seluruh validasi rampung; status Sudah Dicek Tim Keuangan; tombol tanda tangan pelaksana tetap ada setelah masa sanggah; popup konfirmasi pada validasi dan pencabutannya.</w:t>
       </w:r>
     </w:p>
     <w:p>
@@ -11647,7 +11667,7 @@
         </w:numPr>
       </w:pPr>
       <w:r>
-        <w:t xml:space="preserve">Verifikasi PPK (rincian, daftar riil, nominatif) dan Arsip Rincian Lengkap dikelompokkan per bulan dan tahun; arsip tidak lagi menunggu nominatif; menu Keuangan bagi PPK dalam mode lihat saja.</w:t>
+        <w:t xml:space="preserve">Biaya penyelenggaraan: ditanya ada atau tidak; bila ada, nominal, bukti bayar, dan nomor invoice; tercetak di bawah uang penginapan.</w:t>
       </w:r>
     </w:p>
     <w:p>
@@ -11659,7 +11679,7 @@
         </w:numPr>
       </w:pPr>
       <w:r>
-        <w:t xml:space="preserve">Pembatalan penggantian transport lokal dengan alasan; nominatif memuat QR dan kode verifikasi PPK.</w:t>
+        <w:t xml:space="preserve">Tiket membawa invoice; nota transport lokal hanya untuk ruas bernominal (transport lokal boleh tidak ada); dalam kota satu baris transport lokal; checklist kelengkapan mengikuti formulir.</w:t>
       </w:r>
     </w:p>
     <w:p>
@@ -11671,7 +11691,7 @@
         </w:numPr>
       </w:pPr>
       <w:r>
-        <w:t xml:space="preserve">Seluruh dokumen cetak berukuran folio dan dirapikan: usulan sebagai dokumen resmi berkop, rincian satu halaman, tanggal berbahasa Indonesia, WITA.</w:t>
+        <w:t xml:space="preserve">Verifikasi PPK (rincian, daftar riil, nominatif) dan Arsip Rincian Lengkap dikelompokkan per bulan dan tahun; arsip tidak lagi menunggu nominatif; menu Keuangan bagi PPK dalam mode lihat saja.</w:t>
       </w:r>
     </w:p>
     <w:p>
@@ -11683,15 +11703,7 @@
         </w:numPr>
       </w:pPr>
       <w:r>
-        <w:t xml:space="preserve">Pelacakan berkas: sepuluh tonggak dengan lama hari antar tahap; versi aplikasi tertera di halaman masuk.</w:t>
-      </w:r>
-    </w:p>
-    <w:p>
-      <w:pPr>
-        <w:pStyle w:val="Heading2"/>
-      </w:pPr>
-      <w:r>
-        <w:t xml:space="preserve">Versi 2.4 — 5 September 2026</w:t>
+        <w:t xml:space="preserve">Pembatalan penggantian transport lokal dengan alasan; nominatif memuat QR dan kode verifikasi PPK.</w:t>
       </w:r>
     </w:p>
     <w:p>
@@ -11703,6 +11715,38 @@
         </w:numPr>
       </w:pPr>
       <w:r>
+        <w:t xml:space="preserve">Seluruh dokumen cetak berukuran folio dan dirapikan: usulan sebagai dokumen resmi berkop, rincian satu halaman, tanggal berbahasa Indonesia, WITA.</w:t>
+      </w:r>
+    </w:p>
+    <w:p>
+      <w:pPr>
+        <w:pStyle w:val="ListParagraph"/>
+        <w:numPr>
+          <w:ilvl w:val="0"/>
+          <w:numId w:val="2"/>
+        </w:numPr>
+      </w:pPr>
+      <w:r>
+        <w:t xml:space="preserve">Pelacakan berkas: sepuluh tonggak dengan lama hari antar tahap; versi aplikasi tertera di halaman masuk.</w:t>
+      </w:r>
+    </w:p>
+    <w:p>
+      <w:pPr>
+        <w:pStyle w:val="Heading2"/>
+      </w:pPr>
+      <w:r>
+        <w:t xml:space="preserve">Versi 2.4 — 5 September 2026</w:t>
+      </w:r>
+    </w:p>
+    <w:p>
+      <w:pPr>
+        <w:pStyle w:val="ListParagraph"/>
+        <w:numPr>
+          <w:ilvl w:val="0"/>
+          <w:numId w:val="2"/>
+        </w:numPr>
+      </w:pPr>
+      <w:r>
         <w:t xml:space="preserve">Rilis dasar versi 2: Surat Perjalanan Dinas dengan nomor unik dan pengikut, pertanggungjawaban per pelaksana (tiket, nota, bill hotel, laporan), rincian biaya dan daftar riil dengan dua jalur tanda tangan, daftar nominatif, pembayaran beserta riwayatnya, pelacakan berkas, dan saluran bantuan.</w:t>
       </w:r>
     </w:p>
@@ -11724,7 +11768,7 @@
           <w:sz w:val="17"/>
           <w:szCs w:val="17"/>
         </w:rPr>
-        <w:t xml:space="preserve">Buku Panduan PANGI v2.5 — Politeknik Kesehatan Kemenkes Manado. Isi buku ini mengikuti sistem sebagaimana berjalan pada 16 September 2026 (versi 2.5.2); bila tampilan di layar berbeda, yang berlaku adalah sistemnya, dan mohon laporkan selisihnya lewat menu Bantuan.</w:t>
+        <w:t xml:space="preserve">Buku Panduan PANGI v2.5 — Politeknik Kesehatan Kemenkes Manado. Isi buku ini mengikuti sistem sebagaimana berjalan pada 1 Oktober 2026 (versi 2.5.7); bila tampilan di layar berbeda, yang berlaku adalah sistemnya, dan mohon laporkan selisihnya lewat menu Bantuan.</w:t>
       </w:r>
     </w:p>
     <w:sectPr>

</xml_diff>

<commit_message>
Panduan bergambar dan buku panduan bersampul baru (2.5.8)
Langkah membuat SPD sampai mengajukan perjadin kini disertai tangkapan
layar bertanda nomor, baik di menu Panduan Penggunaan maupun di buku
panduan. Gambarnya diambil dari alur sungguhan pada salinan basis data
berisi pegawai fiktif, dan dapat diketuk untuk diperbesar.

Buku panduan bersampul baru bergaya Kemenkes (teal, hijau, limau) dengan
logo Poltekkes Manado dan BLU Speed; judul bab, kotak catatan, dan kaki
halaman mengikuti palet yang sama. Selain Word, buku kini dapat diunduh
sebagai PDF lewat ?format=pdf.

Kotak konfirmasi sebelum mengirim pengajuan kini menampilkan tujuan,
tanggal, dan nomor SPD yang benar-benar diisi. Sebelumnya ringkasan itu
dibaca dari kolom formulir yang bukan data reaktif Alpine, sehingga
selalu tertulis "—".

Berkas VERSION ikut diperbarui; rilis 2.5.7 terlewat dan masih menyebut 2.5.6.

Co-Authored-By: Claude Opus 5.5 <noreply@anthropic.com>
</commit_message>
<xml_diff>
--- a/resources/panduan/Buku-Panduan-PANGI-v2.5.docx
+++ b/resources/panduan/Buku-Panduan-PANGI-v2.5.docx
@@ -2,6 +2,57 @@
 <file path=word/document.xml><?xml version="1.0" encoding="utf-8"?>
 <w:document xmlns:wpc="http://schemas.microsoft.com/office/word/2010/wordprocessingCanvas" xmlns:mc="http://schemas.openxmlformats.org/markup-compatibility/2006" xmlns:o="urn:schemas-microsoft-com:office:office" xmlns:r="http://schemas.openxmlformats.org/officeDocument/2006/relationships" xmlns:m="http://schemas.openxmlformats.org/officeDocument/2006/math" xmlns:v="urn:schemas-microsoft-com:vml" xmlns:wp14="http://schemas.microsoft.com/office/word/2010/wordprocessingDrawing" xmlns:wp="http://schemas.openxmlformats.org/drawingml/2006/wordprocessingDrawing" xmlns:w10="urn:schemas-microsoft-com:office:word" xmlns:w="http://schemas.openxmlformats.org/wordprocessingml/2006/main" xmlns:w14="http://schemas.microsoft.com/office/word/2010/wordml" xmlns:w15="http://schemas.microsoft.com/office/word/2012/wordml" xmlns:wpg="http://schemas.microsoft.com/office/word/2010/wordprocessingGroup" xmlns:wpi="http://schemas.microsoft.com/office/word/2010/wordprocessingInk" xmlns:wne="http://schemas.microsoft.com/office/word/2006/wordml" xmlns:wps="http://schemas.microsoft.com/office/word/2010/wordprocessingShape" xmlns:cx="http://schemas.microsoft.com/office/drawing/2014/chartex" xmlns:cx1="http://schemas.microsoft.com/office/drawing/2015/9/8/chartex" xmlns:cx2="http://schemas.microsoft.com/office/drawing/2015/10/21/chartex" xmlns:cx3="http://schemas.microsoft.com/office/drawing/2016/5/9/chartex" xmlns:cx4="http://schemas.microsoft.com/office/drawing/2016/5/10/chartex" xmlns:cx5="http://schemas.microsoft.com/office/drawing/2016/5/11/chartex" xmlns:cx6="http://schemas.microsoft.com/office/drawing/2016/5/12/chartex" xmlns:cx7="http://schemas.microsoft.com/office/drawing/2016/5/13/chartex" xmlns:cx8="http://schemas.microsoft.com/office/drawing/2016/5/14/chartex" xmlns:aink="http://schemas.microsoft.com/office/drawing/2016/ink" xmlns:am3d="http://schemas.microsoft.com/office/drawing/2017/model3d" xmlns:w16cex="http://schemas.microsoft.com/office/word/2018/wordml/cex" xmlns:w16cid="http://schemas.microsoft.com/office/word/2016/wordml/cid" xmlns:w16="http://schemas.microsoft.com/office/word/2018/wordml" xmlns:w16sdtdh="http://schemas.microsoft.com/office/word/2020/wordml/sdtdatahash" xmlns:w16se="http://schemas.microsoft.com/office/word/2015/wordml/symex" mc:Ignorable="w14 w15 wp14">
   <w:body>
+    <w:p>
+      <w:pPr>
+        <w:spacing w:before="0" w:after="0" w:line="240" w:lineRule="auto"/>
+      </w:pPr>
+      <w:r>
+        <w:drawing>
+          <wp:anchor distT="0" distB="0" distL="0" distR="0" simplePos="0" relativeHeight="251658240" behindDoc="1" locked="1" layoutInCell="1" allowOverlap="1">
+            <wp:simplePos x="0" y="0"/>
+            <wp:positionH relativeFrom="page">
+              <wp:posOffset>0</wp:posOffset>
+            </wp:positionH>
+            <wp:positionV relativeFrom="page">
+              <wp:posOffset>0</wp:posOffset>
+            </wp:positionV>
+            <wp:extent cx="7560310" cy="10692130"/>
+            <wp:effectExtent l="0" t="0" r="0" b="0"/>
+            <wp:wrapNone/>
+            <wp:docPr id="201" name="Sampul Buku Panduan PANGI"/>
+            <wp:cNvGraphicFramePr/>
+            <a:graphic xmlns:a="http://schemas.openxmlformats.org/drawingml/2006/main">
+              <a:graphicData uri="http://schemas.openxmlformats.org/drawingml/2006/picture">
+                <pic:pic xmlns:pic="http://schemas.openxmlformats.org/drawingml/2006/picture">
+                  <pic:nvPicPr>
+                    <pic:cNvPr id="201" name="sampul.jpg"/>
+                    <pic:cNvPicPr/>
+                  </pic:nvPicPr>
+                  <pic:blipFill>
+                    <a:blip r:embed="rIdPanduan201"/>
+                    <a:stretch>
+                      <a:fillRect/>
+                    </a:stretch>
+                  </pic:blipFill>
+                  <pic:spPr>
+                    <a:xfrm>
+                      <a:off x="0" y="0"/>
+                      <a:ext cx="7560310" cy="10692130"/>
+                    </a:xfrm>
+                    <a:prstGeom prst="rect">
+                      <a:avLst/>
+                    </a:prstGeom>
+                  </pic:spPr>
+                </pic:pic>
+              </a:graphicData>
+            </a:graphic>
+          </wp:anchor>
+        </w:drawing>
+      </w:r>
+      <w:r>
+        <w:br w:type="page"/>
+      </w:r>
+    </w:p>
     <w:p>
       <w:pPr>
         <w:spacing w:after="200"/>
@@ -64,7 +115,7 @@
         <w:tc>
           <w:tcPr>
             <w:tcW w:type="dxa" w:w="1805"/>
-            <w:shd w:fill="EDF0F5" w:val="clear"/>
+            <w:shd w:fill="EAF5F4" w:val="clear"/>
             <w:tcMar>
               <w:top w:type="dxa" w:w="80"/>
               <w:left w:type="dxa" w:w="120"/>
@@ -90,7 +141,7 @@
         <w:tc>
           <w:tcPr>
             <w:tcW w:type="dxa" w:w="2527"/>
-            <w:shd w:fill="EDF0F5" w:val="clear"/>
+            <w:shd w:fill="EAF5F4" w:val="clear"/>
             <w:tcMar>
               <w:top w:type="dxa" w:w="80"/>
               <w:left w:type="dxa" w:w="120"/>
@@ -116,7 +167,7 @@
         <w:tc>
           <w:tcPr>
             <w:tcW w:type="dxa" w:w="2888"/>
-            <w:shd w:fill="EDF0F5" w:val="clear"/>
+            <w:shd w:fill="EAF5F4" w:val="clear"/>
             <w:tcMar>
               <w:top w:type="dxa" w:w="80"/>
               <w:left w:type="dxa" w:w="120"/>
@@ -142,7 +193,7 @@
         <w:tc>
           <w:tcPr>
             <w:tcW w:type="dxa" w:w="1806"/>
-            <w:shd w:fill="EDF0F5" w:val="clear"/>
+            <w:shd w:fill="EAF5F4" w:val="clear"/>
             <w:tcMar>
               <w:top w:type="dxa" w:w="80"/>
               <w:left w:type="dxa" w:w="120"/>
@@ -188,7 +239,7 @@
                 <w:sz w:val="19"/>
                 <w:szCs w:val="19"/>
               </w:rPr>
-              <w:t xml:space="preserve">2.5.7</w:t>
+              <w:t xml:space="preserve">2.5.8</w:t>
             </w:r>
           </w:p>
         </w:tc>
@@ -465,7 +516,7 @@
         <w:tblW w:type="dxa" w:w="9026"/>
         <w:tblBorders>
           <w:top w:val="single" w:color="D3DAE4" w:sz="2"/>
-          <w:left w:val="single" w:color="1D5C8F" w:sz="18"/>
+          <w:left w:val="single" w:color="0B7F87" w:sz="18"/>
           <w:bottom w:val="single" w:color="D3DAE4" w:sz="2"/>
           <w:right w:val="single" w:color="D3DAE4" w:sz="2"/>
           <w:insideH w:val="none"/>
@@ -479,7 +530,7 @@
         <w:tc>
           <w:tcPr>
             <w:tcW w:type="dxa" w:w="9026"/>
-            <w:shd w:fill="EDF0F5" w:val="clear"/>
+            <w:shd w:fill="EAF5F4" w:val="clear"/>
             <w:tcMar>
               <w:top w:type="dxa" w:w="120"/>
               <w:left w:type="dxa" w:w="180"/>
@@ -495,7 +546,7 @@
               <w:rPr>
                 <w:b/>
                 <w:bCs/>
-                <w:color w:val="1D5C8F"/>
+                <w:color w:val="0B7F87"/>
                 <w:spacing w:val="20"/>
                 <w:sz w:val="16"/>
                 <w:szCs w:val="16"/>
@@ -642,7 +693,7 @@
         <w:tc>
           <w:tcPr>
             <w:tcW w:type="dxa" w:w="2149"/>
-            <w:shd w:fill="EDF0F5" w:val="clear"/>
+            <w:shd w:fill="EAF5F4" w:val="clear"/>
             <w:tcMar>
               <w:top w:type="dxa" w:w="80"/>
               <w:left w:type="dxa" w:w="120"/>
@@ -668,7 +719,7 @@
         <w:tc>
           <w:tcPr>
             <w:tcW w:type="dxa" w:w="3438"/>
-            <w:shd w:fill="EDF0F5" w:val="clear"/>
+            <w:shd w:fill="EAF5F4" w:val="clear"/>
             <w:tcMar>
               <w:top w:type="dxa" w:w="80"/>
               <w:left w:type="dxa" w:w="120"/>
@@ -694,7 +745,7 @@
         <w:tc>
           <w:tcPr>
             <w:tcW w:type="dxa" w:w="3439"/>
-            <w:shd w:fill="EDF0F5" w:val="clear"/>
+            <w:shd w:fill="EAF5F4" w:val="clear"/>
             <w:tcMar>
               <w:top w:type="dxa" w:w="80"/>
               <w:left w:type="dxa" w:w="120"/>
@@ -1033,7 +1084,7 @@
         <w:tblW w:type="dxa" w:w="9026"/>
         <w:tblBorders>
           <w:top w:val="single" w:color="D3DAE4" w:sz="2"/>
-          <w:left w:val="single" w:color="1D5C8F" w:sz="18"/>
+          <w:left w:val="single" w:color="0B7F87" w:sz="18"/>
           <w:bottom w:val="single" w:color="D3DAE4" w:sz="2"/>
           <w:right w:val="single" w:color="D3DAE4" w:sz="2"/>
           <w:insideH w:val="none"/>
@@ -1047,7 +1098,7 @@
         <w:tc>
           <w:tcPr>
             <w:tcW w:type="dxa" w:w="9026"/>
-            <w:shd w:fill="EDF0F5" w:val="clear"/>
+            <w:shd w:fill="EAF5F4" w:val="clear"/>
             <w:tcMar>
               <w:top w:type="dxa" w:w="120"/>
               <w:left w:type="dxa" w:w="180"/>
@@ -1063,7 +1114,7 @@
               <w:rPr>
                 <w:b/>
                 <w:bCs/>
-                <w:color w:val="1D5C8F"/>
+                <w:color w:val="0B7F87"/>
                 <w:spacing w:val="20"/>
                 <w:sz w:val="16"/>
                 <w:szCs w:val="16"/>
@@ -1133,7 +1184,7 @@
         <w:tc>
           <w:tcPr>
             <w:tcW w:type="dxa" w:w="2290"/>
-            <w:shd w:fill="EDF0F5" w:val="clear"/>
+            <w:shd w:fill="EAF5F4" w:val="clear"/>
             <w:tcMar>
               <w:top w:type="dxa" w:w="80"/>
               <w:left w:type="dxa" w:w="120"/>
@@ -1159,7 +1210,7 @@
         <w:tc>
           <w:tcPr>
             <w:tcW w:type="dxa" w:w="881"/>
-            <w:shd w:fill="EDF0F5" w:val="clear"/>
+            <w:shd w:fill="EAF5F4" w:val="clear"/>
             <w:tcMar>
               <w:top w:type="dxa" w:w="80"/>
               <w:left w:type="dxa" w:w="120"/>
@@ -1185,7 +1236,7 @@
         <w:tc>
           <w:tcPr>
             <w:tcW w:type="dxa" w:w="1013"/>
-            <w:shd w:fill="EDF0F5" w:val="clear"/>
+            <w:shd w:fill="EAF5F4" w:val="clear"/>
             <w:tcMar>
               <w:top w:type="dxa" w:w="80"/>
               <w:left w:type="dxa" w:w="120"/>
@@ -1211,7 +1262,7 @@
         <w:tc>
           <w:tcPr>
             <w:tcW w:type="dxa" w:w="925"/>
-            <w:shd w:fill="EDF0F5" w:val="clear"/>
+            <w:shd w:fill="EAF5F4" w:val="clear"/>
             <w:tcMar>
               <w:top w:type="dxa" w:w="80"/>
               <w:left w:type="dxa" w:w="120"/>
@@ -1237,7 +1288,7 @@
         <w:tc>
           <w:tcPr>
             <w:tcW w:type="dxa" w:w="1145"/>
-            <w:shd w:fill="EDF0F5" w:val="clear"/>
+            <w:shd w:fill="EAF5F4" w:val="clear"/>
             <w:tcMar>
               <w:top w:type="dxa" w:w="80"/>
               <w:left w:type="dxa" w:w="120"/>
@@ -1263,7 +1314,7 @@
         <w:tc>
           <w:tcPr>
             <w:tcW w:type="dxa" w:w="881"/>
-            <w:shd w:fill="EDF0F5" w:val="clear"/>
+            <w:shd w:fill="EAF5F4" w:val="clear"/>
             <w:tcMar>
               <w:top w:type="dxa" w:w="80"/>
               <w:left w:type="dxa" w:w="120"/>
@@ -1289,7 +1340,7 @@
         <w:tc>
           <w:tcPr>
             <w:tcW w:type="dxa" w:w="925"/>
-            <w:shd w:fill="EDF0F5" w:val="clear"/>
+            <w:shd w:fill="EAF5F4" w:val="clear"/>
             <w:tcMar>
               <w:top w:type="dxa" w:w="80"/>
               <w:left w:type="dxa" w:w="120"/>
@@ -1315,7 +1366,7 @@
         <w:tc>
           <w:tcPr>
             <w:tcW w:type="dxa" w:w="966"/>
-            <w:shd w:fill="EDF0F5" w:val="clear"/>
+            <w:shd w:fill="EAF5F4" w:val="clear"/>
             <w:tcMar>
               <w:top w:type="dxa" w:w="80"/>
               <w:left w:type="dxa" w:w="120"/>
@@ -3370,7 +3421,7 @@
         <w:tblW w:type="dxa" w:w="9026"/>
         <w:tblBorders>
           <w:top w:val="single" w:color="D3DAE4" w:sz="2"/>
-          <w:left w:val="single" w:color="1D5C8F" w:sz="18"/>
+          <w:left w:val="single" w:color="0B7F87" w:sz="18"/>
           <w:bottom w:val="single" w:color="D3DAE4" w:sz="2"/>
           <w:right w:val="single" w:color="D3DAE4" w:sz="2"/>
           <w:insideH w:val="none"/>
@@ -3384,7 +3435,7 @@
         <w:tc>
           <w:tcPr>
             <w:tcW w:type="dxa" w:w="9026"/>
-            <w:shd w:fill="EDF0F5" w:val="clear"/>
+            <w:shd w:fill="EAF5F4" w:val="clear"/>
             <w:tcMar>
               <w:top w:type="dxa" w:w="120"/>
               <w:left w:type="dxa" w:w="180"/>
@@ -3400,7 +3451,7 @@
               <w:rPr>
                 <w:b/>
                 <w:bCs/>
-                <w:color w:val="1D5C8F"/>
+                <w:color w:val="0B7F87"/>
                 <w:spacing w:val="20"/>
                 <w:sz w:val="16"/>
                 <w:szCs w:val="16"/>
@@ -3465,7 +3516,7 @@
         <w:tc>
           <w:tcPr>
             <w:tcW w:type="dxa" w:w="792"/>
-            <w:shd w:fill="EDF0F5" w:val="clear"/>
+            <w:shd w:fill="EAF5F4" w:val="clear"/>
             <w:tcMar>
               <w:top w:type="dxa" w:w="80"/>
               <w:left w:type="dxa" w:w="120"/>
@@ -3491,7 +3542,7 @@
         <w:tc>
           <w:tcPr>
             <w:tcW w:type="dxa" w:w="5384"/>
-            <w:shd w:fill="EDF0F5" w:val="clear"/>
+            <w:shd w:fill="EAF5F4" w:val="clear"/>
             <w:tcMar>
               <w:top w:type="dxa" w:w="80"/>
               <w:left w:type="dxa" w:w="120"/>
@@ -3517,7 +3568,7 @@
         <w:tc>
           <w:tcPr>
             <w:tcW w:type="dxa" w:w="2850"/>
-            <w:shd w:fill="EDF0F5" w:val="clear"/>
+            <w:shd w:fill="EAF5F4" w:val="clear"/>
             <w:tcMar>
               <w:top w:type="dxa" w:w="80"/>
               <w:left w:type="dxa" w:w="120"/>
@@ -4322,7 +4373,7 @@
         <w:tblW w:type="dxa" w:w="9026"/>
         <w:tblBorders>
           <w:top w:val="single" w:color="D3DAE4" w:sz="2"/>
-          <w:left w:val="single" w:color="1D5C8F" w:sz="18"/>
+          <w:left w:val="single" w:color="0B7F87" w:sz="18"/>
           <w:bottom w:val="single" w:color="D3DAE4" w:sz="2"/>
           <w:right w:val="single" w:color="D3DAE4" w:sz="2"/>
           <w:insideH w:val="none"/>
@@ -4336,7 +4387,7 @@
         <w:tc>
           <w:tcPr>
             <w:tcW w:type="dxa" w:w="9026"/>
-            <w:shd w:fill="EDF0F5" w:val="clear"/>
+            <w:shd w:fill="EAF5F4" w:val="clear"/>
             <w:tcMar>
               <w:top w:type="dxa" w:w="120"/>
               <w:left w:type="dxa" w:w="180"/>
@@ -4352,7 +4403,7 @@
               <w:rPr>
                 <w:b/>
                 <w:bCs/>
-                <w:color w:val="1D5C8F"/>
+                <w:color w:val="0B7F87"/>
                 <w:spacing w:val="20"/>
                 <w:sz w:val="16"/>
                 <w:szCs w:val="16"/>
@@ -4407,6 +4458,15 @@
     <w:p>
       <w:r>
         <w:t xml:space="preserve">SPD yang dibuat lewat aplikasi menyalin isiannya ke formulir usulan dan memberi tahu pelaksana yang tercantum — tetapi tidak wajib. Bila SPD diterbitkan di luar aplikasi, usulan tetap dapat langsung diajukan; yang wajib adalah SPD bertanda tangan beserta nomornya.</w:t>
+      </w:r>
+    </w:p>
+    <w:p>
+      <w:pPr>
+        <w:pStyle w:val="Keterangan"/>
+        <w:spacing w:before="40" w:after="200"/>
+      </w:pPr>
+      <w:r>
+        <w:t xml:space="preserve">Gambar pada bab ini memakai data contoh dengan pegawai fiktif. Angka merah pada gambar menandai bagian yang dibahas pada langkah yang bersangkutan.</w:t>
       </w:r>
     </w:p>
     <w:p>
@@ -4433,6 +4493,75 @@
     </w:p>
     <w:p>
       <w:pPr>
+        <w:keepNext/>
+        <w:spacing w:before="160" w:after="80"/>
+        <w:jc w:val="center"/>
+      </w:pPr>
+      <w:r>
+        <w:drawing>
+          <wp:inline distT="0" distB="0" distL="0" distR="0">
+            <wp:extent cx="5724000" cy="2385000"/>
+            <wp:effectExtent l="0" t="0" r="0" b="0"/>
+            <wp:docPr id="202" name="spd-01-menu"/>
+            <wp:cNvGraphicFramePr>
+              <a:graphicFrameLocks xmlns:a="http://schemas.openxmlformats.org/drawingml/2006/main" noChangeAspect="1"/>
+            </wp:cNvGraphicFramePr>
+            <a:graphic xmlns:a="http://schemas.openxmlformats.org/drawingml/2006/main">
+              <a:graphicData uri="http://schemas.openxmlformats.org/drawingml/2006/picture">
+                <pic:pic xmlns:pic="http://schemas.openxmlformats.org/drawingml/2006/picture">
+                  <pic:nvPicPr>
+                    <pic:cNvPr id="202" name="spd-01-menu"/>
+                    <pic:cNvPicPr/>
+                  </pic:nvPicPr>
+                  <pic:blipFill>
+                    <a:blip r:embed="rIdPanduan202"/>
+                    <a:stretch>
+                      <a:fillRect/>
+                    </a:stretch>
+                  </pic:blipFill>
+                  <pic:spPr>
+                    <a:xfrm>
+                      <a:off x="0" y="0"/>
+                      <a:ext cx="5724000" cy="2385000"/>
+                    </a:xfrm>
+                    <a:prstGeom prst="rect">
+                      <a:avLst/>
+                    </a:prstGeom>
+                    <a:ln w="9525">
+                      <a:solidFill>
+                        <a:srgbClr val="D5DEE0"/>
+                      </a:solidFill>
+                    </a:ln>
+                  </pic:spPr>
+                </pic:pic>
+              </a:graphicData>
+            </a:graphic>
+          </wp:inline>
+        </w:drawing>
+      </w:r>
+    </w:p>
+    <w:p>
+      <w:pPr>
+        <w:pStyle w:val="Keterangan"/>
+        <w:spacing w:before="0" w:after="260"/>
+        <w:jc w:val="center"/>
+      </w:pPr>
+      <w:r>
+        <w:rPr>
+          <w:b/>
+          <w:bCs/>
+          <w:i w:val="0"/>
+          <w:iCs w:val="0"/>
+          <w:color w:val="045E6A"/>
+        </w:rPr>
+        <w:t xml:space="preserve">Gambar 5.1</w:t>
+      </w:r>
+      <w:r>
+        <w:t xml:space="preserve"> — Menu Buat SPD → Pembuatan SPD (1), atau tombol + Buat SPD pada Daftar SPD (2).</w:t>
+      </w:r>
+    </w:p>
+    <w:p>
+      <w:pPr>
         <w:pStyle w:val="ListParagraph"/>
         <w:numPr>
           <w:ilvl w:val="0"/>
@@ -4444,13 +4573,151 @@
           <w:b/>
           <w:bCs/>
         </w:rPr>
-        <w:t xml:space="preserve">Isi nomor surat tiap pelaksana.</w:t>
+        <w:t xml:space="preserve">Periksa identitas surat dan pelaksana.</w:t>
       </w:r>
       <w:r>
         <w:rPr>
           <w:color w:val="55616F"/>
         </w:rPr>
-        <w:t xml:space="preserve">  Cukup angka urutnya sesuai buku agenda — tanpa garis miring maupun tahun. Sistem merakitnya menjadi KU.02.04/F.XXX.8/[urut]/[tahun]. Nomor yang sudah terpakai ditolak.</w:t>
+        <w:t xml:space="preserve">  Isi kota tempat SPD dikeluarkan (1); tanggalnya mengikuti hari pembuatan. Pelaksana pertama terisi sendiri dari akun Anda (2), dan nomor suratnya terbit sendiri berpola PJ-[unit]-[tahun]-[bulan]-[urut] — tidak perlu diketik; nomor resmi diisi SRIKANDI saat surat diregistrasi. Bila berangkat bersama rekan, tekan Tambah Pelaksana (3) lalu pilih namanya dari daftar pegawai: nama, NIP, pangkat, dan jabatannya terisi sendiri. Satu SPD memuat paling banyak lima pelaksana.</w:t>
+      </w:r>
+    </w:p>
+    <w:p>
+      <w:pPr>
+        <w:keepNext/>
+        <w:spacing w:before="160" w:after="80"/>
+        <w:jc w:val="center"/>
+      </w:pPr>
+      <w:r>
+        <w:drawing>
+          <wp:inline distT="0" distB="0" distL="0" distR="0">
+            <wp:extent cx="3960000" cy="4033920"/>
+            <wp:effectExtent l="0" t="0" r="0" b="0"/>
+            <wp:docPr id="203" name="spd-02-identitas"/>
+            <wp:cNvGraphicFramePr>
+              <a:graphicFrameLocks xmlns:a="http://schemas.openxmlformats.org/drawingml/2006/main" noChangeAspect="1"/>
+            </wp:cNvGraphicFramePr>
+            <a:graphic xmlns:a="http://schemas.openxmlformats.org/drawingml/2006/main">
+              <a:graphicData uri="http://schemas.openxmlformats.org/drawingml/2006/picture">
+                <pic:pic xmlns:pic="http://schemas.openxmlformats.org/drawingml/2006/picture">
+                  <pic:nvPicPr>
+                    <pic:cNvPr id="203" name="spd-02-identitas"/>
+                    <pic:cNvPicPr/>
+                  </pic:nvPicPr>
+                  <pic:blipFill>
+                    <a:blip r:embed="rIdPanduan203"/>
+                    <a:stretch>
+                      <a:fillRect/>
+                    </a:stretch>
+                  </pic:blipFill>
+                  <pic:spPr>
+                    <a:xfrm>
+                      <a:off x="0" y="0"/>
+                      <a:ext cx="3960000" cy="4033920"/>
+                    </a:xfrm>
+                    <a:prstGeom prst="rect">
+                      <a:avLst/>
+                    </a:prstGeom>
+                    <a:ln w="9525">
+                      <a:solidFill>
+                        <a:srgbClr val="D5DEE0"/>
+                      </a:solidFill>
+                    </a:ln>
+                  </pic:spPr>
+                </pic:pic>
+              </a:graphicData>
+            </a:graphic>
+          </wp:inline>
+        </w:drawing>
+      </w:r>
+    </w:p>
+    <w:p>
+      <w:pPr>
+        <w:pStyle w:val="Keterangan"/>
+        <w:spacing w:before="0" w:after="260"/>
+        <w:jc w:val="center"/>
+      </w:pPr>
+      <w:r>
+        <w:rPr>
+          <w:b/>
+          <w:bCs/>
+          <w:i w:val="0"/>
+          <w:iCs w:val="0"/>
+          <w:color w:val="045E6A"/>
+        </w:rPr>
+        <w:t xml:space="preserve">Gambar 5.2</w:t>
+      </w:r>
+      <w:r>
+        <w:t xml:space="preserve"> — Identitas surat (1), pelaksana pertama dari akun yang sedang masuk (2), dan tombol Tambah Pelaksana (3).</w:t>
+      </w:r>
+    </w:p>
+    <w:p>
+      <w:pPr>
+        <w:keepNext/>
+        <w:spacing w:before="160" w:after="80"/>
+        <w:jc w:val="center"/>
+      </w:pPr>
+      <w:r>
+        <w:drawing>
+          <wp:inline distT="0" distB="0" distL="0" distR="0">
+            <wp:extent cx="4500000" cy="3159000"/>
+            <wp:effectExtent l="0" t="0" r="0" b="0"/>
+            <wp:docPr id="204" name="spd-03-pelaksana-tambahan"/>
+            <wp:cNvGraphicFramePr>
+              <a:graphicFrameLocks xmlns:a="http://schemas.openxmlformats.org/drawingml/2006/main" noChangeAspect="1"/>
+            </wp:cNvGraphicFramePr>
+            <a:graphic xmlns:a="http://schemas.openxmlformats.org/drawingml/2006/main">
+              <a:graphicData uri="http://schemas.openxmlformats.org/drawingml/2006/picture">
+                <pic:pic xmlns:pic="http://schemas.openxmlformats.org/drawingml/2006/picture">
+                  <pic:nvPicPr>
+                    <pic:cNvPr id="204" name="spd-03-pelaksana-tambahan"/>
+                    <pic:cNvPicPr/>
+                  </pic:nvPicPr>
+                  <pic:blipFill>
+                    <a:blip r:embed="rIdPanduan204"/>
+                    <a:stretch>
+                      <a:fillRect/>
+                    </a:stretch>
+                  </pic:blipFill>
+                  <pic:spPr>
+                    <a:xfrm>
+                      <a:off x="0" y="0"/>
+                      <a:ext cx="4500000" cy="3159000"/>
+                    </a:xfrm>
+                    <a:prstGeom prst="rect">
+                      <a:avLst/>
+                    </a:prstGeom>
+                    <a:ln w="9525">
+                      <a:solidFill>
+                        <a:srgbClr val="D5DEE0"/>
+                      </a:solidFill>
+                    </a:ln>
+                  </pic:spPr>
+                </pic:pic>
+              </a:graphicData>
+            </a:graphic>
+          </wp:inline>
+        </w:drawing>
+      </w:r>
+    </w:p>
+    <w:p>
+      <w:pPr>
+        <w:pStyle w:val="Keterangan"/>
+        <w:spacing w:before="0" w:after="260"/>
+        <w:jc w:val="center"/>
+      </w:pPr>
+      <w:r>
+        <w:rPr>
+          <w:b/>
+          <w:bCs/>
+          <w:i w:val="0"/>
+          <w:iCs w:val="0"/>
+          <w:color w:val="045E6A"/>
+        </w:rPr>
+        <w:t xml:space="preserve">Gambar 5.3</w:t>
+      </w:r>
+      <w:r>
+        <w:t xml:space="preserve"> — Pelaksana tambahan dipilih dari daftar pegawai (1); data kepegawaiannya terisi sendiri (2).</w:t>
       </w:r>
     </w:p>
     <w:p>
@@ -4477,6 +4744,75 @@
     </w:p>
     <w:p>
       <w:pPr>
+        <w:keepNext/>
+        <w:spacing w:before="160" w:after="80"/>
+        <w:jc w:val="center"/>
+      </w:pPr>
+      <w:r>
+        <w:drawing>
+          <wp:inline distT="0" distB="0" distL="0" distR="0">
+            <wp:extent cx="4860000" cy="3032640"/>
+            <wp:effectExtent l="0" t="0" r="0" b="0"/>
+            <wp:docPr id="205" name="spd-04-rencana"/>
+            <wp:cNvGraphicFramePr>
+              <a:graphicFrameLocks xmlns:a="http://schemas.openxmlformats.org/drawingml/2006/main" noChangeAspect="1"/>
+            </wp:cNvGraphicFramePr>
+            <a:graphic xmlns:a="http://schemas.openxmlformats.org/drawingml/2006/main">
+              <a:graphicData uri="http://schemas.openxmlformats.org/drawingml/2006/picture">
+                <pic:pic xmlns:pic="http://schemas.openxmlformats.org/drawingml/2006/picture">
+                  <pic:nvPicPr>
+                    <pic:cNvPr id="205" name="spd-04-rencana"/>
+                    <pic:cNvPicPr/>
+                  </pic:nvPicPr>
+                  <pic:blipFill>
+                    <a:blip r:embed="rIdPanduan205"/>
+                    <a:stretch>
+                      <a:fillRect/>
+                    </a:stretch>
+                  </pic:blipFill>
+                  <pic:spPr>
+                    <a:xfrm>
+                      <a:off x="0" y="0"/>
+                      <a:ext cx="4860000" cy="3032640"/>
+                    </a:xfrm>
+                    <a:prstGeom prst="rect">
+                      <a:avLst/>
+                    </a:prstGeom>
+                    <a:ln w="9525">
+                      <a:solidFill>
+                        <a:srgbClr val="D5DEE0"/>
+                      </a:solidFill>
+                    </a:ln>
+                  </pic:spPr>
+                </pic:pic>
+              </a:graphicData>
+            </a:graphic>
+          </wp:inline>
+        </w:drawing>
+      </w:r>
+    </w:p>
+    <w:p>
+      <w:pPr>
+        <w:pStyle w:val="Keterangan"/>
+        <w:spacing w:before="0" w:after="260"/>
+        <w:jc w:val="center"/>
+      </w:pPr>
+      <w:r>
+        <w:rPr>
+          <w:b/>
+          <w:bCs/>
+          <w:i w:val="0"/>
+          <w:iCs w:val="0"/>
+          <w:color w:val="045E6A"/>
+        </w:rPr>
+        <w:t xml:space="preserve">Gambar 5.4</w:t>
+      </w:r>
+      <w:r>
+        <w:t xml:space="preserve"> — Maksud perjalanan (1), tempat tujuan (2), serta tanggal berangkat dan kembali (3); lamanya perjalanan dihitung sendiri (4).</w:t>
+      </w:r>
+    </w:p>
+    <w:p>
+      <w:pPr>
         <w:pStyle w:val="ListParagraph"/>
         <w:numPr>
           <w:ilvl w:val="0"/>
@@ -4499,6 +4835,75 @@
     </w:p>
     <w:p>
       <w:pPr>
+        <w:keepNext/>
+        <w:spacing w:before="160" w:after="80"/>
+        <w:jc w:val="center"/>
+      </w:pPr>
+      <w:r>
+        <w:drawing>
+          <wp:inline distT="0" distB="0" distL="0" distR="0">
+            <wp:extent cx="4500000" cy="3356999"/>
+            <wp:effectExtent l="0" t="0" r="0" b="0"/>
+            <wp:docPr id="206" name="spd-05-surat-tugas"/>
+            <wp:cNvGraphicFramePr>
+              <a:graphicFrameLocks xmlns:a="http://schemas.openxmlformats.org/drawingml/2006/main" noChangeAspect="1"/>
+            </wp:cNvGraphicFramePr>
+            <a:graphic xmlns:a="http://schemas.openxmlformats.org/drawingml/2006/main">
+              <a:graphicData uri="http://schemas.openxmlformats.org/drawingml/2006/picture">
+                <pic:pic xmlns:pic="http://schemas.openxmlformats.org/drawingml/2006/picture">
+                  <pic:nvPicPr>
+                    <pic:cNvPr id="206" name="spd-05-surat-tugas"/>
+                    <pic:cNvPicPr/>
+                  </pic:nvPicPr>
+                  <pic:blipFill>
+                    <a:blip r:embed="rIdPanduan206"/>
+                    <a:stretch>
+                      <a:fillRect/>
+                    </a:stretch>
+                  </pic:blipFill>
+                  <pic:spPr>
+                    <a:xfrm>
+                      <a:off x="0" y="0"/>
+                      <a:ext cx="4500000" cy="3356999"/>
+                    </a:xfrm>
+                    <a:prstGeom prst="rect">
+                      <a:avLst/>
+                    </a:prstGeom>
+                    <a:ln w="9525">
+                      <a:solidFill>
+                        <a:srgbClr val="D5DEE0"/>
+                      </a:solidFill>
+                    </a:ln>
+                  </pic:spPr>
+                </pic:pic>
+              </a:graphicData>
+            </a:graphic>
+          </wp:inline>
+        </w:drawing>
+      </w:r>
+    </w:p>
+    <w:p>
+      <w:pPr>
+        <w:pStyle w:val="Keterangan"/>
+        <w:spacing w:before="0" w:after="260"/>
+        <w:jc w:val="center"/>
+      </w:pPr>
+      <w:r>
+        <w:rPr>
+          <w:b/>
+          <w:bCs/>
+          <w:i w:val="0"/>
+          <w:iCs w:val="0"/>
+          <w:color w:val="045E6A"/>
+        </w:rPr>
+        <w:t xml:space="preserve">Gambar 5.5</w:t>
+      </w:r>
+      <w:r>
+        <w:t xml:space="preserve"> — Nomor dan berkas surat tugas (1), lalu tombol Pratinjau (2) dan Simpan (3).</w:t>
+      </w:r>
+    </w:p>
+    <w:p>
+      <w:pPr>
         <w:pStyle w:val="ListParagraph"/>
         <w:numPr>
           <w:ilvl w:val="0"/>
@@ -4516,7 +4921,7 @@
         <w:rPr>
           <w:color w:val="55616F"/>
         </w:rPr>
-        <w:t xml:space="preserve">  Pengikut ikut berangkat dan namanya tercantum pada SPD, tetapi ia tidak mengajukan usulan sendiri.</w:t>
+        <w:t xml:space="preserve">  Pengikut ikut berangkat dan namanya tercantum pada SPD, tetapi ia tidak mengajukan usulan sendiri. Kolomnya hanya tersedia bagi Pimpinan dan Super Administrator.</w:t>
       </w:r>
     </w:p>
     <w:p>
@@ -4543,6 +4948,152 @@
     </w:p>
     <w:p>
       <w:pPr>
+        <w:keepNext/>
+        <w:spacing w:before="160" w:after="80"/>
+        <w:jc w:val="center"/>
+      </w:pPr>
+      <w:r>
+        <w:drawing>
+          <wp:inline distT="0" distB="0" distL="0" distR="0">
+            <wp:extent cx="5040000" cy="2563680"/>
+            <wp:effectExtent l="0" t="0" r="0" b="0"/>
+            <wp:docPr id="207" name="spd-06-detail"/>
+            <wp:cNvGraphicFramePr>
+              <a:graphicFrameLocks xmlns:a="http://schemas.openxmlformats.org/drawingml/2006/main" noChangeAspect="1"/>
+            </wp:cNvGraphicFramePr>
+            <a:graphic xmlns:a="http://schemas.openxmlformats.org/drawingml/2006/main">
+              <a:graphicData uri="http://schemas.openxmlformats.org/drawingml/2006/picture">
+                <pic:pic xmlns:pic="http://schemas.openxmlformats.org/drawingml/2006/picture">
+                  <pic:nvPicPr>
+                    <pic:cNvPr id="207" name="spd-06-detail"/>
+                    <pic:cNvPicPr/>
+                  </pic:nvPicPr>
+                  <pic:blipFill>
+                    <a:blip r:embed="rIdPanduan207"/>
+                    <a:stretch>
+                      <a:fillRect/>
+                    </a:stretch>
+                  </pic:blipFill>
+                  <pic:spPr>
+                    <a:xfrm>
+                      <a:off x="0" y="0"/>
+                      <a:ext cx="5040000" cy="2563680"/>
+                    </a:xfrm>
+                    <a:prstGeom prst="rect">
+                      <a:avLst/>
+                    </a:prstGeom>
+                    <a:ln w="9525">
+                      <a:solidFill>
+                        <a:srgbClr val="D5DEE0"/>
+                      </a:solidFill>
+                    </a:ln>
+                  </pic:spPr>
+                </pic:pic>
+              </a:graphicData>
+            </a:graphic>
+          </wp:inline>
+        </w:drawing>
+      </w:r>
+    </w:p>
+    <w:p>
+      <w:pPr>
+        <w:pStyle w:val="Keterangan"/>
+        <w:spacing w:before="0" w:after="260"/>
+        <w:jc w:val="center"/>
+      </w:pPr>
+      <w:r>
+        <w:rPr>
+          <w:b/>
+          <w:bCs/>
+          <w:i w:val="0"/>
+          <w:iCs w:val="0"/>
+          <w:color w:val="045E6A"/>
+        </w:rPr>
+        <w:t xml:space="preserve">Gambar 5.6</w:t>
+      </w:r>
+      <w:r>
+        <w:t xml:space="preserve"> — SPD tersimpan (1) beserta nomor tiap pelaksana (2); tekan Unduh PDF (3) untuk mencetaknya.</w:t>
+      </w:r>
+    </w:p>
+    <w:p>
+      <w:pPr>
+        <w:keepNext/>
+        <w:spacing w:before="160" w:after="80"/>
+        <w:jc w:val="center"/>
+      </w:pPr>
+      <w:r>
+        <w:drawing>
+          <wp:inline distT="0" distB="0" distL="0" distR="0">
+            <wp:extent cx="5724000" cy="3816000"/>
+            <wp:effectExtent l="0" t="0" r="0" b="0"/>
+            <wp:docPr id="208" name="spd-07-dokumen"/>
+            <wp:cNvGraphicFramePr>
+              <a:graphicFrameLocks xmlns:a="http://schemas.openxmlformats.org/drawingml/2006/main" noChangeAspect="1"/>
+            </wp:cNvGraphicFramePr>
+            <a:graphic xmlns:a="http://schemas.openxmlformats.org/drawingml/2006/main">
+              <a:graphicData uri="http://schemas.openxmlformats.org/drawingml/2006/picture">
+                <pic:pic xmlns:pic="http://schemas.openxmlformats.org/drawingml/2006/picture">
+                  <pic:nvPicPr>
+                    <pic:cNvPr id="208" name="spd-07-dokumen"/>
+                    <pic:cNvPicPr/>
+                  </pic:nvPicPr>
+                  <pic:blipFill>
+                    <a:blip r:embed="rIdPanduan208"/>
+                    <a:stretch>
+                      <a:fillRect/>
+                    </a:stretch>
+                  </pic:blipFill>
+                  <pic:spPr>
+                    <a:xfrm>
+                      <a:off x="0" y="0"/>
+                      <a:ext cx="5724000" cy="3816000"/>
+                    </a:xfrm>
+                    <a:prstGeom prst="rect">
+                      <a:avLst/>
+                    </a:prstGeom>
+                    <a:ln w="9525">
+                      <a:solidFill>
+                        <a:srgbClr val="D5DEE0"/>
+                      </a:solidFill>
+                    </a:ln>
+                  </pic:spPr>
+                </pic:pic>
+              </a:graphicData>
+            </a:graphic>
+          </wp:inline>
+        </w:drawing>
+      </w:r>
+    </w:p>
+    <w:p>
+      <w:pPr>
+        <w:pStyle w:val="Keterangan"/>
+        <w:spacing w:before="0" w:after="260"/>
+        <w:jc w:val="center"/>
+      </w:pPr>
+      <w:r>
+        <w:rPr>
+          <w:b/>
+          <w:bCs/>
+          <w:i w:val="0"/>
+          <w:iCs w:val="0"/>
+          <w:color w:val="045E6A"/>
+        </w:rPr>
+        <w:t xml:space="preserve">Gambar 5.7</w:t>
+      </w:r>
+      <w:r>
+        <w:t xml:space="preserve"> — Contoh cetakan SPD, lembar pertama dan kedua. Penanda ${nomor_naskah} dan ${ttd_pengirim} diganti SRIKANDI saat surat ditandatangani.</w:t>
+      </w:r>
+    </w:p>
+    <w:p>
+      <w:pPr>
+        <w:spacing w:before="60" w:after="160"/>
+      </w:pPr>
+      <w:r>
+        <w:t xml:space="preserve">Ajukan SPD yang sudah diunduh untuk ditandatangani PPK dan Direktur lewat SRIKANDI. Berkas SPD bertanda tangan itulah yang diunggah saat mengajukan usulan perjalanan dinas (bagian 5.2).</w:t>
+      </w:r>
+    </w:p>
+    <w:p>
+      <w:pPr>
         <w:pStyle w:val="Heading2"/>
       </w:pPr>
       <w:r>
@@ -4573,6 +5124,75 @@
     </w:p>
     <w:p>
       <w:pPr>
+        <w:keepNext/>
+        <w:spacing w:before="160" w:after="80"/>
+        <w:jc w:val="center"/>
+      </w:pPr>
+      <w:r>
+        <w:drawing>
+          <wp:inline distT="0" distB="0" distL="0" distR="0">
+            <wp:extent cx="5724000" cy="2625408"/>
+            <wp:effectExtent l="0" t="0" r="0" b="0"/>
+            <wp:docPr id="209" name="usulan-01-jalur"/>
+            <wp:cNvGraphicFramePr>
+              <a:graphicFrameLocks xmlns:a="http://schemas.openxmlformats.org/drawingml/2006/main" noChangeAspect="1"/>
+            </wp:cNvGraphicFramePr>
+            <a:graphic xmlns:a="http://schemas.openxmlformats.org/drawingml/2006/main">
+              <a:graphicData uri="http://schemas.openxmlformats.org/drawingml/2006/picture">
+                <pic:pic xmlns:pic="http://schemas.openxmlformats.org/drawingml/2006/picture">
+                  <pic:nvPicPr>
+                    <pic:cNvPr id="209" name="usulan-01-jalur"/>
+                    <pic:cNvPicPr/>
+                  </pic:nvPicPr>
+                  <pic:blipFill>
+                    <a:blip r:embed="rIdPanduan209"/>
+                    <a:stretch>
+                      <a:fillRect/>
+                    </a:stretch>
+                  </pic:blipFill>
+                  <pic:spPr>
+                    <a:xfrm>
+                      <a:off x="0" y="0"/>
+                      <a:ext cx="5724000" cy="2625408"/>
+                    </a:xfrm>
+                    <a:prstGeom prst="rect">
+                      <a:avLst/>
+                    </a:prstGeom>
+                    <a:ln w="9525">
+                      <a:solidFill>
+                        <a:srgbClr val="D5DEE0"/>
+                      </a:solidFill>
+                    </a:ln>
+                  </pic:spPr>
+                </pic:pic>
+              </a:graphicData>
+            </a:graphic>
+          </wp:inline>
+        </w:drawing>
+      </w:r>
+    </w:p>
+    <w:p>
+      <w:pPr>
+        <w:pStyle w:val="Keterangan"/>
+        <w:spacing w:before="0" w:after="260"/>
+        <w:jc w:val="center"/>
+      </w:pPr>
+      <w:r>
+        <w:rPr>
+          <w:b/>
+          <w:bCs/>
+          <w:i w:val="0"/>
+          <w:iCs w:val="0"/>
+          <w:color w:val="045E6A"/>
+        </w:rPr>
+        <w:t xml:space="preserve">Gambar 5.8</w:t>
+      </w:r>
+      <w:r>
+        <w:t xml:space="preserve"> — Menu Buat Usulan Perjadin (1) membuka pilihan jalur; pilih yang sesuai, misalnya Perjalanan Luar Kota (2).</w:t>
+      </w:r>
+    </w:p>
+    <w:p>
+      <w:pPr>
         <w:pStyle w:val="ListParagraph"/>
         <w:numPr>
           <w:ilvl w:val="0"/>
@@ -4595,6 +5215,75 @@
     </w:p>
     <w:p>
       <w:pPr>
+        <w:keepNext/>
+        <w:spacing w:before="160" w:after="80"/>
+        <w:jc w:val="center"/>
+      </w:pPr>
+      <w:r>
+        <w:drawing>
+          <wp:inline distT="0" distB="0" distL="0" distR="0">
+            <wp:extent cx="5724000" cy="2499480"/>
+            <wp:effectExtent l="0" t="0" r="0" b="0"/>
+            <wp:docPr id="210" name="usulan-02-dasar"/>
+            <wp:cNvGraphicFramePr>
+              <a:graphicFrameLocks xmlns:a="http://schemas.openxmlformats.org/drawingml/2006/main" noChangeAspect="1"/>
+            </wp:cNvGraphicFramePr>
+            <a:graphic xmlns:a="http://schemas.openxmlformats.org/drawingml/2006/main">
+              <a:graphicData uri="http://schemas.openxmlformats.org/drawingml/2006/picture">
+                <pic:pic xmlns:pic="http://schemas.openxmlformats.org/drawingml/2006/picture">
+                  <pic:nvPicPr>
+                    <pic:cNvPr id="210" name="usulan-02-dasar"/>
+                    <pic:cNvPicPr/>
+                  </pic:nvPicPr>
+                  <pic:blipFill>
+                    <a:blip r:embed="rIdPanduan210"/>
+                    <a:stretch>
+                      <a:fillRect/>
+                    </a:stretch>
+                  </pic:blipFill>
+                  <pic:spPr>
+                    <a:xfrm>
+                      <a:off x="0" y="0"/>
+                      <a:ext cx="5724000" cy="2499480"/>
+                    </a:xfrm>
+                    <a:prstGeom prst="rect">
+                      <a:avLst/>
+                    </a:prstGeom>
+                    <a:ln w="9525">
+                      <a:solidFill>
+                        <a:srgbClr val="D5DEE0"/>
+                      </a:solidFill>
+                    </a:ln>
+                  </pic:spPr>
+                </pic:pic>
+              </a:graphicData>
+            </a:graphic>
+          </wp:inline>
+        </w:drawing>
+      </w:r>
+    </w:p>
+    <w:p>
+      <w:pPr>
+        <w:pStyle w:val="Keterangan"/>
+        <w:spacing w:before="0" w:after="260"/>
+        <w:jc w:val="center"/>
+      </w:pPr>
+      <w:r>
+        <w:rPr>
+          <w:b/>
+          <w:bCs/>
+          <w:i w:val="0"/>
+          <w:iCs w:val="0"/>
+          <w:color w:val="045E6A"/>
+        </w:rPr>
+        <w:t xml:space="preserve">Gambar 5.9</w:t>
+      </w:r>
+      <w:r>
+        <w:t xml:space="preserve"> — SPD dari aplikasi (1) mengisi formulir secara otomatis; jalur yang dipilih tampil di kanan atas dan dapat diganti (2).</w:t>
+      </w:r>
+    </w:p>
+    <w:p>
+      <w:pPr>
         <w:pStyle w:val="ListParagraph"/>
         <w:numPr>
           <w:ilvl w:val="0"/>
@@ -4617,6 +5306,152 @@
     </w:p>
     <w:p>
       <w:pPr>
+        <w:keepNext/>
+        <w:spacing w:before="160" w:after="80"/>
+        <w:jc w:val="center"/>
+      </w:pPr>
+      <w:r>
+        <w:drawing>
+          <wp:inline distT="0" distB="0" distL="0" distR="0">
+            <wp:extent cx="3780000" cy="4488120"/>
+            <wp:effectExtent l="0" t="0" r="0" b="0"/>
+            <wp:docPr id="211" name="usulan-03-berkas"/>
+            <wp:cNvGraphicFramePr>
+              <a:graphicFrameLocks xmlns:a="http://schemas.openxmlformats.org/drawingml/2006/main" noChangeAspect="1"/>
+            </wp:cNvGraphicFramePr>
+            <a:graphic xmlns:a="http://schemas.openxmlformats.org/drawingml/2006/main">
+              <a:graphicData uri="http://schemas.openxmlformats.org/drawingml/2006/picture">
+                <pic:pic xmlns:pic="http://schemas.openxmlformats.org/drawingml/2006/picture">
+                  <pic:nvPicPr>
+                    <pic:cNvPr id="211" name="usulan-03-berkas"/>
+                    <pic:cNvPicPr/>
+                  </pic:nvPicPr>
+                  <pic:blipFill>
+                    <a:blip r:embed="rIdPanduan211"/>
+                    <a:stretch>
+                      <a:fillRect/>
+                    </a:stretch>
+                  </pic:blipFill>
+                  <pic:spPr>
+                    <a:xfrm>
+                      <a:off x="0" y="0"/>
+                      <a:ext cx="3780000" cy="4488120"/>
+                    </a:xfrm>
+                    <a:prstGeom prst="rect">
+                      <a:avLst/>
+                    </a:prstGeom>
+                    <a:ln w="9525">
+                      <a:solidFill>
+                        <a:srgbClr val="D5DEE0"/>
+                      </a:solidFill>
+                    </a:ln>
+                  </pic:spPr>
+                </pic:pic>
+              </a:graphicData>
+            </a:graphic>
+          </wp:inline>
+        </w:drawing>
+      </w:r>
+    </w:p>
+    <w:p>
+      <w:pPr>
+        <w:pStyle w:val="Keterangan"/>
+        <w:spacing w:before="0" w:after="260"/>
+        <w:jc w:val="center"/>
+      </w:pPr>
+      <w:r>
+        <w:rPr>
+          <w:b/>
+          <w:bCs/>
+          <w:i w:val="0"/>
+          <w:iCs w:val="0"/>
+          <w:color w:val="045E6A"/>
+        </w:rPr>
+        <w:t xml:space="preserve">Gambar 5.10</w:t>
+      </w:r>
+      <w:r>
+        <w:t xml:space="preserve"> — Surat tugas diambil dari SPD yang dipilih (1); unggah SPD bertanda tangan (2) dan salin nomor naskahnya dari SRIKANDI (3).</w:t>
+      </w:r>
+    </w:p>
+    <w:p>
+      <w:pPr>
+        <w:spacing w:before="60" w:after="160"/>
+      </w:pPr>
+      <w:r>
+        <w:t xml:space="preserve">Pada jalur Supervisi Kerja Praktek / Magang, isian SPD baru muncul setelah kategori Supervisi Luar Kota dipilih. Supervisi di dalam kota cukup dengan surat tugas.</w:t>
+      </w:r>
+    </w:p>
+    <w:p>
+      <w:pPr>
+        <w:keepNext/>
+        <w:spacing w:before="160" w:after="80"/>
+        <w:jc w:val="center"/>
+      </w:pPr>
+      <w:r>
+        <w:drawing>
+          <wp:inline distT="0" distB="0" distL="0" distR="0">
+            <wp:extent cx="3420000" cy="5606520"/>
+            <wp:effectExtent l="0" t="0" r="0" b="0"/>
+            <wp:docPr id="212" name="usulan-08-supervisi"/>
+            <wp:cNvGraphicFramePr>
+              <a:graphicFrameLocks xmlns:a="http://schemas.openxmlformats.org/drawingml/2006/main" noChangeAspect="1"/>
+            </wp:cNvGraphicFramePr>
+            <a:graphic xmlns:a="http://schemas.openxmlformats.org/drawingml/2006/main">
+              <a:graphicData uri="http://schemas.openxmlformats.org/drawingml/2006/picture">
+                <pic:pic xmlns:pic="http://schemas.openxmlformats.org/drawingml/2006/picture">
+                  <pic:nvPicPr>
+                    <pic:cNvPr id="212" name="usulan-08-supervisi"/>
+                    <pic:cNvPicPr/>
+                  </pic:nvPicPr>
+                  <pic:blipFill>
+                    <a:blip r:embed="rIdPanduan212"/>
+                    <a:stretch>
+                      <a:fillRect/>
+                    </a:stretch>
+                  </pic:blipFill>
+                  <pic:spPr>
+                    <a:xfrm>
+                      <a:off x="0" y="0"/>
+                      <a:ext cx="3420000" cy="5606520"/>
+                    </a:xfrm>
+                    <a:prstGeom prst="rect">
+                      <a:avLst/>
+                    </a:prstGeom>
+                    <a:ln w="9525">
+                      <a:solidFill>
+                        <a:srgbClr val="D5DEE0"/>
+                      </a:solidFill>
+                    </a:ln>
+                  </pic:spPr>
+                </pic:pic>
+              </a:graphicData>
+            </a:graphic>
+          </wp:inline>
+        </w:drawing>
+      </w:r>
+    </w:p>
+    <w:p>
+      <w:pPr>
+        <w:pStyle w:val="Keterangan"/>
+        <w:spacing w:before="0" w:after="260"/>
+        <w:jc w:val="center"/>
+      </w:pPr>
+      <w:r>
+        <w:rPr>
+          <w:b/>
+          <w:bCs/>
+          <w:i w:val="0"/>
+          <w:iCs w:val="0"/>
+          <w:color w:val="045E6A"/>
+        </w:rPr>
+        <w:t xml:space="preserve">Gambar 5.11</w:t>
+      </w:r>
+      <w:r>
+        <w:t xml:space="preserve"> — Jalur supervisi: kategori luar kota (3) memunculkan catatan (1) dan isian SPD bertanda tangan (2).</w:t>
+      </w:r>
+    </w:p>
+    <w:p>
+      <w:pPr>
         <w:pStyle w:val="ListParagraph"/>
         <w:numPr>
           <w:ilvl w:val="0"/>
@@ -4661,6 +5496,75 @@
     </w:p>
     <w:p>
       <w:pPr>
+        <w:keepNext/>
+        <w:spacing w:before="160" w:after="80"/>
+        <w:jc w:val="center"/>
+      </w:pPr>
+      <w:r>
+        <w:drawing>
+          <wp:inline distT="0" distB="0" distL="0" distR="0">
+            <wp:extent cx="4320000" cy="3657600"/>
+            <wp:effectExtent l="0" t="0" r="0" b="0"/>
+            <wp:docPr id="213" name="usulan-04-kegiatan"/>
+            <wp:cNvGraphicFramePr>
+              <a:graphicFrameLocks xmlns:a="http://schemas.openxmlformats.org/drawingml/2006/main" noChangeAspect="1"/>
+            </wp:cNvGraphicFramePr>
+            <a:graphic xmlns:a="http://schemas.openxmlformats.org/drawingml/2006/main">
+              <a:graphicData uri="http://schemas.openxmlformats.org/drawingml/2006/picture">
+                <pic:pic xmlns:pic="http://schemas.openxmlformats.org/drawingml/2006/picture">
+                  <pic:nvPicPr>
+                    <pic:cNvPr id="213" name="usulan-04-kegiatan"/>
+                    <pic:cNvPicPr/>
+                  </pic:nvPicPr>
+                  <pic:blipFill>
+                    <a:blip r:embed="rIdPanduan213"/>
+                    <a:stretch>
+                      <a:fillRect/>
+                    </a:stretch>
+                  </pic:blipFill>
+                  <pic:spPr>
+                    <a:xfrm>
+                      <a:off x="0" y="0"/>
+                      <a:ext cx="4320000" cy="3657600"/>
+                    </a:xfrm>
+                    <a:prstGeom prst="rect">
+                      <a:avLst/>
+                    </a:prstGeom>
+                    <a:ln w="9525">
+                      <a:solidFill>
+                        <a:srgbClr val="D5DEE0"/>
+                      </a:solidFill>
+                    </a:ln>
+                  </pic:spPr>
+                </pic:pic>
+              </a:graphicData>
+            </a:graphic>
+          </wp:inline>
+        </w:drawing>
+      </w:r>
+    </w:p>
+    <w:p>
+      <w:pPr>
+        <w:pStyle w:val="Keterangan"/>
+        <w:spacing w:before="0" w:after="260"/>
+        <w:jc w:val="center"/>
+      </w:pPr>
+      <w:r>
+        <w:rPr>
+          <w:b/>
+          <w:bCs/>
+          <w:i w:val="0"/>
+          <w:iCs w:val="0"/>
+          <w:color w:val="045E6A"/>
+        </w:rPr>
+        <w:t xml:space="preserve">Gambar 5.12</w:t>
+      </w:r>
+      <w:r>
+        <w:t xml:space="preserve"> — Jenis kegiatan (1), kategori perjalanan (2), lokasi dan instansi tujuan (3), serta tanggal yang tersalin dari SPD (4).</w:t>
+      </w:r>
+    </w:p>
+    <w:p>
+      <w:pPr>
         <w:pStyle w:val="ListParagraph"/>
         <w:numPr>
           <w:ilvl w:val="0"/>
@@ -4683,6 +5587,221 @@
     </w:p>
     <w:p>
       <w:pPr>
+        <w:keepNext/>
+        <w:spacing w:before="160" w:after="80"/>
+        <w:jc w:val="center"/>
+      </w:pPr>
+      <w:r>
+        <w:drawing>
+          <wp:inline distT="0" distB="0" distL="0" distR="0">
+            <wp:extent cx="2700000" cy="2285611"/>
+            <wp:effectExtent l="0" t="0" r="0" b="0"/>
+            <wp:docPr id="214" name="usulan-05-tindakan"/>
+            <wp:cNvGraphicFramePr>
+              <a:graphicFrameLocks xmlns:a="http://schemas.openxmlformats.org/drawingml/2006/main" noChangeAspect="1"/>
+            </wp:cNvGraphicFramePr>
+            <a:graphic xmlns:a="http://schemas.openxmlformats.org/drawingml/2006/main">
+              <a:graphicData uri="http://schemas.openxmlformats.org/drawingml/2006/picture">
+                <pic:pic xmlns:pic="http://schemas.openxmlformats.org/drawingml/2006/picture">
+                  <pic:nvPicPr>
+                    <pic:cNvPr id="214" name="usulan-05-tindakan"/>
+                    <pic:cNvPicPr/>
+                  </pic:nvPicPr>
+                  <pic:blipFill>
+                    <a:blip r:embed="rIdPanduan214"/>
+                    <a:stretch>
+                      <a:fillRect/>
+                    </a:stretch>
+                  </pic:blipFill>
+                  <pic:spPr>
+                    <a:xfrm>
+                      <a:off x="0" y="0"/>
+                      <a:ext cx="2700000" cy="2285611"/>
+                    </a:xfrm>
+                    <a:prstGeom prst="rect">
+                      <a:avLst/>
+                    </a:prstGeom>
+                    <a:ln w="9525">
+                      <a:solidFill>
+                        <a:srgbClr val="D5DEE0"/>
+                      </a:solidFill>
+                    </a:ln>
+                  </pic:spPr>
+                </pic:pic>
+              </a:graphicData>
+            </a:graphic>
+          </wp:inline>
+        </w:drawing>
+      </w:r>
+    </w:p>
+    <w:p>
+      <w:pPr>
+        <w:pStyle w:val="Keterangan"/>
+        <w:spacing w:before="0" w:after="260"/>
+        <w:jc w:val="center"/>
+      </w:pPr>
+      <w:r>
+        <w:rPr>
+          <w:b/>
+          <w:bCs/>
+          <w:i w:val="0"/>
+          <w:iCs w:val="0"/>
+          <w:color w:val="045E6A"/>
+        </w:rPr>
+        <w:t xml:space="preserve">Gambar 5.13</w:t>
+      </w:r>
+      <w:r>
+        <w:t xml:space="preserve"> — Tombol Kirim Pengajuan Perjadin (1), atau Simpan Draft (2) bila belum siap dikirim.</w:t>
+      </w:r>
+    </w:p>
+    <w:p>
+      <w:pPr>
+        <w:keepNext/>
+        <w:spacing w:before="160" w:after="80"/>
+        <w:jc w:val="center"/>
+      </w:pPr>
+      <w:r>
+        <w:drawing>
+          <wp:inline distT="0" distB="0" distL="0" distR="0">
+            <wp:extent cx="5724000" cy="3579408"/>
+            <wp:effectExtent l="0" t="0" r="0" b="0"/>
+            <wp:docPr id="215" name="usulan-06-konfirmasi"/>
+            <wp:cNvGraphicFramePr>
+              <a:graphicFrameLocks xmlns:a="http://schemas.openxmlformats.org/drawingml/2006/main" noChangeAspect="1"/>
+            </wp:cNvGraphicFramePr>
+            <a:graphic xmlns:a="http://schemas.openxmlformats.org/drawingml/2006/main">
+              <a:graphicData uri="http://schemas.openxmlformats.org/drawingml/2006/picture">
+                <pic:pic xmlns:pic="http://schemas.openxmlformats.org/drawingml/2006/picture">
+                  <pic:nvPicPr>
+                    <pic:cNvPr id="215" name="usulan-06-konfirmasi"/>
+                    <pic:cNvPicPr/>
+                  </pic:nvPicPr>
+                  <pic:blipFill>
+                    <a:blip r:embed="rIdPanduan215"/>
+                    <a:stretch>
+                      <a:fillRect/>
+                    </a:stretch>
+                  </pic:blipFill>
+                  <pic:spPr>
+                    <a:xfrm>
+                      <a:off x="0" y="0"/>
+                      <a:ext cx="5724000" cy="3579408"/>
+                    </a:xfrm>
+                    <a:prstGeom prst="rect">
+                      <a:avLst/>
+                    </a:prstGeom>
+                    <a:ln w="9525">
+                      <a:solidFill>
+                        <a:srgbClr val="D5DEE0"/>
+                      </a:solidFill>
+                    </a:ln>
+                  </pic:spPr>
+                </pic:pic>
+              </a:graphicData>
+            </a:graphic>
+          </wp:inline>
+        </w:drawing>
+      </w:r>
+    </w:p>
+    <w:p>
+      <w:pPr>
+        <w:pStyle w:val="Keterangan"/>
+        <w:spacing w:before="0" w:after="260"/>
+        <w:jc w:val="center"/>
+      </w:pPr>
+      <w:r>
+        <w:rPr>
+          <w:b/>
+          <w:bCs/>
+          <w:i w:val="0"/>
+          <w:iCs w:val="0"/>
+          <w:color w:val="045E6A"/>
+        </w:rPr>
+        <w:t xml:space="preserve">Gambar 5.14</w:t>
+      </w:r>
+      <w:r>
+        <w:t xml:space="preserve"> — Kotak konfirmasi memuat ringkasan isian (1); tekan Ya, Kirim (2) untuk mengajukan.</w:t>
+      </w:r>
+    </w:p>
+    <w:p>
+      <w:pPr>
+        <w:spacing w:before="60" w:after="160"/>
+      </w:pPr>
+      <w:r>
+        <w:t xml:space="preserve">Usulan yang terkirim langsung tampil pada Daftar Usulan Perjadin berstatus Konfirmasi, beserta tahap berikutnya yang sedang ditunggu — biasanya pembayaran uang muka.</w:t>
+      </w:r>
+    </w:p>
+    <w:p>
+      <w:pPr>
+        <w:keepNext/>
+        <w:spacing w:before="160" w:after="80"/>
+        <w:jc w:val="center"/>
+      </w:pPr>
+      <w:r>
+        <w:drawing>
+          <wp:inline distT="0" distB="0" distL="0" distR="0">
+            <wp:extent cx="5400000" cy="3466800"/>
+            <wp:effectExtent l="0" t="0" r="0" b="0"/>
+            <wp:docPr id="216" name="usulan-07-daftar"/>
+            <wp:cNvGraphicFramePr>
+              <a:graphicFrameLocks xmlns:a="http://schemas.openxmlformats.org/drawingml/2006/main" noChangeAspect="1"/>
+            </wp:cNvGraphicFramePr>
+            <a:graphic xmlns:a="http://schemas.openxmlformats.org/drawingml/2006/main">
+              <a:graphicData uri="http://schemas.openxmlformats.org/drawingml/2006/picture">
+                <pic:pic xmlns:pic="http://schemas.openxmlformats.org/drawingml/2006/picture">
+                  <pic:nvPicPr>
+                    <pic:cNvPr id="216" name="usulan-07-daftar"/>
+                    <pic:cNvPicPr/>
+                  </pic:nvPicPr>
+                  <pic:blipFill>
+                    <a:blip r:embed="rIdPanduan216"/>
+                    <a:stretch>
+                      <a:fillRect/>
+                    </a:stretch>
+                  </pic:blipFill>
+                  <pic:spPr>
+                    <a:xfrm>
+                      <a:off x="0" y="0"/>
+                      <a:ext cx="5400000" cy="3466800"/>
+                    </a:xfrm>
+                    <a:prstGeom prst="rect">
+                      <a:avLst/>
+                    </a:prstGeom>
+                    <a:ln w="9525">
+                      <a:solidFill>
+                        <a:srgbClr val="D5DEE0"/>
+                      </a:solidFill>
+                    </a:ln>
+                  </pic:spPr>
+                </pic:pic>
+              </a:graphicData>
+            </a:graphic>
+          </wp:inline>
+        </w:drawing>
+      </w:r>
+    </w:p>
+    <w:p>
+      <w:pPr>
+        <w:pStyle w:val="Keterangan"/>
+        <w:spacing w:before="0" w:after="260"/>
+        <w:jc w:val="center"/>
+      </w:pPr>
+      <w:r>
+        <w:rPr>
+          <w:b/>
+          <w:bCs/>
+          <w:i w:val="0"/>
+          <w:iCs w:val="0"/>
+          <w:color w:val="045E6A"/>
+        </w:rPr>
+        <w:t xml:space="preserve">Gambar 5.15</w:t>
+      </w:r>
+      <w:r>
+        <w:t xml:space="preserve"> — Pesan berhasil (1), nomor usulan (2), dan statusnya (3) pada Daftar Usulan Perjadin.</w:t>
+      </w:r>
+    </w:p>
+    <w:p>
+      <w:pPr>
         <w:spacing w:after="160"/>
       </w:pPr>
     </w:p>
@@ -4691,7 +5810,7 @@
         <w:tblW w:type="dxa" w:w="9026"/>
         <w:tblBorders>
           <w:top w:val="single" w:color="D3DAE4" w:sz="2"/>
-          <w:left w:val="single" w:color="1D5C8F" w:sz="18"/>
+          <w:left w:val="single" w:color="0B7F87" w:sz="18"/>
           <w:bottom w:val="single" w:color="D3DAE4" w:sz="2"/>
           <w:right w:val="single" w:color="D3DAE4" w:sz="2"/>
           <w:insideH w:val="none"/>
@@ -4705,7 +5824,7 @@
         <w:tc>
           <w:tcPr>
             <w:tcW w:type="dxa" w:w="9026"/>
-            <w:shd w:fill="EDF0F5" w:val="clear"/>
+            <w:shd w:fill="EAF5F4" w:val="clear"/>
             <w:tcMar>
               <w:top w:type="dxa" w:w="120"/>
               <w:left w:type="dxa" w:w="180"/>
@@ -4721,7 +5840,7 @@
               <w:rPr>
                 <w:b/>
                 <w:bCs/>
-                <w:color w:val="1D5C8F"/>
+                <w:color w:val="0B7F87"/>
                 <w:spacing w:val="20"/>
                 <w:sz w:val="16"/>
                 <w:szCs w:val="16"/>
@@ -4786,7 +5905,7 @@
         <w:tc>
           <w:tcPr>
             <w:tcW w:type="dxa" w:w="5480"/>
-            <w:shd w:fill="EDF0F5" w:val="clear"/>
+            <w:shd w:fill="EAF5F4" w:val="clear"/>
             <w:tcMar>
               <w:top w:type="dxa" w:w="80"/>
               <w:left w:type="dxa" w:w="120"/>
@@ -4812,7 +5931,7 @@
         <w:tc>
           <w:tcPr>
             <w:tcW w:type="dxa" w:w="1773"/>
-            <w:shd w:fill="EDF0F5" w:val="clear"/>
+            <w:shd w:fill="EAF5F4" w:val="clear"/>
             <w:tcMar>
               <w:top w:type="dxa" w:w="80"/>
               <w:left w:type="dxa" w:w="120"/>
@@ -4838,7 +5957,7 @@
         <w:tc>
           <w:tcPr>
             <w:tcW w:type="dxa" w:w="1773"/>
-            <w:shd w:fill="EDF0F5" w:val="clear"/>
+            <w:shd w:fill="EAF5F4" w:val="clear"/>
             <w:tcMar>
               <w:top w:type="dxa" w:w="80"/>
               <w:left w:type="dxa" w:w="120"/>
@@ -5489,7 +6608,7 @@
         <w:tblW w:type="dxa" w:w="9026"/>
         <w:tblBorders>
           <w:top w:val="single" w:color="D3DAE4" w:sz="2"/>
-          <w:left w:val="single" w:color="1D5C8F" w:sz="18"/>
+          <w:left w:val="single" w:color="0B7F87" w:sz="18"/>
           <w:bottom w:val="single" w:color="D3DAE4" w:sz="2"/>
           <w:right w:val="single" w:color="D3DAE4" w:sz="2"/>
           <w:insideH w:val="none"/>
@@ -5503,7 +6622,7 @@
         <w:tc>
           <w:tcPr>
             <w:tcW w:type="dxa" w:w="9026"/>
-            <w:shd w:fill="EDF0F5" w:val="clear"/>
+            <w:shd w:fill="EAF5F4" w:val="clear"/>
             <w:tcMar>
               <w:top w:type="dxa" w:w="120"/>
               <w:left w:type="dxa" w:w="180"/>
@@ -5519,7 +6638,7 @@
               <w:rPr>
                 <w:b/>
                 <w:bCs/>
-                <w:color w:val="1D5C8F"/>
+                <w:color w:val="0B7F87"/>
                 <w:spacing w:val="20"/>
                 <w:sz w:val="16"/>
                 <w:szCs w:val="16"/>
@@ -5690,7 +6809,7 @@
         <w:tc>
           <w:tcPr>
             <w:tcW w:type="dxa" w:w="2462"/>
-            <w:shd w:fill="EDF0F5" w:val="clear"/>
+            <w:shd w:fill="EAF5F4" w:val="clear"/>
             <w:tcMar>
               <w:top w:type="dxa" w:w="80"/>
               <w:left w:type="dxa" w:w="120"/>
@@ -5716,7 +6835,7 @@
         <w:tc>
           <w:tcPr>
             <w:tcW w:type="dxa" w:w="1641"/>
-            <w:shd w:fill="EDF0F5" w:val="clear"/>
+            <w:shd w:fill="EAF5F4" w:val="clear"/>
             <w:tcMar>
               <w:top w:type="dxa" w:w="80"/>
               <w:left w:type="dxa" w:w="120"/>
@@ -5742,7 +6861,7 @@
         <w:tc>
           <w:tcPr>
             <w:tcW w:type="dxa" w:w="4923"/>
-            <w:shd w:fill="EDF0F5" w:val="clear"/>
+            <w:shd w:fill="EAF5F4" w:val="clear"/>
             <w:tcMar>
               <w:top w:type="dxa" w:w="80"/>
               <w:left w:type="dxa" w:w="120"/>
@@ -6024,7 +7143,7 @@
         <w:tblW w:type="dxa" w:w="9026"/>
         <w:tblBorders>
           <w:top w:val="single" w:color="D3DAE4" w:sz="2"/>
-          <w:left w:val="single" w:color="1D5C8F" w:sz="18"/>
+          <w:left w:val="single" w:color="0B7F87" w:sz="18"/>
           <w:bottom w:val="single" w:color="D3DAE4" w:sz="2"/>
           <w:right w:val="single" w:color="D3DAE4" w:sz="2"/>
           <w:insideH w:val="none"/>
@@ -6038,7 +7157,7 @@
         <w:tc>
           <w:tcPr>
             <w:tcW w:type="dxa" w:w="9026"/>
-            <w:shd w:fill="EDF0F5" w:val="clear"/>
+            <w:shd w:fill="EAF5F4" w:val="clear"/>
             <w:tcMar>
               <w:top w:type="dxa" w:w="120"/>
               <w:left w:type="dxa" w:w="180"/>
@@ -6054,7 +7173,7 @@
               <w:rPr>
                 <w:b/>
                 <w:bCs/>
-                <w:color w:val="1D5C8F"/>
+                <w:color w:val="0B7F87"/>
                 <w:spacing w:val="20"/>
                 <w:sz w:val="16"/>
                 <w:szCs w:val="16"/>
@@ -6262,7 +7381,7 @@
         <w:tblW w:type="dxa" w:w="9026"/>
         <w:tblBorders>
           <w:top w:val="single" w:color="D3DAE4" w:sz="2"/>
-          <w:left w:val="single" w:color="1D5C8F" w:sz="18"/>
+          <w:left w:val="single" w:color="0B7F87" w:sz="18"/>
           <w:bottom w:val="single" w:color="D3DAE4" w:sz="2"/>
           <w:right w:val="single" w:color="D3DAE4" w:sz="2"/>
           <w:insideH w:val="none"/>
@@ -6276,7 +7395,7 @@
         <w:tc>
           <w:tcPr>
             <w:tcW w:type="dxa" w:w="9026"/>
-            <w:shd w:fill="EDF0F5" w:val="clear"/>
+            <w:shd w:fill="EAF5F4" w:val="clear"/>
             <w:tcMar>
               <w:top w:type="dxa" w:w="120"/>
               <w:left w:type="dxa" w:w="180"/>
@@ -6292,7 +7411,7 @@
               <w:rPr>
                 <w:b/>
                 <w:bCs/>
-                <w:color w:val="1D5C8F"/>
+                <w:color w:val="0B7F87"/>
                 <w:spacing w:val="20"/>
                 <w:sz w:val="16"/>
                 <w:szCs w:val="16"/>
@@ -6477,7 +7596,7 @@
         <w:tblW w:type="dxa" w:w="9026"/>
         <w:tblBorders>
           <w:top w:val="single" w:color="D3DAE4" w:sz="2"/>
-          <w:left w:val="single" w:color="1D5C8F" w:sz="18"/>
+          <w:left w:val="single" w:color="0B7F87" w:sz="18"/>
           <w:bottom w:val="single" w:color="D3DAE4" w:sz="2"/>
           <w:right w:val="single" w:color="D3DAE4" w:sz="2"/>
           <w:insideH w:val="none"/>
@@ -6491,7 +7610,7 @@
         <w:tc>
           <w:tcPr>
             <w:tcW w:type="dxa" w:w="9026"/>
-            <w:shd w:fill="EDF0F5" w:val="clear"/>
+            <w:shd w:fill="EAF5F4" w:val="clear"/>
             <w:tcMar>
               <w:top w:type="dxa" w:w="120"/>
               <w:left w:type="dxa" w:w="180"/>
@@ -6507,7 +7626,7 @@
               <w:rPr>
                 <w:b/>
                 <w:bCs/>
-                <w:color w:val="1D5C8F"/>
+                <w:color w:val="0B7F87"/>
                 <w:spacing w:val="20"/>
                 <w:sz w:val="16"/>
                 <w:szCs w:val="16"/>
@@ -6689,7 +7808,7 @@
         <w:tblW w:type="dxa" w:w="9026"/>
         <w:tblBorders>
           <w:top w:val="single" w:color="D3DAE4" w:sz="2"/>
-          <w:left w:val="single" w:color="1D5C8F" w:sz="18"/>
+          <w:left w:val="single" w:color="0B7F87" w:sz="18"/>
           <w:bottom w:val="single" w:color="D3DAE4" w:sz="2"/>
           <w:right w:val="single" w:color="D3DAE4" w:sz="2"/>
           <w:insideH w:val="none"/>
@@ -6703,7 +7822,7 @@
         <w:tc>
           <w:tcPr>
             <w:tcW w:type="dxa" w:w="9026"/>
-            <w:shd w:fill="EDF0F5" w:val="clear"/>
+            <w:shd w:fill="EAF5F4" w:val="clear"/>
             <w:tcMar>
               <w:top w:type="dxa" w:w="120"/>
               <w:left w:type="dxa" w:w="180"/>
@@ -6719,7 +7838,7 @@
               <w:rPr>
                 <w:b/>
                 <w:bCs/>
-                <w:color w:val="1D5C8F"/>
+                <w:color w:val="0B7F87"/>
                 <w:spacing w:val="20"/>
                 <w:sz w:val="16"/>
                 <w:szCs w:val="16"/>
@@ -6847,7 +7966,7 @@
         <w:tc>
           <w:tcPr>
             <w:tcW w:type="dxa" w:w="2888"/>
-            <w:shd w:fill="EDF0F5" w:val="clear"/>
+            <w:shd w:fill="EAF5F4" w:val="clear"/>
             <w:tcMar>
               <w:top w:type="dxa" w:w="80"/>
               <w:left w:type="dxa" w:w="120"/>
@@ -6873,7 +7992,7 @@
         <w:tc>
           <w:tcPr>
             <w:tcW w:type="dxa" w:w="6138"/>
-            <w:shd w:fill="EDF0F5" w:val="clear"/>
+            <w:shd w:fill="EAF5F4" w:val="clear"/>
             <w:tcMar>
               <w:top w:type="dxa" w:w="80"/>
               <w:left w:type="dxa" w:w="120"/>
@@ -7596,7 +8715,7 @@
         <w:tc>
           <w:tcPr>
             <w:tcW w:type="dxa" w:w="1969"/>
-            <w:shd w:fill="EDF0F5" w:val="clear"/>
+            <w:shd w:fill="EAF5F4" w:val="clear"/>
             <w:tcMar>
               <w:top w:type="dxa" w:w="80"/>
               <w:left w:type="dxa" w:w="120"/>
@@ -7622,7 +8741,7 @@
         <w:tc>
           <w:tcPr>
             <w:tcW w:type="dxa" w:w="4923"/>
-            <w:shd w:fill="EDF0F5" w:val="clear"/>
+            <w:shd w:fill="EAF5F4" w:val="clear"/>
             <w:tcMar>
               <w:top w:type="dxa" w:w="80"/>
               <w:left w:type="dxa" w:w="120"/>
@@ -7648,7 +8767,7 @@
         <w:tc>
           <w:tcPr>
             <w:tcW w:type="dxa" w:w="2134"/>
-            <w:shd w:fill="EDF0F5" w:val="clear"/>
+            <w:shd w:fill="EAF5F4" w:val="clear"/>
             <w:tcMar>
               <w:top w:type="dxa" w:w="80"/>
               <w:left w:type="dxa" w:w="120"/>
@@ -8941,7 +10060,7 @@
         <w:tc>
           <w:tcPr>
             <w:tcW w:type="dxa" w:w="2888"/>
-            <w:shd w:fill="EDF0F5" w:val="clear"/>
+            <w:shd w:fill="EAF5F4" w:val="clear"/>
             <w:tcMar>
               <w:top w:type="dxa" w:w="80"/>
               <w:left w:type="dxa" w:w="120"/>
@@ -8967,7 +10086,7 @@
         <w:tc>
           <w:tcPr>
             <w:tcW w:type="dxa" w:w="6138"/>
-            <w:shd w:fill="EDF0F5" w:val="clear"/>
+            <w:shd w:fill="EAF5F4" w:val="clear"/>
             <w:tcMar>
               <w:top w:type="dxa" w:w="80"/>
               <w:left w:type="dxa" w:w="120"/>
@@ -9340,7 +10459,7 @@
         <w:tc>
           <w:tcPr>
             <w:tcW w:type="dxa" w:w="2888"/>
-            <w:shd w:fill="EDF0F5" w:val="clear"/>
+            <w:shd w:fill="EAF5F4" w:val="clear"/>
             <w:tcMar>
               <w:top w:type="dxa" w:w="80"/>
               <w:left w:type="dxa" w:w="120"/>
@@ -9366,7 +10485,7 @@
         <w:tc>
           <w:tcPr>
             <w:tcW w:type="dxa" w:w="6138"/>
-            <w:shd w:fill="EDF0F5" w:val="clear"/>
+            <w:shd w:fill="EAF5F4" w:val="clear"/>
             <w:tcMar>
               <w:top w:type="dxa" w:w="80"/>
               <w:left w:type="dxa" w:w="120"/>
@@ -9739,7 +10858,7 @@
         <w:tc>
           <w:tcPr>
             <w:tcW w:type="dxa" w:w="2888"/>
-            <w:shd w:fill="EDF0F5" w:val="clear"/>
+            <w:shd w:fill="EAF5F4" w:val="clear"/>
             <w:tcMar>
               <w:top w:type="dxa" w:w="80"/>
               <w:left w:type="dxa" w:w="120"/>
@@ -9765,7 +10884,7 @@
         <w:tc>
           <w:tcPr>
             <w:tcW w:type="dxa" w:w="6138"/>
-            <w:shd w:fill="EDF0F5" w:val="clear"/>
+            <w:shd w:fill="EAF5F4" w:val="clear"/>
             <w:tcMar>
               <w:top w:type="dxa" w:w="80"/>
               <w:left w:type="dxa" w:w="120"/>
@@ -10138,7 +11257,7 @@
         <w:tc>
           <w:tcPr>
             <w:tcW w:type="dxa" w:w="2888"/>
-            <w:shd w:fill="EDF0F5" w:val="clear"/>
+            <w:shd w:fill="EAF5F4" w:val="clear"/>
             <w:tcMar>
               <w:top w:type="dxa" w:w="80"/>
               <w:left w:type="dxa" w:w="120"/>
@@ -10164,7 +11283,7 @@
         <w:tc>
           <w:tcPr>
             <w:tcW w:type="dxa" w:w="6138"/>
-            <w:shd w:fill="EDF0F5" w:val="clear"/>
+            <w:shd w:fill="EAF5F4" w:val="clear"/>
             <w:tcMar>
               <w:top w:type="dxa" w:w="80"/>
               <w:left w:type="dxa" w:w="120"/>
@@ -10399,7 +11518,7 @@
         <w:tc>
           <w:tcPr>
             <w:tcW w:type="dxa" w:w="3249"/>
-            <w:shd w:fill="EDF0F5" w:val="clear"/>
+            <w:shd w:fill="EAF5F4" w:val="clear"/>
             <w:tcMar>
               <w:top w:type="dxa" w:w="80"/>
               <w:left w:type="dxa" w:w="120"/>
@@ -10425,7 +11544,7 @@
         <w:tc>
           <w:tcPr>
             <w:tcW w:type="dxa" w:w="5777"/>
-            <w:shd w:fill="EDF0F5" w:val="clear"/>
+            <w:shd w:fill="EAF5F4" w:val="clear"/>
             <w:tcMar>
               <w:top w:type="dxa" w:w="80"/>
               <w:left w:type="dxa" w:w="120"/>
@@ -11136,7 +12255,7 @@
         <w:tblW w:type="dxa" w:w="9026"/>
         <w:tblBorders>
           <w:top w:val="single" w:color="D3DAE4" w:sz="2"/>
-          <w:left w:val="single" w:color="1D5C8F" w:sz="18"/>
+          <w:left w:val="single" w:color="0B7F87" w:sz="18"/>
           <w:bottom w:val="single" w:color="D3DAE4" w:sz="2"/>
           <w:right w:val="single" w:color="D3DAE4" w:sz="2"/>
           <w:insideH w:val="none"/>
@@ -11150,7 +12269,7 @@
         <w:tc>
           <w:tcPr>
             <w:tcW w:type="dxa" w:w="9026"/>
-            <w:shd w:fill="EDF0F5" w:val="clear"/>
+            <w:shd w:fill="EAF5F4" w:val="clear"/>
             <w:tcMar>
               <w:top w:type="dxa" w:w="120"/>
               <w:left w:type="dxa" w:w="180"/>
@@ -11166,7 +12285,7 @@
               <w:rPr>
                 <w:b/>
                 <w:bCs/>
-                <w:color w:val="1D5C8F"/>
+                <w:color w:val="0B7F87"/>
                 <w:spacing w:val="20"/>
                 <w:sz w:val="16"/>
                 <w:szCs w:val="16"/>
@@ -11215,7 +12334,7 @@
         <w:pStyle w:val="Heading2"/>
       </w:pPr>
       <w:r>
-        <w:t xml:space="preserve">Versi 2.5.7 — 1 Oktober 2026</w:t>
+        <w:t xml:space="preserve">Versi 2.5.8 — 1 Oktober 2026</w:t>
       </w:r>
     </w:p>
     <w:p>
@@ -11227,7 +12346,7 @@
         </w:numPr>
       </w:pPr>
       <w:r>
-        <w:t xml:space="preserve">Supervisi kerja praktek / magang dibedakan menurut tujuannya: supervisi ke luar kota tetap menerbitkan SPD — berkas SPD bertanda tangan beserta nomornya wajib dilampirkan — sedangkan supervisi di dalam kota cukup surat tugas.</w:t>
+        <w:t xml:space="preserve">Buku panduan bersampul baru dengan warna Kemenkes. Bab 5.1 dan 5.2 kini bergambar: setiap langkah membuat SPD sampai mengajukan perjadin disertai tangkapan layar bertanda nomor.</w:t>
       </w:r>
     </w:p>
     <w:p>
@@ -11239,15 +12358,7 @@
         </w:numPr>
       </w:pPr>
       <w:r>
-        <w:t xml:space="preserve">Isian SPD pada formulir usulan muncul dan menghilang sendiri mengikuti kategori yang dipilih; checklist kelengkapan dan formulir Dokumen Perdin ikut menyesuaikan.</w:t>
-      </w:r>
-    </w:p>
-    <w:p>
-      <w:pPr>
-        <w:pStyle w:val="Heading2"/>
-      </w:pPr>
-      <w:r>
-        <w:t xml:space="preserve">Versi 2.5.6 — 1 Oktober 2026</w:t>
+        <w:t xml:space="preserve">Kotak konfirmasi sebelum mengirim pengajuan kini benar-benar menampilkan tujuan, tanggal, dan nomor SPD yang diisi — sebelumnya selalu tertulis "—".</w:t>
       </w:r>
     </w:p>
     <w:p>
@@ -11259,7 +12370,7 @@
         </w:numPr>
       </w:pPr>
       <w:r>
-        <w:t xml:space="preserve">Berkas Pertanggungjawaban (submenu Administrasi Sistem): berkas yang ditagih sesudah perjalanan dipilih sendiri untuk tiap jalur pengajuan, dan berlaku serentak pada formulir dokumen, checklist, serta penagihan.</w:t>
+        <w:t xml:space="preserve">Menu Panduan Penggunaan memuat tangkapan layar yang sama, dan buku lengkapnya dapat diunduh dalam format PDF maupun Word.</w:t>
       </w:r>
     </w:p>
     <w:p>
@@ -11267,7 +12378,7 @@
         <w:pStyle w:val="Heading2"/>
       </w:pPr>
       <w:r>
-        <w:t xml:space="preserve">Versi 2.5.5 — 1 Oktober 2026</w:t>
+        <w:t xml:space="preserve">Versi 2.5.7 — 1 Oktober 2026</w:t>
       </w:r>
     </w:p>
     <w:p>
@@ -11279,7 +12390,7 @@
         </w:numPr>
       </w:pPr>
       <w:r>
-        <w:t xml:space="preserve">Pengajuan perjadin dimulai dengan memilih jalur: dalam kota, luar kota, atau supervisi kerja praktek / magang. Jalur itu menyaring kategori perjalanan dinas dari Master Data.</w:t>
+        <w:t xml:space="preserve">Supervisi kerja praktek / magang dibedakan menurut tujuannya: supervisi ke luar kota tetap menerbitkan SPD — berkas SPD bertanda tangan beserta nomornya wajib dilampirkan — sedangkan supervisi di dalam kota cukup surat tugas.</w:t>
       </w:r>
     </w:p>
     <w:p>
@@ -11291,7 +12402,15 @@
         </w:numPr>
       </w:pPr>
       <w:r>
-        <w:t xml:space="preserve">Jalur supervisi kerja praktek / magang tidak memakai Surat Perjalanan Dinas: cukup surat tugas beserta nomornya, dan jenis kegiatannya terisi sendiri.</w:t>
+        <w:t xml:space="preserve">Isian SPD pada formulir usulan muncul dan menghilang sendiri mengikuti kategori yang dipilih; checklist kelengkapan dan formulir Dokumen Perdin ikut menyesuaikan.</w:t>
+      </w:r>
+    </w:p>
+    <w:p>
+      <w:pPr>
+        <w:pStyle w:val="Heading2"/>
+      </w:pPr>
+      <w:r>
+        <w:t xml:space="preserve">Versi 2.5.6 — 1 Oktober 2026</w:t>
       </w:r>
     </w:p>
     <w:p>
@@ -11303,7 +12422,15 @@
         </w:numPr>
       </w:pPr>
       <w:r>
-        <w:t xml:space="preserve">Kaki halaman SPD mengikuti cetakan terbaru — lambang Garuda Sertifikasi dilepas, alamat verifikasi menjadi tte.komdigi.go.id — dan butir V tidak lagi memuat penanda QR.</w:t>
+        <w:t xml:space="preserve">Berkas Pertanggungjawaban (submenu Administrasi Sistem): berkas yang ditagih sesudah perjalanan dipilih sendiri untuk tiap jalur pengajuan, dan berlaku serentak pada formulir dokumen, checklist, serta penagihan.</w:t>
+      </w:r>
+    </w:p>
+    <w:p>
+      <w:pPr>
+        <w:pStyle w:val="Heading2"/>
+      </w:pPr>
+      <w:r>
+        <w:t xml:space="preserve">Versi 2.5.5 — 1 Oktober 2026</w:t>
       </w:r>
     </w:p>
     <w:p>
@@ -11315,15 +12442,7 @@
         </w:numPr>
       </w:pPr>
       <w:r>
-        <w:t xml:space="preserve">Daftar Usulan Perjadin menyebut pelaksana perjalanan pada kolom pertama, menggantikan kolom Pemohon yang selalu kosong.</w:t>
-      </w:r>
-    </w:p>
-    <w:p>
-      <w:pPr>
-        <w:pStyle w:val="Heading2"/>
-      </w:pPr>
-      <w:r>
-        <w:t xml:space="preserve">Versi 2.5.4 — 30 September 2026</w:t>
+        <w:t xml:space="preserve">Pengajuan perjadin dimulai dengan memilih jalur: dalam kota, luar kota, atau supervisi kerja praktek / magang. Jalur itu menyaring kategori perjalanan dinas dari Master Data.</w:t>
       </w:r>
     </w:p>
     <w:p>
@@ -11335,7 +12454,7 @@
         </w:numPr>
       </w:pPr>
       <w:r>
-        <w:t xml:space="preserve">Dokumen Output (submenu Administrasi Sistem): tampilan empat dokumen cetak diatur dari aplikasi — ukuran kertas dan huruf, elemen yang ikut tercetak, serta teks bakunya. Tiap perubahan tercatat pada jejak audit dan dapat dikembalikan ke bawaan.</w:t>
+        <w:t xml:space="preserve">Jalur supervisi kerja praktek / magang tidak memakai Surat Perjalanan Dinas: cukup surat tugas beserta nomornya, dan jenis kegiatannya terisi sendiri.</w:t>
       </w:r>
     </w:p>
     <w:p>
@@ -11347,7 +12466,7 @@
         </w:numPr>
       </w:pPr>
       <w:r>
-        <w:t xml:space="preserve">Dokumen Output memuat pratinjau dokumen contoh yang ikut berubah mengikuti centangan elemen, lengkap dengan tombol buka di tab baru dan unduh contoh PDF.</w:t>
+        <w:t xml:space="preserve">Kaki halaman SPD mengikuti cetakan terbaru — lambang Garuda Sertifikasi dilepas, alamat verifikasi menjadi tte.komdigi.go.id — dan butir V tidak lagi memuat penanda QR.</w:t>
       </w:r>
     </w:p>
     <w:p>
@@ -11359,7 +12478,7 @@
         </w:numPr>
       </w:pPr>
       <w:r>
-        <w:t xml:space="preserve">Penanda tanda tangan elektronik SRIKANDI dan nomor naskah sengaja tidak dapat dimatikan, supaya surat tetap dapat ditandatangani secara elektronik.</w:t>
+        <w:t xml:space="preserve">Daftar Usulan Perjadin menyebut pelaksana perjalanan pada kolom pertama, menggantikan kolom Pemohon yang selalu kosong.</w:t>
       </w:r>
     </w:p>
     <w:p>
@@ -11367,7 +12486,7 @@
         <w:pStyle w:val="Heading2"/>
       </w:pPr>
       <w:r>
-        <w:t xml:space="preserve">Versi 2.5.3 — 21 September 2026</w:t>
+        <w:t xml:space="preserve">Versi 2.5.4 — 30 September 2026</w:t>
       </w:r>
     </w:p>
     <w:p>
@@ -11379,7 +12498,7 @@
         </w:numPr>
       </w:pPr>
       <w:r>
-        <w:t xml:space="preserve">Formulir SPD: surat tugas dilampirkan sejak SPD dibuat — nomor dan berkasnya diisi pada kartu Surat Tugas (tidak wajib). Usulan perjadin yang memilih SPD itu mengambil keduanya secara otomatis; berkas surat tugas tidak diunggah lagi dan nomornya tidak disalin ulang.</w:t>
+        <w:t xml:space="preserve">Dokumen Output (submenu Administrasi Sistem): tampilan empat dokumen cetak diatur dari aplikasi — ukuran kertas dan huruf, elemen yang ikut tercetak, serta teks bakunya. Tiap perubahan tercatat pada jejak audit dan dapat dikembalikan ke bawaan.</w:t>
       </w:r>
     </w:p>
     <w:p>
@@ -11391,7 +12510,7 @@
         </w:numPr>
       </w:pPr>
       <w:r>
-        <w:t xml:space="preserve">Formulir SPD: kolom Akun pembebanan dihapus — akun diisi PPK saat verifikasi dan tanda tangan, bukan oleh pembuat SPD.</w:t>
+        <w:t xml:space="preserve">Dokumen Output memuat pratinjau dokumen contoh yang ikut berubah mengikuti centangan elemen, lengkap dengan tombol buka di tab baru dan unduh contoh PDF.</w:t>
       </w:r>
     </w:p>
     <w:p>
@@ -11403,7 +12522,15 @@
         </w:numPr>
       </w:pPr>
       <w:r>
-        <w:t xml:space="preserve">Berkas pertanggungjawaban: unggahan dan ceklist "Kuitansi" kini disebut "Kuitansi penyelenggara / hotel" agar jelas kuitansi mana yang dimaksud — dari penyelenggara kegiatan atau dari hotel tempat menginap.</w:t>
+        <w:t xml:space="preserve">Penanda tanda tangan elektronik SRIKANDI dan nomor naskah sengaja tidak dapat dimatikan, supaya surat tetap dapat ditandatangani secara elektronik.</w:t>
+      </w:r>
+    </w:p>
+    <w:p>
+      <w:pPr>
+        <w:pStyle w:val="Heading2"/>
+      </w:pPr>
+      <w:r>
+        <w:t xml:space="preserve">Versi 2.5.3 — 21 September 2026</w:t>
       </w:r>
     </w:p>
     <w:p>
@@ -11415,7 +12542,7 @@
         </w:numPr>
       </w:pPr>
       <w:r>
-        <w:t xml:space="preserve">Jadwal Perjalanan kini bermenu: Jadwal Keberangkatan, Peta Dalam Kota &amp; Sekitarnya, dan Peta Luar Kota. Peta memperlihatkan kota-kota tujuan pegawai beserta jumlah perjalanan dan orang yang berangkat; klik penanda untuk rinciannya, saring per tahun. Dalam kota &amp; sekitarnya berarti tujuan di Sulawesi Utara. Kota-kota besar sudah dikenal sistem; kota lain diberi lintang-bujur pada Master Data → Lokasi Tujuan.</w:t>
+        <w:t xml:space="preserve">Formulir SPD: surat tugas dilampirkan sejak SPD dibuat — nomor dan berkasnya diisi pada kartu Surat Tugas (tidak wajib). Usulan perjadin yang memilih SPD itu mengambil keduanya secara otomatis; berkas surat tugas tidak diunggah lagi dan nomornya tidak disalin ulang.</w:t>
       </w:r>
     </w:p>
     <w:p>
@@ -11427,7 +12554,7 @@
         </w:numPr>
       </w:pPr>
       <w:r>
-        <w:t xml:space="preserve">Peran baru Mahasiswa, dapat dipilih saat membuat akun atau diimpor lewat kolom role bernilai "mahasiswa".</w:t>
+        <w:t xml:space="preserve">Formulir SPD: kolom Akun pembebanan dihapus — akun diisi PPK saat verifikasi dan tanda tangan, bukan oleh pembuat SPD.</w:t>
       </w:r>
     </w:p>
     <w:p>
@@ -11439,7 +12566,7 @@
         </w:numPr>
       </w:pPr>
       <w:r>
-        <w:t xml:space="preserve">Peran &amp; Hak Akses (submenu Administrasi Sistem, super administrator): menambah peran baru dan mengatur, per menu, kemampuan yang boleh dilihat, diubah, dan dihapus tiap peran — termasuk peran bawaan. Perubahan berlaku seketika dan tercatat pada jejak audit; Super Administrator selalu memegang seluruh akses. Hak menghapus master data dan menghapus pengguna kini kemampuan tersendiri.</w:t>
+        <w:t xml:space="preserve">Berkas pertanggungjawaban: unggahan dan ceklist "Kuitansi" kini disebut "Kuitansi penyelenggara / hotel" agar jelas kuitansi mana yang dimaksud — dari penyelenggara kegiatan atau dari hotel tempat menginap.</w:t>
       </w:r>
     </w:p>
     <w:p>
@@ -11451,15 +12578,7 @@
         </w:numPr>
       </w:pPr>
       <w:r>
-        <w:t xml:space="preserve">Pegawai eksternal, mahasiswa, dan outsourcing: modul perjalanan dinasnya dikembangkan terpisah. Sementara itu, setelah masuk mereka melihat halaman pemberitahuan "fitur masih dikembangkan" dengan tombol keluar; menu lain belum dapat dibuka.</w:t>
-      </w:r>
-    </w:p>
-    <w:p>
-      <w:pPr>
-        <w:pStyle w:val="Heading2"/>
-      </w:pPr>
-      <w:r>
-        <w:t xml:space="preserve">Versi 2.5.2 — 15 September 2026</w:t>
+        <w:t xml:space="preserve">Jadwal Perjalanan kini bermenu: Jadwal Keberangkatan, Peta Dalam Kota &amp; Sekitarnya, dan Peta Luar Kota. Peta memperlihatkan kota-kota tujuan pegawai beserta jumlah perjalanan dan orang yang berangkat; klik penanda untuk rinciannya, saring per tahun. Dalam kota &amp; sekitarnya berarti tujuan di Sulawesi Utara. Kota-kota besar sudah dikenal sistem; kota lain diberi lintang-bujur pada Master Data → Lokasi Tujuan.</w:t>
       </w:r>
     </w:p>
     <w:p>
@@ -11471,7 +12590,7 @@
         </w:numPr>
       </w:pPr>
       <w:r>
-        <w:t xml:space="preserve">Impor pengguna: sel yang kosong pada berkas CSV tidak lagi menghapus surel, nomor HP, dan rekening yang sudah diisi pengguna, sehingga data pegawai aman diimpor ulang untuk menambah orang. Wakil Direktur II ditambahkan ke data pegawai bawaan.</w:t>
+        <w:t xml:space="preserve">Peran baru Mahasiswa, dapat dipilih saat membuat akun atau diimpor lewat kolom role bernilai "mahasiswa".</w:t>
       </w:r>
     </w:p>
     <w:p>
@@ -11483,7 +12602,7 @@
         </w:numPr>
       </w:pPr>
       <w:r>
-        <w:t xml:space="preserve">Integrasi Data (submenu Administrasi Sistem): token API dashboard eksekutif dibuat, diganti, atau dicabut langsung dari aplikasi tanpa menyunting .env di server, lengkap dengan alamat dan jalur API-nya; token yang berlaku dapat ditampilkan dan disalin.</w:t>
+        <w:t xml:space="preserve">Peran &amp; Hak Akses (submenu Administrasi Sistem, super administrator): menambah peran baru dan mengatur, per menu, kemampuan yang boleh dilihat, diubah, dan dihapus tiap peran — termasuk peran bawaan. Perubahan berlaku seketika dan tercatat pada jejak audit; Super Administrator selalu memegang seluruh akses. Hak menghapus master data dan menghapus pengguna kini kemampuan tersendiri.</w:t>
       </w:r>
     </w:p>
     <w:p>
@@ -11495,7 +12614,15 @@
         </w:numPr>
       </w:pPr>
       <w:r>
-        <w:t xml:space="preserve">Integrasi Data: pemantauan setiap permintaan API yang masuk (alamat IP, jalur, token yang dibawa — hanya ujung-ujungnya — diterima atau ditolak) dan pengiriman data dashboard eksekutif terjadwal (tiap jam, harian, atau mingguan) ke aplikasi tujuan memakai token, lengkap dengan riwayat pengirimannya dan tombol Kirim Sekarang.</w:t>
+        <w:t xml:space="preserve">Pegawai eksternal, mahasiswa, dan outsourcing: modul perjalanan dinasnya dikembangkan terpisah. Sementara itu, setelah masuk mereka melihat halaman pemberitahuan "fitur masih dikembangkan" dengan tombol keluar; menu lain belum dapat dibuka.</w:t>
+      </w:r>
+    </w:p>
+    <w:p>
+      <w:pPr>
+        <w:pStyle w:val="Heading2"/>
+      </w:pPr>
+      <w:r>
+        <w:t xml:space="preserve">Versi 2.5.2 — 15 September 2026</w:t>
       </w:r>
     </w:p>
     <w:p>
@@ -11507,7 +12634,7 @@
         </w:numPr>
       </w:pPr>
       <w:r>
-        <w:t xml:space="preserve">Pengaturan Sistem: kunci API Anthropic untuk Wawasan AI dan agen tanya-jawab Dashboard Eksekutif dipasang, diganti, atau dihapus dari aplikasi — tersimpan terenkripsi, tanpa menyunting .env di server.</w:t>
+        <w:t xml:space="preserve">Impor pengguna: sel yang kosong pada berkas CSV tidak lagi menghapus surel, nomor HP, dan rekening yang sudah diisi pengguna, sehingga data pegawai aman diimpor ulang untuk menambah orang. Wakil Direktur II ditambahkan ke data pegawai bawaan.</w:t>
       </w:r>
     </w:p>
     <w:p>
@@ -11519,7 +12646,7 @@
         </w:numPr>
       </w:pPr>
       <w:r>
-        <w:t xml:space="preserve">Membuka atau mengunci tanggal dikeluarkan SPD serta mengelola token API dan kunci AI kini melalui kotak konfirmasi.</w:t>
+        <w:t xml:space="preserve">Integrasi Data (submenu Administrasi Sistem): token API dashboard eksekutif dibuat, diganti, atau dicabut langsung dari aplikasi tanpa menyunting .env di server, lengkap dengan alamat dan jalur API-nya; token yang berlaku dapat ditampilkan dan disalin.</w:t>
       </w:r>
     </w:p>
     <w:p>
@@ -11531,7 +12658,7 @@
         </w:numPr>
       </w:pPr>
       <w:r>
-        <w:t xml:space="preserve">Nomor SPD pada usulan bersifat unik: nomor yang sudah dipakai usulan lain — milik siapa pun — ditolak saat mengajukan maupun menyunting, dengan pesan yang menyebut usulan mana yang memakainya, sehingga tidak ada usulan ganda atas SPD yang sama.</w:t>
+        <w:t xml:space="preserve">Integrasi Data: pemantauan setiap permintaan API yang masuk (alamat IP, jalur, token yang dibawa — hanya ujung-ujungnya — diterima atau ditolak) dan pengiriman data dashboard eksekutif terjadwal (tiap jam, harian, atau mingguan) ke aplikasi tujuan memakai token, lengkap dengan riwayat pengirimannya dan tombol Kirim Sekarang.</w:t>
       </w:r>
     </w:p>
     <w:p>
@@ -11543,7 +12670,7 @@
         </w:numPr>
       </w:pPr>
       <w:r>
-        <w:t xml:space="preserve">Usulan perjadin tidak lagi mensyaratkan SPD dibuat lewat aplikasi lebih dulu: formulir usulan terbuka bagi semua, memilih SPD dari aplikasi hanya untuk mengisi otomatis. SPD bertanda tangan beserta nomornya tetap wajib diunggah sebagai dasar persetujuan PPK.</w:t>
+        <w:t xml:space="preserve">Pengaturan Sistem: kunci API Anthropic untuk Wawasan AI dan agen tanya-jawab Dashboard Eksekutif dipasang, diganti, atau dihapus dari aplikasi — tersimpan terenkripsi, tanpa menyunting .env di server.</w:t>
       </w:r>
     </w:p>
     <w:p>
@@ -11555,15 +12682,7 @@
         </w:numPr>
       </w:pPr>
       <w:r>
-        <w:t xml:space="preserve">Rincian Saya: tiap berkas memuat panel Pemantauan Berkas — status seluruh tanda tangan (tim keuangan, pelaksana, PPK, konfirmasi Direktur, daftar nominatif) dan status pembayaran (uang muka, pelunasan, transport lokal) beserta tanggal dan kodenya.</w:t>
-      </w:r>
-    </w:p>
-    <w:p>
-      <w:pPr>
-        <w:pStyle w:val="Heading2"/>
-      </w:pPr>
-      <w:r>
-        <w:t xml:space="preserve">Versi 2.5.1 — 15 September 2026</w:t>
+        <w:t xml:space="preserve">Membuka atau mengunci tanggal dikeluarkan SPD serta mengelola token API dan kunci AI kini melalui kotak konfirmasi.</w:t>
       </w:r>
     </w:p>
     <w:p>
@@ -11575,7 +12694,7 @@
         </w:numPr>
       </w:pPr>
       <w:r>
-        <w:t xml:space="preserve">Administrasi Sistem: super administrator dapat membuka atau mengunci tanggal dikeluarkan SPD bagi seluruh peran untuk kasus tanggal mundur (backdate); bawaannya terkunci, tiap perubahan tercatat pada jejak audit.</w:t>
+        <w:t xml:space="preserve">Nomor SPD pada usulan bersifat unik: nomor yang sudah dipakai usulan lain — milik siapa pun — ditolak saat mengajukan maupun menyunting, dengan pesan yang menyebut usulan mana yang memakainya, sehingga tidak ada usulan ganda atas SPD yang sama.</w:t>
       </w:r>
     </w:p>
     <w:p>
@@ -11587,15 +12706,7 @@
         </w:numPr>
       </w:pPr>
       <w:r>
-        <w:t xml:space="preserve">Administrasi Sistem dipecah menjadi tiga halaman bermenu — Pengguna, Impor &amp; Ekspor, Pengaturan Sistem — dengan submenu di sidebar dan navigasi di kepala halaman.</w:t>
-      </w:r>
-    </w:p>
-    <w:p>
-      <w:pPr>
-        <w:pStyle w:val="Heading2"/>
-      </w:pPr>
-      <w:r>
-        <w:t xml:space="preserve">Versi 2.5 — 12 September 2026</w:t>
+        <w:t xml:space="preserve">Usulan perjadin tidak lagi mensyaratkan SPD dibuat lewat aplikasi lebih dulu: formulir usulan terbuka bagi semua, memilih SPD dari aplikasi hanya untuk mengisi otomatis. SPD bertanda tangan beserta nomornya tetap wajib diunggah sebagai dasar persetujuan PPK.</w:t>
       </w:r>
     </w:p>
     <w:p>
@@ -11607,7 +12718,15 @@
         </w:numPr>
       </w:pPr>
       <w:r>
-        <w:t xml:space="preserve">Usulan wajib melampirkan SPD bertanda tangan beserta nomornya; persetujuan PPK tercatat otomatis. Pengajuan berkelompok dan tombol Salin dihapus.</w:t>
+        <w:t xml:space="preserve">Rincian Saya: tiap berkas memuat panel Pemantauan Berkas — status seluruh tanda tangan (tim keuangan, pelaksana, PPK, konfirmasi Direktur, daftar nominatif) dan status pembayaran (uang muka, pelunasan, transport lokal) beserta tanggal dan kodenya.</w:t>
+      </w:r>
+    </w:p>
+    <w:p>
+      <w:pPr>
+        <w:pStyle w:val="Heading2"/>
+      </w:pPr>
+      <w:r>
+        <w:t xml:space="preserve">Versi 2.5.1 — 15 September 2026</w:t>
       </w:r>
     </w:p>
     <w:p>
@@ -11619,7 +12738,7 @@
         </w:numPr>
       </w:pPr>
       <w:r>
-        <w:t xml:space="preserve">Menu Laporan Perjadin bagi pimpinan: daftar laporan, status konfirmasi, tindak lanjut. Laporan dikirim ke pimpinan saat disimpan dan dikonfirmasi Direktur lewat QR; tempat kegiatan per hari.</w:t>
+        <w:t xml:space="preserve">Administrasi Sistem: super administrator dapat membuka atau mengunci tanggal dikeluarkan SPD bagi seluruh peran untuk kasus tanggal mundur (backdate); bawaannya terkunci, tiap perubahan tercatat pada jejak audit.</w:t>
       </w:r>
     </w:p>
     <w:p>
@@ -11631,7 +12750,15 @@
         </w:numPr>
       </w:pPr>
       <w:r>
-        <w:t xml:space="preserve">Pelunasan hanya menunggu konfirmasi laporan oleh Direktur — bukan tanda tangan PPK maupun daftar nominatif.</w:t>
+        <w:t xml:space="preserve">Administrasi Sistem dipecah menjadi tiga halaman bermenu — Pengguna, Impor &amp; Ekspor, Pengaturan Sistem — dengan submenu di sidebar dan navigasi di kepala halaman.</w:t>
+      </w:r>
+    </w:p>
+    <w:p>
+      <w:pPr>
+        <w:pStyle w:val="Heading2"/>
+      </w:pPr>
+      <w:r>
+        <w:t xml:space="preserve">Versi 2.5 — 12 September 2026</w:t>
       </w:r>
     </w:p>
     <w:p>
@@ -11643,7 +12770,7 @@
         </w:numPr>
       </w:pPr>
       <w:r>
-        <w:t xml:space="preserve">Daftar nominatif terbit per surat tugas begitu satu pelaksana tuntas; yang belum tercantum disebut dan bertambah sendiri. List Daftar Nominatif memuat seluruh daftar beserta status tanda tangan tiap pelaksana.</w:t>
+        <w:t xml:space="preserve">Usulan wajib melampirkan SPD bertanda tangan beserta nomornya; persetujuan PPK tercatat otomatis. Pengajuan berkelompok dan tombol Salin dihapus.</w:t>
       </w:r>
     </w:p>
     <w:p>
@@ -11655,7 +12782,7 @@
         </w:numPr>
       </w:pPr>
       <w:r>
-        <w:t xml:space="preserve">Berkas terkirim otomatis ke pelaksana setelah seluruh validasi rampung; status Sudah Dicek Tim Keuangan; tombol tanda tangan pelaksana tetap ada setelah masa sanggah; popup konfirmasi pada validasi dan pencabutannya.</w:t>
+        <w:t xml:space="preserve">Menu Laporan Perjadin bagi pimpinan: daftar laporan, status konfirmasi, tindak lanjut. Laporan dikirim ke pimpinan saat disimpan dan dikonfirmasi Direktur lewat QR; tempat kegiatan per hari.</w:t>
       </w:r>
     </w:p>
     <w:p>
@@ -11667,7 +12794,7 @@
         </w:numPr>
       </w:pPr>
       <w:r>
-        <w:t xml:space="preserve">Biaya penyelenggaraan: ditanya ada atau tidak; bila ada, nominal, bukti bayar, dan nomor invoice; tercetak di bawah uang penginapan.</w:t>
+        <w:t xml:space="preserve">Pelunasan hanya menunggu konfirmasi laporan oleh Direktur — bukan tanda tangan PPK maupun daftar nominatif.</w:t>
       </w:r>
     </w:p>
     <w:p>
@@ -11679,7 +12806,7 @@
         </w:numPr>
       </w:pPr>
       <w:r>
-        <w:t xml:space="preserve">Tiket membawa invoice; nota transport lokal hanya untuk ruas bernominal (transport lokal boleh tidak ada); dalam kota satu baris transport lokal; checklist kelengkapan mengikuti formulir.</w:t>
+        <w:t xml:space="preserve">Daftar nominatif terbit per surat tugas begitu satu pelaksana tuntas; yang belum tercantum disebut dan bertambah sendiri. List Daftar Nominatif memuat seluruh daftar beserta status tanda tangan tiap pelaksana.</w:t>
       </w:r>
     </w:p>
     <w:p>
@@ -11691,7 +12818,7 @@
         </w:numPr>
       </w:pPr>
       <w:r>
-        <w:t xml:space="preserve">Verifikasi PPK (rincian, daftar riil, nominatif) dan Arsip Rincian Lengkap dikelompokkan per bulan dan tahun; arsip tidak lagi menunggu nominatif; menu Keuangan bagi PPK dalam mode lihat saja.</w:t>
+        <w:t xml:space="preserve">Berkas terkirim otomatis ke pelaksana setelah seluruh validasi rampung; status Sudah Dicek Tim Keuangan; tombol tanda tangan pelaksana tetap ada setelah masa sanggah; popup konfirmasi pada validasi dan pencabutannya.</w:t>
       </w:r>
     </w:p>
     <w:p>
@@ -11703,7 +12830,7 @@
         </w:numPr>
       </w:pPr>
       <w:r>
-        <w:t xml:space="preserve">Pembatalan penggantian transport lokal dengan alasan; nominatif memuat QR dan kode verifikasi PPK.</w:t>
+        <w:t xml:space="preserve">Biaya penyelenggaraan: ditanya ada atau tidak; bila ada, nominal, bukti bayar, dan nomor invoice; tercetak di bawah uang penginapan.</w:t>
       </w:r>
     </w:p>
     <w:p>
@@ -11715,7 +12842,7 @@
         </w:numPr>
       </w:pPr>
       <w:r>
-        <w:t xml:space="preserve">Seluruh dokumen cetak berukuran folio dan dirapikan: usulan sebagai dokumen resmi berkop, rincian satu halaman, tanggal berbahasa Indonesia, WITA.</w:t>
+        <w:t xml:space="preserve">Tiket membawa invoice; nota transport lokal hanya untuk ruas bernominal (transport lokal boleh tidak ada); dalam kota satu baris transport lokal; checklist kelengkapan mengikuti formulir.</w:t>
       </w:r>
     </w:p>
     <w:p>
@@ -11727,15 +12854,7 @@
         </w:numPr>
       </w:pPr>
       <w:r>
-        <w:t xml:space="preserve">Pelacakan berkas: sepuluh tonggak dengan lama hari antar tahap; versi aplikasi tertera di halaman masuk.</w:t>
-      </w:r>
-    </w:p>
-    <w:p>
-      <w:pPr>
-        <w:pStyle w:val="Heading2"/>
-      </w:pPr>
-      <w:r>
-        <w:t xml:space="preserve">Versi 2.4 — 5 September 2026</w:t>
+        <w:t xml:space="preserve">Verifikasi PPK (rincian, daftar riil, nominatif) dan Arsip Rincian Lengkap dikelompokkan per bulan dan tahun; arsip tidak lagi menunggu nominatif; menu Keuangan bagi PPK dalam mode lihat saja.</w:t>
       </w:r>
     </w:p>
     <w:p>
@@ -11747,6 +12866,50 @@
         </w:numPr>
       </w:pPr>
       <w:r>
+        <w:t xml:space="preserve">Pembatalan penggantian transport lokal dengan alasan; nominatif memuat QR dan kode verifikasi PPK.</w:t>
+      </w:r>
+    </w:p>
+    <w:p>
+      <w:pPr>
+        <w:pStyle w:val="ListParagraph"/>
+        <w:numPr>
+          <w:ilvl w:val="0"/>
+          <w:numId w:val="2"/>
+        </w:numPr>
+      </w:pPr>
+      <w:r>
+        <w:t xml:space="preserve">Seluruh dokumen cetak berukuran folio dan dirapikan: usulan sebagai dokumen resmi berkop, rincian satu halaman, tanggal berbahasa Indonesia, WITA.</w:t>
+      </w:r>
+    </w:p>
+    <w:p>
+      <w:pPr>
+        <w:pStyle w:val="ListParagraph"/>
+        <w:numPr>
+          <w:ilvl w:val="0"/>
+          <w:numId w:val="2"/>
+        </w:numPr>
+      </w:pPr>
+      <w:r>
+        <w:t xml:space="preserve">Pelacakan berkas: sepuluh tonggak dengan lama hari antar tahap; versi aplikasi tertera di halaman masuk.</w:t>
+      </w:r>
+    </w:p>
+    <w:p>
+      <w:pPr>
+        <w:pStyle w:val="Heading2"/>
+      </w:pPr>
+      <w:r>
+        <w:t xml:space="preserve">Versi 2.4 — 5 September 2026</w:t>
+      </w:r>
+    </w:p>
+    <w:p>
+      <w:pPr>
+        <w:pStyle w:val="ListParagraph"/>
+        <w:numPr>
+          <w:ilvl w:val="0"/>
+          <w:numId w:val="2"/>
+        </w:numPr>
+      </w:pPr>
+      <w:r>
         <w:t xml:space="preserve">Rilis dasar versi 2: Surat Perjalanan Dinas dengan nomor unik dan pengikut, pertanggungjawaban per pelaksana (tiket, nota, bill hotel, laporan), rincian biaya dan daftar riil dengan dua jalur tanda tangan, daftar nominatif, pembayaran beserta riwayatnya, pelacakan berkas, dan saluran bantuan.</w:t>
       </w:r>
     </w:p>
@@ -11768,13 +12931,15 @@
           <w:sz w:val="17"/>
           <w:szCs w:val="17"/>
         </w:rPr>
-        <w:t xml:space="preserve">Buku Panduan PANGI v2.5 — Politeknik Kesehatan Kemenkes Manado. Isi buku ini mengikuti sistem sebagaimana berjalan pada 1 Oktober 2026 (versi 2.5.7); bila tampilan di layar berbeda, yang berlaku adalah sistemnya, dan mohon laporkan selisihnya lewat menu Bantuan.</w:t>
+        <w:t xml:space="preserve">Buku Panduan PANGI v2.5 — Politeknik Kesehatan Kemenkes Manado. Isi buku ini mengikuti sistem sebagaimana berjalan pada 1 Oktober 2026 (versi 2.5.8); bila tampilan di layar berbeda, yang berlaku adalah sistemnya, dan mohon laporkan selisihnya lewat menu Bantuan.</w:t>
       </w:r>
     </w:p>
     <w:sectPr>
+      <w:footerReference w:type="default" r:id="rIdKakiPanduan"/>
       <w:pgSz w:w="11906" w:h="16838" w:orient="portrait"/>
       <w:pgMar w:top="1440" w:right="1440" w:bottom="1440" w:left="1440" w:header="708" w:footer="708" w:gutter="0"/>
       <w:pgNumType/>
+      <w:titlePg/>
       <w:docGrid w:linePitch="360"/>
     </w:sectPr>
   </w:body>
@@ -11820,6 +12985,88 @@
     </w:p>
   </w:endnote>
 </w:endnotes>
+</file>
+
+<file path=word/footer1.xml><?xml version="1.0" encoding="utf-8"?>
+<w:ftr xmlns:w="http://schemas.openxmlformats.org/wordprocessingml/2006/main" xmlns:r="http://schemas.openxmlformats.org/officeDocument/2006/relationships">
+  <w:p>
+    <w:pPr>
+      <w:pBdr>
+        <w:top w:val="single" w:sz="8" w:space="6" w:color="CDD84B"/>
+      </w:pBdr>
+      <w:tabs>
+        <w:tab w:val="right" w:pos="9026"/>
+      </w:tabs>
+      <w:spacing w:before="0" w:after="0"/>
+    </w:pPr>
+    <w:r>
+      <w:rPr>
+        <w:color w:val="0B7F87"/>
+        <w:sz w:val="16"/>
+        <w:szCs w:val="16"/>
+      </w:rPr>
+      <w:t xml:space="preserve">Buku Panduan PANGI · Politeknik Kesehatan Kemenkes Manado</w:t>
+    </w:r>
+    <w:r>
+      <w:rPr>
+        <w:color w:val="0B7F87"/>
+        <w:sz w:val="16"/>
+        <w:szCs w:val="16"/>
+      </w:rPr>
+      <w:tab/>
+    </w:r>
+    <w:r>
+      <w:rPr>
+        <w:b/>
+        <w:bCs/>
+        <w:color w:val="045E6A"/>
+        <w:sz w:val="16"/>
+        <w:szCs w:val="16"/>
+      </w:rPr>
+      <w:fldChar w:fldCharType="begin"/>
+    </w:r>
+    <w:r>
+      <w:rPr>
+        <w:b/>
+        <w:bCs/>
+        <w:color w:val="045E6A"/>
+        <w:sz w:val="16"/>
+        <w:szCs w:val="16"/>
+      </w:rPr>
+      <w:instrText xml:space="preserve"> PAGE </w:instrText>
+    </w:r>
+    <w:r>
+      <w:rPr>
+        <w:b/>
+        <w:bCs/>
+        <w:color w:val="045E6A"/>
+        <w:sz w:val="16"/>
+        <w:szCs w:val="16"/>
+      </w:rPr>
+      <w:fldChar w:fldCharType="separate"/>
+    </w:r>
+    <w:r>
+      <w:rPr>
+        <w:b/>
+        <w:bCs/>
+        <w:color w:val="045E6A"/>
+        <w:sz w:val="16"/>
+        <w:szCs w:val="16"/>
+      </w:rPr>
+      <w:t>2</w:t>
+    </w:r>
+    <w:r>
+      <w:rPr>
+        <w:b/>
+        <w:bCs/>
+        <w:color w:val="045E6A"/>
+        <w:sz w:val="16"/>
+        <w:szCs w:val="16"/>
+      </w:rPr>
+      <w:fldChar w:fldCharType="end"/>
+    </w:r>
+  </w:p>
+</w:ftr>
 </file>
 
 <file path=word/footnotes.xml><?xml version="1.0" encoding="utf-8"?>
@@ -12057,49 +13304,6 @@
       </w:pPr>
     </w:pPrDefault>
   </w:docDefaults>
-  <w:style w:type="paragraph" w:styleId="Title">
-    <w:name w:val="Title"/>
-    <w:basedOn w:val="Normal"/>
-    <w:next w:val="Normal"/>
-    <w:qFormat/>
-    <w:rPr>
-      <w:sz w:val="56"/>
-      <w:szCs w:val="56"/>
-    </w:rPr>
-  </w:style>
-  <w:style w:type="paragraph" w:styleId="Heading1">
-    <w:name w:val="Heading 1"/>
-    <w:basedOn w:val="Normal"/>
-    <w:next w:val="Normal"/>
-    <w:qFormat/>
-    <w:rPr>
-      <w:color w:val="2E74B5"/>
-      <w:sz w:val="32"/>
-      <w:szCs w:val="32"/>
-    </w:rPr>
-  </w:style>
-  <w:style w:type="paragraph" w:styleId="Heading2">
-    <w:name w:val="Heading 2"/>
-    <w:basedOn w:val="Normal"/>
-    <w:next w:val="Normal"/>
-    <w:qFormat/>
-    <w:rPr>
-      <w:color w:val="2E74B5"/>
-      <w:sz w:val="26"/>
-      <w:szCs w:val="26"/>
-    </w:rPr>
-  </w:style>
-  <w:style w:type="paragraph" w:styleId="Heading3">
-    <w:name w:val="Heading 3"/>
-    <w:basedOn w:val="Normal"/>
-    <w:next w:val="Normal"/>
-    <w:qFormat/>
-    <w:rPr>
-      <w:color w:val="1F4D78"/>
-      <w:sz w:val="24"/>
-      <w:szCs w:val="24"/>
-    </w:rPr>
-  </w:style>
   <w:style w:type="paragraph" w:styleId="Heading4">
     <w:name w:val="Heading 4"/>
     <w:basedOn w:val="Normal"/>
@@ -12228,77 +13432,6 @@
       <w:szCs w:val="20"/>
     </w:rPr>
   </w:style>
-  <w:style w:type="paragraph" w:styleId="Title">
-    <w:name w:val="Title"/>
-    <w:basedOn w:val="Normal"/>
-    <w:next w:val="Normal"/>
-    <w:qFormat/>
-    <w:pPr>
-      <w:spacing w:after="120" w:before="0"/>
-    </w:pPr>
-    <w:rPr>
-      <w:rFonts w:ascii="Cambria" w:cs="Cambria" w:eastAsia="Cambria" w:hAnsi="Cambria"/>
-      <w:b/>
-      <w:bCs/>
-      <w:color w:val="16202E"/>
-      <w:sz w:val="52"/>
-      <w:szCs w:val="52"/>
-    </w:rPr>
-  </w:style>
-  <w:style w:type="paragraph" w:styleId="Heading1">
-    <w:name w:val="Heading 1"/>
-    <w:basedOn w:val="Normal"/>
-    <w:next w:val="Normal"/>
-    <w:qFormat/>
-    <w:pPr>
-      <w:pBdr>
-        <w:top w:val="single" w:color="16202E" w:sz="12" w:space="8"/>
-      </w:pBdr>
-      <w:spacing w:after="160" w:before="400"/>
-    </w:pPr>
-    <w:rPr>
-      <w:rFonts w:ascii="Cambria" w:cs="Cambria" w:eastAsia="Cambria" w:hAnsi="Cambria"/>
-      <w:b/>
-      <w:bCs/>
-      <w:color w:val="16202E"/>
-      <w:sz w:val="30"/>
-      <w:szCs w:val="30"/>
-    </w:rPr>
-  </w:style>
-  <w:style w:type="paragraph" w:styleId="Heading2">
-    <w:name w:val="Heading 2"/>
-    <w:basedOn w:val="Normal"/>
-    <w:next w:val="Normal"/>
-    <w:qFormat/>
-    <w:pPr>
-      <w:spacing w:after="100" w:before="280"/>
-    </w:pPr>
-    <w:rPr>
-      <w:rFonts w:ascii="Cambria" w:cs="Cambria" w:eastAsia="Cambria" w:hAnsi="Cambria"/>
-      <w:b/>
-      <w:bCs/>
-      <w:color w:val="16202E"/>
-      <w:sz w:val="24"/>
-      <w:szCs w:val="24"/>
-    </w:rPr>
-  </w:style>
-  <w:style w:type="paragraph" w:styleId="Heading3">
-    <w:name w:val="Heading 3"/>
-    <w:basedOn w:val="Normal"/>
-    <w:next w:val="Normal"/>
-    <w:qFormat/>
-    <w:pPr>
-      <w:spacing w:after="60" w:before="200"/>
-    </w:pPr>
-    <w:rPr>
-      <w:rFonts w:ascii="Calibri" w:cs="Calibri" w:eastAsia="Calibri" w:hAnsi="Calibri"/>
-      <w:b/>
-      <w:bCs/>
-      <w:color w:val="1D5C8F"/>
-      <w:sz w:val="21"/>
-      <w:szCs w:val="21"/>
-    </w:rPr>
-  </w:style>
   <w:style w:type="paragraph" w:styleId="Keterangan">
     <w:name w:val="Keterangan"/>
     <w:basedOn w:val="Normal"/>
@@ -12314,5 +13447,84 @@
       <w:szCs w:val="18"/>
     </w:rPr>
   </w:style>
+  <w:style w:type="paragraph" w:styleId="Title">
+    <w:name w:val="Title"/>
+    <w:basedOn w:val="Normal"/>
+    <w:next w:val="Normal"/>
+    <w:qFormat/>
+    <w:pPr>
+      <w:spacing w:after="120" w:before="0"/>
+    </w:pPr>
+    <w:rPr>
+      <w:rFonts w:ascii="Cambria" w:cs="Cambria" w:eastAsia="Cambria" w:hAnsi="Cambria"/>
+      <w:b/>
+      <w:bCs/>
+      <w:color w:val="045E6A"/>
+      <w:sz w:val="52"/>
+      <w:szCs w:val="52"/>
+    </w:rPr>
+  </w:style>
+  <w:style w:type="paragraph" w:styleId="Heading1">
+    <w:name w:val="heading 1"/>
+    <w:basedOn w:val="Normal"/>
+    <w:next w:val="Normal"/>
+    <w:qFormat/>
+    <w:pPr>
+      <w:keepNext/>
+      <w:keepLines/>
+      <w:pBdr>
+        <w:top w:val="single" w:color="0B7F87" w:sz="12" w:space="8"/>
+      </w:pBdr>
+      <w:spacing w:after="160" w:before="400"/>
+      <w:outlineLvl w:val="0"/>
+    </w:pPr>
+    <w:rPr>
+      <w:rFonts w:ascii="Cambria" w:cs="Cambria" w:eastAsia="Cambria" w:hAnsi="Cambria"/>
+      <w:b/>
+      <w:bCs/>
+      <w:color w:val="045E6A"/>
+      <w:sz w:val="30"/>
+      <w:szCs w:val="30"/>
+    </w:rPr>
+  </w:style>
+  <w:style w:type="paragraph" w:styleId="Heading2">
+    <w:name w:val="heading 2"/>
+    <w:basedOn w:val="Normal"/>
+    <w:next w:val="Normal"/>
+    <w:qFormat/>
+    <w:pPr>
+      <w:keepNext/>
+      <w:keepLines/>
+      <w:spacing w:after="100" w:before="280"/>
+      <w:outlineLvl w:val="1"/>
+    </w:pPr>
+    <w:rPr>
+      <w:rFonts w:ascii="Cambria" w:cs="Cambria" w:eastAsia="Cambria" w:hAnsi="Cambria"/>
+      <w:b/>
+      <w:bCs/>
+      <w:color w:val="0B7F87"/>
+      <w:sz w:val="24"/>
+      <w:szCs w:val="24"/>
+    </w:rPr>
+  </w:style>
+  <w:style w:type="paragraph" w:styleId="Heading3">
+    <w:name w:val="heading 3"/>
+    <w:basedOn w:val="Normal"/>
+    <w:next w:val="Normal"/>
+    <w:qFormat/>
+    <w:pPr>
+      <w:keepNext/>
+      <w:spacing w:after="60" w:before="200"/>
+      <w:outlineLvl w:val="2"/>
+    </w:pPr>
+    <w:rPr>
+      <w:rFonts w:ascii="Calibri" w:cs="Calibri" w:eastAsia="Calibri" w:hAnsi="Calibri"/>
+      <w:b/>
+      <w:bCs/>
+      <w:color w:val="05767D"/>
+      <w:sz w:val="21"/>
+      <w:szCs w:val="21"/>
+    </w:rPr>
+  </w:style>
 </w:styles>
 </file>
</xml_diff>

<commit_message>
Sanggahan rincian biaya ditindaklanjuti dari halaman Keuangan (2.5.9)
- Sanggahan pelaksana atas rincian biaya tampil di halaman Detail
  Keuangan beserta alasan dan waktunya, lengkap dengan tombol Kirim Ulang
  ke Pelaksana. Sebelumnya berkas yang rinciannya disanggah buntu.
- Kirim ulang hanya membuka dokumen yang belum disetujui pelaksana:
  tanda tangan dan kode konfirmasi pada dokumen satunya tetap berlaku.
  Pemberitahuannya hanya menyebut dan menautkan dokumen yang perlu
  disikapi. Jalan membuka dokumen yang sudah disetujui kini pengembalian
  oleh PPK, sebagaimana disebut pesan kuncinya.
- Pemberitahuan sanggahan ke tim keuangan menautkan halaman Detail
  Keuangan; halaman itu kini menampilkan pesan hasil tindakan dan menyebut
  tujuan perjalanan (sebelumnya kosong).
- Panduan Penggunaan, buku panduan (sampul 2.5.9), dan riwayat perubahan
  diperbarui.

Co-Authored-By: Claude Opus 5.5 <noreply@anthropic.com>
</commit_message>
<xml_diff>
--- a/resources/panduan/Buku-Panduan-PANGI-v2.5.docx
+++ b/resources/panduan/Buku-Panduan-PANGI-v2.5.docx
@@ -239,7 +239,7 @@
                 <w:sz w:val="19"/>
                 <w:szCs w:val="19"/>
               </w:rPr>
-              <w:t xml:space="preserve">2.5.8</w:t>
+              <w:t xml:space="preserve">2.5.9</w:t>
             </w:r>
           </w:p>
         </w:tc>
@@ -7108,7 +7108,7 @@
         <w:rPr>
           <w:color w:val="55616F"/>
         </w:rPr>
-        <w:t xml:space="preserve">  Menyanggah mengembalikan dokumen itu ke tim keuangan; dokumen satunya tetap berjalan.</w:t>
+        <w:t xml:space="preserve">  Menyanggah mengembalikan dokumen itu ke tim keuangan; dokumen satunya tetap berjalan. Setelah diperbaiki, hanya dokumen yang disanggah yang perlu Anda sikapi lagi — tanda tangan Anda pada dokumen satunya tetap berlaku.</w:t>
       </w:r>
     </w:p>
     <w:p>
@@ -7340,6 +7340,28 @@
           <w:b/>
           <w:bCs/>
         </w:rPr>
+        <w:t xml:space="preserve">Tindak lanjuti sanggahan pelaksana.</w:t>
+      </w:r>
+      <w:r>
+        <w:rPr>
+          <w:color w:val="55616F"/>
+        </w:rPr>
+        <w:t xml:space="preserve">  Pemberitahuan sanggahan membuka halaman rincian biaya usulannya; sanggahan beserta alasan dan waktunya tampil di panel kanan. Perbaiki nominalnya, lalu tekan Kirim Ulang ke Pelaksana. Hanya dokumen yang disanggah yang dibuka kembali — dokumen yang sudah ditandatangani pelaksana tetap berlaku.</w:t>
+      </w:r>
+    </w:p>
+    <w:p>
+      <w:pPr>
+        <w:pStyle w:val="ListParagraph"/>
+        <w:numPr>
+          <w:ilvl w:val="0"/>
+          <w:numId w:val="9"/>
+        </w:numPr>
+      </w:pPr>
+      <w:r>
+        <w:rPr>
+          <w:b/>
+          <w:bCs/>
+        </w:rPr>
         <w:t xml:space="preserve">Pantau daftar nominatif.</w:t>
       </w:r>
       <w:r>
@@ -7428,7 +7450,7 @@
                 <w:sz w:val="20"/>
                 <w:szCs w:val="20"/>
               </w:rPr>
-              <w:t xml:space="preserve">Setelah pelaksana atau PPK menandatangani, rincian tidak dapat disunting lagi. Bila memang perlu diperbaiki, mintalah PPK membatalkan tanda tangannya lebih dulu — bukan mengubah angkanya diam-diam. Penguncian ini berlaku pada seluruh pintu masuk, termasuk penyelarasan otomatis dari dokumen.</w:t>
+              <w:t xml:space="preserve">Setelah pelaksana atau PPK menandatangani, rincian tidak dapat disunting lagi. Bila memang perlu diperbaiki, mintalah PPK mengembalikan berkasnya ke tim keuangan — atau mencabut tanda tangannya bila sudah disahkan — bukan mengubah angkanya diam-diam. Penguncian ini berlaku pada seluruh pintu masuk, termasuk penyelarasan otomatis dari dokumen.</w:t>
             </w:r>
           </w:p>
         </w:tc>
@@ -12334,7 +12356,7 @@
         <w:pStyle w:val="Heading2"/>
       </w:pPr>
       <w:r>
-        <w:t xml:space="preserve">Versi 2.5.8 — 1 Oktober 2026</w:t>
+        <w:t xml:space="preserve">Versi 2.5.9 — 1 Oktober 2026</w:t>
       </w:r>
     </w:p>
     <w:p>
@@ -12346,7 +12368,7 @@
         </w:numPr>
       </w:pPr>
       <w:r>
-        <w:t xml:space="preserve">Buku panduan bersampul baru dengan warna Kemenkes. Bab 5.1 dan 5.2 kini bergambar: setiap langkah membuat SPD sampai mengajukan perjadin disertai tangkapan layar bertanda nomor.</w:t>
+        <w:t xml:space="preserve">Sanggahan pelaksana atas rincian biaya kini tampil di halaman Keuangan — tempat nominalnya diperbaiki — lengkap dengan alasan dan waktunya, beserta tombol Kirim Ulang ke Pelaksana. Sebelumnya berkas yang rinciannya disanggah tidak dapat dikirim ulang.</w:t>
       </w:r>
     </w:p>
     <w:p>
@@ -12358,7 +12380,7 @@
         </w:numPr>
       </w:pPr>
       <w:r>
-        <w:t xml:space="preserve">Kotak konfirmasi sebelum mengirim pengajuan kini benar-benar menampilkan tujuan, tanggal, dan nomor SPD yang diisi — sebelumnya selalu tertulis "—".</w:t>
+        <w:t xml:space="preserve">Mengirim ulang hanya membuka dokumen yang disanggah: dokumen yang sudah ditandatangani pelaksana tetap berlaku beserta kode konfirmasinya, dan pemberitahuannya hanya menyebut dokumen yang perlu disikapi lagi.</w:t>
       </w:r>
     </w:p>
     <w:p>
@@ -12370,7 +12392,7 @@
         </w:numPr>
       </w:pPr>
       <w:r>
-        <w:t xml:space="preserve">Menu Panduan Penggunaan memuat tangkapan layar yang sama, dan buku lengkapnya dapat diunduh dalam format PDF maupun Word.</w:t>
+        <w:t xml:space="preserve">Halaman Detail Keuangan kini menampilkan pesan hasil tiap tindakan — komponen tersimpan, berkas terkirim, atau alasan tertahan — dan menyebut tujuan perjalanan pada kepalanya. Pemberitahuan sanggahan kepada tim keuangan langsung membuka halaman ini.</w:t>
       </w:r>
     </w:p>
     <w:p>
@@ -12378,7 +12400,7 @@
         <w:pStyle w:val="Heading2"/>
       </w:pPr>
       <w:r>
-        <w:t xml:space="preserve">Versi 2.5.7 — 1 Oktober 2026</w:t>
+        <w:t xml:space="preserve">Versi 2.5.8 — 1 Oktober 2026</w:t>
       </w:r>
     </w:p>
     <w:p>
@@ -12390,7 +12412,7 @@
         </w:numPr>
       </w:pPr>
       <w:r>
-        <w:t xml:space="preserve">Supervisi kerja praktek / magang dibedakan menurut tujuannya: supervisi ke luar kota tetap menerbitkan SPD — berkas SPD bertanda tangan beserta nomornya wajib dilampirkan — sedangkan supervisi di dalam kota cukup surat tugas.</w:t>
+        <w:t xml:space="preserve">Buku panduan bersampul baru dengan warna Kemenkes. Bab 5.1 dan 5.2 kini bergambar: setiap langkah membuat SPD sampai mengajukan perjadin disertai tangkapan layar bertanda nomor.</w:t>
       </w:r>
     </w:p>
     <w:p>
@@ -12402,15 +12424,7 @@
         </w:numPr>
       </w:pPr>
       <w:r>
-        <w:t xml:space="preserve">Isian SPD pada formulir usulan muncul dan menghilang sendiri mengikuti kategori yang dipilih; checklist kelengkapan dan formulir Dokumen Perdin ikut menyesuaikan.</w:t>
-      </w:r>
-    </w:p>
-    <w:p>
-      <w:pPr>
-        <w:pStyle w:val="Heading2"/>
-      </w:pPr>
-      <w:r>
-        <w:t xml:space="preserve">Versi 2.5.6 — 1 Oktober 2026</w:t>
+        <w:t xml:space="preserve">Kotak konfirmasi sebelum mengirim pengajuan kini benar-benar menampilkan tujuan, tanggal, dan nomor SPD yang diisi — sebelumnya selalu tertulis "—".</w:t>
       </w:r>
     </w:p>
     <w:p>
@@ -12422,7 +12436,7 @@
         </w:numPr>
       </w:pPr>
       <w:r>
-        <w:t xml:space="preserve">Berkas Pertanggungjawaban (submenu Administrasi Sistem): berkas yang ditagih sesudah perjalanan dipilih sendiri untuk tiap jalur pengajuan, dan berlaku serentak pada formulir dokumen, checklist, serta penagihan.</w:t>
+        <w:t xml:space="preserve">Menu Panduan Penggunaan memuat tangkapan layar yang sama, dan buku lengkapnya dapat diunduh dalam format PDF maupun Word.</w:t>
       </w:r>
     </w:p>
     <w:p>
@@ -12430,7 +12444,7 @@
         <w:pStyle w:val="Heading2"/>
       </w:pPr>
       <w:r>
-        <w:t xml:space="preserve">Versi 2.5.5 — 1 Oktober 2026</w:t>
+        <w:t xml:space="preserve">Versi 2.5.7 — 1 Oktober 2026</w:t>
       </w:r>
     </w:p>
     <w:p>
@@ -12442,7 +12456,7 @@
         </w:numPr>
       </w:pPr>
       <w:r>
-        <w:t xml:space="preserve">Pengajuan perjadin dimulai dengan memilih jalur: dalam kota, luar kota, atau supervisi kerja praktek / magang. Jalur itu menyaring kategori perjalanan dinas dari Master Data.</w:t>
+        <w:t xml:space="preserve">Supervisi kerja praktek / magang dibedakan menurut tujuannya: supervisi ke luar kota tetap menerbitkan SPD — berkas SPD bertanda tangan beserta nomornya wajib dilampirkan — sedangkan supervisi di dalam kota cukup surat tugas.</w:t>
       </w:r>
     </w:p>
     <w:p>
@@ -12454,7 +12468,15 @@
         </w:numPr>
       </w:pPr>
       <w:r>
-        <w:t xml:space="preserve">Jalur supervisi kerja praktek / magang tidak memakai Surat Perjalanan Dinas: cukup surat tugas beserta nomornya, dan jenis kegiatannya terisi sendiri.</w:t>
+        <w:t xml:space="preserve">Isian SPD pada formulir usulan muncul dan menghilang sendiri mengikuti kategori yang dipilih; checklist kelengkapan dan formulir Dokumen Perdin ikut menyesuaikan.</w:t>
+      </w:r>
+    </w:p>
+    <w:p>
+      <w:pPr>
+        <w:pStyle w:val="Heading2"/>
+      </w:pPr>
+      <w:r>
+        <w:t xml:space="preserve">Versi 2.5.6 — 1 Oktober 2026</w:t>
       </w:r>
     </w:p>
     <w:p>
@@ -12466,7 +12488,15 @@
         </w:numPr>
       </w:pPr>
       <w:r>
-        <w:t xml:space="preserve">Kaki halaman SPD mengikuti cetakan terbaru — lambang Garuda Sertifikasi dilepas, alamat verifikasi menjadi tte.komdigi.go.id — dan butir V tidak lagi memuat penanda QR.</w:t>
+        <w:t xml:space="preserve">Berkas Pertanggungjawaban (submenu Administrasi Sistem): berkas yang ditagih sesudah perjalanan dipilih sendiri untuk tiap jalur pengajuan, dan berlaku serentak pada formulir dokumen, checklist, serta penagihan.</w:t>
+      </w:r>
+    </w:p>
+    <w:p>
+      <w:pPr>
+        <w:pStyle w:val="Heading2"/>
+      </w:pPr>
+      <w:r>
+        <w:t xml:space="preserve">Versi 2.5.5 — 1 Oktober 2026</w:t>
       </w:r>
     </w:p>
     <w:p>
@@ -12478,15 +12508,7 @@
         </w:numPr>
       </w:pPr>
       <w:r>
-        <w:t xml:space="preserve">Daftar Usulan Perjadin menyebut pelaksana perjalanan pada kolom pertama, menggantikan kolom Pemohon yang selalu kosong.</w:t>
-      </w:r>
-    </w:p>
-    <w:p>
-      <w:pPr>
-        <w:pStyle w:val="Heading2"/>
-      </w:pPr>
-      <w:r>
-        <w:t xml:space="preserve">Versi 2.5.4 — 30 September 2026</w:t>
+        <w:t xml:space="preserve">Pengajuan perjadin dimulai dengan memilih jalur: dalam kota, luar kota, atau supervisi kerja praktek / magang. Jalur itu menyaring kategori perjalanan dinas dari Master Data.</w:t>
       </w:r>
     </w:p>
     <w:p>
@@ -12498,7 +12520,7 @@
         </w:numPr>
       </w:pPr>
       <w:r>
-        <w:t xml:space="preserve">Dokumen Output (submenu Administrasi Sistem): tampilan empat dokumen cetak diatur dari aplikasi — ukuran kertas dan huruf, elemen yang ikut tercetak, serta teks bakunya. Tiap perubahan tercatat pada jejak audit dan dapat dikembalikan ke bawaan.</w:t>
+        <w:t xml:space="preserve">Jalur supervisi kerja praktek / magang tidak memakai Surat Perjalanan Dinas: cukup surat tugas beserta nomornya, dan jenis kegiatannya terisi sendiri.</w:t>
       </w:r>
     </w:p>
     <w:p>
@@ -12510,7 +12532,7 @@
         </w:numPr>
       </w:pPr>
       <w:r>
-        <w:t xml:space="preserve">Dokumen Output memuat pratinjau dokumen contoh yang ikut berubah mengikuti centangan elemen, lengkap dengan tombol buka di tab baru dan unduh contoh PDF.</w:t>
+        <w:t xml:space="preserve">Kaki halaman SPD mengikuti cetakan terbaru — lambang Garuda Sertifikasi dilepas, alamat verifikasi menjadi tte.komdigi.go.id — dan butir V tidak lagi memuat penanda QR.</w:t>
       </w:r>
     </w:p>
     <w:p>
@@ -12522,7 +12544,7 @@
         </w:numPr>
       </w:pPr>
       <w:r>
-        <w:t xml:space="preserve">Penanda tanda tangan elektronik SRIKANDI dan nomor naskah sengaja tidak dapat dimatikan, supaya surat tetap dapat ditandatangani secara elektronik.</w:t>
+        <w:t xml:space="preserve">Daftar Usulan Perjadin menyebut pelaksana perjalanan pada kolom pertama, menggantikan kolom Pemohon yang selalu kosong.</w:t>
       </w:r>
     </w:p>
     <w:p>
@@ -12530,7 +12552,7 @@
         <w:pStyle w:val="Heading2"/>
       </w:pPr>
       <w:r>
-        <w:t xml:space="preserve">Versi 2.5.3 — 21 September 2026</w:t>
+        <w:t xml:space="preserve">Versi 2.5.4 — 30 September 2026</w:t>
       </w:r>
     </w:p>
     <w:p>
@@ -12542,7 +12564,7 @@
         </w:numPr>
       </w:pPr>
       <w:r>
-        <w:t xml:space="preserve">Formulir SPD: surat tugas dilampirkan sejak SPD dibuat — nomor dan berkasnya diisi pada kartu Surat Tugas (tidak wajib). Usulan perjadin yang memilih SPD itu mengambil keduanya secara otomatis; berkas surat tugas tidak diunggah lagi dan nomornya tidak disalin ulang.</w:t>
+        <w:t xml:space="preserve">Dokumen Output (submenu Administrasi Sistem): tampilan empat dokumen cetak diatur dari aplikasi — ukuran kertas dan huruf, elemen yang ikut tercetak, serta teks bakunya. Tiap perubahan tercatat pada jejak audit dan dapat dikembalikan ke bawaan.</w:t>
       </w:r>
     </w:p>
     <w:p>
@@ -12554,7 +12576,7 @@
         </w:numPr>
       </w:pPr>
       <w:r>
-        <w:t xml:space="preserve">Formulir SPD: kolom Akun pembebanan dihapus — akun diisi PPK saat verifikasi dan tanda tangan, bukan oleh pembuat SPD.</w:t>
+        <w:t xml:space="preserve">Dokumen Output memuat pratinjau dokumen contoh yang ikut berubah mengikuti centangan elemen, lengkap dengan tombol buka di tab baru dan unduh contoh PDF.</w:t>
       </w:r>
     </w:p>
     <w:p>
@@ -12566,7 +12588,15 @@
         </w:numPr>
       </w:pPr>
       <w:r>
-        <w:t xml:space="preserve">Berkas pertanggungjawaban: unggahan dan ceklist "Kuitansi" kini disebut "Kuitansi penyelenggara / hotel" agar jelas kuitansi mana yang dimaksud — dari penyelenggara kegiatan atau dari hotel tempat menginap.</w:t>
+        <w:t xml:space="preserve">Penanda tanda tangan elektronik SRIKANDI dan nomor naskah sengaja tidak dapat dimatikan, supaya surat tetap dapat ditandatangani secara elektronik.</w:t>
+      </w:r>
+    </w:p>
+    <w:p>
+      <w:pPr>
+        <w:pStyle w:val="Heading2"/>
+      </w:pPr>
+      <w:r>
+        <w:t xml:space="preserve">Versi 2.5.3 — 21 September 2026</w:t>
       </w:r>
     </w:p>
     <w:p>
@@ -12578,7 +12608,7 @@
         </w:numPr>
       </w:pPr>
       <w:r>
-        <w:t xml:space="preserve">Jadwal Perjalanan kini bermenu: Jadwal Keberangkatan, Peta Dalam Kota &amp; Sekitarnya, dan Peta Luar Kota. Peta memperlihatkan kota-kota tujuan pegawai beserta jumlah perjalanan dan orang yang berangkat; klik penanda untuk rinciannya, saring per tahun. Dalam kota &amp; sekitarnya berarti tujuan di Sulawesi Utara. Kota-kota besar sudah dikenal sistem; kota lain diberi lintang-bujur pada Master Data → Lokasi Tujuan.</w:t>
+        <w:t xml:space="preserve">Formulir SPD: surat tugas dilampirkan sejak SPD dibuat — nomor dan berkasnya diisi pada kartu Surat Tugas (tidak wajib). Usulan perjadin yang memilih SPD itu mengambil keduanya secara otomatis; berkas surat tugas tidak diunggah lagi dan nomornya tidak disalin ulang.</w:t>
       </w:r>
     </w:p>
     <w:p>
@@ -12590,7 +12620,7 @@
         </w:numPr>
       </w:pPr>
       <w:r>
-        <w:t xml:space="preserve">Peran baru Mahasiswa, dapat dipilih saat membuat akun atau diimpor lewat kolom role bernilai "mahasiswa".</w:t>
+        <w:t xml:space="preserve">Formulir SPD: kolom Akun pembebanan dihapus — akun diisi PPK saat verifikasi dan tanda tangan, bukan oleh pembuat SPD.</w:t>
       </w:r>
     </w:p>
     <w:p>
@@ -12602,7 +12632,7 @@
         </w:numPr>
       </w:pPr>
       <w:r>
-        <w:t xml:space="preserve">Peran &amp; Hak Akses (submenu Administrasi Sistem, super administrator): menambah peran baru dan mengatur, per menu, kemampuan yang boleh dilihat, diubah, dan dihapus tiap peran — termasuk peran bawaan. Perubahan berlaku seketika dan tercatat pada jejak audit; Super Administrator selalu memegang seluruh akses. Hak menghapus master data dan menghapus pengguna kini kemampuan tersendiri.</w:t>
+        <w:t xml:space="preserve">Berkas pertanggungjawaban: unggahan dan ceklist "Kuitansi" kini disebut "Kuitansi penyelenggara / hotel" agar jelas kuitansi mana yang dimaksud — dari penyelenggara kegiatan atau dari hotel tempat menginap.</w:t>
       </w:r>
     </w:p>
     <w:p>
@@ -12614,15 +12644,7 @@
         </w:numPr>
       </w:pPr>
       <w:r>
-        <w:t xml:space="preserve">Pegawai eksternal, mahasiswa, dan outsourcing: modul perjalanan dinasnya dikembangkan terpisah. Sementara itu, setelah masuk mereka melihat halaman pemberitahuan "fitur masih dikembangkan" dengan tombol keluar; menu lain belum dapat dibuka.</w:t>
-      </w:r>
-    </w:p>
-    <w:p>
-      <w:pPr>
-        <w:pStyle w:val="Heading2"/>
-      </w:pPr>
-      <w:r>
-        <w:t xml:space="preserve">Versi 2.5.2 — 15 September 2026</w:t>
+        <w:t xml:space="preserve">Jadwal Perjalanan kini bermenu: Jadwal Keberangkatan, Peta Dalam Kota &amp; Sekitarnya, dan Peta Luar Kota. Peta memperlihatkan kota-kota tujuan pegawai beserta jumlah perjalanan dan orang yang berangkat; klik penanda untuk rinciannya, saring per tahun. Dalam kota &amp; sekitarnya berarti tujuan di Sulawesi Utara. Kota-kota besar sudah dikenal sistem; kota lain diberi lintang-bujur pada Master Data → Lokasi Tujuan.</w:t>
       </w:r>
     </w:p>
     <w:p>
@@ -12634,7 +12656,7 @@
         </w:numPr>
       </w:pPr>
       <w:r>
-        <w:t xml:space="preserve">Impor pengguna: sel yang kosong pada berkas CSV tidak lagi menghapus surel, nomor HP, dan rekening yang sudah diisi pengguna, sehingga data pegawai aman diimpor ulang untuk menambah orang. Wakil Direktur II ditambahkan ke data pegawai bawaan.</w:t>
+        <w:t xml:space="preserve">Peran baru Mahasiswa, dapat dipilih saat membuat akun atau diimpor lewat kolom role bernilai "mahasiswa".</w:t>
       </w:r>
     </w:p>
     <w:p>
@@ -12646,7 +12668,7 @@
         </w:numPr>
       </w:pPr>
       <w:r>
-        <w:t xml:space="preserve">Integrasi Data (submenu Administrasi Sistem): token API dashboard eksekutif dibuat, diganti, atau dicabut langsung dari aplikasi tanpa menyunting .env di server, lengkap dengan alamat dan jalur API-nya; token yang berlaku dapat ditampilkan dan disalin.</w:t>
+        <w:t xml:space="preserve">Peran &amp; Hak Akses (submenu Administrasi Sistem, super administrator): menambah peran baru dan mengatur, per menu, kemampuan yang boleh dilihat, diubah, dan dihapus tiap peran — termasuk peran bawaan. Perubahan berlaku seketika dan tercatat pada jejak audit; Super Administrator selalu memegang seluruh akses. Hak menghapus master data dan menghapus pengguna kini kemampuan tersendiri.</w:t>
       </w:r>
     </w:p>
     <w:p>
@@ -12658,7 +12680,15 @@
         </w:numPr>
       </w:pPr>
       <w:r>
-        <w:t xml:space="preserve">Integrasi Data: pemantauan setiap permintaan API yang masuk (alamat IP, jalur, token yang dibawa — hanya ujung-ujungnya — diterima atau ditolak) dan pengiriman data dashboard eksekutif terjadwal (tiap jam, harian, atau mingguan) ke aplikasi tujuan memakai token, lengkap dengan riwayat pengirimannya dan tombol Kirim Sekarang.</w:t>
+        <w:t xml:space="preserve">Pegawai eksternal, mahasiswa, dan outsourcing: modul perjalanan dinasnya dikembangkan terpisah. Sementara itu, setelah masuk mereka melihat halaman pemberitahuan "fitur masih dikembangkan" dengan tombol keluar; menu lain belum dapat dibuka.</w:t>
+      </w:r>
+    </w:p>
+    <w:p>
+      <w:pPr>
+        <w:pStyle w:val="Heading2"/>
+      </w:pPr>
+      <w:r>
+        <w:t xml:space="preserve">Versi 2.5.2 — 15 September 2026</w:t>
       </w:r>
     </w:p>
     <w:p>
@@ -12670,7 +12700,7 @@
         </w:numPr>
       </w:pPr>
       <w:r>
-        <w:t xml:space="preserve">Pengaturan Sistem: kunci API Anthropic untuk Wawasan AI dan agen tanya-jawab Dashboard Eksekutif dipasang, diganti, atau dihapus dari aplikasi — tersimpan terenkripsi, tanpa menyunting .env di server.</w:t>
+        <w:t xml:space="preserve">Impor pengguna: sel yang kosong pada berkas CSV tidak lagi menghapus surel, nomor HP, dan rekening yang sudah diisi pengguna, sehingga data pegawai aman diimpor ulang untuk menambah orang. Wakil Direktur II ditambahkan ke data pegawai bawaan.</w:t>
       </w:r>
     </w:p>
     <w:p>
@@ -12682,7 +12712,7 @@
         </w:numPr>
       </w:pPr>
       <w:r>
-        <w:t xml:space="preserve">Membuka atau mengunci tanggal dikeluarkan SPD serta mengelola token API dan kunci AI kini melalui kotak konfirmasi.</w:t>
+        <w:t xml:space="preserve">Integrasi Data (submenu Administrasi Sistem): token API dashboard eksekutif dibuat, diganti, atau dicabut langsung dari aplikasi tanpa menyunting .env di server, lengkap dengan alamat dan jalur API-nya; token yang berlaku dapat ditampilkan dan disalin.</w:t>
       </w:r>
     </w:p>
     <w:p>
@@ -12694,7 +12724,7 @@
         </w:numPr>
       </w:pPr>
       <w:r>
-        <w:t xml:space="preserve">Nomor SPD pada usulan bersifat unik: nomor yang sudah dipakai usulan lain — milik siapa pun — ditolak saat mengajukan maupun menyunting, dengan pesan yang menyebut usulan mana yang memakainya, sehingga tidak ada usulan ganda atas SPD yang sama.</w:t>
+        <w:t xml:space="preserve">Integrasi Data: pemantauan setiap permintaan API yang masuk (alamat IP, jalur, token yang dibawa — hanya ujung-ujungnya — diterima atau ditolak) dan pengiriman data dashboard eksekutif terjadwal (tiap jam, harian, atau mingguan) ke aplikasi tujuan memakai token, lengkap dengan riwayat pengirimannya dan tombol Kirim Sekarang.</w:t>
       </w:r>
     </w:p>
     <w:p>
@@ -12706,7 +12736,7 @@
         </w:numPr>
       </w:pPr>
       <w:r>
-        <w:t xml:space="preserve">Usulan perjadin tidak lagi mensyaratkan SPD dibuat lewat aplikasi lebih dulu: formulir usulan terbuka bagi semua, memilih SPD dari aplikasi hanya untuk mengisi otomatis. SPD bertanda tangan beserta nomornya tetap wajib diunggah sebagai dasar persetujuan PPK.</w:t>
+        <w:t xml:space="preserve">Pengaturan Sistem: kunci API Anthropic untuk Wawasan AI dan agen tanya-jawab Dashboard Eksekutif dipasang, diganti, atau dihapus dari aplikasi — tersimpan terenkripsi, tanpa menyunting .env di server.</w:t>
       </w:r>
     </w:p>
     <w:p>
@@ -12718,15 +12748,7 @@
         </w:numPr>
       </w:pPr>
       <w:r>
-        <w:t xml:space="preserve">Rincian Saya: tiap berkas memuat panel Pemantauan Berkas — status seluruh tanda tangan (tim keuangan, pelaksana, PPK, konfirmasi Direktur, daftar nominatif) dan status pembayaran (uang muka, pelunasan, transport lokal) beserta tanggal dan kodenya.</w:t>
-      </w:r>
-    </w:p>
-    <w:p>
-      <w:pPr>
-        <w:pStyle w:val="Heading2"/>
-      </w:pPr>
-      <w:r>
-        <w:t xml:space="preserve">Versi 2.5.1 — 15 September 2026</w:t>
+        <w:t xml:space="preserve">Membuka atau mengunci tanggal dikeluarkan SPD serta mengelola token API dan kunci AI kini melalui kotak konfirmasi.</w:t>
       </w:r>
     </w:p>
     <w:p>
@@ -12738,7 +12760,7 @@
         </w:numPr>
       </w:pPr>
       <w:r>
-        <w:t xml:space="preserve">Administrasi Sistem: super administrator dapat membuka atau mengunci tanggal dikeluarkan SPD bagi seluruh peran untuk kasus tanggal mundur (backdate); bawaannya terkunci, tiap perubahan tercatat pada jejak audit.</w:t>
+        <w:t xml:space="preserve">Nomor SPD pada usulan bersifat unik: nomor yang sudah dipakai usulan lain — milik siapa pun — ditolak saat mengajukan maupun menyunting, dengan pesan yang menyebut usulan mana yang memakainya, sehingga tidak ada usulan ganda atas SPD yang sama.</w:t>
       </w:r>
     </w:p>
     <w:p>
@@ -12750,15 +12772,7 @@
         </w:numPr>
       </w:pPr>
       <w:r>
-        <w:t xml:space="preserve">Administrasi Sistem dipecah menjadi tiga halaman bermenu — Pengguna, Impor &amp; Ekspor, Pengaturan Sistem — dengan submenu di sidebar dan navigasi di kepala halaman.</w:t>
-      </w:r>
-    </w:p>
-    <w:p>
-      <w:pPr>
-        <w:pStyle w:val="Heading2"/>
-      </w:pPr>
-      <w:r>
-        <w:t xml:space="preserve">Versi 2.5 — 12 September 2026</w:t>
+        <w:t xml:space="preserve">Usulan perjadin tidak lagi mensyaratkan SPD dibuat lewat aplikasi lebih dulu: formulir usulan terbuka bagi semua, memilih SPD dari aplikasi hanya untuk mengisi otomatis. SPD bertanda tangan beserta nomornya tetap wajib diunggah sebagai dasar persetujuan PPK.</w:t>
       </w:r>
     </w:p>
     <w:p>
@@ -12770,7 +12784,15 @@
         </w:numPr>
       </w:pPr>
       <w:r>
-        <w:t xml:space="preserve">Usulan wajib melampirkan SPD bertanda tangan beserta nomornya; persetujuan PPK tercatat otomatis. Pengajuan berkelompok dan tombol Salin dihapus.</w:t>
+        <w:t xml:space="preserve">Rincian Saya: tiap berkas memuat panel Pemantauan Berkas — status seluruh tanda tangan (tim keuangan, pelaksana, PPK, konfirmasi Direktur, daftar nominatif) dan status pembayaran (uang muka, pelunasan, transport lokal) beserta tanggal dan kodenya.</w:t>
+      </w:r>
+    </w:p>
+    <w:p>
+      <w:pPr>
+        <w:pStyle w:val="Heading2"/>
+      </w:pPr>
+      <w:r>
+        <w:t xml:space="preserve">Versi 2.5.1 — 15 September 2026</w:t>
       </w:r>
     </w:p>
     <w:p>
@@ -12782,7 +12804,7 @@
         </w:numPr>
       </w:pPr>
       <w:r>
-        <w:t xml:space="preserve">Menu Laporan Perjadin bagi pimpinan: daftar laporan, status konfirmasi, tindak lanjut. Laporan dikirim ke pimpinan saat disimpan dan dikonfirmasi Direktur lewat QR; tempat kegiatan per hari.</w:t>
+        <w:t xml:space="preserve">Administrasi Sistem: super administrator dapat membuka atau mengunci tanggal dikeluarkan SPD bagi seluruh peran untuk kasus tanggal mundur (backdate); bawaannya terkunci, tiap perubahan tercatat pada jejak audit.</w:t>
       </w:r>
     </w:p>
     <w:p>
@@ -12794,7 +12816,15 @@
         </w:numPr>
       </w:pPr>
       <w:r>
-        <w:t xml:space="preserve">Pelunasan hanya menunggu konfirmasi laporan oleh Direktur — bukan tanda tangan PPK maupun daftar nominatif.</w:t>
+        <w:t xml:space="preserve">Administrasi Sistem dipecah menjadi tiga halaman bermenu — Pengguna, Impor &amp; Ekspor, Pengaturan Sistem — dengan submenu di sidebar dan navigasi di kepala halaman.</w:t>
+      </w:r>
+    </w:p>
+    <w:p>
+      <w:pPr>
+        <w:pStyle w:val="Heading2"/>
+      </w:pPr>
+      <w:r>
+        <w:t xml:space="preserve">Versi 2.5 — 12 September 2026</w:t>
       </w:r>
     </w:p>
     <w:p>
@@ -12806,7 +12836,7 @@
         </w:numPr>
       </w:pPr>
       <w:r>
-        <w:t xml:space="preserve">Daftar nominatif terbit per surat tugas begitu satu pelaksana tuntas; yang belum tercantum disebut dan bertambah sendiri. List Daftar Nominatif memuat seluruh daftar beserta status tanda tangan tiap pelaksana.</w:t>
+        <w:t xml:space="preserve">Usulan wajib melampirkan SPD bertanda tangan beserta nomornya; persetujuan PPK tercatat otomatis. Pengajuan berkelompok dan tombol Salin dihapus.</w:t>
       </w:r>
     </w:p>
     <w:p>
@@ -12818,7 +12848,7 @@
         </w:numPr>
       </w:pPr>
       <w:r>
-        <w:t xml:space="preserve">Berkas terkirim otomatis ke pelaksana setelah seluruh validasi rampung; status Sudah Dicek Tim Keuangan; tombol tanda tangan pelaksana tetap ada setelah masa sanggah; popup konfirmasi pada validasi dan pencabutannya.</w:t>
+        <w:t xml:space="preserve">Menu Laporan Perjadin bagi pimpinan: daftar laporan, status konfirmasi, tindak lanjut. Laporan dikirim ke pimpinan saat disimpan dan dikonfirmasi Direktur lewat QR; tempat kegiatan per hari.</w:t>
       </w:r>
     </w:p>
     <w:p>
@@ -12830,7 +12860,7 @@
         </w:numPr>
       </w:pPr>
       <w:r>
-        <w:t xml:space="preserve">Biaya penyelenggaraan: ditanya ada atau tidak; bila ada, nominal, bukti bayar, dan nomor invoice; tercetak di bawah uang penginapan.</w:t>
+        <w:t xml:space="preserve">Pelunasan hanya menunggu konfirmasi laporan oleh Direktur — bukan tanda tangan PPK maupun daftar nominatif.</w:t>
       </w:r>
     </w:p>
     <w:p>
@@ -12842,7 +12872,7 @@
         </w:numPr>
       </w:pPr>
       <w:r>
-        <w:t xml:space="preserve">Tiket membawa invoice; nota transport lokal hanya untuk ruas bernominal (transport lokal boleh tidak ada); dalam kota satu baris transport lokal; checklist kelengkapan mengikuti formulir.</w:t>
+        <w:t xml:space="preserve">Daftar nominatif terbit per surat tugas begitu satu pelaksana tuntas; yang belum tercantum disebut dan bertambah sendiri. List Daftar Nominatif memuat seluruh daftar beserta status tanda tangan tiap pelaksana.</w:t>
       </w:r>
     </w:p>
     <w:p>
@@ -12854,7 +12884,7 @@
         </w:numPr>
       </w:pPr>
       <w:r>
-        <w:t xml:space="preserve">Verifikasi PPK (rincian, daftar riil, nominatif) dan Arsip Rincian Lengkap dikelompokkan per bulan dan tahun; arsip tidak lagi menunggu nominatif; menu Keuangan bagi PPK dalam mode lihat saja.</w:t>
+        <w:t xml:space="preserve">Berkas terkirim otomatis ke pelaksana setelah seluruh validasi rampung; status Sudah Dicek Tim Keuangan; tombol tanda tangan pelaksana tetap ada setelah masa sanggah; popup konfirmasi pada validasi dan pencabutannya.</w:t>
       </w:r>
     </w:p>
     <w:p>
@@ -12866,7 +12896,7 @@
         </w:numPr>
       </w:pPr>
       <w:r>
-        <w:t xml:space="preserve">Pembatalan penggantian transport lokal dengan alasan; nominatif memuat QR dan kode verifikasi PPK.</w:t>
+        <w:t xml:space="preserve">Biaya penyelenggaraan: ditanya ada atau tidak; bila ada, nominal, bukti bayar, dan nomor invoice; tercetak di bawah uang penginapan.</w:t>
       </w:r>
     </w:p>
     <w:p>
@@ -12878,7 +12908,7 @@
         </w:numPr>
       </w:pPr>
       <w:r>
-        <w:t xml:space="preserve">Seluruh dokumen cetak berukuran folio dan dirapikan: usulan sebagai dokumen resmi berkop, rincian satu halaman, tanggal berbahasa Indonesia, WITA.</w:t>
+        <w:t xml:space="preserve">Tiket membawa invoice; nota transport lokal hanya untuk ruas bernominal (transport lokal boleh tidak ada); dalam kota satu baris transport lokal; checklist kelengkapan mengikuti formulir.</w:t>
       </w:r>
     </w:p>
     <w:p>
@@ -12890,15 +12920,7 @@
         </w:numPr>
       </w:pPr>
       <w:r>
-        <w:t xml:space="preserve">Pelacakan berkas: sepuluh tonggak dengan lama hari antar tahap; versi aplikasi tertera di halaman masuk.</w:t>
-      </w:r>
-    </w:p>
-    <w:p>
-      <w:pPr>
-        <w:pStyle w:val="Heading2"/>
-      </w:pPr>
-      <w:r>
-        <w:t xml:space="preserve">Versi 2.4 — 5 September 2026</w:t>
+        <w:t xml:space="preserve">Verifikasi PPK (rincian, daftar riil, nominatif) dan Arsip Rincian Lengkap dikelompokkan per bulan dan tahun; arsip tidak lagi menunggu nominatif; menu Keuangan bagi PPK dalam mode lihat saja.</w:t>
       </w:r>
     </w:p>
     <w:p>
@@ -12910,6 +12932,50 @@
         </w:numPr>
       </w:pPr>
       <w:r>
+        <w:t xml:space="preserve">Pembatalan penggantian transport lokal dengan alasan; nominatif memuat QR dan kode verifikasi PPK.</w:t>
+      </w:r>
+    </w:p>
+    <w:p>
+      <w:pPr>
+        <w:pStyle w:val="ListParagraph"/>
+        <w:numPr>
+          <w:ilvl w:val="0"/>
+          <w:numId w:val="2"/>
+        </w:numPr>
+      </w:pPr>
+      <w:r>
+        <w:t xml:space="preserve">Seluruh dokumen cetak berukuran folio dan dirapikan: usulan sebagai dokumen resmi berkop, rincian satu halaman, tanggal berbahasa Indonesia, WITA.</w:t>
+      </w:r>
+    </w:p>
+    <w:p>
+      <w:pPr>
+        <w:pStyle w:val="ListParagraph"/>
+        <w:numPr>
+          <w:ilvl w:val="0"/>
+          <w:numId w:val="2"/>
+        </w:numPr>
+      </w:pPr>
+      <w:r>
+        <w:t xml:space="preserve">Pelacakan berkas: sepuluh tonggak dengan lama hari antar tahap; versi aplikasi tertera di halaman masuk.</w:t>
+      </w:r>
+    </w:p>
+    <w:p>
+      <w:pPr>
+        <w:pStyle w:val="Heading2"/>
+      </w:pPr>
+      <w:r>
+        <w:t xml:space="preserve">Versi 2.4 — 5 September 2026</w:t>
+      </w:r>
+    </w:p>
+    <w:p>
+      <w:pPr>
+        <w:pStyle w:val="ListParagraph"/>
+        <w:numPr>
+          <w:ilvl w:val="0"/>
+          <w:numId w:val="2"/>
+        </w:numPr>
+      </w:pPr>
+      <w:r>
         <w:t xml:space="preserve">Rilis dasar versi 2: Surat Perjalanan Dinas dengan nomor unik dan pengikut, pertanggungjawaban per pelaksana (tiket, nota, bill hotel, laporan), rincian biaya dan daftar riil dengan dua jalur tanda tangan, daftar nominatif, pembayaran beserta riwayatnya, pelacakan berkas, dan saluran bantuan.</w:t>
       </w:r>
     </w:p>
@@ -12931,7 +12997,7 @@
           <w:sz w:val="17"/>
           <w:szCs w:val="17"/>
         </w:rPr>
-        <w:t xml:space="preserve">Buku Panduan PANGI v2.5 — Politeknik Kesehatan Kemenkes Manado. Isi buku ini mengikuti sistem sebagaimana berjalan pada 1 Oktober 2026 (versi 2.5.8); bila tampilan di layar berbeda, yang berlaku adalah sistemnya, dan mohon laporkan selisihnya lewat menu Bantuan.</w:t>
+        <w:t xml:space="preserve">Buku Panduan PANGI v2.5 — Politeknik Kesehatan Kemenkes Manado. Isi buku ini mengikuti sistem sebagaimana berjalan pada 1 Oktober 2026 (versi 2.5.9); bila tampilan di layar berbeda, yang berlaku adalah sistemnya, dan mohon laporkan selisihnya lewat menu Bantuan.</w:t>
       </w:r>
     </w:p>
     <w:sectPr>

</xml_diff>

<commit_message>
Jejak penghapusan, register nomor surat, dan news feed eksekutif (2.5.10)
- Jejak Audit bersubmenu: Semua Aktivitas, Penghapusan Usulan & SPD, dan
  Nomor Surat.
- Penghapusan usulan perjadin dan SPD direkam beserta cuplikan isinya
  (nomor, pelaksana, tujuan, tanggal, maksud), penghapus, waktu, dan
  alamatnya. Penghapusan SPD sebelumnya tidak tercatat sama sekali;
  penghapusan usulan lama ditandai lewat migrasi.
- Nomor Surat mendaftar nomor SPD aplikasi, nomor SPD bertanda tangan,
  dan nomor surat tugas per bulan dan tahun, dengan ekspor Excel untuk
  dicocokkan arsiparis dengan buku agenda surat keluar.
- Dashboard Eksekutif bersubmenu: Dashboard Utama (angka seperti
  sebelumnya) dan News Feed — lini masa perjalanan dinas yang akan dan
  sedang berlangsung serta tindak lanjut terjadwal; yang lewat tenggat
  ditaruh paling atas.
- Panduan Penggunaan, buku panduan (sampul 2.5.10), dan riwayat
  perubahan diperbarui.

Co-Authored-By: Claude Opus 5.5 <noreply@anthropic.com>
</commit_message>
<xml_diff>
--- a/resources/panduan/Buku-Panduan-PANGI-v2.5.docx
+++ b/resources/panduan/Buku-Panduan-PANGI-v2.5.docx
@@ -239,7 +239,7 @@
                 <w:sz w:val="19"/>
                 <w:szCs w:val="19"/>
               </w:rPr>
-              <w:t xml:space="preserve">2.5.9</w:t>
+              <w:t xml:space="preserve">2.5.10</w:t>
             </w:r>
           </w:p>
         </w:tc>
@@ -264,7 +264,7 @@
                 <w:sz w:val="19"/>
                 <w:szCs w:val="19"/>
               </w:rPr>
-              <w:t xml:space="preserve">1 Oktober 2026</w:t>
+              <w:t xml:space="preserve">2 Oktober 2026</w:t>
             </w:r>
           </w:p>
         </w:tc>
@@ -8397,7 +8397,7 @@
         </w:numPr>
       </w:pPr>
       <w:r>
-        <w:t xml:space="preserve">Jejak Audit mencatat setiap tindakan yang mengubah data beserta pelakunya dan waktunya.</w:t>
+        <w:t xml:space="preserve">Jejak Audit mencatat setiap tindakan yang mengubah data beserta pelakunya dan waktunya, pada submenu Semua Aktivitas. Submenu Penghapusan Usulan &amp; SPD memuat usulan perjadin dan SPD yang dihapus lengkap dengan isinya — nomor, pelaksana, tujuan, tanggal perjalanan — serta siapa yang menghapus, kapan, dan dari alamat mana. Submenu Nomor Surat mendaftar nomor SPD aplikasi, nomor SPD bertanda tangan, dan nomor surat tugas per bulan dan tahun, dan dapat diekspor ke Excel untuk dicocokkan arsiparis dengan buku agenda surat keluar.</w:t>
       </w:r>
     </w:p>
     <w:p>
@@ -8629,7 +8629,19 @@
         </w:numPr>
       </w:pPr>
       <w:r>
-        <w:t xml:space="preserve">Dashboard Eksekutif — realisasi anggaran per kategori dan per bulan, pergerakan pegawai per unit kerja, serta siapa yang akan berangkat, sedang berjalan, dan belum melapor. Tahun anggarannya dapat dipilih. Bila super administrator sudah memasang kunci API Anthropic di Pengaturan Sistem, panel Wawasan AI dan agen tanya-jawab ikut aktif di halaman ini.</w:t>
+        <w:t xml:space="preserve">Dashboard Eksekutif → Dashboard Utama — realisasi anggaran per kategori dan per bulan, pergerakan pegawai per unit kerja, serta siapa yang akan berangkat, sedang berjalan, dan belum melapor. Tahun anggarannya dapat dipilih. Bila super administrator sudah memasang kunci API Anthropic di Pengaturan Sistem, panel Wawasan AI dan agen tanya-jawab ikut aktif di halaman ini.</w:t>
+      </w:r>
+    </w:p>
+    <w:p>
+      <w:pPr>
+        <w:pStyle w:val="ListParagraph"/>
+        <w:numPr>
+          <w:ilvl w:val="0"/>
+          <w:numId w:val="2"/>
+        </w:numPr>
+      </w:pPr>
+      <w:r>
+        <w:t xml:space="preserve">Dashboard Eksekutif → News Feed — lini masa seperti media sosial: siapa yang akan dan sedang melakukan perjalanan dinas, ke mana dan bersama siapa, serta tindak lanjut hasil perjalanan yang dijadwalkan. Tindak lanjut yang melewati tenggat ditaruh paling atas. Saring menurut jenis kabar dan rentang 7, 30, atau 90 hari ke depan.</w:t>
       </w:r>
     </w:p>
     <w:p>
@@ -12356,7 +12368,7 @@
         <w:pStyle w:val="Heading2"/>
       </w:pPr>
       <w:r>
-        <w:t xml:space="preserve">Versi 2.5.9 — 1 Oktober 2026</w:t>
+        <w:t xml:space="preserve">Versi 2.5.10 — 2 Oktober 2026</w:t>
       </w:r>
     </w:p>
     <w:p>
@@ -12368,7 +12380,7 @@
         </w:numPr>
       </w:pPr>
       <w:r>
-        <w:t xml:space="preserve">Sanggahan pelaksana atas rincian biaya kini tampil di halaman Keuangan — tempat nominalnya diperbaiki — lengkap dengan alasan dan waktunya, beserta tombol Kirim Ulang ke Pelaksana. Sebelumnya berkas yang rinciannya disanggah tidak dapat dikirim ulang.</w:t>
+        <w:t xml:space="preserve">Jejak Audit bersubmenu: Semua Aktivitas, Penghapusan Usulan &amp; SPD — usulan dan SPD yang dihapus beserta isinya, penghapusnya, waktu, dan alamatnya; penghapusan SPD sebelumnya tidak tercatat — dan Nomor Surat.</w:t>
       </w:r>
     </w:p>
     <w:p>
@@ -12380,7 +12392,7 @@
         </w:numPr>
       </w:pPr>
       <w:r>
-        <w:t xml:space="preserve">Mengirim ulang hanya membuka dokumen yang disanggah: dokumen yang sudah ditandatangani pelaksana tetap berlaku beserta kode konfirmasinya, dan pemberitahuannya hanya menyebut dokumen yang perlu disikapi lagi.</w:t>
+        <w:t xml:space="preserve">Nomor Surat mendaftar nomor SPD aplikasi, nomor SPD bertanda tangan, dan nomor surat tugas per bulan dan tahun, dan dapat diekspor ke Excel untuk dicocokkan arsiparis.</w:t>
       </w:r>
     </w:p>
     <w:p>
@@ -12392,7 +12404,7 @@
         </w:numPr>
       </w:pPr>
       <w:r>
-        <w:t xml:space="preserve">Halaman Detail Keuangan kini menampilkan pesan hasil tiap tindakan — komponen tersimpan, berkas terkirim, atau alasan tertahan — dan menyebut tujuan perjalanan pada kepalanya. Pemberitahuan sanggahan kepada tim keuangan langsung membuka halaman ini.</w:t>
+        <w:t xml:space="preserve">Dashboard Eksekutif bersubmenu: Dashboard Utama berisi angka-angka seperti sebelumnya, dan News Feed menyajikan perjalanan dinas serta tindak lanjut yang dijadwalkan sebagai lini masa.</w:t>
       </w:r>
     </w:p>
     <w:p>
@@ -12400,7 +12412,7 @@
         <w:pStyle w:val="Heading2"/>
       </w:pPr>
       <w:r>
-        <w:t xml:space="preserve">Versi 2.5.8 — 1 Oktober 2026</w:t>
+        <w:t xml:space="preserve">Versi 2.5.9 — 1 Oktober 2026</w:t>
       </w:r>
     </w:p>
     <w:p>
@@ -12412,7 +12424,7 @@
         </w:numPr>
       </w:pPr>
       <w:r>
-        <w:t xml:space="preserve">Buku panduan bersampul baru dengan warna Kemenkes. Bab 5.1 dan 5.2 kini bergambar: setiap langkah membuat SPD sampai mengajukan perjadin disertai tangkapan layar bertanda nomor.</w:t>
+        <w:t xml:space="preserve">Sanggahan pelaksana atas rincian biaya kini tampil di halaman Keuangan — tempat nominalnya diperbaiki — lengkap dengan alasan dan waktunya, beserta tombol Kirim Ulang ke Pelaksana. Sebelumnya berkas yang rinciannya disanggah tidak dapat dikirim ulang.</w:t>
       </w:r>
     </w:p>
     <w:p>
@@ -12424,7 +12436,7 @@
         </w:numPr>
       </w:pPr>
       <w:r>
-        <w:t xml:space="preserve">Kotak konfirmasi sebelum mengirim pengajuan kini benar-benar menampilkan tujuan, tanggal, dan nomor SPD yang diisi — sebelumnya selalu tertulis "—".</w:t>
+        <w:t xml:space="preserve">Mengirim ulang hanya membuka dokumen yang disanggah: dokumen yang sudah ditandatangani pelaksana tetap berlaku beserta kode konfirmasinya, dan pemberitahuannya hanya menyebut dokumen yang perlu disikapi lagi.</w:t>
       </w:r>
     </w:p>
     <w:p>
@@ -12436,7 +12448,7 @@
         </w:numPr>
       </w:pPr>
       <w:r>
-        <w:t xml:space="preserve">Menu Panduan Penggunaan memuat tangkapan layar yang sama, dan buku lengkapnya dapat diunduh dalam format PDF maupun Word.</w:t>
+        <w:t xml:space="preserve">Halaman Detail Keuangan kini menampilkan pesan hasil tiap tindakan — komponen tersimpan, berkas terkirim, atau alasan tertahan — dan menyebut tujuan perjalanan pada kepalanya. Pemberitahuan sanggahan kepada tim keuangan langsung membuka halaman ini.</w:t>
       </w:r>
     </w:p>
     <w:p>
@@ -12444,7 +12456,7 @@
         <w:pStyle w:val="Heading2"/>
       </w:pPr>
       <w:r>
-        <w:t xml:space="preserve">Versi 2.5.7 — 1 Oktober 2026</w:t>
+        <w:t xml:space="preserve">Versi 2.5.8 — 1 Oktober 2026</w:t>
       </w:r>
     </w:p>
     <w:p>
@@ -12456,7 +12468,7 @@
         </w:numPr>
       </w:pPr>
       <w:r>
-        <w:t xml:space="preserve">Supervisi kerja praktek / magang dibedakan menurut tujuannya: supervisi ke luar kota tetap menerbitkan SPD — berkas SPD bertanda tangan beserta nomornya wajib dilampirkan — sedangkan supervisi di dalam kota cukup surat tugas.</w:t>
+        <w:t xml:space="preserve">Buku panduan bersampul baru dengan warna Kemenkes. Bab 5.1 dan 5.2 kini bergambar: setiap langkah membuat SPD sampai mengajukan perjadin disertai tangkapan layar bertanda nomor.</w:t>
       </w:r>
     </w:p>
     <w:p>
@@ -12468,15 +12480,7 @@
         </w:numPr>
       </w:pPr>
       <w:r>
-        <w:t xml:space="preserve">Isian SPD pada formulir usulan muncul dan menghilang sendiri mengikuti kategori yang dipilih; checklist kelengkapan dan formulir Dokumen Perdin ikut menyesuaikan.</w:t>
-      </w:r>
-    </w:p>
-    <w:p>
-      <w:pPr>
-        <w:pStyle w:val="Heading2"/>
-      </w:pPr>
-      <w:r>
-        <w:t xml:space="preserve">Versi 2.5.6 — 1 Oktober 2026</w:t>
+        <w:t xml:space="preserve">Kotak konfirmasi sebelum mengirim pengajuan kini benar-benar menampilkan tujuan, tanggal, dan nomor SPD yang diisi — sebelumnya selalu tertulis "—".</w:t>
       </w:r>
     </w:p>
     <w:p>
@@ -12488,7 +12492,7 @@
         </w:numPr>
       </w:pPr>
       <w:r>
-        <w:t xml:space="preserve">Berkas Pertanggungjawaban (submenu Administrasi Sistem): berkas yang ditagih sesudah perjalanan dipilih sendiri untuk tiap jalur pengajuan, dan berlaku serentak pada formulir dokumen, checklist, serta penagihan.</w:t>
+        <w:t xml:space="preserve">Menu Panduan Penggunaan memuat tangkapan layar yang sama, dan buku lengkapnya dapat diunduh dalam format PDF maupun Word.</w:t>
       </w:r>
     </w:p>
     <w:p>
@@ -12496,7 +12500,7 @@
         <w:pStyle w:val="Heading2"/>
       </w:pPr>
       <w:r>
-        <w:t xml:space="preserve">Versi 2.5.5 — 1 Oktober 2026</w:t>
+        <w:t xml:space="preserve">Versi 2.5.7 — 1 Oktober 2026</w:t>
       </w:r>
     </w:p>
     <w:p>
@@ -12508,7 +12512,7 @@
         </w:numPr>
       </w:pPr>
       <w:r>
-        <w:t xml:space="preserve">Pengajuan perjadin dimulai dengan memilih jalur: dalam kota, luar kota, atau supervisi kerja praktek / magang. Jalur itu menyaring kategori perjalanan dinas dari Master Data.</w:t>
+        <w:t xml:space="preserve">Supervisi kerja praktek / magang dibedakan menurut tujuannya: supervisi ke luar kota tetap menerbitkan SPD — berkas SPD bertanda tangan beserta nomornya wajib dilampirkan — sedangkan supervisi di dalam kota cukup surat tugas.</w:t>
       </w:r>
     </w:p>
     <w:p>
@@ -12520,7 +12524,15 @@
         </w:numPr>
       </w:pPr>
       <w:r>
-        <w:t xml:space="preserve">Jalur supervisi kerja praktek / magang tidak memakai Surat Perjalanan Dinas: cukup surat tugas beserta nomornya, dan jenis kegiatannya terisi sendiri.</w:t>
+        <w:t xml:space="preserve">Isian SPD pada formulir usulan muncul dan menghilang sendiri mengikuti kategori yang dipilih; checklist kelengkapan dan formulir Dokumen Perdin ikut menyesuaikan.</w:t>
+      </w:r>
+    </w:p>
+    <w:p>
+      <w:pPr>
+        <w:pStyle w:val="Heading2"/>
+      </w:pPr>
+      <w:r>
+        <w:t xml:space="preserve">Versi 2.5.6 — 1 Oktober 2026</w:t>
       </w:r>
     </w:p>
     <w:p>
@@ -12532,7 +12544,15 @@
         </w:numPr>
       </w:pPr>
       <w:r>
-        <w:t xml:space="preserve">Kaki halaman SPD mengikuti cetakan terbaru — lambang Garuda Sertifikasi dilepas, alamat verifikasi menjadi tte.komdigi.go.id — dan butir V tidak lagi memuat penanda QR.</w:t>
+        <w:t xml:space="preserve">Berkas Pertanggungjawaban (submenu Administrasi Sistem): berkas yang ditagih sesudah perjalanan dipilih sendiri untuk tiap jalur pengajuan, dan berlaku serentak pada formulir dokumen, checklist, serta penagihan.</w:t>
+      </w:r>
+    </w:p>
+    <w:p>
+      <w:pPr>
+        <w:pStyle w:val="Heading2"/>
+      </w:pPr>
+      <w:r>
+        <w:t xml:space="preserve">Versi 2.5.5 — 1 Oktober 2026</w:t>
       </w:r>
     </w:p>
     <w:p>
@@ -12544,15 +12564,7 @@
         </w:numPr>
       </w:pPr>
       <w:r>
-        <w:t xml:space="preserve">Daftar Usulan Perjadin menyebut pelaksana perjalanan pada kolom pertama, menggantikan kolom Pemohon yang selalu kosong.</w:t>
-      </w:r>
-    </w:p>
-    <w:p>
-      <w:pPr>
-        <w:pStyle w:val="Heading2"/>
-      </w:pPr>
-      <w:r>
-        <w:t xml:space="preserve">Versi 2.5.4 — 30 September 2026</w:t>
+        <w:t xml:space="preserve">Pengajuan perjadin dimulai dengan memilih jalur: dalam kota, luar kota, atau supervisi kerja praktek / magang. Jalur itu menyaring kategori perjalanan dinas dari Master Data.</w:t>
       </w:r>
     </w:p>
     <w:p>
@@ -12564,7 +12576,7 @@
         </w:numPr>
       </w:pPr>
       <w:r>
-        <w:t xml:space="preserve">Dokumen Output (submenu Administrasi Sistem): tampilan empat dokumen cetak diatur dari aplikasi — ukuran kertas dan huruf, elemen yang ikut tercetak, serta teks bakunya. Tiap perubahan tercatat pada jejak audit dan dapat dikembalikan ke bawaan.</w:t>
+        <w:t xml:space="preserve">Jalur supervisi kerja praktek / magang tidak memakai Surat Perjalanan Dinas: cukup surat tugas beserta nomornya, dan jenis kegiatannya terisi sendiri.</w:t>
       </w:r>
     </w:p>
     <w:p>
@@ -12576,7 +12588,7 @@
         </w:numPr>
       </w:pPr>
       <w:r>
-        <w:t xml:space="preserve">Dokumen Output memuat pratinjau dokumen contoh yang ikut berubah mengikuti centangan elemen, lengkap dengan tombol buka di tab baru dan unduh contoh PDF.</w:t>
+        <w:t xml:space="preserve">Kaki halaman SPD mengikuti cetakan terbaru — lambang Garuda Sertifikasi dilepas, alamat verifikasi menjadi tte.komdigi.go.id — dan butir V tidak lagi memuat penanda QR.</w:t>
       </w:r>
     </w:p>
     <w:p>
@@ -12588,7 +12600,7 @@
         </w:numPr>
       </w:pPr>
       <w:r>
-        <w:t xml:space="preserve">Penanda tanda tangan elektronik SRIKANDI dan nomor naskah sengaja tidak dapat dimatikan, supaya surat tetap dapat ditandatangani secara elektronik.</w:t>
+        <w:t xml:space="preserve">Daftar Usulan Perjadin menyebut pelaksana perjalanan pada kolom pertama, menggantikan kolom Pemohon yang selalu kosong.</w:t>
       </w:r>
     </w:p>
     <w:p>
@@ -12596,7 +12608,7 @@
         <w:pStyle w:val="Heading2"/>
       </w:pPr>
       <w:r>
-        <w:t xml:space="preserve">Versi 2.5.3 — 21 September 2026</w:t>
+        <w:t xml:space="preserve">Versi 2.5.4 — 30 September 2026</w:t>
       </w:r>
     </w:p>
     <w:p>
@@ -12608,7 +12620,7 @@
         </w:numPr>
       </w:pPr>
       <w:r>
-        <w:t xml:space="preserve">Formulir SPD: surat tugas dilampirkan sejak SPD dibuat — nomor dan berkasnya diisi pada kartu Surat Tugas (tidak wajib). Usulan perjadin yang memilih SPD itu mengambil keduanya secara otomatis; berkas surat tugas tidak diunggah lagi dan nomornya tidak disalin ulang.</w:t>
+        <w:t xml:space="preserve">Dokumen Output (submenu Administrasi Sistem): tampilan empat dokumen cetak diatur dari aplikasi — ukuran kertas dan huruf, elemen yang ikut tercetak, serta teks bakunya. Tiap perubahan tercatat pada jejak audit dan dapat dikembalikan ke bawaan.</w:t>
       </w:r>
     </w:p>
     <w:p>
@@ -12620,7 +12632,7 @@
         </w:numPr>
       </w:pPr>
       <w:r>
-        <w:t xml:space="preserve">Formulir SPD: kolom Akun pembebanan dihapus — akun diisi PPK saat verifikasi dan tanda tangan, bukan oleh pembuat SPD.</w:t>
+        <w:t xml:space="preserve">Dokumen Output memuat pratinjau dokumen contoh yang ikut berubah mengikuti centangan elemen, lengkap dengan tombol buka di tab baru dan unduh contoh PDF.</w:t>
       </w:r>
     </w:p>
     <w:p>
@@ -12632,7 +12644,15 @@
         </w:numPr>
       </w:pPr>
       <w:r>
-        <w:t xml:space="preserve">Berkas pertanggungjawaban: unggahan dan ceklist "Kuitansi" kini disebut "Kuitansi penyelenggara / hotel" agar jelas kuitansi mana yang dimaksud — dari penyelenggara kegiatan atau dari hotel tempat menginap.</w:t>
+        <w:t xml:space="preserve">Penanda tanda tangan elektronik SRIKANDI dan nomor naskah sengaja tidak dapat dimatikan, supaya surat tetap dapat ditandatangani secara elektronik.</w:t>
+      </w:r>
+    </w:p>
+    <w:p>
+      <w:pPr>
+        <w:pStyle w:val="Heading2"/>
+      </w:pPr>
+      <w:r>
+        <w:t xml:space="preserve">Versi 2.5.3 — 21 September 2026</w:t>
       </w:r>
     </w:p>
     <w:p>
@@ -12644,7 +12664,7 @@
         </w:numPr>
       </w:pPr>
       <w:r>
-        <w:t xml:space="preserve">Jadwal Perjalanan kini bermenu: Jadwal Keberangkatan, Peta Dalam Kota &amp; Sekitarnya, dan Peta Luar Kota. Peta memperlihatkan kota-kota tujuan pegawai beserta jumlah perjalanan dan orang yang berangkat; klik penanda untuk rinciannya, saring per tahun. Dalam kota &amp; sekitarnya berarti tujuan di Sulawesi Utara. Kota-kota besar sudah dikenal sistem; kota lain diberi lintang-bujur pada Master Data → Lokasi Tujuan.</w:t>
+        <w:t xml:space="preserve">Formulir SPD: surat tugas dilampirkan sejak SPD dibuat — nomor dan berkasnya diisi pada kartu Surat Tugas (tidak wajib). Usulan perjadin yang memilih SPD itu mengambil keduanya secara otomatis; berkas surat tugas tidak diunggah lagi dan nomornya tidak disalin ulang.</w:t>
       </w:r>
     </w:p>
     <w:p>
@@ -12656,7 +12676,7 @@
         </w:numPr>
       </w:pPr>
       <w:r>
-        <w:t xml:space="preserve">Peran baru Mahasiswa, dapat dipilih saat membuat akun atau diimpor lewat kolom role bernilai "mahasiswa".</w:t>
+        <w:t xml:space="preserve">Formulir SPD: kolom Akun pembebanan dihapus — akun diisi PPK saat verifikasi dan tanda tangan, bukan oleh pembuat SPD.</w:t>
       </w:r>
     </w:p>
     <w:p>
@@ -12668,7 +12688,7 @@
         </w:numPr>
       </w:pPr>
       <w:r>
-        <w:t xml:space="preserve">Peran &amp; Hak Akses (submenu Administrasi Sistem, super administrator): menambah peran baru dan mengatur, per menu, kemampuan yang boleh dilihat, diubah, dan dihapus tiap peran — termasuk peran bawaan. Perubahan berlaku seketika dan tercatat pada jejak audit; Super Administrator selalu memegang seluruh akses. Hak menghapus master data dan menghapus pengguna kini kemampuan tersendiri.</w:t>
+        <w:t xml:space="preserve">Berkas pertanggungjawaban: unggahan dan ceklist "Kuitansi" kini disebut "Kuitansi penyelenggara / hotel" agar jelas kuitansi mana yang dimaksud — dari penyelenggara kegiatan atau dari hotel tempat menginap.</w:t>
       </w:r>
     </w:p>
     <w:p>
@@ -12680,15 +12700,7 @@
         </w:numPr>
       </w:pPr>
       <w:r>
-        <w:t xml:space="preserve">Pegawai eksternal, mahasiswa, dan outsourcing: modul perjalanan dinasnya dikembangkan terpisah. Sementara itu, setelah masuk mereka melihat halaman pemberitahuan "fitur masih dikembangkan" dengan tombol keluar; menu lain belum dapat dibuka.</w:t>
-      </w:r>
-    </w:p>
-    <w:p>
-      <w:pPr>
-        <w:pStyle w:val="Heading2"/>
-      </w:pPr>
-      <w:r>
-        <w:t xml:space="preserve">Versi 2.5.2 — 15 September 2026</w:t>
+        <w:t xml:space="preserve">Jadwal Perjalanan kini bermenu: Jadwal Keberangkatan, Peta Dalam Kota &amp; Sekitarnya, dan Peta Luar Kota. Peta memperlihatkan kota-kota tujuan pegawai beserta jumlah perjalanan dan orang yang berangkat; klik penanda untuk rinciannya, saring per tahun. Dalam kota &amp; sekitarnya berarti tujuan di Sulawesi Utara. Kota-kota besar sudah dikenal sistem; kota lain diberi lintang-bujur pada Master Data → Lokasi Tujuan.</w:t>
       </w:r>
     </w:p>
     <w:p>
@@ -12700,7 +12712,7 @@
         </w:numPr>
       </w:pPr>
       <w:r>
-        <w:t xml:space="preserve">Impor pengguna: sel yang kosong pada berkas CSV tidak lagi menghapus surel, nomor HP, dan rekening yang sudah diisi pengguna, sehingga data pegawai aman diimpor ulang untuk menambah orang. Wakil Direktur II ditambahkan ke data pegawai bawaan.</w:t>
+        <w:t xml:space="preserve">Peran baru Mahasiswa, dapat dipilih saat membuat akun atau diimpor lewat kolom role bernilai "mahasiswa".</w:t>
       </w:r>
     </w:p>
     <w:p>
@@ -12712,7 +12724,7 @@
         </w:numPr>
       </w:pPr>
       <w:r>
-        <w:t xml:space="preserve">Integrasi Data (submenu Administrasi Sistem): token API dashboard eksekutif dibuat, diganti, atau dicabut langsung dari aplikasi tanpa menyunting .env di server, lengkap dengan alamat dan jalur API-nya; token yang berlaku dapat ditampilkan dan disalin.</w:t>
+        <w:t xml:space="preserve">Peran &amp; Hak Akses (submenu Administrasi Sistem, super administrator): menambah peran baru dan mengatur, per menu, kemampuan yang boleh dilihat, diubah, dan dihapus tiap peran — termasuk peran bawaan. Perubahan berlaku seketika dan tercatat pada jejak audit; Super Administrator selalu memegang seluruh akses. Hak menghapus master data dan menghapus pengguna kini kemampuan tersendiri.</w:t>
       </w:r>
     </w:p>
     <w:p>
@@ -12724,7 +12736,15 @@
         </w:numPr>
       </w:pPr>
       <w:r>
-        <w:t xml:space="preserve">Integrasi Data: pemantauan setiap permintaan API yang masuk (alamat IP, jalur, token yang dibawa — hanya ujung-ujungnya — diterima atau ditolak) dan pengiriman data dashboard eksekutif terjadwal (tiap jam, harian, atau mingguan) ke aplikasi tujuan memakai token, lengkap dengan riwayat pengirimannya dan tombol Kirim Sekarang.</w:t>
+        <w:t xml:space="preserve">Pegawai eksternal, mahasiswa, dan outsourcing: modul perjalanan dinasnya dikembangkan terpisah. Sementara itu, setelah masuk mereka melihat halaman pemberitahuan "fitur masih dikembangkan" dengan tombol keluar; menu lain belum dapat dibuka.</w:t>
+      </w:r>
+    </w:p>
+    <w:p>
+      <w:pPr>
+        <w:pStyle w:val="Heading2"/>
+      </w:pPr>
+      <w:r>
+        <w:t xml:space="preserve">Versi 2.5.2 — 15 September 2026</w:t>
       </w:r>
     </w:p>
     <w:p>
@@ -12736,7 +12756,7 @@
         </w:numPr>
       </w:pPr>
       <w:r>
-        <w:t xml:space="preserve">Pengaturan Sistem: kunci API Anthropic untuk Wawasan AI dan agen tanya-jawab Dashboard Eksekutif dipasang, diganti, atau dihapus dari aplikasi — tersimpan terenkripsi, tanpa menyunting .env di server.</w:t>
+        <w:t xml:space="preserve">Impor pengguna: sel yang kosong pada berkas CSV tidak lagi menghapus surel, nomor HP, dan rekening yang sudah diisi pengguna, sehingga data pegawai aman diimpor ulang untuk menambah orang. Wakil Direktur II ditambahkan ke data pegawai bawaan.</w:t>
       </w:r>
     </w:p>
     <w:p>
@@ -12748,7 +12768,7 @@
         </w:numPr>
       </w:pPr>
       <w:r>
-        <w:t xml:space="preserve">Membuka atau mengunci tanggal dikeluarkan SPD serta mengelola token API dan kunci AI kini melalui kotak konfirmasi.</w:t>
+        <w:t xml:space="preserve">Integrasi Data (submenu Administrasi Sistem): token API dashboard eksekutif dibuat, diganti, atau dicabut langsung dari aplikasi tanpa menyunting .env di server, lengkap dengan alamat dan jalur API-nya; token yang berlaku dapat ditampilkan dan disalin.</w:t>
       </w:r>
     </w:p>
     <w:p>
@@ -12760,7 +12780,7 @@
         </w:numPr>
       </w:pPr>
       <w:r>
-        <w:t xml:space="preserve">Nomor SPD pada usulan bersifat unik: nomor yang sudah dipakai usulan lain — milik siapa pun — ditolak saat mengajukan maupun menyunting, dengan pesan yang menyebut usulan mana yang memakainya, sehingga tidak ada usulan ganda atas SPD yang sama.</w:t>
+        <w:t xml:space="preserve">Integrasi Data: pemantauan setiap permintaan API yang masuk (alamat IP, jalur, token yang dibawa — hanya ujung-ujungnya — diterima atau ditolak) dan pengiriman data dashboard eksekutif terjadwal (tiap jam, harian, atau mingguan) ke aplikasi tujuan memakai token, lengkap dengan riwayat pengirimannya dan tombol Kirim Sekarang.</w:t>
       </w:r>
     </w:p>
     <w:p>
@@ -12772,7 +12792,7 @@
         </w:numPr>
       </w:pPr>
       <w:r>
-        <w:t xml:space="preserve">Usulan perjadin tidak lagi mensyaratkan SPD dibuat lewat aplikasi lebih dulu: formulir usulan terbuka bagi semua, memilih SPD dari aplikasi hanya untuk mengisi otomatis. SPD bertanda tangan beserta nomornya tetap wajib diunggah sebagai dasar persetujuan PPK.</w:t>
+        <w:t xml:space="preserve">Pengaturan Sistem: kunci API Anthropic untuk Wawasan AI dan agen tanya-jawab Dashboard Eksekutif dipasang, diganti, atau dihapus dari aplikasi — tersimpan terenkripsi, tanpa menyunting .env di server.</w:t>
       </w:r>
     </w:p>
     <w:p>
@@ -12784,15 +12804,7 @@
         </w:numPr>
       </w:pPr>
       <w:r>
-        <w:t xml:space="preserve">Rincian Saya: tiap berkas memuat panel Pemantauan Berkas — status seluruh tanda tangan (tim keuangan, pelaksana, PPK, konfirmasi Direktur, daftar nominatif) dan status pembayaran (uang muka, pelunasan, transport lokal) beserta tanggal dan kodenya.</w:t>
-      </w:r>
-    </w:p>
-    <w:p>
-      <w:pPr>
-        <w:pStyle w:val="Heading2"/>
-      </w:pPr>
-      <w:r>
-        <w:t xml:space="preserve">Versi 2.5.1 — 15 September 2026</w:t>
+        <w:t xml:space="preserve">Membuka atau mengunci tanggal dikeluarkan SPD serta mengelola token API dan kunci AI kini melalui kotak konfirmasi.</w:t>
       </w:r>
     </w:p>
     <w:p>
@@ -12804,7 +12816,7 @@
         </w:numPr>
       </w:pPr>
       <w:r>
-        <w:t xml:space="preserve">Administrasi Sistem: super administrator dapat membuka atau mengunci tanggal dikeluarkan SPD bagi seluruh peran untuk kasus tanggal mundur (backdate); bawaannya terkunci, tiap perubahan tercatat pada jejak audit.</w:t>
+        <w:t xml:space="preserve">Nomor SPD pada usulan bersifat unik: nomor yang sudah dipakai usulan lain — milik siapa pun — ditolak saat mengajukan maupun menyunting, dengan pesan yang menyebut usulan mana yang memakainya, sehingga tidak ada usulan ganda atas SPD yang sama.</w:t>
       </w:r>
     </w:p>
     <w:p>
@@ -12816,15 +12828,7 @@
         </w:numPr>
       </w:pPr>
       <w:r>
-        <w:t xml:space="preserve">Administrasi Sistem dipecah menjadi tiga halaman bermenu — Pengguna, Impor &amp; Ekspor, Pengaturan Sistem — dengan submenu di sidebar dan navigasi di kepala halaman.</w:t>
-      </w:r>
-    </w:p>
-    <w:p>
-      <w:pPr>
-        <w:pStyle w:val="Heading2"/>
-      </w:pPr>
-      <w:r>
-        <w:t xml:space="preserve">Versi 2.5 — 12 September 2026</w:t>
+        <w:t xml:space="preserve">Usulan perjadin tidak lagi mensyaratkan SPD dibuat lewat aplikasi lebih dulu: formulir usulan terbuka bagi semua, memilih SPD dari aplikasi hanya untuk mengisi otomatis. SPD bertanda tangan beserta nomornya tetap wajib diunggah sebagai dasar persetujuan PPK.</w:t>
       </w:r>
     </w:p>
     <w:p>
@@ -12836,7 +12840,15 @@
         </w:numPr>
       </w:pPr>
       <w:r>
-        <w:t xml:space="preserve">Usulan wajib melampirkan SPD bertanda tangan beserta nomornya; persetujuan PPK tercatat otomatis. Pengajuan berkelompok dan tombol Salin dihapus.</w:t>
+        <w:t xml:space="preserve">Rincian Saya: tiap berkas memuat panel Pemantauan Berkas — status seluruh tanda tangan (tim keuangan, pelaksana, PPK, konfirmasi Direktur, daftar nominatif) dan status pembayaran (uang muka, pelunasan, transport lokal) beserta tanggal dan kodenya.</w:t>
+      </w:r>
+    </w:p>
+    <w:p>
+      <w:pPr>
+        <w:pStyle w:val="Heading2"/>
+      </w:pPr>
+      <w:r>
+        <w:t xml:space="preserve">Versi 2.5.1 — 15 September 2026</w:t>
       </w:r>
     </w:p>
     <w:p>
@@ -12848,7 +12860,7 @@
         </w:numPr>
       </w:pPr>
       <w:r>
-        <w:t xml:space="preserve">Menu Laporan Perjadin bagi pimpinan: daftar laporan, status konfirmasi, tindak lanjut. Laporan dikirim ke pimpinan saat disimpan dan dikonfirmasi Direktur lewat QR; tempat kegiatan per hari.</w:t>
+        <w:t xml:space="preserve">Administrasi Sistem: super administrator dapat membuka atau mengunci tanggal dikeluarkan SPD bagi seluruh peran untuk kasus tanggal mundur (backdate); bawaannya terkunci, tiap perubahan tercatat pada jejak audit.</w:t>
       </w:r>
     </w:p>
     <w:p>
@@ -12860,7 +12872,15 @@
         </w:numPr>
       </w:pPr>
       <w:r>
-        <w:t xml:space="preserve">Pelunasan hanya menunggu konfirmasi laporan oleh Direktur — bukan tanda tangan PPK maupun daftar nominatif.</w:t>
+        <w:t xml:space="preserve">Administrasi Sistem dipecah menjadi tiga halaman bermenu — Pengguna, Impor &amp; Ekspor, Pengaturan Sistem — dengan submenu di sidebar dan navigasi di kepala halaman.</w:t>
+      </w:r>
+    </w:p>
+    <w:p>
+      <w:pPr>
+        <w:pStyle w:val="Heading2"/>
+      </w:pPr>
+      <w:r>
+        <w:t xml:space="preserve">Versi 2.5 — 12 September 2026</w:t>
       </w:r>
     </w:p>
     <w:p>
@@ -12872,7 +12892,7 @@
         </w:numPr>
       </w:pPr>
       <w:r>
-        <w:t xml:space="preserve">Daftar nominatif terbit per surat tugas begitu satu pelaksana tuntas; yang belum tercantum disebut dan bertambah sendiri. List Daftar Nominatif memuat seluruh daftar beserta status tanda tangan tiap pelaksana.</w:t>
+        <w:t xml:space="preserve">Usulan wajib melampirkan SPD bertanda tangan beserta nomornya; persetujuan PPK tercatat otomatis. Pengajuan berkelompok dan tombol Salin dihapus.</w:t>
       </w:r>
     </w:p>
     <w:p>
@@ -12884,7 +12904,7 @@
         </w:numPr>
       </w:pPr>
       <w:r>
-        <w:t xml:space="preserve">Berkas terkirim otomatis ke pelaksana setelah seluruh validasi rampung; status Sudah Dicek Tim Keuangan; tombol tanda tangan pelaksana tetap ada setelah masa sanggah; popup konfirmasi pada validasi dan pencabutannya.</w:t>
+        <w:t xml:space="preserve">Menu Laporan Perjadin bagi pimpinan: daftar laporan, status konfirmasi, tindak lanjut. Laporan dikirim ke pimpinan saat disimpan dan dikonfirmasi Direktur lewat QR; tempat kegiatan per hari.</w:t>
       </w:r>
     </w:p>
     <w:p>
@@ -12896,7 +12916,7 @@
         </w:numPr>
       </w:pPr>
       <w:r>
-        <w:t xml:space="preserve">Biaya penyelenggaraan: ditanya ada atau tidak; bila ada, nominal, bukti bayar, dan nomor invoice; tercetak di bawah uang penginapan.</w:t>
+        <w:t xml:space="preserve">Pelunasan hanya menunggu konfirmasi laporan oleh Direktur — bukan tanda tangan PPK maupun daftar nominatif.</w:t>
       </w:r>
     </w:p>
     <w:p>
@@ -12908,7 +12928,7 @@
         </w:numPr>
       </w:pPr>
       <w:r>
-        <w:t xml:space="preserve">Tiket membawa invoice; nota transport lokal hanya untuk ruas bernominal (transport lokal boleh tidak ada); dalam kota satu baris transport lokal; checklist kelengkapan mengikuti formulir.</w:t>
+        <w:t xml:space="preserve">Daftar nominatif terbit per surat tugas begitu satu pelaksana tuntas; yang belum tercantum disebut dan bertambah sendiri. List Daftar Nominatif memuat seluruh daftar beserta status tanda tangan tiap pelaksana.</w:t>
       </w:r>
     </w:p>
     <w:p>
@@ -12920,7 +12940,7 @@
         </w:numPr>
       </w:pPr>
       <w:r>
-        <w:t xml:space="preserve">Verifikasi PPK (rincian, daftar riil, nominatif) dan Arsip Rincian Lengkap dikelompokkan per bulan dan tahun; arsip tidak lagi menunggu nominatif; menu Keuangan bagi PPK dalam mode lihat saja.</w:t>
+        <w:t xml:space="preserve">Berkas terkirim otomatis ke pelaksana setelah seluruh validasi rampung; status Sudah Dicek Tim Keuangan; tombol tanda tangan pelaksana tetap ada setelah masa sanggah; popup konfirmasi pada validasi dan pencabutannya.</w:t>
       </w:r>
     </w:p>
     <w:p>
@@ -12932,7 +12952,7 @@
         </w:numPr>
       </w:pPr>
       <w:r>
-        <w:t xml:space="preserve">Pembatalan penggantian transport lokal dengan alasan; nominatif memuat QR dan kode verifikasi PPK.</w:t>
+        <w:t xml:space="preserve">Biaya penyelenggaraan: ditanya ada atau tidak; bila ada, nominal, bukti bayar, dan nomor invoice; tercetak di bawah uang penginapan.</w:t>
       </w:r>
     </w:p>
     <w:p>
@@ -12944,7 +12964,7 @@
         </w:numPr>
       </w:pPr>
       <w:r>
-        <w:t xml:space="preserve">Seluruh dokumen cetak berukuran folio dan dirapikan: usulan sebagai dokumen resmi berkop, rincian satu halaman, tanggal berbahasa Indonesia, WITA.</w:t>
+        <w:t xml:space="preserve">Tiket membawa invoice; nota transport lokal hanya untuk ruas bernominal (transport lokal boleh tidak ada); dalam kota satu baris transport lokal; checklist kelengkapan mengikuti formulir.</w:t>
       </w:r>
     </w:p>
     <w:p>
@@ -12956,15 +12976,7 @@
         </w:numPr>
       </w:pPr>
       <w:r>
-        <w:t xml:space="preserve">Pelacakan berkas: sepuluh tonggak dengan lama hari antar tahap; versi aplikasi tertera di halaman masuk.</w:t>
-      </w:r>
-    </w:p>
-    <w:p>
-      <w:pPr>
-        <w:pStyle w:val="Heading2"/>
-      </w:pPr>
-      <w:r>
-        <w:t xml:space="preserve">Versi 2.4 — 5 September 2026</w:t>
+        <w:t xml:space="preserve">Verifikasi PPK (rincian, daftar riil, nominatif) dan Arsip Rincian Lengkap dikelompokkan per bulan dan tahun; arsip tidak lagi menunggu nominatif; menu Keuangan bagi PPK dalam mode lihat saja.</w:t>
       </w:r>
     </w:p>
     <w:p>
@@ -12976,6 +12988,50 @@
         </w:numPr>
       </w:pPr>
       <w:r>
+        <w:t xml:space="preserve">Pembatalan penggantian transport lokal dengan alasan; nominatif memuat QR dan kode verifikasi PPK.</w:t>
+      </w:r>
+    </w:p>
+    <w:p>
+      <w:pPr>
+        <w:pStyle w:val="ListParagraph"/>
+        <w:numPr>
+          <w:ilvl w:val="0"/>
+          <w:numId w:val="2"/>
+        </w:numPr>
+      </w:pPr>
+      <w:r>
+        <w:t xml:space="preserve">Seluruh dokumen cetak berukuran folio dan dirapikan: usulan sebagai dokumen resmi berkop, rincian satu halaman, tanggal berbahasa Indonesia, WITA.</w:t>
+      </w:r>
+    </w:p>
+    <w:p>
+      <w:pPr>
+        <w:pStyle w:val="ListParagraph"/>
+        <w:numPr>
+          <w:ilvl w:val="0"/>
+          <w:numId w:val="2"/>
+        </w:numPr>
+      </w:pPr>
+      <w:r>
+        <w:t xml:space="preserve">Pelacakan berkas: sepuluh tonggak dengan lama hari antar tahap; versi aplikasi tertera di halaman masuk.</w:t>
+      </w:r>
+    </w:p>
+    <w:p>
+      <w:pPr>
+        <w:pStyle w:val="Heading2"/>
+      </w:pPr>
+      <w:r>
+        <w:t xml:space="preserve">Versi 2.4 — 5 September 2026</w:t>
+      </w:r>
+    </w:p>
+    <w:p>
+      <w:pPr>
+        <w:pStyle w:val="ListParagraph"/>
+        <w:numPr>
+          <w:ilvl w:val="0"/>
+          <w:numId w:val="2"/>
+        </w:numPr>
+      </w:pPr>
+      <w:r>
         <w:t xml:space="preserve">Rilis dasar versi 2: Surat Perjalanan Dinas dengan nomor unik dan pengikut, pertanggungjawaban per pelaksana (tiket, nota, bill hotel, laporan), rincian biaya dan daftar riil dengan dua jalur tanda tangan, daftar nominatif, pembayaran beserta riwayatnya, pelacakan berkas, dan saluran bantuan.</w:t>
       </w:r>
     </w:p>
@@ -12997,7 +13053,7 @@
           <w:sz w:val="17"/>
           <w:szCs w:val="17"/>
         </w:rPr>
-        <w:t xml:space="preserve">Buku Panduan PANGI v2.5 — Politeknik Kesehatan Kemenkes Manado. Isi buku ini mengikuti sistem sebagaimana berjalan pada 1 Oktober 2026 (versi 2.5.9); bila tampilan di layar berbeda, yang berlaku adalah sistemnya, dan mohon laporkan selisihnya lewat menu Bantuan.</w:t>
+        <w:t xml:space="preserve">Buku Panduan PANGI v2.5 — Politeknik Kesehatan Kemenkes Manado. Isi buku ini mengikuti sistem sebagaimana berjalan pada 2 Oktober 2026 (versi 2.5.10); bila tampilan di layar berbeda, yang berlaku adalah sistemnya, dan mohon laporkan selisihnya lewat menu Bantuan.</w:t>
       </w:r>
     </w:p>
     <w:sectPr>

</xml_diff>

<commit_message>
Keterangan alur SPD ke SRIKANDI lalu usulan perjadin (2.5.11)
- Halaman SPD memuat keterangan langkah berikutnya: unduh PDF berformat
  SRIKANDI (penanda nomor naskah dan tanda tangan jangan diubah), masukkan
  ke SRIKANDI untuk ditandatangani PPK dan Direktur, unduh SPD bertanda
  tangan beserta nomor naskahnya, lalu buat usulan perjadin dengan
  dokumen dan nomor itu. Pesan sesudah SPD disimpan ikut mengarahkannya.
- Formulir usulan tidak lagi mengisi kolom nomor SPD dengan nomor
  internal PJ-…; keterangannya mengingatkan bahwa yang diisi nomor naskah
  dari SRIKANDI.
- Panduan Penggunaan, buku panduan (sampul 2.5.11), dan riwayat
  perubahan diperbarui.

Co-Authored-By: Claude Opus 5.5 <noreply@anthropic.com>
</commit_message>
<xml_diff>
--- a/resources/panduan/Buku-Panduan-PANGI-v2.5.docx
+++ b/resources/panduan/Buku-Panduan-PANGI-v2.5.docx
@@ -239,7 +239,7 @@
                 <w:sz w:val="19"/>
                 <w:szCs w:val="19"/>
               </w:rPr>
-              <w:t xml:space="preserve">2.5.10</w:t>
+              <w:t xml:space="preserve">2.5.11</w:t>
             </w:r>
           </w:p>
         </w:tc>
@@ -5089,7 +5089,7 @@
         <w:spacing w:before="60" w:after="160"/>
       </w:pPr>
       <w:r>
-        <w:t xml:space="preserve">Ajukan SPD yang sudah diunduh untuk ditandatangani PPK dan Direktur lewat SRIKANDI. Berkas SPD bertanda tangan itulah yang diunggah saat mengajukan usulan perjalanan dinas (bagian 5.2).</w:t>
+        <w:t xml:space="preserve">Halaman SPD yang baru disimpan memuat keterangan Langkah berikutnya: (1) tekan Unduh PDF — dokumennya sudah berformat SRIKANDI, jadi penanda ${nomor_naskah}, ${ttd_pengirim1}, dan ${ttd_pengirim2} jangan diubah atau dihapus; (2) masukkan dokumen itu ke SRIKANDI sebagai naskah dinas keluar dan ajukan tanda tangan kepada PPK (lembar pertama) dan Direktur (lembar kedua); (3) setelah selesai diproses, unduh SPD bertanda tangan dari SRIKANDI dan catat nomor naskahnya — nomor PJ-… di PANGI hanya nomor internal; (4) lanjutkan dengan mengajukan usulan perjalanan dinas memakai dokumen dan nomor itu (bagian 5.2).</w:t>
       </w:r>
     </w:p>
     <w:p>
@@ -5210,7 +5210,7 @@
         <w:rPr>
           <w:color w:val="55616F"/>
         </w:rPr>
-        <w:t xml:space="preserve">  Bila ada, tujuan, tanggal, maksud, dan nomor SPD Anda terisi sendiri dari SPD yang dipilih. Bila SPD itu sudah melampirkan surat tugas, berkas dan nomor surat tugasnya ikut diambil — tidak perlu diunggah maupun disalin lagi. Bila tidak ada, lewati dan isi data perjalanan secara manual, termasuk mengunggah surat tugas beserta nomornya.</w:t>
+        <w:t xml:space="preserve">  Bila ada, tujuan, tanggal, dan maksud terisi sendiri dari SPD yang dipilih. Nomor SPD sengaja tidak ikut terisi, karena yang diisi nomor naskah dari SRIKANDI. Bila SPD itu sudah melampirkan surat tugas, berkas dan nomor surat tugasnya ikut diambil — tidak perlu diunggah maupun disalin lagi. Bila tidak ada, lewati dan isi data perjalanan secara manual, termasuk mengunggah surat tugas beserta nomornya.</w:t>
       </w:r>
     </w:p>
     <w:p>
@@ -12368,7 +12368,7 @@
         <w:pStyle w:val="Heading2"/>
       </w:pPr>
       <w:r>
-        <w:t xml:space="preserve">Versi 2.5.10 — 2 Oktober 2026</w:t>
+        <w:t xml:space="preserve">Versi 2.5.11 — 2 Oktober 2026</w:t>
       </w:r>
     </w:p>
     <w:p>
@@ -12380,7 +12380,7 @@
         </w:numPr>
       </w:pPr>
       <w:r>
-        <w:t xml:space="preserve">Jejak Audit bersubmenu: Semua Aktivitas, Penghapusan Usulan &amp; SPD — usulan dan SPD yang dihapus beserta isinya, penghapusnya, waktu, dan alamatnya; penghapusan SPD sebelumnya tidak tercatat — dan Nomor Surat.</w:t>
+        <w:t xml:space="preserve">Halaman SPD memuat keterangan langkah sesudah SPD disimpan: unduh dokumen berformat SRIKANDI, masukkan ke SRIKANDI untuk ditandatangani PPK dan Direktur, unduh SPD bertanda tangan beserta nomor naskahnya, lalu buat usulan perjadin dengan dokumen dan nomor itu.</w:t>
       </w:r>
     </w:p>
     <w:p>
@@ -12392,7 +12392,15 @@
         </w:numPr>
       </w:pPr>
       <w:r>
-        <w:t xml:space="preserve">Nomor Surat mendaftar nomor SPD aplikasi, nomor SPD bertanda tangan, dan nomor surat tugas per bulan dan tahun, dan dapat diekspor ke Excel untuk dicocokkan arsiparis.</w:t>
+        <w:t xml:space="preserve">Kolom nomor SPD pada formulir usulan tidak lagi terisi nomor internal PJ-… dari PANGI; keterangannya mengingatkan bahwa yang diisi nomor naskah dari SRIKANDI.</w:t>
+      </w:r>
+    </w:p>
+    <w:p>
+      <w:pPr>
+        <w:pStyle w:val="Heading2"/>
+      </w:pPr>
+      <w:r>
+        <w:t xml:space="preserve">Versi 2.5.10 — 2 Oktober 2026</w:t>
       </w:r>
     </w:p>
     <w:p>
@@ -12404,15 +12412,7 @@
         </w:numPr>
       </w:pPr>
       <w:r>
-        <w:t xml:space="preserve">Dashboard Eksekutif bersubmenu: Dashboard Utama berisi angka-angka seperti sebelumnya, dan News Feed menyajikan perjalanan dinas serta tindak lanjut yang dijadwalkan sebagai lini masa.</w:t>
-      </w:r>
-    </w:p>
-    <w:p>
-      <w:pPr>
-        <w:pStyle w:val="Heading2"/>
-      </w:pPr>
-      <w:r>
-        <w:t xml:space="preserve">Versi 2.5.9 — 1 Oktober 2026</w:t>
+        <w:t xml:space="preserve">Jejak Audit bersubmenu: Semua Aktivitas, Penghapusan Usulan &amp; SPD — usulan dan SPD yang dihapus beserta isinya, penghapusnya, waktu, dan alamatnya; penghapusan SPD sebelumnya tidak tercatat — dan Nomor Surat.</w:t>
       </w:r>
     </w:p>
     <w:p>
@@ -12424,7 +12424,7 @@
         </w:numPr>
       </w:pPr>
       <w:r>
-        <w:t xml:space="preserve">Sanggahan pelaksana atas rincian biaya kini tampil di halaman Keuangan — tempat nominalnya diperbaiki — lengkap dengan alasan dan waktunya, beserta tombol Kirim Ulang ke Pelaksana. Sebelumnya berkas yang rinciannya disanggah tidak dapat dikirim ulang.</w:t>
+        <w:t xml:space="preserve">Nomor Surat mendaftar nomor SPD aplikasi, nomor SPD bertanda tangan, dan nomor surat tugas per bulan dan tahun, dan dapat diekspor ke Excel untuk dicocokkan arsiparis.</w:t>
       </w:r>
     </w:p>
     <w:p>
@@ -12436,7 +12436,15 @@
         </w:numPr>
       </w:pPr>
       <w:r>
-        <w:t xml:space="preserve">Mengirim ulang hanya membuka dokumen yang disanggah: dokumen yang sudah ditandatangani pelaksana tetap berlaku beserta kode konfirmasinya, dan pemberitahuannya hanya menyebut dokumen yang perlu disikapi lagi.</w:t>
+        <w:t xml:space="preserve">Dashboard Eksekutif bersubmenu: Dashboard Utama berisi angka-angka seperti sebelumnya, dan News Feed menyajikan perjalanan dinas serta tindak lanjut yang dijadwalkan sebagai lini masa.</w:t>
+      </w:r>
+    </w:p>
+    <w:p>
+      <w:pPr>
+        <w:pStyle w:val="Heading2"/>
+      </w:pPr>
+      <w:r>
+        <w:t xml:space="preserve">Versi 2.5.9 — 1 Oktober 2026</w:t>
       </w:r>
     </w:p>
     <w:p>
@@ -12448,15 +12456,7 @@
         </w:numPr>
       </w:pPr>
       <w:r>
-        <w:t xml:space="preserve">Halaman Detail Keuangan kini menampilkan pesan hasil tiap tindakan — komponen tersimpan, berkas terkirim, atau alasan tertahan — dan menyebut tujuan perjalanan pada kepalanya. Pemberitahuan sanggahan kepada tim keuangan langsung membuka halaman ini.</w:t>
-      </w:r>
-    </w:p>
-    <w:p>
-      <w:pPr>
-        <w:pStyle w:val="Heading2"/>
-      </w:pPr>
-      <w:r>
-        <w:t xml:space="preserve">Versi 2.5.8 — 1 Oktober 2026</w:t>
+        <w:t xml:space="preserve">Sanggahan pelaksana atas rincian biaya kini tampil di halaman Keuangan — tempat nominalnya diperbaiki — lengkap dengan alasan dan waktunya, beserta tombol Kirim Ulang ke Pelaksana. Sebelumnya berkas yang rinciannya disanggah tidak dapat dikirim ulang.</w:t>
       </w:r>
     </w:p>
     <w:p>
@@ -12468,7 +12468,7 @@
         </w:numPr>
       </w:pPr>
       <w:r>
-        <w:t xml:space="preserve">Buku panduan bersampul baru dengan warna Kemenkes. Bab 5.1 dan 5.2 kini bergambar: setiap langkah membuat SPD sampai mengajukan perjadin disertai tangkapan layar bertanda nomor.</w:t>
+        <w:t xml:space="preserve">Mengirim ulang hanya membuka dokumen yang disanggah: dokumen yang sudah ditandatangani pelaksana tetap berlaku beserta kode konfirmasinya, dan pemberitahuannya hanya menyebut dokumen yang perlu disikapi lagi.</w:t>
       </w:r>
     </w:p>
     <w:p>
@@ -12480,7 +12480,15 @@
         </w:numPr>
       </w:pPr>
       <w:r>
-        <w:t xml:space="preserve">Kotak konfirmasi sebelum mengirim pengajuan kini benar-benar menampilkan tujuan, tanggal, dan nomor SPD yang diisi — sebelumnya selalu tertulis "—".</w:t>
+        <w:t xml:space="preserve">Halaman Detail Keuangan kini menampilkan pesan hasil tiap tindakan — komponen tersimpan, berkas terkirim, atau alasan tertahan — dan menyebut tujuan perjalanan pada kepalanya. Pemberitahuan sanggahan kepada tim keuangan langsung membuka halaman ini.</w:t>
+      </w:r>
+    </w:p>
+    <w:p>
+      <w:pPr>
+        <w:pStyle w:val="Heading2"/>
+      </w:pPr>
+      <w:r>
+        <w:t xml:space="preserve">Versi 2.5.8 — 1 Oktober 2026</w:t>
       </w:r>
     </w:p>
     <w:p>
@@ -12492,15 +12500,7 @@
         </w:numPr>
       </w:pPr>
       <w:r>
-        <w:t xml:space="preserve">Menu Panduan Penggunaan memuat tangkapan layar yang sama, dan buku lengkapnya dapat diunduh dalam format PDF maupun Word.</w:t>
-      </w:r>
-    </w:p>
-    <w:p>
-      <w:pPr>
-        <w:pStyle w:val="Heading2"/>
-      </w:pPr>
-      <w:r>
-        <w:t xml:space="preserve">Versi 2.5.7 — 1 Oktober 2026</w:t>
+        <w:t xml:space="preserve">Buku panduan bersampul baru dengan warna Kemenkes. Bab 5.1 dan 5.2 kini bergambar: setiap langkah membuat SPD sampai mengajukan perjadin disertai tangkapan layar bertanda nomor.</w:t>
       </w:r>
     </w:p>
     <w:p>
@@ -12512,7 +12512,7 @@
         </w:numPr>
       </w:pPr>
       <w:r>
-        <w:t xml:space="preserve">Supervisi kerja praktek / magang dibedakan menurut tujuannya: supervisi ke luar kota tetap menerbitkan SPD — berkas SPD bertanda tangan beserta nomornya wajib dilampirkan — sedangkan supervisi di dalam kota cukup surat tugas.</w:t>
+        <w:t xml:space="preserve">Kotak konfirmasi sebelum mengirim pengajuan kini benar-benar menampilkan tujuan, tanggal, dan nomor SPD yang diisi — sebelumnya selalu tertulis "—".</w:t>
       </w:r>
     </w:p>
     <w:p>
@@ -12524,7 +12524,7 @@
         </w:numPr>
       </w:pPr>
       <w:r>
-        <w:t xml:space="preserve">Isian SPD pada formulir usulan muncul dan menghilang sendiri mengikuti kategori yang dipilih; checklist kelengkapan dan formulir Dokumen Perdin ikut menyesuaikan.</w:t>
+        <w:t xml:space="preserve">Menu Panduan Penggunaan memuat tangkapan layar yang sama, dan buku lengkapnya dapat diunduh dalam format PDF maupun Word.</w:t>
       </w:r>
     </w:p>
     <w:p>
@@ -12532,7 +12532,7 @@
         <w:pStyle w:val="Heading2"/>
       </w:pPr>
       <w:r>
-        <w:t xml:space="preserve">Versi 2.5.6 — 1 Oktober 2026</w:t>
+        <w:t xml:space="preserve">Versi 2.5.7 — 1 Oktober 2026</w:t>
       </w:r>
     </w:p>
     <w:p>
@@ -12544,15 +12544,7 @@
         </w:numPr>
       </w:pPr>
       <w:r>
-        <w:t xml:space="preserve">Berkas Pertanggungjawaban (submenu Administrasi Sistem): berkas yang ditagih sesudah perjalanan dipilih sendiri untuk tiap jalur pengajuan, dan berlaku serentak pada formulir dokumen, checklist, serta penagihan.</w:t>
-      </w:r>
-    </w:p>
-    <w:p>
-      <w:pPr>
-        <w:pStyle w:val="Heading2"/>
-      </w:pPr>
-      <w:r>
-        <w:t xml:space="preserve">Versi 2.5.5 — 1 Oktober 2026</w:t>
+        <w:t xml:space="preserve">Supervisi kerja praktek / magang dibedakan menurut tujuannya: supervisi ke luar kota tetap menerbitkan SPD — berkas SPD bertanda tangan beserta nomornya wajib dilampirkan — sedangkan supervisi di dalam kota cukup surat tugas.</w:t>
       </w:r>
     </w:p>
     <w:p>
@@ -12564,7 +12556,15 @@
         </w:numPr>
       </w:pPr>
       <w:r>
-        <w:t xml:space="preserve">Pengajuan perjadin dimulai dengan memilih jalur: dalam kota, luar kota, atau supervisi kerja praktek / magang. Jalur itu menyaring kategori perjalanan dinas dari Master Data.</w:t>
+        <w:t xml:space="preserve">Isian SPD pada formulir usulan muncul dan menghilang sendiri mengikuti kategori yang dipilih; checklist kelengkapan dan formulir Dokumen Perdin ikut menyesuaikan.</w:t>
+      </w:r>
+    </w:p>
+    <w:p>
+      <w:pPr>
+        <w:pStyle w:val="Heading2"/>
+      </w:pPr>
+      <w:r>
+        <w:t xml:space="preserve">Versi 2.5.6 — 1 Oktober 2026</w:t>
       </w:r>
     </w:p>
     <w:p>
@@ -12576,7 +12576,15 @@
         </w:numPr>
       </w:pPr>
       <w:r>
-        <w:t xml:space="preserve">Jalur supervisi kerja praktek / magang tidak memakai Surat Perjalanan Dinas: cukup surat tugas beserta nomornya, dan jenis kegiatannya terisi sendiri.</w:t>
+        <w:t xml:space="preserve">Berkas Pertanggungjawaban (submenu Administrasi Sistem): berkas yang ditagih sesudah perjalanan dipilih sendiri untuk tiap jalur pengajuan, dan berlaku serentak pada formulir dokumen, checklist, serta penagihan.</w:t>
+      </w:r>
+    </w:p>
+    <w:p>
+      <w:pPr>
+        <w:pStyle w:val="Heading2"/>
+      </w:pPr>
+      <w:r>
+        <w:t xml:space="preserve">Versi 2.5.5 — 1 Oktober 2026</w:t>
       </w:r>
     </w:p>
     <w:p>
@@ -12588,7 +12596,7 @@
         </w:numPr>
       </w:pPr>
       <w:r>
-        <w:t xml:space="preserve">Kaki halaman SPD mengikuti cetakan terbaru — lambang Garuda Sertifikasi dilepas, alamat verifikasi menjadi tte.komdigi.go.id — dan butir V tidak lagi memuat penanda QR.</w:t>
+        <w:t xml:space="preserve">Pengajuan perjadin dimulai dengan memilih jalur: dalam kota, luar kota, atau supervisi kerja praktek / magang. Jalur itu menyaring kategori perjalanan dinas dari Master Data.</w:t>
       </w:r>
     </w:p>
     <w:p>
@@ -12600,15 +12608,7 @@
         </w:numPr>
       </w:pPr>
       <w:r>
-        <w:t xml:space="preserve">Daftar Usulan Perjadin menyebut pelaksana perjalanan pada kolom pertama, menggantikan kolom Pemohon yang selalu kosong.</w:t>
-      </w:r>
-    </w:p>
-    <w:p>
-      <w:pPr>
-        <w:pStyle w:val="Heading2"/>
-      </w:pPr>
-      <w:r>
-        <w:t xml:space="preserve">Versi 2.5.4 — 30 September 2026</w:t>
+        <w:t xml:space="preserve">Jalur supervisi kerja praktek / magang tidak memakai Surat Perjalanan Dinas: cukup surat tugas beserta nomornya, dan jenis kegiatannya terisi sendiri.</w:t>
       </w:r>
     </w:p>
     <w:p>
@@ -12620,7 +12620,7 @@
         </w:numPr>
       </w:pPr>
       <w:r>
-        <w:t xml:space="preserve">Dokumen Output (submenu Administrasi Sistem): tampilan empat dokumen cetak diatur dari aplikasi — ukuran kertas dan huruf, elemen yang ikut tercetak, serta teks bakunya. Tiap perubahan tercatat pada jejak audit dan dapat dikembalikan ke bawaan.</w:t>
+        <w:t xml:space="preserve">Kaki halaman SPD mengikuti cetakan terbaru — lambang Garuda Sertifikasi dilepas, alamat verifikasi menjadi tte.komdigi.go.id — dan butir V tidak lagi memuat penanda QR.</w:t>
       </w:r>
     </w:p>
     <w:p>
@@ -12632,7 +12632,15 @@
         </w:numPr>
       </w:pPr>
       <w:r>
-        <w:t xml:space="preserve">Dokumen Output memuat pratinjau dokumen contoh yang ikut berubah mengikuti centangan elemen, lengkap dengan tombol buka di tab baru dan unduh contoh PDF.</w:t>
+        <w:t xml:space="preserve">Daftar Usulan Perjadin menyebut pelaksana perjalanan pada kolom pertama, menggantikan kolom Pemohon yang selalu kosong.</w:t>
+      </w:r>
+    </w:p>
+    <w:p>
+      <w:pPr>
+        <w:pStyle w:val="Heading2"/>
+      </w:pPr>
+      <w:r>
+        <w:t xml:space="preserve">Versi 2.5.4 — 30 September 2026</w:t>
       </w:r>
     </w:p>
     <w:p>
@@ -12644,15 +12652,7 @@
         </w:numPr>
       </w:pPr>
       <w:r>
-        <w:t xml:space="preserve">Penanda tanda tangan elektronik SRIKANDI dan nomor naskah sengaja tidak dapat dimatikan, supaya surat tetap dapat ditandatangani secara elektronik.</w:t>
-      </w:r>
-    </w:p>
-    <w:p>
-      <w:pPr>
-        <w:pStyle w:val="Heading2"/>
-      </w:pPr>
-      <w:r>
-        <w:t xml:space="preserve">Versi 2.5.3 — 21 September 2026</w:t>
+        <w:t xml:space="preserve">Dokumen Output (submenu Administrasi Sistem): tampilan empat dokumen cetak diatur dari aplikasi — ukuran kertas dan huruf, elemen yang ikut tercetak, serta teks bakunya. Tiap perubahan tercatat pada jejak audit dan dapat dikembalikan ke bawaan.</w:t>
       </w:r>
     </w:p>
     <w:p>
@@ -12664,7 +12664,7 @@
         </w:numPr>
       </w:pPr>
       <w:r>
-        <w:t xml:space="preserve">Formulir SPD: surat tugas dilampirkan sejak SPD dibuat — nomor dan berkasnya diisi pada kartu Surat Tugas (tidak wajib). Usulan perjadin yang memilih SPD itu mengambil keduanya secara otomatis; berkas surat tugas tidak diunggah lagi dan nomornya tidak disalin ulang.</w:t>
+        <w:t xml:space="preserve">Dokumen Output memuat pratinjau dokumen contoh yang ikut berubah mengikuti centangan elemen, lengkap dengan tombol buka di tab baru dan unduh contoh PDF.</w:t>
       </w:r>
     </w:p>
     <w:p>
@@ -12676,7 +12676,15 @@
         </w:numPr>
       </w:pPr>
       <w:r>
-        <w:t xml:space="preserve">Formulir SPD: kolom Akun pembebanan dihapus — akun diisi PPK saat verifikasi dan tanda tangan, bukan oleh pembuat SPD.</w:t>
+        <w:t xml:space="preserve">Penanda tanda tangan elektronik SRIKANDI dan nomor naskah sengaja tidak dapat dimatikan, supaya surat tetap dapat ditandatangani secara elektronik.</w:t>
+      </w:r>
+    </w:p>
+    <w:p>
+      <w:pPr>
+        <w:pStyle w:val="Heading2"/>
+      </w:pPr>
+      <w:r>
+        <w:t xml:space="preserve">Versi 2.5.3 — 21 September 2026</w:t>
       </w:r>
     </w:p>
     <w:p>
@@ -12688,7 +12696,7 @@
         </w:numPr>
       </w:pPr>
       <w:r>
-        <w:t xml:space="preserve">Berkas pertanggungjawaban: unggahan dan ceklist "Kuitansi" kini disebut "Kuitansi penyelenggara / hotel" agar jelas kuitansi mana yang dimaksud — dari penyelenggara kegiatan atau dari hotel tempat menginap.</w:t>
+        <w:t xml:space="preserve">Formulir SPD: surat tugas dilampirkan sejak SPD dibuat — nomor dan berkasnya diisi pada kartu Surat Tugas (tidak wajib). Usulan perjadin yang memilih SPD itu mengambil keduanya secara otomatis; berkas surat tugas tidak diunggah lagi dan nomornya tidak disalin ulang.</w:t>
       </w:r>
     </w:p>
     <w:p>
@@ -12700,7 +12708,7 @@
         </w:numPr>
       </w:pPr>
       <w:r>
-        <w:t xml:space="preserve">Jadwal Perjalanan kini bermenu: Jadwal Keberangkatan, Peta Dalam Kota &amp; Sekitarnya, dan Peta Luar Kota. Peta memperlihatkan kota-kota tujuan pegawai beserta jumlah perjalanan dan orang yang berangkat; klik penanda untuk rinciannya, saring per tahun. Dalam kota &amp; sekitarnya berarti tujuan di Sulawesi Utara. Kota-kota besar sudah dikenal sistem; kota lain diberi lintang-bujur pada Master Data → Lokasi Tujuan.</w:t>
+        <w:t xml:space="preserve">Formulir SPD: kolom Akun pembebanan dihapus — akun diisi PPK saat verifikasi dan tanda tangan, bukan oleh pembuat SPD.</w:t>
       </w:r>
     </w:p>
     <w:p>
@@ -12712,7 +12720,7 @@
         </w:numPr>
       </w:pPr>
       <w:r>
-        <w:t xml:space="preserve">Peran baru Mahasiswa, dapat dipilih saat membuat akun atau diimpor lewat kolom role bernilai "mahasiswa".</w:t>
+        <w:t xml:space="preserve">Berkas pertanggungjawaban: unggahan dan ceklist "Kuitansi" kini disebut "Kuitansi penyelenggara / hotel" agar jelas kuitansi mana yang dimaksud — dari penyelenggara kegiatan atau dari hotel tempat menginap.</w:t>
       </w:r>
     </w:p>
     <w:p>
@@ -12724,7 +12732,7 @@
         </w:numPr>
       </w:pPr>
       <w:r>
-        <w:t xml:space="preserve">Peran &amp; Hak Akses (submenu Administrasi Sistem, super administrator): menambah peran baru dan mengatur, per menu, kemampuan yang boleh dilihat, diubah, dan dihapus tiap peran — termasuk peran bawaan. Perubahan berlaku seketika dan tercatat pada jejak audit; Super Administrator selalu memegang seluruh akses. Hak menghapus master data dan menghapus pengguna kini kemampuan tersendiri.</w:t>
+        <w:t xml:space="preserve">Jadwal Perjalanan kini bermenu: Jadwal Keberangkatan, Peta Dalam Kota &amp; Sekitarnya, dan Peta Luar Kota. Peta memperlihatkan kota-kota tujuan pegawai beserta jumlah perjalanan dan orang yang berangkat; klik penanda untuk rinciannya, saring per tahun. Dalam kota &amp; sekitarnya berarti tujuan di Sulawesi Utara. Kota-kota besar sudah dikenal sistem; kota lain diberi lintang-bujur pada Master Data → Lokasi Tujuan.</w:t>
       </w:r>
     </w:p>
     <w:p>
@@ -12736,15 +12744,7 @@
         </w:numPr>
       </w:pPr>
       <w:r>
-        <w:t xml:space="preserve">Pegawai eksternal, mahasiswa, dan outsourcing: modul perjalanan dinasnya dikembangkan terpisah. Sementara itu, setelah masuk mereka melihat halaman pemberitahuan "fitur masih dikembangkan" dengan tombol keluar; menu lain belum dapat dibuka.</w:t>
-      </w:r>
-    </w:p>
-    <w:p>
-      <w:pPr>
-        <w:pStyle w:val="Heading2"/>
-      </w:pPr>
-      <w:r>
-        <w:t xml:space="preserve">Versi 2.5.2 — 15 September 2026</w:t>
+        <w:t xml:space="preserve">Peran baru Mahasiswa, dapat dipilih saat membuat akun atau diimpor lewat kolom role bernilai "mahasiswa".</w:t>
       </w:r>
     </w:p>
     <w:p>
@@ -12756,7 +12756,7 @@
         </w:numPr>
       </w:pPr>
       <w:r>
-        <w:t xml:space="preserve">Impor pengguna: sel yang kosong pada berkas CSV tidak lagi menghapus surel, nomor HP, dan rekening yang sudah diisi pengguna, sehingga data pegawai aman diimpor ulang untuk menambah orang. Wakil Direktur II ditambahkan ke data pegawai bawaan.</w:t>
+        <w:t xml:space="preserve">Peran &amp; Hak Akses (submenu Administrasi Sistem, super administrator): menambah peran baru dan mengatur, per menu, kemampuan yang boleh dilihat, diubah, dan dihapus tiap peran — termasuk peran bawaan. Perubahan berlaku seketika dan tercatat pada jejak audit; Super Administrator selalu memegang seluruh akses. Hak menghapus master data dan menghapus pengguna kini kemampuan tersendiri.</w:t>
       </w:r>
     </w:p>
     <w:p>
@@ -12768,7 +12768,15 @@
         </w:numPr>
       </w:pPr>
       <w:r>
-        <w:t xml:space="preserve">Integrasi Data (submenu Administrasi Sistem): token API dashboard eksekutif dibuat, diganti, atau dicabut langsung dari aplikasi tanpa menyunting .env di server, lengkap dengan alamat dan jalur API-nya; token yang berlaku dapat ditampilkan dan disalin.</w:t>
+        <w:t xml:space="preserve">Pegawai eksternal, mahasiswa, dan outsourcing: modul perjalanan dinasnya dikembangkan terpisah. Sementara itu, setelah masuk mereka melihat halaman pemberitahuan "fitur masih dikembangkan" dengan tombol keluar; menu lain belum dapat dibuka.</w:t>
+      </w:r>
+    </w:p>
+    <w:p>
+      <w:pPr>
+        <w:pStyle w:val="Heading2"/>
+      </w:pPr>
+      <w:r>
+        <w:t xml:space="preserve">Versi 2.5.2 — 15 September 2026</w:t>
       </w:r>
     </w:p>
     <w:p>
@@ -12780,7 +12788,7 @@
         </w:numPr>
       </w:pPr>
       <w:r>
-        <w:t xml:space="preserve">Integrasi Data: pemantauan setiap permintaan API yang masuk (alamat IP, jalur, token yang dibawa — hanya ujung-ujungnya — diterima atau ditolak) dan pengiriman data dashboard eksekutif terjadwal (tiap jam, harian, atau mingguan) ke aplikasi tujuan memakai token, lengkap dengan riwayat pengirimannya dan tombol Kirim Sekarang.</w:t>
+        <w:t xml:space="preserve">Impor pengguna: sel yang kosong pada berkas CSV tidak lagi menghapus surel, nomor HP, dan rekening yang sudah diisi pengguna, sehingga data pegawai aman diimpor ulang untuk menambah orang. Wakil Direktur II ditambahkan ke data pegawai bawaan.</w:t>
       </w:r>
     </w:p>
     <w:p>
@@ -12792,7 +12800,7 @@
         </w:numPr>
       </w:pPr>
       <w:r>
-        <w:t xml:space="preserve">Pengaturan Sistem: kunci API Anthropic untuk Wawasan AI dan agen tanya-jawab Dashboard Eksekutif dipasang, diganti, atau dihapus dari aplikasi — tersimpan terenkripsi, tanpa menyunting .env di server.</w:t>
+        <w:t xml:space="preserve">Integrasi Data (submenu Administrasi Sistem): token API dashboard eksekutif dibuat, diganti, atau dicabut langsung dari aplikasi tanpa menyunting .env di server, lengkap dengan alamat dan jalur API-nya; token yang berlaku dapat ditampilkan dan disalin.</w:t>
       </w:r>
     </w:p>
     <w:p>
@@ -12804,7 +12812,7 @@
         </w:numPr>
       </w:pPr>
       <w:r>
-        <w:t xml:space="preserve">Membuka atau mengunci tanggal dikeluarkan SPD serta mengelola token API dan kunci AI kini melalui kotak konfirmasi.</w:t>
+        <w:t xml:space="preserve">Integrasi Data: pemantauan setiap permintaan API yang masuk (alamat IP, jalur, token yang dibawa — hanya ujung-ujungnya — diterima atau ditolak) dan pengiriman data dashboard eksekutif terjadwal (tiap jam, harian, atau mingguan) ke aplikasi tujuan memakai token, lengkap dengan riwayat pengirimannya dan tombol Kirim Sekarang.</w:t>
       </w:r>
     </w:p>
     <w:p>
@@ -12816,7 +12824,7 @@
         </w:numPr>
       </w:pPr>
       <w:r>
-        <w:t xml:space="preserve">Nomor SPD pada usulan bersifat unik: nomor yang sudah dipakai usulan lain — milik siapa pun — ditolak saat mengajukan maupun menyunting, dengan pesan yang menyebut usulan mana yang memakainya, sehingga tidak ada usulan ganda atas SPD yang sama.</w:t>
+        <w:t xml:space="preserve">Pengaturan Sistem: kunci API Anthropic untuk Wawasan AI dan agen tanya-jawab Dashboard Eksekutif dipasang, diganti, atau dihapus dari aplikasi — tersimpan terenkripsi, tanpa menyunting .env di server.</w:t>
       </w:r>
     </w:p>
     <w:p>
@@ -12828,7 +12836,7 @@
         </w:numPr>
       </w:pPr>
       <w:r>
-        <w:t xml:space="preserve">Usulan perjadin tidak lagi mensyaratkan SPD dibuat lewat aplikasi lebih dulu: formulir usulan terbuka bagi semua, memilih SPD dari aplikasi hanya untuk mengisi otomatis. SPD bertanda tangan beserta nomornya tetap wajib diunggah sebagai dasar persetujuan PPK.</w:t>
+        <w:t xml:space="preserve">Membuka atau mengunci tanggal dikeluarkan SPD serta mengelola token API dan kunci AI kini melalui kotak konfirmasi.</w:t>
       </w:r>
     </w:p>
     <w:p>
@@ -12840,15 +12848,7 @@
         </w:numPr>
       </w:pPr>
       <w:r>
-        <w:t xml:space="preserve">Rincian Saya: tiap berkas memuat panel Pemantauan Berkas — status seluruh tanda tangan (tim keuangan, pelaksana, PPK, konfirmasi Direktur, daftar nominatif) dan status pembayaran (uang muka, pelunasan, transport lokal) beserta tanggal dan kodenya.</w:t>
-      </w:r>
-    </w:p>
-    <w:p>
-      <w:pPr>
-        <w:pStyle w:val="Heading2"/>
-      </w:pPr>
-      <w:r>
-        <w:t xml:space="preserve">Versi 2.5.1 — 15 September 2026</w:t>
+        <w:t xml:space="preserve">Nomor SPD pada usulan bersifat unik: nomor yang sudah dipakai usulan lain — milik siapa pun — ditolak saat mengajukan maupun menyunting, dengan pesan yang menyebut usulan mana yang memakainya, sehingga tidak ada usulan ganda atas SPD yang sama.</w:t>
       </w:r>
     </w:p>
     <w:p>
@@ -12860,7 +12860,7 @@
         </w:numPr>
       </w:pPr>
       <w:r>
-        <w:t xml:space="preserve">Administrasi Sistem: super administrator dapat membuka atau mengunci tanggal dikeluarkan SPD bagi seluruh peran untuk kasus tanggal mundur (backdate); bawaannya terkunci, tiap perubahan tercatat pada jejak audit.</w:t>
+        <w:t xml:space="preserve">Usulan perjadin tidak lagi mensyaratkan SPD dibuat lewat aplikasi lebih dulu: formulir usulan terbuka bagi semua, memilih SPD dari aplikasi hanya untuk mengisi otomatis. SPD bertanda tangan beserta nomornya tetap wajib diunggah sebagai dasar persetujuan PPK.</w:t>
       </w:r>
     </w:p>
     <w:p>
@@ -12872,7 +12872,7 @@
         </w:numPr>
       </w:pPr>
       <w:r>
-        <w:t xml:space="preserve">Administrasi Sistem dipecah menjadi tiga halaman bermenu — Pengguna, Impor &amp; Ekspor, Pengaturan Sistem — dengan submenu di sidebar dan navigasi di kepala halaman.</w:t>
+        <w:t xml:space="preserve">Rincian Saya: tiap berkas memuat panel Pemantauan Berkas — status seluruh tanda tangan (tim keuangan, pelaksana, PPK, konfirmasi Direktur, daftar nominatif) dan status pembayaran (uang muka, pelunasan, transport lokal) beserta tanggal dan kodenya.</w:t>
       </w:r>
     </w:p>
     <w:p>
@@ -12880,7 +12880,7 @@
         <w:pStyle w:val="Heading2"/>
       </w:pPr>
       <w:r>
-        <w:t xml:space="preserve">Versi 2.5 — 12 September 2026</w:t>
+        <w:t xml:space="preserve">Versi 2.5.1 — 15 September 2026</w:t>
       </w:r>
     </w:p>
     <w:p>
@@ -12892,7 +12892,7 @@
         </w:numPr>
       </w:pPr>
       <w:r>
-        <w:t xml:space="preserve">Usulan wajib melampirkan SPD bertanda tangan beserta nomornya; persetujuan PPK tercatat otomatis. Pengajuan berkelompok dan tombol Salin dihapus.</w:t>
+        <w:t xml:space="preserve">Administrasi Sistem: super administrator dapat membuka atau mengunci tanggal dikeluarkan SPD bagi seluruh peran untuk kasus tanggal mundur (backdate); bawaannya terkunci, tiap perubahan tercatat pada jejak audit.</w:t>
       </w:r>
     </w:p>
     <w:p>
@@ -12904,7 +12904,15 @@
         </w:numPr>
       </w:pPr>
       <w:r>
-        <w:t xml:space="preserve">Menu Laporan Perjadin bagi pimpinan: daftar laporan, status konfirmasi, tindak lanjut. Laporan dikirim ke pimpinan saat disimpan dan dikonfirmasi Direktur lewat QR; tempat kegiatan per hari.</w:t>
+        <w:t xml:space="preserve">Administrasi Sistem dipecah menjadi tiga halaman bermenu — Pengguna, Impor &amp; Ekspor, Pengaturan Sistem — dengan submenu di sidebar dan navigasi di kepala halaman.</w:t>
+      </w:r>
+    </w:p>
+    <w:p>
+      <w:pPr>
+        <w:pStyle w:val="Heading2"/>
+      </w:pPr>
+      <w:r>
+        <w:t xml:space="preserve">Versi 2.5 — 12 September 2026</w:t>
       </w:r>
     </w:p>
     <w:p>
@@ -12916,7 +12924,7 @@
         </w:numPr>
       </w:pPr>
       <w:r>
-        <w:t xml:space="preserve">Pelunasan hanya menunggu konfirmasi laporan oleh Direktur — bukan tanda tangan PPK maupun daftar nominatif.</w:t>
+        <w:t xml:space="preserve">Usulan wajib melampirkan SPD bertanda tangan beserta nomornya; persetujuan PPK tercatat otomatis. Pengajuan berkelompok dan tombol Salin dihapus.</w:t>
       </w:r>
     </w:p>
     <w:p>
@@ -12928,7 +12936,7 @@
         </w:numPr>
       </w:pPr>
       <w:r>
-        <w:t xml:space="preserve">Daftar nominatif terbit per surat tugas begitu satu pelaksana tuntas; yang belum tercantum disebut dan bertambah sendiri. List Daftar Nominatif memuat seluruh daftar beserta status tanda tangan tiap pelaksana.</w:t>
+        <w:t xml:space="preserve">Menu Laporan Perjadin bagi pimpinan: daftar laporan, status konfirmasi, tindak lanjut. Laporan dikirim ke pimpinan saat disimpan dan dikonfirmasi Direktur lewat QR; tempat kegiatan per hari.</w:t>
       </w:r>
     </w:p>
     <w:p>
@@ -12940,7 +12948,7 @@
         </w:numPr>
       </w:pPr>
       <w:r>
-        <w:t xml:space="preserve">Berkas terkirim otomatis ke pelaksana setelah seluruh validasi rampung; status Sudah Dicek Tim Keuangan; tombol tanda tangan pelaksana tetap ada setelah masa sanggah; popup konfirmasi pada validasi dan pencabutannya.</w:t>
+        <w:t xml:space="preserve">Pelunasan hanya menunggu konfirmasi laporan oleh Direktur — bukan tanda tangan PPK maupun daftar nominatif.</w:t>
       </w:r>
     </w:p>
     <w:p>
@@ -12952,7 +12960,7 @@
         </w:numPr>
       </w:pPr>
       <w:r>
-        <w:t xml:space="preserve">Biaya penyelenggaraan: ditanya ada atau tidak; bila ada, nominal, bukti bayar, dan nomor invoice; tercetak di bawah uang penginapan.</w:t>
+        <w:t xml:space="preserve">Daftar nominatif terbit per surat tugas begitu satu pelaksana tuntas; yang belum tercantum disebut dan bertambah sendiri. List Daftar Nominatif memuat seluruh daftar beserta status tanda tangan tiap pelaksana.</w:t>
       </w:r>
     </w:p>
     <w:p>
@@ -12964,7 +12972,7 @@
         </w:numPr>
       </w:pPr>
       <w:r>
-        <w:t xml:space="preserve">Tiket membawa invoice; nota transport lokal hanya untuk ruas bernominal (transport lokal boleh tidak ada); dalam kota satu baris transport lokal; checklist kelengkapan mengikuti formulir.</w:t>
+        <w:t xml:space="preserve">Berkas terkirim otomatis ke pelaksana setelah seluruh validasi rampung; status Sudah Dicek Tim Keuangan; tombol tanda tangan pelaksana tetap ada setelah masa sanggah; popup konfirmasi pada validasi dan pencabutannya.</w:t>
       </w:r>
     </w:p>
     <w:p>
@@ -12976,7 +12984,7 @@
         </w:numPr>
       </w:pPr>
       <w:r>
-        <w:t xml:space="preserve">Verifikasi PPK (rincian, daftar riil, nominatif) dan Arsip Rincian Lengkap dikelompokkan per bulan dan tahun; arsip tidak lagi menunggu nominatif; menu Keuangan bagi PPK dalam mode lihat saja.</w:t>
+        <w:t xml:space="preserve">Biaya penyelenggaraan: ditanya ada atau tidak; bila ada, nominal, bukti bayar, dan nomor invoice; tercetak di bawah uang penginapan.</w:t>
       </w:r>
     </w:p>
     <w:p>
@@ -12988,7 +12996,7 @@
         </w:numPr>
       </w:pPr>
       <w:r>
-        <w:t xml:space="preserve">Pembatalan penggantian transport lokal dengan alasan; nominatif memuat QR dan kode verifikasi PPK.</w:t>
+        <w:t xml:space="preserve">Tiket membawa invoice; nota transport lokal hanya untuk ruas bernominal (transport lokal boleh tidak ada); dalam kota satu baris transport lokal; checklist kelengkapan mengikuti formulir.</w:t>
       </w:r>
     </w:p>
     <w:p>
@@ -13000,7 +13008,7 @@
         </w:numPr>
       </w:pPr>
       <w:r>
-        <w:t xml:space="preserve">Seluruh dokumen cetak berukuran folio dan dirapikan: usulan sebagai dokumen resmi berkop, rincian satu halaman, tanggal berbahasa Indonesia, WITA.</w:t>
+        <w:t xml:space="preserve">Verifikasi PPK (rincian, daftar riil, nominatif) dan Arsip Rincian Lengkap dikelompokkan per bulan dan tahun; arsip tidak lagi menunggu nominatif; menu Keuangan bagi PPK dalam mode lihat saja.</w:t>
       </w:r>
     </w:p>
     <w:p>
@@ -13012,15 +13020,7 @@
         </w:numPr>
       </w:pPr>
       <w:r>
-        <w:t xml:space="preserve">Pelacakan berkas: sepuluh tonggak dengan lama hari antar tahap; versi aplikasi tertera di halaman masuk.</w:t>
-      </w:r>
-    </w:p>
-    <w:p>
-      <w:pPr>
-        <w:pStyle w:val="Heading2"/>
-      </w:pPr>
-      <w:r>
-        <w:t xml:space="preserve">Versi 2.4 — 5 September 2026</w:t>
+        <w:t xml:space="preserve">Pembatalan penggantian transport lokal dengan alasan; nominatif memuat QR dan kode verifikasi PPK.</w:t>
       </w:r>
     </w:p>
     <w:p>
@@ -13032,6 +13032,38 @@
         </w:numPr>
       </w:pPr>
       <w:r>
+        <w:t xml:space="preserve">Seluruh dokumen cetak berukuran folio dan dirapikan: usulan sebagai dokumen resmi berkop, rincian satu halaman, tanggal berbahasa Indonesia, WITA.</w:t>
+      </w:r>
+    </w:p>
+    <w:p>
+      <w:pPr>
+        <w:pStyle w:val="ListParagraph"/>
+        <w:numPr>
+          <w:ilvl w:val="0"/>
+          <w:numId w:val="2"/>
+        </w:numPr>
+      </w:pPr>
+      <w:r>
+        <w:t xml:space="preserve">Pelacakan berkas: sepuluh tonggak dengan lama hari antar tahap; versi aplikasi tertera di halaman masuk.</w:t>
+      </w:r>
+    </w:p>
+    <w:p>
+      <w:pPr>
+        <w:pStyle w:val="Heading2"/>
+      </w:pPr>
+      <w:r>
+        <w:t xml:space="preserve">Versi 2.4 — 5 September 2026</w:t>
+      </w:r>
+    </w:p>
+    <w:p>
+      <w:pPr>
+        <w:pStyle w:val="ListParagraph"/>
+        <w:numPr>
+          <w:ilvl w:val="0"/>
+          <w:numId w:val="2"/>
+        </w:numPr>
+      </w:pPr>
+      <w:r>
         <w:t xml:space="preserve">Rilis dasar versi 2: Surat Perjalanan Dinas dengan nomor unik dan pengikut, pertanggungjawaban per pelaksana (tiket, nota, bill hotel, laporan), rincian biaya dan daftar riil dengan dua jalur tanda tangan, daftar nominatif, pembayaran beserta riwayatnya, pelacakan berkas, dan saluran bantuan.</w:t>
       </w:r>
     </w:p>
@@ -13053,7 +13085,7 @@
           <w:sz w:val="17"/>
           <w:szCs w:val="17"/>
         </w:rPr>
-        <w:t xml:space="preserve">Buku Panduan PANGI v2.5 — Politeknik Kesehatan Kemenkes Manado. Isi buku ini mengikuti sistem sebagaimana berjalan pada 2 Oktober 2026 (versi 2.5.10); bila tampilan di layar berbeda, yang berlaku adalah sistemnya, dan mohon laporkan selisihnya lewat menu Bantuan.</w:t>
+        <w:t xml:space="preserve">Buku Panduan PANGI v2.5 — Politeknik Kesehatan Kemenkes Manado. Isi buku ini mengikuti sistem sebagaimana berjalan pada 2 Oktober 2026 (versi 2.5.11); bila tampilan di layar berbeda, yang berlaku adalah sistemnya, dan mohon laporkan selisihnya lewat menu Bantuan.</w:t>
       </w:r>
     </w:p>
     <w:sectPr>

</xml_diff>

<commit_message>
Navigasi halaman pada daftar Keuangan dan Persetujuan (2.5.12)
Daftar Keuangan → Input Rincian Biaya dibagi sepuluh baris per halaman,
tetapi navigasi halamannya tidak pernah ditampilkan: "17 data" namun
hanya sepuluh yang dapat dibuka. Halaman Persetujuan mengalami hal yang
sama. Keduanya kini memakai komponen navigasi halaman yang sudah ada.

Co-Authored-By: Claude Opus 5.5 <noreply@anthropic.com>
</commit_message>
<xml_diff>
--- a/resources/panduan/Buku-Panduan-PANGI-v2.5.docx
+++ b/resources/panduan/Buku-Panduan-PANGI-v2.5.docx
@@ -239,7 +239,7 @@
                 <w:sz w:val="19"/>
                 <w:szCs w:val="19"/>
               </w:rPr>
-              <w:t xml:space="preserve">2.5.11</w:t>
+              <w:t xml:space="preserve">2.5.12</w:t>
             </w:r>
           </w:p>
         </w:tc>
@@ -264,7 +264,7 @@
                 <w:sz w:val="19"/>
                 <w:szCs w:val="19"/>
               </w:rPr>
-              <w:t xml:space="preserve">2 Oktober 2026</w:t>
+              <w:t xml:space="preserve">6 Oktober 2026</w:t>
             </w:r>
           </w:p>
         </w:tc>
@@ -12368,7 +12368,7 @@
         <w:pStyle w:val="Heading2"/>
       </w:pPr>
       <w:r>
-        <w:t xml:space="preserve">Versi 2.5.11 — 2 Oktober 2026</w:t>
+        <w:t xml:space="preserve">Versi 2.5.12 — 6 Oktober 2026</w:t>
       </w:r>
     </w:p>
     <w:p>
@@ -12380,7 +12380,15 @@
         </w:numPr>
       </w:pPr>
       <w:r>
-        <w:t xml:space="preserve">Halaman SPD memuat keterangan langkah sesudah SPD disimpan: unduh dokumen berformat SRIKANDI, masukkan ke SRIKANDI untuk ditandatangani PPK dan Direktur, unduh SPD bertanda tangan beserta nomor naskahnya, lalu buat usulan perjadin dengan dokumen dan nomor itu.</w:t>
+        <w:t xml:space="preserve">Menu Keuangan → Input Rincian Biaya menampilkan navigasi halaman: sebelumnya baris setelah halaman pertama tidak dapat dibuka. Halaman Persetujuan mendapat perbaikan yang sama.</w:t>
+      </w:r>
+    </w:p>
+    <w:p>
+      <w:pPr>
+        <w:pStyle w:val="Heading2"/>
+      </w:pPr>
+      <w:r>
+        <w:t xml:space="preserve">Versi 2.5.11 — 2 Oktober 2026</w:t>
       </w:r>
     </w:p>
     <w:p>
@@ -12392,15 +12400,7 @@
         </w:numPr>
       </w:pPr>
       <w:r>
-        <w:t xml:space="preserve">Kolom nomor SPD pada formulir usulan tidak lagi terisi nomor internal PJ-… dari PANGI; keterangannya mengingatkan bahwa yang diisi nomor naskah dari SRIKANDI.</w:t>
-      </w:r>
-    </w:p>
-    <w:p>
-      <w:pPr>
-        <w:pStyle w:val="Heading2"/>
-      </w:pPr>
-      <w:r>
-        <w:t xml:space="preserve">Versi 2.5.10 — 2 Oktober 2026</w:t>
+        <w:t xml:space="preserve">Halaman SPD memuat keterangan langkah sesudah SPD disimpan: unduh dokumen berformat SRIKANDI, masukkan ke SRIKANDI untuk ditandatangani PPK dan Direktur, unduh SPD bertanda tangan beserta nomor naskahnya, lalu buat usulan perjadin dengan dokumen dan nomor itu.</w:t>
       </w:r>
     </w:p>
     <w:p>
@@ -12412,7 +12412,15 @@
         </w:numPr>
       </w:pPr>
       <w:r>
-        <w:t xml:space="preserve">Jejak Audit bersubmenu: Semua Aktivitas, Penghapusan Usulan &amp; SPD — usulan dan SPD yang dihapus beserta isinya, penghapusnya, waktu, dan alamatnya; penghapusan SPD sebelumnya tidak tercatat — dan Nomor Surat.</w:t>
+        <w:t xml:space="preserve">Kolom nomor SPD pada formulir usulan tidak lagi terisi nomor internal PJ-… dari PANGI; keterangannya mengingatkan bahwa yang diisi nomor naskah dari SRIKANDI.</w:t>
+      </w:r>
+    </w:p>
+    <w:p>
+      <w:pPr>
+        <w:pStyle w:val="Heading2"/>
+      </w:pPr>
+      <w:r>
+        <w:t xml:space="preserve">Versi 2.5.10 — 2 Oktober 2026</w:t>
       </w:r>
     </w:p>
     <w:p>
@@ -12424,7 +12432,7 @@
         </w:numPr>
       </w:pPr>
       <w:r>
-        <w:t xml:space="preserve">Nomor Surat mendaftar nomor SPD aplikasi, nomor SPD bertanda tangan, dan nomor surat tugas per bulan dan tahun, dan dapat diekspor ke Excel untuk dicocokkan arsiparis.</w:t>
+        <w:t xml:space="preserve">Jejak Audit bersubmenu: Semua Aktivitas, Penghapusan Usulan &amp; SPD — usulan dan SPD yang dihapus beserta isinya, penghapusnya, waktu, dan alamatnya; penghapusan SPD sebelumnya tidak tercatat — dan Nomor Surat.</w:t>
       </w:r>
     </w:p>
     <w:p>
@@ -12436,15 +12444,7 @@
         </w:numPr>
       </w:pPr>
       <w:r>
-        <w:t xml:space="preserve">Dashboard Eksekutif bersubmenu: Dashboard Utama berisi angka-angka seperti sebelumnya, dan News Feed menyajikan perjalanan dinas serta tindak lanjut yang dijadwalkan sebagai lini masa.</w:t>
-      </w:r>
-    </w:p>
-    <w:p>
-      <w:pPr>
-        <w:pStyle w:val="Heading2"/>
-      </w:pPr>
-      <w:r>
-        <w:t xml:space="preserve">Versi 2.5.9 — 1 Oktober 2026</w:t>
+        <w:t xml:space="preserve">Nomor Surat mendaftar nomor SPD aplikasi, nomor SPD bertanda tangan, dan nomor surat tugas per bulan dan tahun, dan dapat diekspor ke Excel untuk dicocokkan arsiparis.</w:t>
       </w:r>
     </w:p>
     <w:p>
@@ -12456,7 +12456,15 @@
         </w:numPr>
       </w:pPr>
       <w:r>
-        <w:t xml:space="preserve">Sanggahan pelaksana atas rincian biaya kini tampil di halaman Keuangan — tempat nominalnya diperbaiki — lengkap dengan alasan dan waktunya, beserta tombol Kirim Ulang ke Pelaksana. Sebelumnya berkas yang rinciannya disanggah tidak dapat dikirim ulang.</w:t>
+        <w:t xml:space="preserve">Dashboard Eksekutif bersubmenu: Dashboard Utama berisi angka-angka seperti sebelumnya, dan News Feed menyajikan perjalanan dinas serta tindak lanjut yang dijadwalkan sebagai lini masa.</w:t>
+      </w:r>
+    </w:p>
+    <w:p>
+      <w:pPr>
+        <w:pStyle w:val="Heading2"/>
+      </w:pPr>
+      <w:r>
+        <w:t xml:space="preserve">Versi 2.5.9 — 1 Oktober 2026</w:t>
       </w:r>
     </w:p>
     <w:p>
@@ -12468,7 +12476,7 @@
         </w:numPr>
       </w:pPr>
       <w:r>
-        <w:t xml:space="preserve">Mengirim ulang hanya membuka dokumen yang disanggah: dokumen yang sudah ditandatangani pelaksana tetap berlaku beserta kode konfirmasinya, dan pemberitahuannya hanya menyebut dokumen yang perlu disikapi lagi.</w:t>
+        <w:t xml:space="preserve">Sanggahan pelaksana atas rincian biaya kini tampil di halaman Keuangan — tempat nominalnya diperbaiki — lengkap dengan alasan dan waktunya, beserta tombol Kirim Ulang ke Pelaksana. Sebelumnya berkas yang rinciannya disanggah tidak dapat dikirim ulang.</w:t>
       </w:r>
     </w:p>
     <w:p>
@@ -12480,15 +12488,7 @@
         </w:numPr>
       </w:pPr>
       <w:r>
-        <w:t xml:space="preserve">Halaman Detail Keuangan kini menampilkan pesan hasil tiap tindakan — komponen tersimpan, berkas terkirim, atau alasan tertahan — dan menyebut tujuan perjalanan pada kepalanya. Pemberitahuan sanggahan kepada tim keuangan langsung membuka halaman ini.</w:t>
-      </w:r>
-    </w:p>
-    <w:p>
-      <w:pPr>
-        <w:pStyle w:val="Heading2"/>
-      </w:pPr>
-      <w:r>
-        <w:t xml:space="preserve">Versi 2.5.8 — 1 Oktober 2026</w:t>
+        <w:t xml:space="preserve">Mengirim ulang hanya membuka dokumen yang disanggah: dokumen yang sudah ditandatangani pelaksana tetap berlaku beserta kode konfirmasinya, dan pemberitahuannya hanya menyebut dokumen yang perlu disikapi lagi.</w:t>
       </w:r>
     </w:p>
     <w:p>
@@ -12500,7 +12500,15 @@
         </w:numPr>
       </w:pPr>
       <w:r>
-        <w:t xml:space="preserve">Buku panduan bersampul baru dengan warna Kemenkes. Bab 5.1 dan 5.2 kini bergambar: setiap langkah membuat SPD sampai mengajukan perjadin disertai tangkapan layar bertanda nomor.</w:t>
+        <w:t xml:space="preserve">Halaman Detail Keuangan kini menampilkan pesan hasil tiap tindakan — komponen tersimpan, berkas terkirim, atau alasan tertahan — dan menyebut tujuan perjalanan pada kepalanya. Pemberitahuan sanggahan kepada tim keuangan langsung membuka halaman ini.</w:t>
+      </w:r>
+    </w:p>
+    <w:p>
+      <w:pPr>
+        <w:pStyle w:val="Heading2"/>
+      </w:pPr>
+      <w:r>
+        <w:t xml:space="preserve">Versi 2.5.8 — 1 Oktober 2026</w:t>
       </w:r>
     </w:p>
     <w:p>
@@ -12512,7 +12520,7 @@
         </w:numPr>
       </w:pPr>
       <w:r>
-        <w:t xml:space="preserve">Kotak konfirmasi sebelum mengirim pengajuan kini benar-benar menampilkan tujuan, tanggal, dan nomor SPD yang diisi — sebelumnya selalu tertulis "—".</w:t>
+        <w:t xml:space="preserve">Buku panduan bersampul baru dengan warna Kemenkes. Bab 5.1 dan 5.2 kini bergambar: setiap langkah membuat SPD sampai mengajukan perjadin disertai tangkapan layar bertanda nomor.</w:t>
       </w:r>
     </w:p>
     <w:p>
@@ -12524,15 +12532,7 @@
         </w:numPr>
       </w:pPr>
       <w:r>
-        <w:t xml:space="preserve">Menu Panduan Penggunaan memuat tangkapan layar yang sama, dan buku lengkapnya dapat diunduh dalam format PDF maupun Word.</w:t>
-      </w:r>
-    </w:p>
-    <w:p>
-      <w:pPr>
-        <w:pStyle w:val="Heading2"/>
-      </w:pPr>
-      <w:r>
-        <w:t xml:space="preserve">Versi 2.5.7 — 1 Oktober 2026</w:t>
+        <w:t xml:space="preserve">Kotak konfirmasi sebelum mengirim pengajuan kini benar-benar menampilkan tujuan, tanggal, dan nomor SPD yang diisi — sebelumnya selalu tertulis "—".</w:t>
       </w:r>
     </w:p>
     <w:p>
@@ -12544,7 +12544,15 @@
         </w:numPr>
       </w:pPr>
       <w:r>
-        <w:t xml:space="preserve">Supervisi kerja praktek / magang dibedakan menurut tujuannya: supervisi ke luar kota tetap menerbitkan SPD — berkas SPD bertanda tangan beserta nomornya wajib dilampirkan — sedangkan supervisi di dalam kota cukup surat tugas.</w:t>
+        <w:t xml:space="preserve">Menu Panduan Penggunaan memuat tangkapan layar yang sama, dan buku lengkapnya dapat diunduh dalam format PDF maupun Word.</w:t>
+      </w:r>
+    </w:p>
+    <w:p>
+      <w:pPr>
+        <w:pStyle w:val="Heading2"/>
+      </w:pPr>
+      <w:r>
+        <w:t xml:space="preserve">Versi 2.5.7 — 1 Oktober 2026</w:t>
       </w:r>
     </w:p>
     <w:p>
@@ -12556,15 +12564,7 @@
         </w:numPr>
       </w:pPr>
       <w:r>
-        <w:t xml:space="preserve">Isian SPD pada formulir usulan muncul dan menghilang sendiri mengikuti kategori yang dipilih; checklist kelengkapan dan formulir Dokumen Perdin ikut menyesuaikan.</w:t>
-      </w:r>
-    </w:p>
-    <w:p>
-      <w:pPr>
-        <w:pStyle w:val="Heading2"/>
-      </w:pPr>
-      <w:r>
-        <w:t xml:space="preserve">Versi 2.5.6 — 1 Oktober 2026</w:t>
+        <w:t xml:space="preserve">Supervisi kerja praktek / magang dibedakan menurut tujuannya: supervisi ke luar kota tetap menerbitkan SPD — berkas SPD bertanda tangan beserta nomornya wajib dilampirkan — sedangkan supervisi di dalam kota cukup surat tugas.</w:t>
       </w:r>
     </w:p>
     <w:p>
@@ -12576,7 +12576,7 @@
         </w:numPr>
       </w:pPr>
       <w:r>
-        <w:t xml:space="preserve">Berkas Pertanggungjawaban (submenu Administrasi Sistem): berkas yang ditagih sesudah perjalanan dipilih sendiri untuk tiap jalur pengajuan, dan berlaku serentak pada formulir dokumen, checklist, serta penagihan.</w:t>
+        <w:t xml:space="preserve">Isian SPD pada formulir usulan muncul dan menghilang sendiri mengikuti kategori yang dipilih; checklist kelengkapan dan formulir Dokumen Perdin ikut menyesuaikan.</w:t>
       </w:r>
     </w:p>
     <w:p>
@@ -12584,7 +12584,7 @@
         <w:pStyle w:val="Heading2"/>
       </w:pPr>
       <w:r>
-        <w:t xml:space="preserve">Versi 2.5.5 — 1 Oktober 2026</w:t>
+        <w:t xml:space="preserve">Versi 2.5.6 — 1 Oktober 2026</w:t>
       </w:r>
     </w:p>
     <w:p>
@@ -12596,7 +12596,15 @@
         </w:numPr>
       </w:pPr>
       <w:r>
-        <w:t xml:space="preserve">Pengajuan perjadin dimulai dengan memilih jalur: dalam kota, luar kota, atau supervisi kerja praktek / magang. Jalur itu menyaring kategori perjalanan dinas dari Master Data.</w:t>
+        <w:t xml:space="preserve">Berkas Pertanggungjawaban (submenu Administrasi Sistem): berkas yang ditagih sesudah perjalanan dipilih sendiri untuk tiap jalur pengajuan, dan berlaku serentak pada formulir dokumen, checklist, serta penagihan.</w:t>
+      </w:r>
+    </w:p>
+    <w:p>
+      <w:pPr>
+        <w:pStyle w:val="Heading2"/>
+      </w:pPr>
+      <w:r>
+        <w:t xml:space="preserve">Versi 2.5.5 — 1 Oktober 2026</w:t>
       </w:r>
     </w:p>
     <w:p>
@@ -12608,7 +12616,7 @@
         </w:numPr>
       </w:pPr>
       <w:r>
-        <w:t xml:space="preserve">Jalur supervisi kerja praktek / magang tidak memakai Surat Perjalanan Dinas: cukup surat tugas beserta nomornya, dan jenis kegiatannya terisi sendiri.</w:t>
+        <w:t xml:space="preserve">Pengajuan perjadin dimulai dengan memilih jalur: dalam kota, luar kota, atau supervisi kerja praktek / magang. Jalur itu menyaring kategori perjalanan dinas dari Master Data.</w:t>
       </w:r>
     </w:p>
     <w:p>
@@ -12620,7 +12628,7 @@
         </w:numPr>
       </w:pPr>
       <w:r>
-        <w:t xml:space="preserve">Kaki halaman SPD mengikuti cetakan terbaru — lambang Garuda Sertifikasi dilepas, alamat verifikasi menjadi tte.komdigi.go.id — dan butir V tidak lagi memuat penanda QR.</w:t>
+        <w:t xml:space="preserve">Jalur supervisi kerja praktek / magang tidak memakai Surat Perjalanan Dinas: cukup surat tugas beserta nomornya, dan jenis kegiatannya terisi sendiri.</w:t>
       </w:r>
     </w:p>
     <w:p>
@@ -12632,15 +12640,7 @@
         </w:numPr>
       </w:pPr>
       <w:r>
-        <w:t xml:space="preserve">Daftar Usulan Perjadin menyebut pelaksana perjalanan pada kolom pertama, menggantikan kolom Pemohon yang selalu kosong.</w:t>
-      </w:r>
-    </w:p>
-    <w:p>
-      <w:pPr>
-        <w:pStyle w:val="Heading2"/>
-      </w:pPr>
-      <w:r>
-        <w:t xml:space="preserve">Versi 2.5.4 — 30 September 2026</w:t>
+        <w:t xml:space="preserve">Kaki halaman SPD mengikuti cetakan terbaru — lambang Garuda Sertifikasi dilepas, alamat verifikasi menjadi tte.komdigi.go.id — dan butir V tidak lagi memuat penanda QR.</w:t>
       </w:r>
     </w:p>
     <w:p>
@@ -12652,7 +12652,15 @@
         </w:numPr>
       </w:pPr>
       <w:r>
-        <w:t xml:space="preserve">Dokumen Output (submenu Administrasi Sistem): tampilan empat dokumen cetak diatur dari aplikasi — ukuran kertas dan huruf, elemen yang ikut tercetak, serta teks bakunya. Tiap perubahan tercatat pada jejak audit dan dapat dikembalikan ke bawaan.</w:t>
+        <w:t xml:space="preserve">Daftar Usulan Perjadin menyebut pelaksana perjalanan pada kolom pertama, menggantikan kolom Pemohon yang selalu kosong.</w:t>
+      </w:r>
+    </w:p>
+    <w:p>
+      <w:pPr>
+        <w:pStyle w:val="Heading2"/>
+      </w:pPr>
+      <w:r>
+        <w:t xml:space="preserve">Versi 2.5.4 — 30 September 2026</w:t>
       </w:r>
     </w:p>
     <w:p>
@@ -12664,7 +12672,7 @@
         </w:numPr>
       </w:pPr>
       <w:r>
-        <w:t xml:space="preserve">Dokumen Output memuat pratinjau dokumen contoh yang ikut berubah mengikuti centangan elemen, lengkap dengan tombol buka di tab baru dan unduh contoh PDF.</w:t>
+        <w:t xml:space="preserve">Dokumen Output (submenu Administrasi Sistem): tampilan empat dokumen cetak diatur dari aplikasi — ukuran kertas dan huruf, elemen yang ikut tercetak, serta teks bakunya. Tiap perubahan tercatat pada jejak audit dan dapat dikembalikan ke bawaan.</w:t>
       </w:r>
     </w:p>
     <w:p>
@@ -12676,15 +12684,7 @@
         </w:numPr>
       </w:pPr>
       <w:r>
-        <w:t xml:space="preserve">Penanda tanda tangan elektronik SRIKANDI dan nomor naskah sengaja tidak dapat dimatikan, supaya surat tetap dapat ditandatangani secara elektronik.</w:t>
-      </w:r>
-    </w:p>
-    <w:p>
-      <w:pPr>
-        <w:pStyle w:val="Heading2"/>
-      </w:pPr>
-      <w:r>
-        <w:t xml:space="preserve">Versi 2.5.3 — 21 September 2026</w:t>
+        <w:t xml:space="preserve">Dokumen Output memuat pratinjau dokumen contoh yang ikut berubah mengikuti centangan elemen, lengkap dengan tombol buka di tab baru dan unduh contoh PDF.</w:t>
       </w:r>
     </w:p>
     <w:p>
@@ -12696,7 +12696,15 @@
         </w:numPr>
       </w:pPr>
       <w:r>
-        <w:t xml:space="preserve">Formulir SPD: surat tugas dilampirkan sejak SPD dibuat — nomor dan berkasnya diisi pada kartu Surat Tugas (tidak wajib). Usulan perjadin yang memilih SPD itu mengambil keduanya secara otomatis; berkas surat tugas tidak diunggah lagi dan nomornya tidak disalin ulang.</w:t>
+        <w:t xml:space="preserve">Penanda tanda tangan elektronik SRIKANDI dan nomor naskah sengaja tidak dapat dimatikan, supaya surat tetap dapat ditandatangani secara elektronik.</w:t>
+      </w:r>
+    </w:p>
+    <w:p>
+      <w:pPr>
+        <w:pStyle w:val="Heading2"/>
+      </w:pPr>
+      <w:r>
+        <w:t xml:space="preserve">Versi 2.5.3 — 21 September 2026</w:t>
       </w:r>
     </w:p>
     <w:p>
@@ -12708,7 +12716,7 @@
         </w:numPr>
       </w:pPr>
       <w:r>
-        <w:t xml:space="preserve">Formulir SPD: kolom Akun pembebanan dihapus — akun diisi PPK saat verifikasi dan tanda tangan, bukan oleh pembuat SPD.</w:t>
+        <w:t xml:space="preserve">Formulir SPD: surat tugas dilampirkan sejak SPD dibuat — nomor dan berkasnya diisi pada kartu Surat Tugas (tidak wajib). Usulan perjadin yang memilih SPD itu mengambil keduanya secara otomatis; berkas surat tugas tidak diunggah lagi dan nomornya tidak disalin ulang.</w:t>
       </w:r>
     </w:p>
     <w:p>
@@ -12720,7 +12728,7 @@
         </w:numPr>
       </w:pPr>
       <w:r>
-        <w:t xml:space="preserve">Berkas pertanggungjawaban: unggahan dan ceklist "Kuitansi" kini disebut "Kuitansi penyelenggara / hotel" agar jelas kuitansi mana yang dimaksud — dari penyelenggara kegiatan atau dari hotel tempat menginap.</w:t>
+        <w:t xml:space="preserve">Formulir SPD: kolom Akun pembebanan dihapus — akun diisi PPK saat verifikasi dan tanda tangan, bukan oleh pembuat SPD.</w:t>
       </w:r>
     </w:p>
     <w:p>
@@ -12732,7 +12740,7 @@
         </w:numPr>
       </w:pPr>
       <w:r>
-        <w:t xml:space="preserve">Jadwal Perjalanan kini bermenu: Jadwal Keberangkatan, Peta Dalam Kota &amp; Sekitarnya, dan Peta Luar Kota. Peta memperlihatkan kota-kota tujuan pegawai beserta jumlah perjalanan dan orang yang berangkat; klik penanda untuk rinciannya, saring per tahun. Dalam kota &amp; sekitarnya berarti tujuan di Sulawesi Utara. Kota-kota besar sudah dikenal sistem; kota lain diberi lintang-bujur pada Master Data → Lokasi Tujuan.</w:t>
+        <w:t xml:space="preserve">Berkas pertanggungjawaban: unggahan dan ceklist "Kuitansi" kini disebut "Kuitansi penyelenggara / hotel" agar jelas kuitansi mana yang dimaksud — dari penyelenggara kegiatan atau dari hotel tempat menginap.</w:t>
       </w:r>
     </w:p>
     <w:p>
@@ -12744,7 +12752,7 @@
         </w:numPr>
       </w:pPr>
       <w:r>
-        <w:t xml:space="preserve">Peran baru Mahasiswa, dapat dipilih saat membuat akun atau diimpor lewat kolom role bernilai "mahasiswa".</w:t>
+        <w:t xml:space="preserve">Jadwal Perjalanan kini bermenu: Jadwal Keberangkatan, Peta Dalam Kota &amp; Sekitarnya, dan Peta Luar Kota. Peta memperlihatkan kota-kota tujuan pegawai beserta jumlah perjalanan dan orang yang berangkat; klik penanda untuk rinciannya, saring per tahun. Dalam kota &amp; sekitarnya berarti tujuan di Sulawesi Utara. Kota-kota besar sudah dikenal sistem; kota lain diberi lintang-bujur pada Master Data → Lokasi Tujuan.</w:t>
       </w:r>
     </w:p>
     <w:p>
@@ -12756,7 +12764,7 @@
         </w:numPr>
       </w:pPr>
       <w:r>
-        <w:t xml:space="preserve">Peran &amp; Hak Akses (submenu Administrasi Sistem, super administrator): menambah peran baru dan mengatur, per menu, kemampuan yang boleh dilihat, diubah, dan dihapus tiap peran — termasuk peran bawaan. Perubahan berlaku seketika dan tercatat pada jejak audit; Super Administrator selalu memegang seluruh akses. Hak menghapus master data dan menghapus pengguna kini kemampuan tersendiri.</w:t>
+        <w:t xml:space="preserve">Peran baru Mahasiswa, dapat dipilih saat membuat akun atau diimpor lewat kolom role bernilai "mahasiswa".</w:t>
       </w:r>
     </w:p>
     <w:p>
@@ -12768,15 +12776,7 @@
         </w:numPr>
       </w:pPr>
       <w:r>
-        <w:t xml:space="preserve">Pegawai eksternal, mahasiswa, dan outsourcing: modul perjalanan dinasnya dikembangkan terpisah. Sementara itu, setelah masuk mereka melihat halaman pemberitahuan "fitur masih dikembangkan" dengan tombol keluar; menu lain belum dapat dibuka.</w:t>
-      </w:r>
-    </w:p>
-    <w:p>
-      <w:pPr>
-        <w:pStyle w:val="Heading2"/>
-      </w:pPr>
-      <w:r>
-        <w:t xml:space="preserve">Versi 2.5.2 — 15 September 2026</w:t>
+        <w:t xml:space="preserve">Peran &amp; Hak Akses (submenu Administrasi Sistem, super administrator): menambah peran baru dan mengatur, per menu, kemampuan yang boleh dilihat, diubah, dan dihapus tiap peran — termasuk peran bawaan. Perubahan berlaku seketika dan tercatat pada jejak audit; Super Administrator selalu memegang seluruh akses. Hak menghapus master data dan menghapus pengguna kini kemampuan tersendiri.</w:t>
       </w:r>
     </w:p>
     <w:p>
@@ -12788,7 +12788,15 @@
         </w:numPr>
       </w:pPr>
       <w:r>
-        <w:t xml:space="preserve">Impor pengguna: sel yang kosong pada berkas CSV tidak lagi menghapus surel, nomor HP, dan rekening yang sudah diisi pengguna, sehingga data pegawai aman diimpor ulang untuk menambah orang. Wakil Direktur II ditambahkan ke data pegawai bawaan.</w:t>
+        <w:t xml:space="preserve">Pegawai eksternal, mahasiswa, dan outsourcing: modul perjalanan dinasnya dikembangkan terpisah. Sementara itu, setelah masuk mereka melihat halaman pemberitahuan "fitur masih dikembangkan" dengan tombol keluar; menu lain belum dapat dibuka.</w:t>
+      </w:r>
+    </w:p>
+    <w:p>
+      <w:pPr>
+        <w:pStyle w:val="Heading2"/>
+      </w:pPr>
+      <w:r>
+        <w:t xml:space="preserve">Versi 2.5.2 — 15 September 2026</w:t>
       </w:r>
     </w:p>
     <w:p>
@@ -12800,7 +12808,7 @@
         </w:numPr>
       </w:pPr>
       <w:r>
-        <w:t xml:space="preserve">Integrasi Data (submenu Administrasi Sistem): token API dashboard eksekutif dibuat, diganti, atau dicabut langsung dari aplikasi tanpa menyunting .env di server, lengkap dengan alamat dan jalur API-nya; token yang berlaku dapat ditampilkan dan disalin.</w:t>
+        <w:t xml:space="preserve">Impor pengguna: sel yang kosong pada berkas CSV tidak lagi menghapus surel, nomor HP, dan rekening yang sudah diisi pengguna, sehingga data pegawai aman diimpor ulang untuk menambah orang. Wakil Direktur II ditambahkan ke data pegawai bawaan.</w:t>
       </w:r>
     </w:p>
     <w:p>
@@ -12812,7 +12820,7 @@
         </w:numPr>
       </w:pPr>
       <w:r>
-        <w:t xml:space="preserve">Integrasi Data: pemantauan setiap permintaan API yang masuk (alamat IP, jalur, token yang dibawa — hanya ujung-ujungnya — diterima atau ditolak) dan pengiriman data dashboard eksekutif terjadwal (tiap jam, harian, atau mingguan) ke aplikasi tujuan memakai token, lengkap dengan riwayat pengirimannya dan tombol Kirim Sekarang.</w:t>
+        <w:t xml:space="preserve">Integrasi Data (submenu Administrasi Sistem): token API dashboard eksekutif dibuat, diganti, atau dicabut langsung dari aplikasi tanpa menyunting .env di server, lengkap dengan alamat dan jalur API-nya; token yang berlaku dapat ditampilkan dan disalin.</w:t>
       </w:r>
     </w:p>
     <w:p>
@@ -12824,7 +12832,7 @@
         </w:numPr>
       </w:pPr>
       <w:r>
-        <w:t xml:space="preserve">Pengaturan Sistem: kunci API Anthropic untuk Wawasan AI dan agen tanya-jawab Dashboard Eksekutif dipasang, diganti, atau dihapus dari aplikasi — tersimpan terenkripsi, tanpa menyunting .env di server.</w:t>
+        <w:t xml:space="preserve">Integrasi Data: pemantauan setiap permintaan API yang masuk (alamat IP, jalur, token yang dibawa — hanya ujung-ujungnya — diterima atau ditolak) dan pengiriman data dashboard eksekutif terjadwal (tiap jam, harian, atau mingguan) ke aplikasi tujuan memakai token, lengkap dengan riwayat pengirimannya dan tombol Kirim Sekarang.</w:t>
       </w:r>
     </w:p>
     <w:p>
@@ -12836,7 +12844,7 @@
         </w:numPr>
       </w:pPr>
       <w:r>
-        <w:t xml:space="preserve">Membuka atau mengunci tanggal dikeluarkan SPD serta mengelola token API dan kunci AI kini melalui kotak konfirmasi.</w:t>
+        <w:t xml:space="preserve">Pengaturan Sistem: kunci API Anthropic untuk Wawasan AI dan agen tanya-jawab Dashboard Eksekutif dipasang, diganti, atau dihapus dari aplikasi — tersimpan terenkripsi, tanpa menyunting .env di server.</w:t>
       </w:r>
     </w:p>
     <w:p>
@@ -12848,7 +12856,7 @@
         </w:numPr>
       </w:pPr>
       <w:r>
-        <w:t xml:space="preserve">Nomor SPD pada usulan bersifat unik: nomor yang sudah dipakai usulan lain — milik siapa pun — ditolak saat mengajukan maupun menyunting, dengan pesan yang menyebut usulan mana yang memakainya, sehingga tidak ada usulan ganda atas SPD yang sama.</w:t>
+        <w:t xml:space="preserve">Membuka atau mengunci tanggal dikeluarkan SPD serta mengelola token API dan kunci AI kini melalui kotak konfirmasi.</w:t>
       </w:r>
     </w:p>
     <w:p>
@@ -12860,7 +12868,7 @@
         </w:numPr>
       </w:pPr>
       <w:r>
-        <w:t xml:space="preserve">Usulan perjadin tidak lagi mensyaratkan SPD dibuat lewat aplikasi lebih dulu: formulir usulan terbuka bagi semua, memilih SPD dari aplikasi hanya untuk mengisi otomatis. SPD bertanda tangan beserta nomornya tetap wajib diunggah sebagai dasar persetujuan PPK.</w:t>
+        <w:t xml:space="preserve">Nomor SPD pada usulan bersifat unik: nomor yang sudah dipakai usulan lain — milik siapa pun — ditolak saat mengajukan maupun menyunting, dengan pesan yang menyebut usulan mana yang memakainya, sehingga tidak ada usulan ganda atas SPD yang sama.</w:t>
       </w:r>
     </w:p>
     <w:p>
@@ -12872,15 +12880,7 @@
         </w:numPr>
       </w:pPr>
       <w:r>
-        <w:t xml:space="preserve">Rincian Saya: tiap berkas memuat panel Pemantauan Berkas — status seluruh tanda tangan (tim keuangan, pelaksana, PPK, konfirmasi Direktur, daftar nominatif) dan status pembayaran (uang muka, pelunasan, transport lokal) beserta tanggal dan kodenya.</w:t>
-      </w:r>
-    </w:p>
-    <w:p>
-      <w:pPr>
-        <w:pStyle w:val="Heading2"/>
-      </w:pPr>
-      <w:r>
-        <w:t xml:space="preserve">Versi 2.5.1 — 15 September 2026</w:t>
+        <w:t xml:space="preserve">Usulan perjadin tidak lagi mensyaratkan SPD dibuat lewat aplikasi lebih dulu: formulir usulan terbuka bagi semua, memilih SPD dari aplikasi hanya untuk mengisi otomatis. SPD bertanda tangan beserta nomornya tetap wajib diunggah sebagai dasar persetujuan PPK.</w:t>
       </w:r>
     </w:p>
     <w:p>
@@ -12892,7 +12892,15 @@
         </w:numPr>
       </w:pPr>
       <w:r>
-        <w:t xml:space="preserve">Administrasi Sistem: super administrator dapat membuka atau mengunci tanggal dikeluarkan SPD bagi seluruh peran untuk kasus tanggal mundur (backdate); bawaannya terkunci, tiap perubahan tercatat pada jejak audit.</w:t>
+        <w:t xml:space="preserve">Rincian Saya: tiap berkas memuat panel Pemantauan Berkas — status seluruh tanda tangan (tim keuangan, pelaksana, PPK, konfirmasi Direktur, daftar nominatif) dan status pembayaran (uang muka, pelunasan, transport lokal) beserta tanggal dan kodenya.</w:t>
+      </w:r>
+    </w:p>
+    <w:p>
+      <w:pPr>
+        <w:pStyle w:val="Heading2"/>
+      </w:pPr>
+      <w:r>
+        <w:t xml:space="preserve">Versi 2.5.1 — 15 September 2026</w:t>
       </w:r>
     </w:p>
     <w:p>
@@ -12904,15 +12912,7 @@
         </w:numPr>
       </w:pPr>
       <w:r>
-        <w:t xml:space="preserve">Administrasi Sistem dipecah menjadi tiga halaman bermenu — Pengguna, Impor &amp; Ekspor, Pengaturan Sistem — dengan submenu di sidebar dan navigasi di kepala halaman.</w:t>
-      </w:r>
-    </w:p>
-    <w:p>
-      <w:pPr>
-        <w:pStyle w:val="Heading2"/>
-      </w:pPr>
-      <w:r>
-        <w:t xml:space="preserve">Versi 2.5 — 12 September 2026</w:t>
+        <w:t xml:space="preserve">Administrasi Sistem: super administrator dapat membuka atau mengunci tanggal dikeluarkan SPD bagi seluruh peran untuk kasus tanggal mundur (backdate); bawaannya terkunci, tiap perubahan tercatat pada jejak audit.</w:t>
       </w:r>
     </w:p>
     <w:p>
@@ -12924,7 +12924,15 @@
         </w:numPr>
       </w:pPr>
       <w:r>
-        <w:t xml:space="preserve">Usulan wajib melampirkan SPD bertanda tangan beserta nomornya; persetujuan PPK tercatat otomatis. Pengajuan berkelompok dan tombol Salin dihapus.</w:t>
+        <w:t xml:space="preserve">Administrasi Sistem dipecah menjadi tiga halaman bermenu — Pengguna, Impor &amp; Ekspor, Pengaturan Sistem — dengan submenu di sidebar dan navigasi di kepala halaman.</w:t>
+      </w:r>
+    </w:p>
+    <w:p>
+      <w:pPr>
+        <w:pStyle w:val="Heading2"/>
+      </w:pPr>
+      <w:r>
+        <w:t xml:space="preserve">Versi 2.5 — 12 September 2026</w:t>
       </w:r>
     </w:p>
     <w:p>
@@ -12936,7 +12944,7 @@
         </w:numPr>
       </w:pPr>
       <w:r>
-        <w:t xml:space="preserve">Menu Laporan Perjadin bagi pimpinan: daftar laporan, status konfirmasi, tindak lanjut. Laporan dikirim ke pimpinan saat disimpan dan dikonfirmasi Direktur lewat QR; tempat kegiatan per hari.</w:t>
+        <w:t xml:space="preserve">Usulan wajib melampirkan SPD bertanda tangan beserta nomornya; persetujuan PPK tercatat otomatis. Pengajuan berkelompok dan tombol Salin dihapus.</w:t>
       </w:r>
     </w:p>
     <w:p>
@@ -12948,7 +12956,7 @@
         </w:numPr>
       </w:pPr>
       <w:r>
-        <w:t xml:space="preserve">Pelunasan hanya menunggu konfirmasi laporan oleh Direktur — bukan tanda tangan PPK maupun daftar nominatif.</w:t>
+        <w:t xml:space="preserve">Menu Laporan Perjadin bagi pimpinan: daftar laporan, status konfirmasi, tindak lanjut. Laporan dikirim ke pimpinan saat disimpan dan dikonfirmasi Direktur lewat QR; tempat kegiatan per hari.</w:t>
       </w:r>
     </w:p>
     <w:p>
@@ -12960,7 +12968,7 @@
         </w:numPr>
       </w:pPr>
       <w:r>
-        <w:t xml:space="preserve">Daftar nominatif terbit per surat tugas begitu satu pelaksana tuntas; yang belum tercantum disebut dan bertambah sendiri. List Daftar Nominatif memuat seluruh daftar beserta status tanda tangan tiap pelaksana.</w:t>
+        <w:t xml:space="preserve">Pelunasan hanya menunggu konfirmasi laporan oleh Direktur — bukan tanda tangan PPK maupun daftar nominatif.</w:t>
       </w:r>
     </w:p>
     <w:p>
@@ -12972,7 +12980,7 @@
         </w:numPr>
       </w:pPr>
       <w:r>
-        <w:t xml:space="preserve">Berkas terkirim otomatis ke pelaksana setelah seluruh validasi rampung; status Sudah Dicek Tim Keuangan; tombol tanda tangan pelaksana tetap ada setelah masa sanggah; popup konfirmasi pada validasi dan pencabutannya.</w:t>
+        <w:t xml:space="preserve">Daftar nominatif terbit per surat tugas begitu satu pelaksana tuntas; yang belum tercantum disebut dan bertambah sendiri. List Daftar Nominatif memuat seluruh daftar beserta status tanda tangan tiap pelaksana.</w:t>
       </w:r>
     </w:p>
     <w:p>
@@ -12984,7 +12992,7 @@
         </w:numPr>
       </w:pPr>
       <w:r>
-        <w:t xml:space="preserve">Biaya penyelenggaraan: ditanya ada atau tidak; bila ada, nominal, bukti bayar, dan nomor invoice; tercetak di bawah uang penginapan.</w:t>
+        <w:t xml:space="preserve">Berkas terkirim otomatis ke pelaksana setelah seluruh validasi rampung; status Sudah Dicek Tim Keuangan; tombol tanda tangan pelaksana tetap ada setelah masa sanggah; popup konfirmasi pada validasi dan pencabutannya.</w:t>
       </w:r>
     </w:p>
     <w:p>
@@ -12996,7 +13004,7 @@
         </w:numPr>
       </w:pPr>
       <w:r>
-        <w:t xml:space="preserve">Tiket membawa invoice; nota transport lokal hanya untuk ruas bernominal (transport lokal boleh tidak ada); dalam kota satu baris transport lokal; checklist kelengkapan mengikuti formulir.</w:t>
+        <w:t xml:space="preserve">Biaya penyelenggaraan: ditanya ada atau tidak; bila ada, nominal, bukti bayar, dan nomor invoice; tercetak di bawah uang penginapan.</w:t>
       </w:r>
     </w:p>
     <w:p>
@@ -13008,7 +13016,7 @@
         </w:numPr>
       </w:pPr>
       <w:r>
-        <w:t xml:space="preserve">Verifikasi PPK (rincian, daftar riil, nominatif) dan Arsip Rincian Lengkap dikelompokkan per bulan dan tahun; arsip tidak lagi menunggu nominatif; menu Keuangan bagi PPK dalam mode lihat saja.</w:t>
+        <w:t xml:space="preserve">Tiket membawa invoice; nota transport lokal hanya untuk ruas bernominal (transport lokal boleh tidak ada); dalam kota satu baris transport lokal; checklist kelengkapan mengikuti formulir.</w:t>
       </w:r>
     </w:p>
     <w:p>
@@ -13020,7 +13028,7 @@
         </w:numPr>
       </w:pPr>
       <w:r>
-        <w:t xml:space="preserve">Pembatalan penggantian transport lokal dengan alasan; nominatif memuat QR dan kode verifikasi PPK.</w:t>
+        <w:t xml:space="preserve">Verifikasi PPK (rincian, daftar riil, nominatif) dan Arsip Rincian Lengkap dikelompokkan per bulan dan tahun; arsip tidak lagi menunggu nominatif; menu Keuangan bagi PPK dalam mode lihat saja.</w:t>
       </w:r>
     </w:p>
     <w:p>
@@ -13032,7 +13040,7 @@
         </w:numPr>
       </w:pPr>
       <w:r>
-        <w:t xml:space="preserve">Seluruh dokumen cetak berukuran folio dan dirapikan: usulan sebagai dokumen resmi berkop, rincian satu halaman, tanggal berbahasa Indonesia, WITA.</w:t>
+        <w:t xml:space="preserve">Pembatalan penggantian transport lokal dengan alasan; nominatif memuat QR dan kode verifikasi PPK.</w:t>
       </w:r>
     </w:p>
     <w:p>
@@ -13044,15 +13052,7 @@
         </w:numPr>
       </w:pPr>
       <w:r>
-        <w:t xml:space="preserve">Pelacakan berkas: sepuluh tonggak dengan lama hari antar tahap; versi aplikasi tertera di halaman masuk.</w:t>
-      </w:r>
-    </w:p>
-    <w:p>
-      <w:pPr>
-        <w:pStyle w:val="Heading2"/>
-      </w:pPr>
-      <w:r>
-        <w:t xml:space="preserve">Versi 2.4 — 5 September 2026</w:t>
+        <w:t xml:space="preserve">Seluruh dokumen cetak berukuran folio dan dirapikan: usulan sebagai dokumen resmi berkop, rincian satu halaman, tanggal berbahasa Indonesia, WITA.</w:t>
       </w:r>
     </w:p>
     <w:p>
@@ -13064,6 +13064,26 @@
         </w:numPr>
       </w:pPr>
       <w:r>
+        <w:t xml:space="preserve">Pelacakan berkas: sepuluh tonggak dengan lama hari antar tahap; versi aplikasi tertera di halaman masuk.</w:t>
+      </w:r>
+    </w:p>
+    <w:p>
+      <w:pPr>
+        <w:pStyle w:val="Heading2"/>
+      </w:pPr>
+      <w:r>
+        <w:t xml:space="preserve">Versi 2.4 — 5 September 2026</w:t>
+      </w:r>
+    </w:p>
+    <w:p>
+      <w:pPr>
+        <w:pStyle w:val="ListParagraph"/>
+        <w:numPr>
+          <w:ilvl w:val="0"/>
+          <w:numId w:val="2"/>
+        </w:numPr>
+      </w:pPr>
+      <w:r>
         <w:t xml:space="preserve">Rilis dasar versi 2: Surat Perjalanan Dinas dengan nomor unik dan pengikut, pertanggungjawaban per pelaksana (tiket, nota, bill hotel, laporan), rincian biaya dan daftar riil dengan dua jalur tanda tangan, daftar nominatif, pembayaran beserta riwayatnya, pelacakan berkas, dan saluran bantuan.</w:t>
       </w:r>
     </w:p>
@@ -13085,7 +13105,7 @@
           <w:sz w:val="17"/>
           <w:szCs w:val="17"/>
         </w:rPr>
-        <w:t xml:space="preserve">Buku Panduan PANGI v2.5 — Politeknik Kesehatan Kemenkes Manado. Isi buku ini mengikuti sistem sebagaimana berjalan pada 2 Oktober 2026 (versi 2.5.11); bila tampilan di layar berbeda, yang berlaku adalah sistemnya, dan mohon laporkan selisihnya lewat menu Bantuan.</w:t>
+        <w:t xml:space="preserve">Buku Panduan PANGI v2.5 — Politeknik Kesehatan Kemenkes Manado. Isi buku ini mengikuti sistem sebagaimana berjalan pada 6 Oktober 2026 (versi 2.5.12); bila tampilan di layar berbeda, yang berlaku adalah sistemnya, dan mohon laporkan selisihnya lewat menu Bantuan.</w:t>
       </w:r>
     </w:p>
     <w:sectPr>

</xml_diff>

<commit_message>
Status pembayaran berbukti di Rincian Saya dan nomor handphone pengguna (2.5.13)
- Rincian Saya (Daftar Riil Saya dan Rincian Biaya Saya): butir Status
  Pembayaran pada panel Pemantauan Berkas kini menyebut bendahara yang
  membayarkan uang muka, pelunasan, dan transport lokal, beserta tautan
  Lihat bukti bayar ke bukti transfernya. Keuangan mendapat relasi jurnal
  pembayaran untuk membaca pencatat dan buktinya.
- Administrasi Sistem → Pengguna: nomor handphone (WhatsApp) dapat diisi
  saat menambah maupun menyunting pengguna, dengan aturan yang sama
  seperti di halaman Profil.
- Panduan Penggunaan, buku panduan (sampul 2.5.13), dan riwayat
  perubahan diperbarui.

Co-Authored-By: Claude Opus 5.5 <noreply@anthropic.com>
</commit_message>
<xml_diff>
--- a/resources/panduan/Buku-Panduan-PANGI-v2.5.docx
+++ b/resources/panduan/Buku-Panduan-PANGI-v2.5.docx
@@ -239,7 +239,7 @@
                 <w:sz w:val="19"/>
                 <w:szCs w:val="19"/>
               </w:rPr>
-              <w:t xml:space="preserve">2.5.12</w:t>
+              <w:t xml:space="preserve">2.5.13</w:t>
             </w:r>
           </w:p>
         </w:tc>
@@ -7086,7 +7086,7 @@
         <w:rPr>
           <w:color w:val="55616F"/>
         </w:rPr>
-        <w:t xml:space="preserve">  Panel Pemantauan Berkas pada tiap kartu menyebut seluruh tanda tangan — tim keuangan, Anda, PPK, konfirmasi Direktur atas laporan, daftar nominatif — dan pembayaran uang muka, pelunasan, serta transport lokal, lengkap dengan tanggal dan kodenya.</w:t>
+        <w:t xml:space="preserve">  Panel Pemantauan Berkas pada tiap kartu menyebut seluruh tanda tangan — tim keuangan, Anda, PPK, konfirmasi Direktur atas laporan, daftar nominatif — dan pembayaran uang muka, pelunasan, serta transport lokal, lengkap dengan tanggal dan kodenya. Pembayaran yang sudah dicatat bendahara menyebut siapa yang membayarkannya, dan tautan Lihat bukti bayar membuka bukti transfernya.</w:t>
       </w:r>
     </w:p>
     <w:p>
@@ -7913,7 +7913,7 @@
         </w:numPr>
       </w:pPr>
       <w:r>
-        <w:t xml:space="preserve">Menu Administrasi Sistem memuat seluruh pengguna beserta peran, unit kerja, dan atasannya.</w:t>
+        <w:t xml:space="preserve">Menu Administrasi Sistem memuat seluruh pengguna beserta peran, unit kerja, dan atasannya. Saat menambah atau menyunting pengguna, nomor handphone (WhatsApp) dapat diisi langsung — nomor itulah yang dipakai tim keuangan menagih berkas.</w:t>
       </w:r>
     </w:p>
     <w:p>
@@ -12368,7 +12368,7 @@
         <w:pStyle w:val="Heading2"/>
       </w:pPr>
       <w:r>
-        <w:t xml:space="preserve">Versi 2.5.12 — 6 Oktober 2026</w:t>
+        <w:t xml:space="preserve">Versi 2.5.13 — 6 Oktober 2026</w:t>
       </w:r>
     </w:p>
     <w:p>
@@ -12380,15 +12380,7 @@
         </w:numPr>
       </w:pPr>
       <w:r>
-        <w:t xml:space="preserve">Menu Keuangan → Input Rincian Biaya menampilkan navigasi halaman: sebelumnya baris setelah halaman pertama tidak dapat dibuka. Halaman Persetujuan mendapat perbaikan yang sama.</w:t>
-      </w:r>
-    </w:p>
-    <w:p>
-      <w:pPr>
-        <w:pStyle w:val="Heading2"/>
-      </w:pPr>
-      <w:r>
-        <w:t xml:space="preserve">Versi 2.5.11 — 2 Oktober 2026</w:t>
+        <w:t xml:space="preserve">Rincian Saya — Daftar Riil Saya maupun Rincian Biaya Saya — menyebut bendahara yang membayarkan uang muka, pelunasan, dan transport lokal, beserta tautan Lihat bukti bayar.</w:t>
       </w:r>
     </w:p>
     <w:p>
@@ -12400,7 +12392,15 @@
         </w:numPr>
       </w:pPr>
       <w:r>
-        <w:t xml:space="preserve">Halaman SPD memuat keterangan langkah sesudah SPD disimpan: unduh dokumen berformat SRIKANDI, masukkan ke SRIKANDI untuk ditandatangani PPK dan Direktur, unduh SPD bertanda tangan beserta nomor naskahnya, lalu buat usulan perjadin dengan dokumen dan nomor itu.</w:t>
+        <w:t xml:space="preserve">Administrasi Sistem → Pengguna: nomor handphone (WhatsApp) dapat diisi saat menambah maupun menyunting pengguna.</w:t>
+      </w:r>
+    </w:p>
+    <w:p>
+      <w:pPr>
+        <w:pStyle w:val="Heading2"/>
+      </w:pPr>
+      <w:r>
+        <w:t xml:space="preserve">Versi 2.5.12 — 6 Oktober 2026</w:t>
       </w:r>
     </w:p>
     <w:p>
@@ -12412,7 +12412,7 @@
         </w:numPr>
       </w:pPr>
       <w:r>
-        <w:t xml:space="preserve">Kolom nomor SPD pada formulir usulan tidak lagi terisi nomor internal PJ-… dari PANGI; keterangannya mengingatkan bahwa yang diisi nomor naskah dari SRIKANDI.</w:t>
+        <w:t xml:space="preserve">Menu Keuangan → Input Rincian Biaya menampilkan navigasi halaman: sebelumnya baris setelah halaman pertama tidak dapat dibuka. Halaman Persetujuan mendapat perbaikan yang sama.</w:t>
       </w:r>
     </w:p>
     <w:p>
@@ -12420,7 +12420,7 @@
         <w:pStyle w:val="Heading2"/>
       </w:pPr>
       <w:r>
-        <w:t xml:space="preserve">Versi 2.5.10 — 2 Oktober 2026</w:t>
+        <w:t xml:space="preserve">Versi 2.5.11 — 2 Oktober 2026</w:t>
       </w:r>
     </w:p>
     <w:p>
@@ -12432,7 +12432,7 @@
         </w:numPr>
       </w:pPr>
       <w:r>
-        <w:t xml:space="preserve">Jejak Audit bersubmenu: Semua Aktivitas, Penghapusan Usulan &amp; SPD — usulan dan SPD yang dihapus beserta isinya, penghapusnya, waktu, dan alamatnya; penghapusan SPD sebelumnya tidak tercatat — dan Nomor Surat.</w:t>
+        <w:t xml:space="preserve">Halaman SPD memuat keterangan langkah sesudah SPD disimpan: unduh dokumen berformat SRIKANDI, masukkan ke SRIKANDI untuk ditandatangani PPK dan Direktur, unduh SPD bertanda tangan beserta nomor naskahnya, lalu buat usulan perjadin dengan dokumen dan nomor itu.</w:t>
       </w:r>
     </w:p>
     <w:p>
@@ -12444,7 +12444,15 @@
         </w:numPr>
       </w:pPr>
       <w:r>
-        <w:t xml:space="preserve">Nomor Surat mendaftar nomor SPD aplikasi, nomor SPD bertanda tangan, dan nomor surat tugas per bulan dan tahun, dan dapat diekspor ke Excel untuk dicocokkan arsiparis.</w:t>
+        <w:t xml:space="preserve">Kolom nomor SPD pada formulir usulan tidak lagi terisi nomor internal PJ-… dari PANGI; keterangannya mengingatkan bahwa yang diisi nomor naskah dari SRIKANDI.</w:t>
+      </w:r>
+    </w:p>
+    <w:p>
+      <w:pPr>
+        <w:pStyle w:val="Heading2"/>
+      </w:pPr>
+      <w:r>
+        <w:t xml:space="preserve">Versi 2.5.10 — 2 Oktober 2026</w:t>
       </w:r>
     </w:p>
     <w:p>
@@ -12456,15 +12464,7 @@
         </w:numPr>
       </w:pPr>
       <w:r>
-        <w:t xml:space="preserve">Dashboard Eksekutif bersubmenu: Dashboard Utama berisi angka-angka seperti sebelumnya, dan News Feed menyajikan perjalanan dinas serta tindak lanjut yang dijadwalkan sebagai lini masa.</w:t>
-      </w:r>
-    </w:p>
-    <w:p>
-      <w:pPr>
-        <w:pStyle w:val="Heading2"/>
-      </w:pPr>
-      <w:r>
-        <w:t xml:space="preserve">Versi 2.5.9 — 1 Oktober 2026</w:t>
+        <w:t xml:space="preserve">Jejak Audit bersubmenu: Semua Aktivitas, Penghapusan Usulan &amp; SPD — usulan dan SPD yang dihapus beserta isinya, penghapusnya, waktu, dan alamatnya; penghapusan SPD sebelumnya tidak tercatat — dan Nomor Surat.</w:t>
       </w:r>
     </w:p>
     <w:p>
@@ -12476,7 +12476,7 @@
         </w:numPr>
       </w:pPr>
       <w:r>
-        <w:t xml:space="preserve">Sanggahan pelaksana atas rincian biaya kini tampil di halaman Keuangan — tempat nominalnya diperbaiki — lengkap dengan alasan dan waktunya, beserta tombol Kirim Ulang ke Pelaksana. Sebelumnya berkas yang rinciannya disanggah tidak dapat dikirim ulang.</w:t>
+        <w:t xml:space="preserve">Nomor Surat mendaftar nomor SPD aplikasi, nomor SPD bertanda tangan, dan nomor surat tugas per bulan dan tahun, dan dapat diekspor ke Excel untuk dicocokkan arsiparis.</w:t>
       </w:r>
     </w:p>
     <w:p>
@@ -12488,7 +12488,15 @@
         </w:numPr>
       </w:pPr>
       <w:r>
-        <w:t xml:space="preserve">Mengirim ulang hanya membuka dokumen yang disanggah: dokumen yang sudah ditandatangani pelaksana tetap berlaku beserta kode konfirmasinya, dan pemberitahuannya hanya menyebut dokumen yang perlu disikapi lagi.</w:t>
+        <w:t xml:space="preserve">Dashboard Eksekutif bersubmenu: Dashboard Utama berisi angka-angka seperti sebelumnya, dan News Feed menyajikan perjalanan dinas serta tindak lanjut yang dijadwalkan sebagai lini masa.</w:t>
+      </w:r>
+    </w:p>
+    <w:p>
+      <w:pPr>
+        <w:pStyle w:val="Heading2"/>
+      </w:pPr>
+      <w:r>
+        <w:t xml:space="preserve">Versi 2.5.9 — 1 Oktober 2026</w:t>
       </w:r>
     </w:p>
     <w:p>
@@ -12500,15 +12508,7 @@
         </w:numPr>
       </w:pPr>
       <w:r>
-        <w:t xml:space="preserve">Halaman Detail Keuangan kini menampilkan pesan hasil tiap tindakan — komponen tersimpan, berkas terkirim, atau alasan tertahan — dan menyebut tujuan perjalanan pada kepalanya. Pemberitahuan sanggahan kepada tim keuangan langsung membuka halaman ini.</w:t>
-      </w:r>
-    </w:p>
-    <w:p>
-      <w:pPr>
-        <w:pStyle w:val="Heading2"/>
-      </w:pPr>
-      <w:r>
-        <w:t xml:space="preserve">Versi 2.5.8 — 1 Oktober 2026</w:t>
+        <w:t xml:space="preserve">Sanggahan pelaksana atas rincian biaya kini tampil di halaman Keuangan — tempat nominalnya diperbaiki — lengkap dengan alasan dan waktunya, beserta tombol Kirim Ulang ke Pelaksana. Sebelumnya berkas yang rinciannya disanggah tidak dapat dikirim ulang.</w:t>
       </w:r>
     </w:p>
     <w:p>
@@ -12520,7 +12520,7 @@
         </w:numPr>
       </w:pPr>
       <w:r>
-        <w:t xml:space="preserve">Buku panduan bersampul baru dengan warna Kemenkes. Bab 5.1 dan 5.2 kini bergambar: setiap langkah membuat SPD sampai mengajukan perjadin disertai tangkapan layar bertanda nomor.</w:t>
+        <w:t xml:space="preserve">Mengirim ulang hanya membuka dokumen yang disanggah: dokumen yang sudah ditandatangani pelaksana tetap berlaku beserta kode konfirmasinya, dan pemberitahuannya hanya menyebut dokumen yang perlu disikapi lagi.</w:t>
       </w:r>
     </w:p>
     <w:p>
@@ -12532,7 +12532,15 @@
         </w:numPr>
       </w:pPr>
       <w:r>
-        <w:t xml:space="preserve">Kotak konfirmasi sebelum mengirim pengajuan kini benar-benar menampilkan tujuan, tanggal, dan nomor SPD yang diisi — sebelumnya selalu tertulis "—".</w:t>
+        <w:t xml:space="preserve">Halaman Detail Keuangan kini menampilkan pesan hasil tiap tindakan — komponen tersimpan, berkas terkirim, atau alasan tertahan — dan menyebut tujuan perjalanan pada kepalanya. Pemberitahuan sanggahan kepada tim keuangan langsung membuka halaman ini.</w:t>
+      </w:r>
+    </w:p>
+    <w:p>
+      <w:pPr>
+        <w:pStyle w:val="Heading2"/>
+      </w:pPr>
+      <w:r>
+        <w:t xml:space="preserve">Versi 2.5.8 — 1 Oktober 2026</w:t>
       </w:r>
     </w:p>
     <w:p>
@@ -12544,15 +12552,7 @@
         </w:numPr>
       </w:pPr>
       <w:r>
-        <w:t xml:space="preserve">Menu Panduan Penggunaan memuat tangkapan layar yang sama, dan buku lengkapnya dapat diunduh dalam format PDF maupun Word.</w:t>
-      </w:r>
-    </w:p>
-    <w:p>
-      <w:pPr>
-        <w:pStyle w:val="Heading2"/>
-      </w:pPr>
-      <w:r>
-        <w:t xml:space="preserve">Versi 2.5.7 — 1 Oktober 2026</w:t>
+        <w:t xml:space="preserve">Buku panduan bersampul baru dengan warna Kemenkes. Bab 5.1 dan 5.2 kini bergambar: setiap langkah membuat SPD sampai mengajukan perjadin disertai tangkapan layar bertanda nomor.</w:t>
       </w:r>
     </w:p>
     <w:p>
@@ -12564,7 +12564,7 @@
         </w:numPr>
       </w:pPr>
       <w:r>
-        <w:t xml:space="preserve">Supervisi kerja praktek / magang dibedakan menurut tujuannya: supervisi ke luar kota tetap menerbitkan SPD — berkas SPD bertanda tangan beserta nomornya wajib dilampirkan — sedangkan supervisi di dalam kota cukup surat tugas.</w:t>
+        <w:t xml:space="preserve">Kotak konfirmasi sebelum mengirim pengajuan kini benar-benar menampilkan tujuan, tanggal, dan nomor SPD yang diisi — sebelumnya selalu tertulis "—".</w:t>
       </w:r>
     </w:p>
     <w:p>
@@ -12576,7 +12576,7 @@
         </w:numPr>
       </w:pPr>
       <w:r>
-        <w:t xml:space="preserve">Isian SPD pada formulir usulan muncul dan menghilang sendiri mengikuti kategori yang dipilih; checklist kelengkapan dan formulir Dokumen Perdin ikut menyesuaikan.</w:t>
+        <w:t xml:space="preserve">Menu Panduan Penggunaan memuat tangkapan layar yang sama, dan buku lengkapnya dapat diunduh dalam format PDF maupun Word.</w:t>
       </w:r>
     </w:p>
     <w:p>
@@ -12584,7 +12584,7 @@
         <w:pStyle w:val="Heading2"/>
       </w:pPr>
       <w:r>
-        <w:t xml:space="preserve">Versi 2.5.6 — 1 Oktober 2026</w:t>
+        <w:t xml:space="preserve">Versi 2.5.7 — 1 Oktober 2026</w:t>
       </w:r>
     </w:p>
     <w:p>
@@ -12596,15 +12596,7 @@
         </w:numPr>
       </w:pPr>
       <w:r>
-        <w:t xml:space="preserve">Berkas Pertanggungjawaban (submenu Administrasi Sistem): berkas yang ditagih sesudah perjalanan dipilih sendiri untuk tiap jalur pengajuan, dan berlaku serentak pada formulir dokumen, checklist, serta penagihan.</w:t>
-      </w:r>
-    </w:p>
-    <w:p>
-      <w:pPr>
-        <w:pStyle w:val="Heading2"/>
-      </w:pPr>
-      <w:r>
-        <w:t xml:space="preserve">Versi 2.5.5 — 1 Oktober 2026</w:t>
+        <w:t xml:space="preserve">Supervisi kerja praktek / magang dibedakan menurut tujuannya: supervisi ke luar kota tetap menerbitkan SPD — berkas SPD bertanda tangan beserta nomornya wajib dilampirkan — sedangkan supervisi di dalam kota cukup surat tugas.</w:t>
       </w:r>
     </w:p>
     <w:p>
@@ -12616,7 +12608,15 @@
         </w:numPr>
       </w:pPr>
       <w:r>
-        <w:t xml:space="preserve">Pengajuan perjadin dimulai dengan memilih jalur: dalam kota, luar kota, atau supervisi kerja praktek / magang. Jalur itu menyaring kategori perjalanan dinas dari Master Data.</w:t>
+        <w:t xml:space="preserve">Isian SPD pada formulir usulan muncul dan menghilang sendiri mengikuti kategori yang dipilih; checklist kelengkapan dan formulir Dokumen Perdin ikut menyesuaikan.</w:t>
+      </w:r>
+    </w:p>
+    <w:p>
+      <w:pPr>
+        <w:pStyle w:val="Heading2"/>
+      </w:pPr>
+      <w:r>
+        <w:t xml:space="preserve">Versi 2.5.6 — 1 Oktober 2026</w:t>
       </w:r>
     </w:p>
     <w:p>
@@ -12628,7 +12628,15 @@
         </w:numPr>
       </w:pPr>
       <w:r>
-        <w:t xml:space="preserve">Jalur supervisi kerja praktek / magang tidak memakai Surat Perjalanan Dinas: cukup surat tugas beserta nomornya, dan jenis kegiatannya terisi sendiri.</w:t>
+        <w:t xml:space="preserve">Berkas Pertanggungjawaban (submenu Administrasi Sistem): berkas yang ditagih sesudah perjalanan dipilih sendiri untuk tiap jalur pengajuan, dan berlaku serentak pada formulir dokumen, checklist, serta penagihan.</w:t>
+      </w:r>
+    </w:p>
+    <w:p>
+      <w:pPr>
+        <w:pStyle w:val="Heading2"/>
+      </w:pPr>
+      <w:r>
+        <w:t xml:space="preserve">Versi 2.5.5 — 1 Oktober 2026</w:t>
       </w:r>
     </w:p>
     <w:p>
@@ -12640,7 +12648,7 @@
         </w:numPr>
       </w:pPr>
       <w:r>
-        <w:t xml:space="preserve">Kaki halaman SPD mengikuti cetakan terbaru — lambang Garuda Sertifikasi dilepas, alamat verifikasi menjadi tte.komdigi.go.id — dan butir V tidak lagi memuat penanda QR.</w:t>
+        <w:t xml:space="preserve">Pengajuan perjadin dimulai dengan memilih jalur: dalam kota, luar kota, atau supervisi kerja praktek / magang. Jalur itu menyaring kategori perjalanan dinas dari Master Data.</w:t>
       </w:r>
     </w:p>
     <w:p>
@@ -12652,15 +12660,7 @@
         </w:numPr>
       </w:pPr>
       <w:r>
-        <w:t xml:space="preserve">Daftar Usulan Perjadin menyebut pelaksana perjalanan pada kolom pertama, menggantikan kolom Pemohon yang selalu kosong.</w:t>
-      </w:r>
-    </w:p>
-    <w:p>
-      <w:pPr>
-        <w:pStyle w:val="Heading2"/>
-      </w:pPr>
-      <w:r>
-        <w:t xml:space="preserve">Versi 2.5.4 — 30 September 2026</w:t>
+        <w:t xml:space="preserve">Jalur supervisi kerja praktek / magang tidak memakai Surat Perjalanan Dinas: cukup surat tugas beserta nomornya, dan jenis kegiatannya terisi sendiri.</w:t>
       </w:r>
     </w:p>
     <w:p>
@@ -12672,7 +12672,7 @@
         </w:numPr>
       </w:pPr>
       <w:r>
-        <w:t xml:space="preserve">Dokumen Output (submenu Administrasi Sistem): tampilan empat dokumen cetak diatur dari aplikasi — ukuran kertas dan huruf, elemen yang ikut tercetak, serta teks bakunya. Tiap perubahan tercatat pada jejak audit dan dapat dikembalikan ke bawaan.</w:t>
+        <w:t xml:space="preserve">Kaki halaman SPD mengikuti cetakan terbaru — lambang Garuda Sertifikasi dilepas, alamat verifikasi menjadi tte.komdigi.go.id — dan butir V tidak lagi memuat penanda QR.</w:t>
       </w:r>
     </w:p>
     <w:p>
@@ -12684,7 +12684,15 @@
         </w:numPr>
       </w:pPr>
       <w:r>
-        <w:t xml:space="preserve">Dokumen Output memuat pratinjau dokumen contoh yang ikut berubah mengikuti centangan elemen, lengkap dengan tombol buka di tab baru dan unduh contoh PDF.</w:t>
+        <w:t xml:space="preserve">Daftar Usulan Perjadin menyebut pelaksana perjalanan pada kolom pertama, menggantikan kolom Pemohon yang selalu kosong.</w:t>
+      </w:r>
+    </w:p>
+    <w:p>
+      <w:pPr>
+        <w:pStyle w:val="Heading2"/>
+      </w:pPr>
+      <w:r>
+        <w:t xml:space="preserve">Versi 2.5.4 — 30 September 2026</w:t>
       </w:r>
     </w:p>
     <w:p>
@@ -12696,15 +12704,7 @@
         </w:numPr>
       </w:pPr>
       <w:r>
-        <w:t xml:space="preserve">Penanda tanda tangan elektronik SRIKANDI dan nomor naskah sengaja tidak dapat dimatikan, supaya surat tetap dapat ditandatangani secara elektronik.</w:t>
-      </w:r>
-    </w:p>
-    <w:p>
-      <w:pPr>
-        <w:pStyle w:val="Heading2"/>
-      </w:pPr>
-      <w:r>
-        <w:t xml:space="preserve">Versi 2.5.3 — 21 September 2026</w:t>
+        <w:t xml:space="preserve">Dokumen Output (submenu Administrasi Sistem): tampilan empat dokumen cetak diatur dari aplikasi — ukuran kertas dan huruf, elemen yang ikut tercetak, serta teks bakunya. Tiap perubahan tercatat pada jejak audit dan dapat dikembalikan ke bawaan.</w:t>
       </w:r>
     </w:p>
     <w:p>
@@ -12716,7 +12716,7 @@
         </w:numPr>
       </w:pPr>
       <w:r>
-        <w:t xml:space="preserve">Formulir SPD: surat tugas dilampirkan sejak SPD dibuat — nomor dan berkasnya diisi pada kartu Surat Tugas (tidak wajib). Usulan perjadin yang memilih SPD itu mengambil keduanya secara otomatis; berkas surat tugas tidak diunggah lagi dan nomornya tidak disalin ulang.</w:t>
+        <w:t xml:space="preserve">Dokumen Output memuat pratinjau dokumen contoh yang ikut berubah mengikuti centangan elemen, lengkap dengan tombol buka di tab baru dan unduh contoh PDF.</w:t>
       </w:r>
     </w:p>
     <w:p>
@@ -12728,7 +12728,15 @@
         </w:numPr>
       </w:pPr>
       <w:r>
-        <w:t xml:space="preserve">Formulir SPD: kolom Akun pembebanan dihapus — akun diisi PPK saat verifikasi dan tanda tangan, bukan oleh pembuat SPD.</w:t>
+        <w:t xml:space="preserve">Penanda tanda tangan elektronik SRIKANDI dan nomor naskah sengaja tidak dapat dimatikan, supaya surat tetap dapat ditandatangani secara elektronik.</w:t>
+      </w:r>
+    </w:p>
+    <w:p>
+      <w:pPr>
+        <w:pStyle w:val="Heading2"/>
+      </w:pPr>
+      <w:r>
+        <w:t xml:space="preserve">Versi 2.5.3 — 21 September 2026</w:t>
       </w:r>
     </w:p>
     <w:p>
@@ -12740,7 +12748,7 @@
         </w:numPr>
       </w:pPr>
       <w:r>
-        <w:t xml:space="preserve">Berkas pertanggungjawaban: unggahan dan ceklist "Kuitansi" kini disebut "Kuitansi penyelenggara / hotel" agar jelas kuitansi mana yang dimaksud — dari penyelenggara kegiatan atau dari hotel tempat menginap.</w:t>
+        <w:t xml:space="preserve">Formulir SPD: surat tugas dilampirkan sejak SPD dibuat — nomor dan berkasnya diisi pada kartu Surat Tugas (tidak wajib). Usulan perjadin yang memilih SPD itu mengambil keduanya secara otomatis; berkas surat tugas tidak diunggah lagi dan nomornya tidak disalin ulang.</w:t>
       </w:r>
     </w:p>
     <w:p>
@@ -12752,7 +12760,7 @@
         </w:numPr>
       </w:pPr>
       <w:r>
-        <w:t xml:space="preserve">Jadwal Perjalanan kini bermenu: Jadwal Keberangkatan, Peta Dalam Kota &amp; Sekitarnya, dan Peta Luar Kota. Peta memperlihatkan kota-kota tujuan pegawai beserta jumlah perjalanan dan orang yang berangkat; klik penanda untuk rinciannya, saring per tahun. Dalam kota &amp; sekitarnya berarti tujuan di Sulawesi Utara. Kota-kota besar sudah dikenal sistem; kota lain diberi lintang-bujur pada Master Data → Lokasi Tujuan.</w:t>
+        <w:t xml:space="preserve">Formulir SPD: kolom Akun pembebanan dihapus — akun diisi PPK saat verifikasi dan tanda tangan, bukan oleh pembuat SPD.</w:t>
       </w:r>
     </w:p>
     <w:p>
@@ -12764,7 +12772,7 @@
         </w:numPr>
       </w:pPr>
       <w:r>
-        <w:t xml:space="preserve">Peran baru Mahasiswa, dapat dipilih saat membuat akun atau diimpor lewat kolom role bernilai "mahasiswa".</w:t>
+        <w:t xml:space="preserve">Berkas pertanggungjawaban: unggahan dan ceklist "Kuitansi" kini disebut "Kuitansi penyelenggara / hotel" agar jelas kuitansi mana yang dimaksud — dari penyelenggara kegiatan atau dari hotel tempat menginap.</w:t>
       </w:r>
     </w:p>
     <w:p>
@@ -12776,7 +12784,7 @@
         </w:numPr>
       </w:pPr>
       <w:r>
-        <w:t xml:space="preserve">Peran &amp; Hak Akses (submenu Administrasi Sistem, super administrator): menambah peran baru dan mengatur, per menu, kemampuan yang boleh dilihat, diubah, dan dihapus tiap peran — termasuk peran bawaan. Perubahan berlaku seketika dan tercatat pada jejak audit; Super Administrator selalu memegang seluruh akses. Hak menghapus master data dan menghapus pengguna kini kemampuan tersendiri.</w:t>
+        <w:t xml:space="preserve">Jadwal Perjalanan kini bermenu: Jadwal Keberangkatan, Peta Dalam Kota &amp; Sekitarnya, dan Peta Luar Kota. Peta memperlihatkan kota-kota tujuan pegawai beserta jumlah perjalanan dan orang yang berangkat; klik penanda untuk rinciannya, saring per tahun. Dalam kota &amp; sekitarnya berarti tujuan di Sulawesi Utara. Kota-kota besar sudah dikenal sistem; kota lain diberi lintang-bujur pada Master Data → Lokasi Tujuan.</w:t>
       </w:r>
     </w:p>
     <w:p>
@@ -12788,15 +12796,7 @@
         </w:numPr>
       </w:pPr>
       <w:r>
-        <w:t xml:space="preserve">Pegawai eksternal, mahasiswa, dan outsourcing: modul perjalanan dinasnya dikembangkan terpisah. Sementara itu, setelah masuk mereka melihat halaman pemberitahuan "fitur masih dikembangkan" dengan tombol keluar; menu lain belum dapat dibuka.</w:t>
-      </w:r>
-    </w:p>
-    <w:p>
-      <w:pPr>
-        <w:pStyle w:val="Heading2"/>
-      </w:pPr>
-      <w:r>
-        <w:t xml:space="preserve">Versi 2.5.2 — 15 September 2026</w:t>
+        <w:t xml:space="preserve">Peran baru Mahasiswa, dapat dipilih saat membuat akun atau diimpor lewat kolom role bernilai "mahasiswa".</w:t>
       </w:r>
     </w:p>
     <w:p>
@@ -12808,7 +12808,7 @@
         </w:numPr>
       </w:pPr>
       <w:r>
-        <w:t xml:space="preserve">Impor pengguna: sel yang kosong pada berkas CSV tidak lagi menghapus surel, nomor HP, dan rekening yang sudah diisi pengguna, sehingga data pegawai aman diimpor ulang untuk menambah orang. Wakil Direktur II ditambahkan ke data pegawai bawaan.</w:t>
+        <w:t xml:space="preserve">Peran &amp; Hak Akses (submenu Administrasi Sistem, super administrator): menambah peran baru dan mengatur, per menu, kemampuan yang boleh dilihat, diubah, dan dihapus tiap peran — termasuk peran bawaan. Perubahan berlaku seketika dan tercatat pada jejak audit; Super Administrator selalu memegang seluruh akses. Hak menghapus master data dan menghapus pengguna kini kemampuan tersendiri.</w:t>
       </w:r>
     </w:p>
     <w:p>
@@ -12820,7 +12820,15 @@
         </w:numPr>
       </w:pPr>
       <w:r>
-        <w:t xml:space="preserve">Integrasi Data (submenu Administrasi Sistem): token API dashboard eksekutif dibuat, diganti, atau dicabut langsung dari aplikasi tanpa menyunting .env di server, lengkap dengan alamat dan jalur API-nya; token yang berlaku dapat ditampilkan dan disalin.</w:t>
+        <w:t xml:space="preserve">Pegawai eksternal, mahasiswa, dan outsourcing: modul perjalanan dinasnya dikembangkan terpisah. Sementara itu, setelah masuk mereka melihat halaman pemberitahuan "fitur masih dikembangkan" dengan tombol keluar; menu lain belum dapat dibuka.</w:t>
+      </w:r>
+    </w:p>
+    <w:p>
+      <w:pPr>
+        <w:pStyle w:val="Heading2"/>
+      </w:pPr>
+      <w:r>
+        <w:t xml:space="preserve">Versi 2.5.2 — 15 September 2026</w:t>
       </w:r>
     </w:p>
     <w:p>
@@ -12832,7 +12840,7 @@
         </w:numPr>
       </w:pPr>
       <w:r>
-        <w:t xml:space="preserve">Integrasi Data: pemantauan setiap permintaan API yang masuk (alamat IP, jalur, token yang dibawa — hanya ujung-ujungnya — diterima atau ditolak) dan pengiriman data dashboard eksekutif terjadwal (tiap jam, harian, atau mingguan) ke aplikasi tujuan memakai token, lengkap dengan riwayat pengirimannya dan tombol Kirim Sekarang.</w:t>
+        <w:t xml:space="preserve">Impor pengguna: sel yang kosong pada berkas CSV tidak lagi menghapus surel, nomor HP, dan rekening yang sudah diisi pengguna, sehingga data pegawai aman diimpor ulang untuk menambah orang. Wakil Direktur II ditambahkan ke data pegawai bawaan.</w:t>
       </w:r>
     </w:p>
     <w:p>
@@ -12844,7 +12852,7 @@
         </w:numPr>
       </w:pPr>
       <w:r>
-        <w:t xml:space="preserve">Pengaturan Sistem: kunci API Anthropic untuk Wawasan AI dan agen tanya-jawab Dashboard Eksekutif dipasang, diganti, atau dihapus dari aplikasi — tersimpan terenkripsi, tanpa menyunting .env di server.</w:t>
+        <w:t xml:space="preserve">Integrasi Data (submenu Administrasi Sistem): token API dashboard eksekutif dibuat, diganti, atau dicabut langsung dari aplikasi tanpa menyunting .env di server, lengkap dengan alamat dan jalur API-nya; token yang berlaku dapat ditampilkan dan disalin.</w:t>
       </w:r>
     </w:p>
     <w:p>
@@ -12856,7 +12864,7 @@
         </w:numPr>
       </w:pPr>
       <w:r>
-        <w:t xml:space="preserve">Membuka atau mengunci tanggal dikeluarkan SPD serta mengelola token API dan kunci AI kini melalui kotak konfirmasi.</w:t>
+        <w:t xml:space="preserve">Integrasi Data: pemantauan setiap permintaan API yang masuk (alamat IP, jalur, token yang dibawa — hanya ujung-ujungnya — diterima atau ditolak) dan pengiriman data dashboard eksekutif terjadwal (tiap jam, harian, atau mingguan) ke aplikasi tujuan memakai token, lengkap dengan riwayat pengirimannya dan tombol Kirim Sekarang.</w:t>
       </w:r>
     </w:p>
     <w:p>
@@ -12868,7 +12876,7 @@
         </w:numPr>
       </w:pPr>
       <w:r>
-        <w:t xml:space="preserve">Nomor SPD pada usulan bersifat unik: nomor yang sudah dipakai usulan lain — milik siapa pun — ditolak saat mengajukan maupun menyunting, dengan pesan yang menyebut usulan mana yang memakainya, sehingga tidak ada usulan ganda atas SPD yang sama.</w:t>
+        <w:t xml:space="preserve">Pengaturan Sistem: kunci API Anthropic untuk Wawasan AI dan agen tanya-jawab Dashboard Eksekutif dipasang, diganti, atau dihapus dari aplikasi — tersimpan terenkripsi, tanpa menyunting .env di server.</w:t>
       </w:r>
     </w:p>
     <w:p>
@@ -12880,7 +12888,7 @@
         </w:numPr>
       </w:pPr>
       <w:r>
-        <w:t xml:space="preserve">Usulan perjadin tidak lagi mensyaratkan SPD dibuat lewat aplikasi lebih dulu: formulir usulan terbuka bagi semua, memilih SPD dari aplikasi hanya untuk mengisi otomatis. SPD bertanda tangan beserta nomornya tetap wajib diunggah sebagai dasar persetujuan PPK.</w:t>
+        <w:t xml:space="preserve">Membuka atau mengunci tanggal dikeluarkan SPD serta mengelola token API dan kunci AI kini melalui kotak konfirmasi.</w:t>
       </w:r>
     </w:p>
     <w:p>
@@ -12892,15 +12900,7 @@
         </w:numPr>
       </w:pPr>
       <w:r>
-        <w:t xml:space="preserve">Rincian Saya: tiap berkas memuat panel Pemantauan Berkas — status seluruh tanda tangan (tim keuangan, pelaksana, PPK, konfirmasi Direktur, daftar nominatif) dan status pembayaran (uang muka, pelunasan, transport lokal) beserta tanggal dan kodenya.</w:t>
-      </w:r>
-    </w:p>
-    <w:p>
-      <w:pPr>
-        <w:pStyle w:val="Heading2"/>
-      </w:pPr>
-      <w:r>
-        <w:t xml:space="preserve">Versi 2.5.1 — 15 September 2026</w:t>
+        <w:t xml:space="preserve">Nomor SPD pada usulan bersifat unik: nomor yang sudah dipakai usulan lain — milik siapa pun — ditolak saat mengajukan maupun menyunting, dengan pesan yang menyebut usulan mana yang memakainya, sehingga tidak ada usulan ganda atas SPD yang sama.</w:t>
       </w:r>
     </w:p>
     <w:p>
@@ -12912,7 +12912,7 @@
         </w:numPr>
       </w:pPr>
       <w:r>
-        <w:t xml:space="preserve">Administrasi Sistem: super administrator dapat membuka atau mengunci tanggal dikeluarkan SPD bagi seluruh peran untuk kasus tanggal mundur (backdate); bawaannya terkunci, tiap perubahan tercatat pada jejak audit.</w:t>
+        <w:t xml:space="preserve">Usulan perjadin tidak lagi mensyaratkan SPD dibuat lewat aplikasi lebih dulu: formulir usulan terbuka bagi semua, memilih SPD dari aplikasi hanya untuk mengisi otomatis. SPD bertanda tangan beserta nomornya tetap wajib diunggah sebagai dasar persetujuan PPK.</w:t>
       </w:r>
     </w:p>
     <w:p>
@@ -12924,7 +12924,7 @@
         </w:numPr>
       </w:pPr>
       <w:r>
-        <w:t xml:space="preserve">Administrasi Sistem dipecah menjadi tiga halaman bermenu — Pengguna, Impor &amp; Ekspor, Pengaturan Sistem — dengan submenu di sidebar dan navigasi di kepala halaman.</w:t>
+        <w:t xml:space="preserve">Rincian Saya: tiap berkas memuat panel Pemantauan Berkas — status seluruh tanda tangan (tim keuangan, pelaksana, PPK, konfirmasi Direktur, daftar nominatif) dan status pembayaran (uang muka, pelunasan, transport lokal) beserta tanggal dan kodenya.</w:t>
       </w:r>
     </w:p>
     <w:p>
@@ -12932,7 +12932,7 @@
         <w:pStyle w:val="Heading2"/>
       </w:pPr>
       <w:r>
-        <w:t xml:space="preserve">Versi 2.5 — 12 September 2026</w:t>
+        <w:t xml:space="preserve">Versi 2.5.1 — 15 September 2026</w:t>
       </w:r>
     </w:p>
     <w:p>
@@ -12944,7 +12944,7 @@
         </w:numPr>
       </w:pPr>
       <w:r>
-        <w:t xml:space="preserve">Usulan wajib melampirkan SPD bertanda tangan beserta nomornya; persetujuan PPK tercatat otomatis. Pengajuan berkelompok dan tombol Salin dihapus.</w:t>
+        <w:t xml:space="preserve">Administrasi Sistem: super administrator dapat membuka atau mengunci tanggal dikeluarkan SPD bagi seluruh peran untuk kasus tanggal mundur (backdate); bawaannya terkunci, tiap perubahan tercatat pada jejak audit.</w:t>
       </w:r>
     </w:p>
     <w:p>
@@ -12956,7 +12956,15 @@
         </w:numPr>
       </w:pPr>
       <w:r>
-        <w:t xml:space="preserve">Menu Laporan Perjadin bagi pimpinan: daftar laporan, status konfirmasi, tindak lanjut. Laporan dikirim ke pimpinan saat disimpan dan dikonfirmasi Direktur lewat QR; tempat kegiatan per hari.</w:t>
+        <w:t xml:space="preserve">Administrasi Sistem dipecah menjadi tiga halaman bermenu — Pengguna, Impor &amp; Ekspor, Pengaturan Sistem — dengan submenu di sidebar dan navigasi di kepala halaman.</w:t>
+      </w:r>
+    </w:p>
+    <w:p>
+      <w:pPr>
+        <w:pStyle w:val="Heading2"/>
+      </w:pPr>
+      <w:r>
+        <w:t xml:space="preserve">Versi 2.5 — 12 September 2026</w:t>
       </w:r>
     </w:p>
     <w:p>
@@ -12968,7 +12976,7 @@
         </w:numPr>
       </w:pPr>
       <w:r>
-        <w:t xml:space="preserve">Pelunasan hanya menunggu konfirmasi laporan oleh Direktur — bukan tanda tangan PPK maupun daftar nominatif.</w:t>
+        <w:t xml:space="preserve">Usulan wajib melampirkan SPD bertanda tangan beserta nomornya; persetujuan PPK tercatat otomatis. Pengajuan berkelompok dan tombol Salin dihapus.</w:t>
       </w:r>
     </w:p>
     <w:p>
@@ -12980,7 +12988,7 @@
         </w:numPr>
       </w:pPr>
       <w:r>
-        <w:t xml:space="preserve">Daftar nominatif terbit per surat tugas begitu satu pelaksana tuntas; yang belum tercantum disebut dan bertambah sendiri. List Daftar Nominatif memuat seluruh daftar beserta status tanda tangan tiap pelaksana.</w:t>
+        <w:t xml:space="preserve">Menu Laporan Perjadin bagi pimpinan: daftar laporan, status konfirmasi, tindak lanjut. Laporan dikirim ke pimpinan saat disimpan dan dikonfirmasi Direktur lewat QR; tempat kegiatan per hari.</w:t>
       </w:r>
     </w:p>
     <w:p>
@@ -12992,7 +13000,7 @@
         </w:numPr>
       </w:pPr>
       <w:r>
-        <w:t xml:space="preserve">Berkas terkirim otomatis ke pelaksana setelah seluruh validasi rampung; status Sudah Dicek Tim Keuangan; tombol tanda tangan pelaksana tetap ada setelah masa sanggah; popup konfirmasi pada validasi dan pencabutannya.</w:t>
+        <w:t xml:space="preserve">Pelunasan hanya menunggu konfirmasi laporan oleh Direktur — bukan tanda tangan PPK maupun daftar nominatif.</w:t>
       </w:r>
     </w:p>
     <w:p>
@@ -13004,7 +13012,7 @@
         </w:numPr>
       </w:pPr>
       <w:r>
-        <w:t xml:space="preserve">Biaya penyelenggaraan: ditanya ada atau tidak; bila ada, nominal, bukti bayar, dan nomor invoice; tercetak di bawah uang penginapan.</w:t>
+        <w:t xml:space="preserve">Daftar nominatif terbit per surat tugas begitu satu pelaksana tuntas; yang belum tercantum disebut dan bertambah sendiri. List Daftar Nominatif memuat seluruh daftar beserta status tanda tangan tiap pelaksana.</w:t>
       </w:r>
     </w:p>
     <w:p>
@@ -13016,7 +13024,7 @@
         </w:numPr>
       </w:pPr>
       <w:r>
-        <w:t xml:space="preserve">Tiket membawa invoice; nota transport lokal hanya untuk ruas bernominal (transport lokal boleh tidak ada); dalam kota satu baris transport lokal; checklist kelengkapan mengikuti formulir.</w:t>
+        <w:t xml:space="preserve">Berkas terkirim otomatis ke pelaksana setelah seluruh validasi rampung; status Sudah Dicek Tim Keuangan; tombol tanda tangan pelaksana tetap ada setelah masa sanggah; popup konfirmasi pada validasi dan pencabutannya.</w:t>
       </w:r>
     </w:p>
     <w:p>
@@ -13028,7 +13036,7 @@
         </w:numPr>
       </w:pPr>
       <w:r>
-        <w:t xml:space="preserve">Verifikasi PPK (rincian, daftar riil, nominatif) dan Arsip Rincian Lengkap dikelompokkan per bulan dan tahun; arsip tidak lagi menunggu nominatif; menu Keuangan bagi PPK dalam mode lihat saja.</w:t>
+        <w:t xml:space="preserve">Biaya penyelenggaraan: ditanya ada atau tidak; bila ada, nominal, bukti bayar, dan nomor invoice; tercetak di bawah uang penginapan.</w:t>
       </w:r>
     </w:p>
     <w:p>
@@ -13040,7 +13048,7 @@
         </w:numPr>
       </w:pPr>
       <w:r>
-        <w:t xml:space="preserve">Pembatalan penggantian transport lokal dengan alasan; nominatif memuat QR dan kode verifikasi PPK.</w:t>
+        <w:t xml:space="preserve">Tiket membawa invoice; nota transport lokal hanya untuk ruas bernominal (transport lokal boleh tidak ada); dalam kota satu baris transport lokal; checklist kelengkapan mengikuti formulir.</w:t>
       </w:r>
     </w:p>
     <w:p>
@@ -13052,7 +13060,7 @@
         </w:numPr>
       </w:pPr>
       <w:r>
-        <w:t xml:space="preserve">Seluruh dokumen cetak berukuran folio dan dirapikan: usulan sebagai dokumen resmi berkop, rincian satu halaman, tanggal berbahasa Indonesia, WITA.</w:t>
+        <w:t xml:space="preserve">Verifikasi PPK (rincian, daftar riil, nominatif) dan Arsip Rincian Lengkap dikelompokkan per bulan dan tahun; arsip tidak lagi menunggu nominatif; menu Keuangan bagi PPK dalam mode lihat saja.</w:t>
       </w:r>
     </w:p>
     <w:p>
@@ -13064,15 +13072,7 @@
         </w:numPr>
       </w:pPr>
       <w:r>
-        <w:t xml:space="preserve">Pelacakan berkas: sepuluh tonggak dengan lama hari antar tahap; versi aplikasi tertera di halaman masuk.</w:t>
-      </w:r>
-    </w:p>
-    <w:p>
-      <w:pPr>
-        <w:pStyle w:val="Heading2"/>
-      </w:pPr>
-      <w:r>
-        <w:t xml:space="preserve">Versi 2.4 — 5 September 2026</w:t>
+        <w:t xml:space="preserve">Pembatalan penggantian transport lokal dengan alasan; nominatif memuat QR dan kode verifikasi PPK.</w:t>
       </w:r>
     </w:p>
     <w:p>
@@ -13084,6 +13084,38 @@
         </w:numPr>
       </w:pPr>
       <w:r>
+        <w:t xml:space="preserve">Seluruh dokumen cetak berukuran folio dan dirapikan: usulan sebagai dokumen resmi berkop, rincian satu halaman, tanggal berbahasa Indonesia, WITA.</w:t>
+      </w:r>
+    </w:p>
+    <w:p>
+      <w:pPr>
+        <w:pStyle w:val="ListParagraph"/>
+        <w:numPr>
+          <w:ilvl w:val="0"/>
+          <w:numId w:val="2"/>
+        </w:numPr>
+      </w:pPr>
+      <w:r>
+        <w:t xml:space="preserve">Pelacakan berkas: sepuluh tonggak dengan lama hari antar tahap; versi aplikasi tertera di halaman masuk.</w:t>
+      </w:r>
+    </w:p>
+    <w:p>
+      <w:pPr>
+        <w:pStyle w:val="Heading2"/>
+      </w:pPr>
+      <w:r>
+        <w:t xml:space="preserve">Versi 2.4 — 5 September 2026</w:t>
+      </w:r>
+    </w:p>
+    <w:p>
+      <w:pPr>
+        <w:pStyle w:val="ListParagraph"/>
+        <w:numPr>
+          <w:ilvl w:val="0"/>
+          <w:numId w:val="2"/>
+        </w:numPr>
+      </w:pPr>
+      <w:r>
         <w:t xml:space="preserve">Rilis dasar versi 2: Surat Perjalanan Dinas dengan nomor unik dan pengikut, pertanggungjawaban per pelaksana (tiket, nota, bill hotel, laporan), rincian biaya dan daftar riil dengan dua jalur tanda tangan, daftar nominatif, pembayaran beserta riwayatnya, pelacakan berkas, dan saluran bantuan.</w:t>
       </w:r>
     </w:p>
@@ -13105,7 +13137,7 @@
           <w:sz w:val="17"/>
           <w:szCs w:val="17"/>
         </w:rPr>
-        <w:t xml:space="preserve">Buku Panduan PANGI v2.5 — Politeknik Kesehatan Kemenkes Manado. Isi buku ini mengikuti sistem sebagaimana berjalan pada 6 Oktober 2026 (versi 2.5.12); bila tampilan di layar berbeda, yang berlaku adalah sistemnya, dan mohon laporkan selisihnya lewat menu Bantuan.</w:t>
+        <w:t xml:space="preserve">Buku Panduan PANGI v2.5 — Politeknik Kesehatan Kemenkes Manado. Isi buku ini mengikuti sistem sebagaimana berjalan pada 6 Oktober 2026 (versi 2.5.13); bila tampilan di layar berbeda, yang berlaku adalah sistemnya, dan mohon laporkan selisihnya lewat menu Bantuan.</w:t>
       </w:r>
     </w:p>
     <w:sectPr>

</xml_diff>

<commit_message>
Contoh pengisian Registrasi Naskah Keluar di SRIKANDI untuk SPD (2.5.14)
- Halaman SPD: langkah ke SRIKANDI menyebut menu Naskah Keluar →
  Registrasi Naskah Keluar, dengan contoh isian yang bisa dibuka-tutup
  (tipe form, dikirim melalui PPK, klasifikasi KU.02.04, Ambil Nomor,
  penandatangan PPK lalu Direktur, TTE QR 3x3).
- Panduan Penggunaan langkah 7: contoh isian yang sama beserta dua
  tangkapan layar SRIKANDI bertanda nomor.
- Buku panduan bab 5.1: contoh pengisian dan Gambar 5.8–5.9; gambar
  sesudahnya bernomor ulang, sampul dan PDF versi 2.5.14.

Co-Authored-By: Claude Opus 5.5 <noreply@anthropic.com>
</commit_message>
<xml_diff>
--- a/resources/panduan/Buku-Panduan-PANGI-v2.5.docx
+++ b/resources/panduan/Buku-Panduan-PANGI-v2.5.docx
@@ -239,7 +239,7 @@
                 <w:sz w:val="19"/>
                 <w:szCs w:val="19"/>
               </w:rPr>
-              <w:t xml:space="preserve">2.5.13</w:t>
+              <w:t xml:space="preserve">2.5.14</w:t>
             </w:r>
           </w:p>
         </w:tc>
@@ -5089,7 +5089,335 @@
         <w:spacing w:before="60" w:after="160"/>
       </w:pPr>
       <w:r>
-        <w:t xml:space="preserve">Halaman SPD yang baru disimpan memuat keterangan Langkah berikutnya: (1) tekan Unduh PDF — dokumennya sudah berformat SRIKANDI, jadi penanda ${nomor_naskah}, ${ttd_pengirim1}, dan ${ttd_pengirim2} jangan diubah atau dihapus; (2) masukkan dokumen itu ke SRIKANDI sebagai naskah dinas keluar dan ajukan tanda tangan kepada PPK (lembar pertama) dan Direktur (lembar kedua); (3) setelah selesai diproses, unduh SPD bertanda tangan dari SRIKANDI dan catat nomor naskahnya — nomor PJ-… di PANGI hanya nomor internal; (4) lanjutkan dengan mengajukan usulan perjalanan dinas memakai dokumen dan nomor itu (bagian 5.2).</w:t>
+        <w:t xml:space="preserve">Halaman SPD yang baru disimpan memuat keterangan Langkah berikutnya: (1) tekan Unduh PDF — dokumennya sudah berformat SRIKANDI, jadi penanda ${nomor_naskah}, ${ttd_pengirim1}, dan ${ttd_pengirim2} jangan diubah atau dihapus; (2) masukkan dokumen itu ke SRIKANDI lewat Naskah Keluar → Registrasi Naskah Keluar dan ajukan tanda tangan kepada PPK (lembar pertama) dan Direktur (lembar kedua); (3) setelah selesai diproses, unduh SPD bertanda tangan dari SRIKANDI dan catat nomor naskahnya — nomor PJ-… di PANGI hanya nomor internal; (4) lanjutkan dengan mengajukan usulan perjalanan dinas memakai dokumen dan nomor itu (bagian 5.2).</w:t>
+      </w:r>
+    </w:p>
+    <w:p>
+      <w:pPr>
+        <w:keepNext/>
+        <w:spacing w:before="200" w:after="80"/>
+      </w:pPr>
+      <w:r>
+        <w:rPr>
+          <w:b/>
+          <w:bCs/>
+          <w:color w:val="045E6A"/>
+        </w:rPr>
+        <w:t xml:space="preserve">Contoh pengisian Registrasi Naskah Keluar di SRIKANDI</w:t>
+      </w:r>
+    </w:p>
+    <w:p>
+      <w:pPr>
+        <w:spacing w:before="0" w:after="50"/>
+        <w:ind w:left="360"/>
+      </w:pPr>
+      <w:r>
+        <w:rPr>
+          <w:b/>
+          <w:bCs/>
+        </w:rPr>
+        <w:t xml:space="preserve">Tipe Form: </w:t>
+      </w:r>
+      <w:r>
+        <w:t xml:space="preserve">Naskah Keluar</w:t>
+      </w:r>
+    </w:p>
+    <w:p>
+      <w:pPr>
+        <w:spacing w:before="0" w:after="50"/>
+        <w:ind w:left="360"/>
+      </w:pPr>
+      <w:r>
+        <w:rPr>
+          <w:b/>
+          <w:bCs/>
+        </w:rPr>
+        <w:t xml:space="preserve">Dikirimkan melalui: </w:t>
+      </w:r>
+      <w:r>
+        <w:t xml:space="preserve">Pejabat Pembuat Komitmen Politeknik Kesehatan Kementerian Kesehatan Manado</w:t>
+      </w:r>
+    </w:p>
+    <w:p>
+      <w:pPr>
+        <w:spacing w:before="0" w:after="50"/>
+        <w:ind w:left="360"/>
+      </w:pPr>
+      <w:r>
+        <w:rPr>
+          <w:b/>
+          <w:bCs/>
+        </w:rPr>
+        <w:t xml:space="preserve">Jenis / Sifat Naskah: </w:t>
+      </w:r>
+      <w:r>
+        <w:t xml:space="preserve">Naskah Dinas · Biasa</w:t>
+      </w:r>
+    </w:p>
+    <w:p>
+      <w:pPr>
+        <w:spacing w:before="0" w:after="50"/>
+        <w:ind w:left="360"/>
+      </w:pPr>
+      <w:r>
+        <w:rPr>
+          <w:b/>
+          <w:bCs/>
+        </w:rPr>
+        <w:t xml:space="preserve">Klasifikasi: </w:t>
+      </w:r>
+      <w:r>
+        <w:t xml:space="preserve">KU.02.04 – Belanja Modal</w:t>
+      </w:r>
+    </w:p>
+    <w:p>
+      <w:pPr>
+        <w:spacing w:before="0" w:after="50"/>
+        <w:ind w:left="360"/>
+      </w:pPr>
+      <w:r>
+        <w:rPr>
+          <w:b/>
+          <w:bCs/>
+        </w:rPr>
+        <w:t xml:space="preserve">Nomor Naskah: </w:t>
+      </w:r>
+      <w:r>
+        <w:t xml:space="preserve">tekan Ambil Nomor, lalu catat nomornya — nomor inilah yang nanti diisi pada usulan perjadin</w:t>
+      </w:r>
+    </w:p>
+    <w:p>
+      <w:pPr>
+        <w:spacing w:before="0" w:after="50"/>
+        <w:ind w:left="360"/>
+      </w:pPr>
+      <w:r>
+        <w:rPr>
+          <w:b/>
+          <w:bCs/>
+        </w:rPr>
+        <w:t xml:space="preserve">Hal dan Isi Ringkas: </w:t>
+      </w:r>
+      <w:r>
+        <w:t xml:space="preserve">Surat Perjalanan Dinas a.n. nama pelaksana, beserta maksud, tujuan, dan tanggal perjalanan dari SPD</w:t>
+      </w:r>
+    </w:p>
+    <w:p>
+      <w:pPr>
+        <w:spacing w:before="0" w:after="50"/>
+        <w:ind w:left="360"/>
+      </w:pPr>
+      <w:r>
+        <w:rPr>
+          <w:b/>
+          <w:bCs/>
+        </w:rPr>
+        <w:t xml:space="preserve">File naskah: </w:t>
+      </w:r>
+      <w:r>
+        <w:t xml:space="preserve">PDF hasil Unduh PDF di PANGI (maks. 5 MB), tanpa diubah</w:t>
+      </w:r>
+    </w:p>
+    <w:p>
+      <w:pPr>
+        <w:spacing w:before="0" w:after="50"/>
+        <w:ind w:left="360"/>
+      </w:pPr>
+      <w:r>
+        <w:rPr>
+          <w:b/>
+          <w:bCs/>
+        </w:rPr>
+        <w:t xml:space="preserve">Tujuan Utama: </w:t>
+      </w:r>
+      <w:r>
+        <w:t xml:space="preserve">pelaksana perjalanan dinas</w:t>
+      </w:r>
+    </w:p>
+    <w:p>
+      <w:pPr>
+        <w:spacing w:before="0" w:after="50"/>
+        <w:ind w:left="360"/>
+      </w:pPr>
+      <w:r>
+        <w:rPr>
+          <w:b/>
+          <w:bCs/>
+        </w:rPr>
+        <w:t xml:space="preserve">Verifikator: </w:t>
+      </w:r>
+      <w:r>
+        <w:t xml:space="preserve">Kepala Sub Bagian Administrasi Umum, Wakil Direktur II, dan Sekretaris</w:t>
+      </w:r>
+    </w:p>
+    <w:p>
+      <w:pPr>
+        <w:spacing w:before="0" w:after="50"/>
+        <w:ind w:left="360"/>
+      </w:pPr>
+      <w:r>
+        <w:rPr>
+          <w:b/>
+          <w:bCs/>
+        </w:rPr>
+        <w:t xml:space="preserve">Penandatangan: </w:t>
+      </w:r>
+      <w:r>
+        <w:t xml:space="preserve">PPK lebih dulu, lalu Direktur — urutannya menentukan kotak tanda tangan lembar pertama dan kedua</w:t>
+      </w:r>
+    </w:p>
+    <w:p>
+      <w:pPr>
+        <w:spacing w:before="0" w:after="50"/>
+        <w:ind w:left="360"/>
+      </w:pPr>
+      <w:r>
+        <w:rPr>
+          <w:b/>
+          <w:bCs/>
+        </w:rPr>
+        <w:t xml:space="preserve">Tanda tangan: </w:t>
+      </w:r>
+      <w:r>
+        <w:t xml:space="preserve">Elektronik · Visual TTE QR Code · Ukuran QR 3x3, lalu tekan Simpan</w:t>
+      </w:r>
+    </w:p>
+    <w:p>
+      <w:pPr>
+        <w:keepNext/>
+        <w:spacing w:before="160" w:after="80"/>
+        <w:jc w:val="center"/>
+      </w:pPr>
+      <w:r>
+        <w:drawing>
+          <wp:inline distT="0" distB="0" distL="0" distR="0">
+            <wp:extent cx="5760000" cy="2602164"/>
+            <wp:effectExtent l="0" t="0" r="0" b="0"/>
+            <wp:docPr id="301" name="srikandi-01-isi-naskah"/>
+            <wp:cNvGraphicFramePr>
+              <a:graphicFrameLocks xmlns:a="http://schemas.openxmlformats.org/drawingml/2006/main" noChangeAspect="1"/>
+            </wp:cNvGraphicFramePr>
+            <a:graphic xmlns:a="http://schemas.openxmlformats.org/drawingml/2006/main">
+              <a:graphicData uri="http://schemas.openxmlformats.org/drawingml/2006/picture">
+                <pic:pic xmlns:pic="http://schemas.openxmlformats.org/drawingml/2006/picture">
+                  <pic:nvPicPr>
+                    <pic:cNvPr id="301" name="srikandi-01-isi-naskah"/>
+                    <pic:cNvPicPr/>
+                  </pic:nvPicPr>
+                  <pic:blipFill>
+                    <a:blip r:embed="rIdSrikandi301"/>
+                    <a:stretch>
+                      <a:fillRect/>
+                    </a:stretch>
+                  </pic:blipFill>
+                  <pic:spPr>
+                    <a:xfrm>
+                      <a:off x="0" y="0"/>
+                      <a:ext cx="5760000" cy="2602164"/>
+                    </a:xfrm>
+                    <a:prstGeom prst="rect">
+                      <a:avLst/>
+                    </a:prstGeom>
+                    <a:ln w="9525">
+                      <a:solidFill>
+                        <a:srgbClr val="D5DEE0"/>
+                      </a:solidFill>
+                    </a:ln>
+                  </pic:spPr>
+                </pic:pic>
+              </a:graphicData>
+            </a:graphic>
+          </wp:inline>
+        </w:drawing>
+      </w:r>
+    </w:p>
+    <w:p>
+      <w:pPr>
+        <w:pStyle w:val="Keterangan"/>
+        <w:spacing w:before="0" w:after="260"/>
+        <w:jc w:val="center"/>
+      </w:pPr>
+      <w:r>
+        <w:rPr>
+          <w:b/>
+          <w:bCs/>
+          <w:i w:val="0"/>
+          <w:iCs w:val="0"/>
+          <w:color w:val="045E6A"/>
+        </w:rPr>
+        <w:t xml:space="preserve">Gambar 5.8</w:t>
+      </w:r>
+      <w:r>
+        <w:t xml:space="preserve"> — Registrasi Naskah Keluar di SRIKANDI: Tipe Form Naskah Keluar (1), dikirim melalui PPK (2), Naskah Dinas bersifat Biasa (3), klasifikasi KU.02.04 (4), Ambil Nomor (5), Hal dan Isi Ringkas (6), lalu berkas SPD (7).</w:t>
+      </w:r>
+    </w:p>
+    <w:p>
+      <w:pPr>
+        <w:keepNext/>
+        <w:spacing w:before="160" w:after="80"/>
+        <w:jc w:val="center"/>
+      </w:pPr>
+      <w:r>
+        <w:drawing>
+          <wp:inline distT="0" distB="0" distL="0" distR="0">
+            <wp:extent cx="5760000" cy="2575058"/>
+            <wp:effectExtent l="0" t="0" r="0" b="0"/>
+            <wp:docPr id="302" name="srikandi-02-penandatangan"/>
+            <wp:cNvGraphicFramePr>
+              <a:graphicFrameLocks xmlns:a="http://schemas.openxmlformats.org/drawingml/2006/main" noChangeAspect="1"/>
+            </wp:cNvGraphicFramePr>
+            <a:graphic xmlns:a="http://schemas.openxmlformats.org/drawingml/2006/main">
+              <a:graphicData uri="http://schemas.openxmlformats.org/drawingml/2006/picture">
+                <pic:pic xmlns:pic="http://schemas.openxmlformats.org/drawingml/2006/picture">
+                  <pic:nvPicPr>
+                    <pic:cNvPr id="302" name="srikandi-02-penandatangan"/>
+                    <pic:cNvPicPr/>
+                  </pic:nvPicPr>
+                  <pic:blipFill>
+                    <a:blip r:embed="rIdSrikandi302"/>
+                    <a:stretch>
+                      <a:fillRect/>
+                    </a:stretch>
+                  </pic:blipFill>
+                  <pic:spPr>
+                    <a:xfrm>
+                      <a:off x="0" y="0"/>
+                      <a:ext cx="5760000" cy="2575058"/>
+                    </a:xfrm>
+                    <a:prstGeom prst="rect">
+                      <a:avLst/>
+                    </a:prstGeom>
+                    <a:ln w="9525">
+                      <a:solidFill>
+                        <a:srgbClr val="D5DEE0"/>
+                      </a:solidFill>
+                    </a:ln>
+                  </pic:spPr>
+                </pic:pic>
+              </a:graphicData>
+            </a:graphic>
+          </wp:inline>
+        </w:drawing>
+      </w:r>
+    </w:p>
+    <w:p>
+      <w:pPr>
+        <w:pStyle w:val="Keterangan"/>
+        <w:spacing w:before="0" w:after="260"/>
+        <w:jc w:val="center"/>
+      </w:pPr>
+      <w:r>
+        <w:rPr>
+          <w:b/>
+          <w:bCs/>
+          <w:i w:val="0"/>
+          <w:iCs w:val="0"/>
+          <w:color w:val="045E6A"/>
+        </w:rPr>
+        <w:t xml:space="preserve">Gambar 5.9</w:t>
+      </w:r>
+      <w:r>
+        <w:t xml:space="preserve"> — Unggah PDF SPD (1), pelaksana sebagai tujuan utama (2), verifikator (3), penandatangan PPK lalu Direktur (4), tanda tangan elektronik ber-QR 3x3 (5), lalu Simpan (6).</w:t>
       </w:r>
     </w:p>
     <w:p>
@@ -5185,7 +5513,7 @@
           <w:iCs w:val="0"/>
           <w:color w:val="045E6A"/>
         </w:rPr>
-        <w:t xml:space="preserve">Gambar 5.8</w:t>
+        <w:t xml:space="preserve">Gambar 5.10</w:t>
       </w:r>
       <w:r>
         <w:t xml:space="preserve"> — Menu Buat Usulan Perjadin (1) membuka pilihan jalur; pilih yang sesuai, misalnya Perjalanan Luar Kota (2).</w:t>
@@ -5276,7 +5604,7 @@
           <w:iCs w:val="0"/>
           <w:color w:val="045E6A"/>
         </w:rPr>
-        <w:t xml:space="preserve">Gambar 5.9</w:t>
+        <w:t xml:space="preserve">Gambar 5.11</w:t>
       </w:r>
       <w:r>
         <w:t xml:space="preserve"> — SPD dari aplikasi (1) mengisi formulir secara otomatis; jalur yang dipilih tampil di kanan atas dan dapat diganti (2).</w:t>
@@ -5367,7 +5695,7 @@
           <w:iCs w:val="0"/>
           <w:color w:val="045E6A"/>
         </w:rPr>
-        <w:t xml:space="preserve">Gambar 5.10</w:t>
+        <w:t xml:space="preserve">Gambar 5.12</w:t>
       </w:r>
       <w:r>
         <w:t xml:space="preserve"> — Surat tugas diambil dari SPD yang dipilih (1); unggah SPD bertanda tangan (2) dan salin nomor naskahnya dari SRIKANDI (3).</w:t>
@@ -5444,7 +5772,7 @@
           <w:iCs w:val="0"/>
           <w:color w:val="045E6A"/>
         </w:rPr>
-        <w:t xml:space="preserve">Gambar 5.11</w:t>
+        <w:t xml:space="preserve">Gambar 5.13</w:t>
       </w:r>
       <w:r>
         <w:t xml:space="preserve"> — Jalur supervisi: kategori luar kota (3) memunculkan catatan (1) dan isian SPD bertanda tangan (2).</w:t>
@@ -5557,7 +5885,7 @@
           <w:iCs w:val="0"/>
           <w:color w:val="045E6A"/>
         </w:rPr>
-        <w:t xml:space="preserve">Gambar 5.12</w:t>
+        <w:t xml:space="preserve">Gambar 5.14</w:t>
       </w:r>
       <w:r>
         <w:t xml:space="preserve"> — Jenis kegiatan (1), kategori perjalanan (2), lokasi dan instansi tujuan (3), serta tanggal yang tersalin dari SPD (4).</w:t>
@@ -5648,7 +5976,7 @@
           <w:iCs w:val="0"/>
           <w:color w:val="045E6A"/>
         </w:rPr>
-        <w:t xml:space="preserve">Gambar 5.13</w:t>
+        <w:t xml:space="preserve">Gambar 5.15</w:t>
       </w:r>
       <w:r>
         <w:t xml:space="preserve"> — Tombol Kirim Pengajuan Perjadin (1), atau Simpan Draft (2) bila belum siap dikirim.</w:t>
@@ -5717,7 +6045,7 @@
           <w:iCs w:val="0"/>
           <w:color w:val="045E6A"/>
         </w:rPr>
-        <w:t xml:space="preserve">Gambar 5.14</w:t>
+        <w:t xml:space="preserve">Gambar 5.16</w:t>
       </w:r>
       <w:r>
         <w:t xml:space="preserve"> — Kotak konfirmasi memuat ringkasan isian (1); tekan Ya, Kirim (2) untuk mengajukan.</w:t>
@@ -5794,7 +6122,7 @@
           <w:iCs w:val="0"/>
           <w:color w:val="045E6A"/>
         </w:rPr>
-        <w:t xml:space="preserve">Gambar 5.15</w:t>
+        <w:t xml:space="preserve">Gambar 5.17</w:t>
       </w:r>
       <w:r>
         <w:t xml:space="preserve"> — Pesan berhasil (1), nomor usulan (2), dan statusnya (3) pada Daftar Usulan Perjadin.</w:t>
@@ -12368,7 +12696,7 @@
         <w:pStyle w:val="Heading2"/>
       </w:pPr>
       <w:r>
-        <w:t xml:space="preserve">Versi 2.5.13 — 6 Oktober 2026</w:t>
+        <w:t xml:space="preserve">Versi 2.5.14 — 6 Oktober 2026</w:t>
       </w:r>
     </w:p>
     <w:p>
@@ -12380,7 +12708,15 @@
         </w:numPr>
       </w:pPr>
       <w:r>
-        <w:t xml:space="preserve">Rincian Saya — Daftar Riil Saya maupun Rincian Biaya Saya — menyebut bendahara yang membayarkan uang muka, pelunasan, dan transport lokal, beserta tautan Lihat bukti bayar.</w:t>
+        <w:t xml:space="preserve">Contoh pengisian Registrasi Naskah Keluar di SRIKANDI untuk SPD dari PANGI, termasuk urutan penandatangan PPK lalu Direktur — di halaman SPD, Panduan Penggunaan, dan bab 5.1 buku ini.</w:t>
+      </w:r>
+    </w:p>
+    <w:p>
+      <w:pPr>
+        <w:pStyle w:val="Heading2"/>
+      </w:pPr>
+      <w:r>
+        <w:t xml:space="preserve">Versi 2.5.13 — 6 Oktober 2026</w:t>
       </w:r>
     </w:p>
     <w:p>
@@ -12392,15 +12728,7 @@
         </w:numPr>
       </w:pPr>
       <w:r>
-        <w:t xml:space="preserve">Administrasi Sistem → Pengguna: nomor handphone (WhatsApp) dapat diisi saat menambah maupun menyunting pengguna.</w:t>
-      </w:r>
-    </w:p>
-    <w:p>
-      <w:pPr>
-        <w:pStyle w:val="Heading2"/>
-      </w:pPr>
-      <w:r>
-        <w:t xml:space="preserve">Versi 2.5.12 — 6 Oktober 2026</w:t>
+        <w:t xml:space="preserve">Rincian Saya — Daftar Riil Saya maupun Rincian Biaya Saya — menyebut bendahara yang membayarkan uang muka, pelunasan, dan transport lokal, beserta tautan Lihat bukti bayar.</w:t>
       </w:r>
     </w:p>
     <w:p>
@@ -12412,7 +12740,7 @@
         </w:numPr>
       </w:pPr>
       <w:r>
-        <w:t xml:space="preserve">Menu Keuangan → Input Rincian Biaya menampilkan navigasi halaman: sebelumnya baris setelah halaman pertama tidak dapat dibuka. Halaman Persetujuan mendapat perbaikan yang sama.</w:t>
+        <w:t xml:space="preserve">Administrasi Sistem → Pengguna: nomor handphone (WhatsApp) dapat diisi saat menambah maupun menyunting pengguna.</w:t>
       </w:r>
     </w:p>
     <w:p>
@@ -12420,7 +12748,7 @@
         <w:pStyle w:val="Heading2"/>
       </w:pPr>
       <w:r>
-        <w:t xml:space="preserve">Versi 2.5.11 — 2 Oktober 2026</w:t>
+        <w:t xml:space="preserve">Versi 2.5.12 — 6 Oktober 2026</w:t>
       </w:r>
     </w:p>
     <w:p>
@@ -12432,7 +12760,15 @@
         </w:numPr>
       </w:pPr>
       <w:r>
-        <w:t xml:space="preserve">Halaman SPD memuat keterangan langkah sesudah SPD disimpan: unduh dokumen berformat SRIKANDI, masukkan ke SRIKANDI untuk ditandatangani PPK dan Direktur, unduh SPD bertanda tangan beserta nomor naskahnya, lalu buat usulan perjadin dengan dokumen dan nomor itu.</w:t>
+        <w:t xml:space="preserve">Menu Keuangan → Input Rincian Biaya menampilkan navigasi halaman: sebelumnya baris setelah halaman pertama tidak dapat dibuka. Halaman Persetujuan mendapat perbaikan yang sama.</w:t>
+      </w:r>
+    </w:p>
+    <w:p>
+      <w:pPr>
+        <w:pStyle w:val="Heading2"/>
+      </w:pPr>
+      <w:r>
+        <w:t xml:space="preserve">Versi 2.5.11 — 2 Oktober 2026</w:t>
       </w:r>
     </w:p>
     <w:p>
@@ -12444,15 +12780,7 @@
         </w:numPr>
       </w:pPr>
       <w:r>
-        <w:t xml:space="preserve">Kolom nomor SPD pada formulir usulan tidak lagi terisi nomor internal PJ-… dari PANGI; keterangannya mengingatkan bahwa yang diisi nomor naskah dari SRIKANDI.</w:t>
-      </w:r>
-    </w:p>
-    <w:p>
-      <w:pPr>
-        <w:pStyle w:val="Heading2"/>
-      </w:pPr>
-      <w:r>
-        <w:t xml:space="preserve">Versi 2.5.10 — 2 Oktober 2026</w:t>
+        <w:t xml:space="preserve">Halaman SPD memuat keterangan langkah sesudah SPD disimpan: unduh dokumen berformat SRIKANDI, masukkan ke SRIKANDI untuk ditandatangani PPK dan Direktur, unduh SPD bertanda tangan beserta nomor naskahnya, lalu buat usulan perjadin dengan dokumen dan nomor itu.</w:t>
       </w:r>
     </w:p>
     <w:p>
@@ -12464,7 +12792,15 @@
         </w:numPr>
       </w:pPr>
       <w:r>
-        <w:t xml:space="preserve">Jejak Audit bersubmenu: Semua Aktivitas, Penghapusan Usulan &amp; SPD — usulan dan SPD yang dihapus beserta isinya, penghapusnya, waktu, dan alamatnya; penghapusan SPD sebelumnya tidak tercatat — dan Nomor Surat.</w:t>
+        <w:t xml:space="preserve">Kolom nomor SPD pada formulir usulan tidak lagi terisi nomor internal PJ-… dari PANGI; keterangannya mengingatkan bahwa yang diisi nomor naskah dari SRIKANDI.</w:t>
+      </w:r>
+    </w:p>
+    <w:p>
+      <w:pPr>
+        <w:pStyle w:val="Heading2"/>
+      </w:pPr>
+      <w:r>
+        <w:t xml:space="preserve">Versi 2.5.10 — 2 Oktober 2026</w:t>
       </w:r>
     </w:p>
     <w:p>
@@ -12476,7 +12812,7 @@
         </w:numPr>
       </w:pPr>
       <w:r>
-        <w:t xml:space="preserve">Nomor Surat mendaftar nomor SPD aplikasi, nomor SPD bertanda tangan, dan nomor surat tugas per bulan dan tahun, dan dapat diekspor ke Excel untuk dicocokkan arsiparis.</w:t>
+        <w:t xml:space="preserve">Jejak Audit bersubmenu: Semua Aktivitas, Penghapusan Usulan &amp; SPD — usulan dan SPD yang dihapus beserta isinya, penghapusnya, waktu, dan alamatnya; penghapusan SPD sebelumnya tidak tercatat — dan Nomor Surat.</w:t>
       </w:r>
     </w:p>
     <w:p>
@@ -12488,15 +12824,7 @@
         </w:numPr>
       </w:pPr>
       <w:r>
-        <w:t xml:space="preserve">Dashboard Eksekutif bersubmenu: Dashboard Utama berisi angka-angka seperti sebelumnya, dan News Feed menyajikan perjalanan dinas serta tindak lanjut yang dijadwalkan sebagai lini masa.</w:t>
-      </w:r>
-    </w:p>
-    <w:p>
-      <w:pPr>
-        <w:pStyle w:val="Heading2"/>
-      </w:pPr>
-      <w:r>
-        <w:t xml:space="preserve">Versi 2.5.9 — 1 Oktober 2026</w:t>
+        <w:t xml:space="preserve">Nomor Surat mendaftar nomor SPD aplikasi, nomor SPD bertanda tangan, dan nomor surat tugas per bulan dan tahun, dan dapat diekspor ke Excel untuk dicocokkan arsiparis.</w:t>
       </w:r>
     </w:p>
     <w:p>
@@ -12508,7 +12836,15 @@
         </w:numPr>
       </w:pPr>
       <w:r>
-        <w:t xml:space="preserve">Sanggahan pelaksana atas rincian biaya kini tampil di halaman Keuangan — tempat nominalnya diperbaiki — lengkap dengan alasan dan waktunya, beserta tombol Kirim Ulang ke Pelaksana. Sebelumnya berkas yang rinciannya disanggah tidak dapat dikirim ulang.</w:t>
+        <w:t xml:space="preserve">Dashboard Eksekutif bersubmenu: Dashboard Utama berisi angka-angka seperti sebelumnya, dan News Feed menyajikan perjalanan dinas serta tindak lanjut yang dijadwalkan sebagai lini masa.</w:t>
+      </w:r>
+    </w:p>
+    <w:p>
+      <w:pPr>
+        <w:pStyle w:val="Heading2"/>
+      </w:pPr>
+      <w:r>
+        <w:t xml:space="preserve">Versi 2.5.9 — 1 Oktober 2026</w:t>
       </w:r>
     </w:p>
     <w:p>
@@ -12520,7 +12856,7 @@
         </w:numPr>
       </w:pPr>
       <w:r>
-        <w:t xml:space="preserve">Mengirim ulang hanya membuka dokumen yang disanggah: dokumen yang sudah ditandatangani pelaksana tetap berlaku beserta kode konfirmasinya, dan pemberitahuannya hanya menyebut dokumen yang perlu disikapi lagi.</w:t>
+        <w:t xml:space="preserve">Sanggahan pelaksana atas rincian biaya kini tampil di halaman Keuangan — tempat nominalnya diperbaiki — lengkap dengan alasan dan waktunya, beserta tombol Kirim Ulang ke Pelaksana. Sebelumnya berkas yang rinciannya disanggah tidak dapat dikirim ulang.</w:t>
       </w:r>
     </w:p>
     <w:p>
@@ -12532,15 +12868,7 @@
         </w:numPr>
       </w:pPr>
       <w:r>
-        <w:t xml:space="preserve">Halaman Detail Keuangan kini menampilkan pesan hasil tiap tindakan — komponen tersimpan, berkas terkirim, atau alasan tertahan — dan menyebut tujuan perjalanan pada kepalanya. Pemberitahuan sanggahan kepada tim keuangan langsung membuka halaman ini.</w:t>
-      </w:r>
-    </w:p>
-    <w:p>
-      <w:pPr>
-        <w:pStyle w:val="Heading2"/>
-      </w:pPr>
-      <w:r>
-        <w:t xml:space="preserve">Versi 2.5.8 — 1 Oktober 2026</w:t>
+        <w:t xml:space="preserve">Mengirim ulang hanya membuka dokumen yang disanggah: dokumen yang sudah ditandatangani pelaksana tetap berlaku beserta kode konfirmasinya, dan pemberitahuannya hanya menyebut dokumen yang perlu disikapi lagi.</w:t>
       </w:r>
     </w:p>
     <w:p>
@@ -12552,7 +12880,15 @@
         </w:numPr>
       </w:pPr>
       <w:r>
-        <w:t xml:space="preserve">Buku panduan bersampul baru dengan warna Kemenkes. Bab 5.1 dan 5.2 kini bergambar: setiap langkah membuat SPD sampai mengajukan perjadin disertai tangkapan layar bertanda nomor.</w:t>
+        <w:t xml:space="preserve">Halaman Detail Keuangan kini menampilkan pesan hasil tiap tindakan — komponen tersimpan, berkas terkirim, atau alasan tertahan — dan menyebut tujuan perjalanan pada kepalanya. Pemberitahuan sanggahan kepada tim keuangan langsung membuka halaman ini.</w:t>
+      </w:r>
+    </w:p>
+    <w:p>
+      <w:pPr>
+        <w:pStyle w:val="Heading2"/>
+      </w:pPr>
+      <w:r>
+        <w:t xml:space="preserve">Versi 2.5.8 — 1 Oktober 2026</w:t>
       </w:r>
     </w:p>
     <w:p>
@@ -12564,7 +12900,7 @@
         </w:numPr>
       </w:pPr>
       <w:r>
-        <w:t xml:space="preserve">Kotak konfirmasi sebelum mengirim pengajuan kini benar-benar menampilkan tujuan, tanggal, dan nomor SPD yang diisi — sebelumnya selalu tertulis "—".</w:t>
+        <w:t xml:space="preserve">Buku panduan bersampul baru dengan warna Kemenkes. Bab 5.1 dan 5.2 kini bergambar: setiap langkah membuat SPD sampai mengajukan perjadin disertai tangkapan layar bertanda nomor.</w:t>
       </w:r>
     </w:p>
     <w:p>
@@ -12576,15 +12912,7 @@
         </w:numPr>
       </w:pPr>
       <w:r>
-        <w:t xml:space="preserve">Menu Panduan Penggunaan memuat tangkapan layar yang sama, dan buku lengkapnya dapat diunduh dalam format PDF maupun Word.</w:t>
-      </w:r>
-    </w:p>
-    <w:p>
-      <w:pPr>
-        <w:pStyle w:val="Heading2"/>
-      </w:pPr>
-      <w:r>
-        <w:t xml:space="preserve">Versi 2.5.7 — 1 Oktober 2026</w:t>
+        <w:t xml:space="preserve">Kotak konfirmasi sebelum mengirim pengajuan kini benar-benar menampilkan tujuan, tanggal, dan nomor SPD yang diisi — sebelumnya selalu tertulis "—".</w:t>
       </w:r>
     </w:p>
     <w:p>
@@ -12596,7 +12924,15 @@
         </w:numPr>
       </w:pPr>
       <w:r>
-        <w:t xml:space="preserve">Supervisi kerja praktek / magang dibedakan menurut tujuannya: supervisi ke luar kota tetap menerbitkan SPD — berkas SPD bertanda tangan beserta nomornya wajib dilampirkan — sedangkan supervisi di dalam kota cukup surat tugas.</w:t>
+        <w:t xml:space="preserve">Menu Panduan Penggunaan memuat tangkapan layar yang sama, dan buku lengkapnya dapat diunduh dalam format PDF maupun Word.</w:t>
+      </w:r>
+    </w:p>
+    <w:p>
+      <w:pPr>
+        <w:pStyle w:val="Heading2"/>
+      </w:pPr>
+      <w:r>
+        <w:t xml:space="preserve">Versi 2.5.7 — 1 Oktober 2026</w:t>
       </w:r>
     </w:p>
     <w:p>
@@ -12608,15 +12944,7 @@
         </w:numPr>
       </w:pPr>
       <w:r>
-        <w:t xml:space="preserve">Isian SPD pada formulir usulan muncul dan menghilang sendiri mengikuti kategori yang dipilih; checklist kelengkapan dan formulir Dokumen Perdin ikut menyesuaikan.</w:t>
-      </w:r>
-    </w:p>
-    <w:p>
-      <w:pPr>
-        <w:pStyle w:val="Heading2"/>
-      </w:pPr>
-      <w:r>
-        <w:t xml:space="preserve">Versi 2.5.6 — 1 Oktober 2026</w:t>
+        <w:t xml:space="preserve">Supervisi kerja praktek / magang dibedakan menurut tujuannya: supervisi ke luar kota tetap menerbitkan SPD — berkas SPD bertanda tangan beserta nomornya wajib dilampirkan — sedangkan supervisi di dalam kota cukup surat tugas.</w:t>
       </w:r>
     </w:p>
     <w:p>
@@ -12628,7 +12956,7 @@
         </w:numPr>
       </w:pPr>
       <w:r>
-        <w:t xml:space="preserve">Berkas Pertanggungjawaban (submenu Administrasi Sistem): berkas yang ditagih sesudah perjalanan dipilih sendiri untuk tiap jalur pengajuan, dan berlaku serentak pada formulir dokumen, checklist, serta penagihan.</w:t>
+        <w:t xml:space="preserve">Isian SPD pada formulir usulan muncul dan menghilang sendiri mengikuti kategori yang dipilih; checklist kelengkapan dan formulir Dokumen Perdin ikut menyesuaikan.</w:t>
       </w:r>
     </w:p>
     <w:p>
@@ -12636,7 +12964,7 @@
         <w:pStyle w:val="Heading2"/>
       </w:pPr>
       <w:r>
-        <w:t xml:space="preserve">Versi 2.5.5 — 1 Oktober 2026</w:t>
+        <w:t xml:space="preserve">Versi 2.5.6 — 1 Oktober 2026</w:t>
       </w:r>
     </w:p>
     <w:p>
@@ -12648,7 +12976,15 @@
         </w:numPr>
       </w:pPr>
       <w:r>
-        <w:t xml:space="preserve">Pengajuan perjadin dimulai dengan memilih jalur: dalam kota, luar kota, atau supervisi kerja praktek / magang. Jalur itu menyaring kategori perjalanan dinas dari Master Data.</w:t>
+        <w:t xml:space="preserve">Berkas Pertanggungjawaban (submenu Administrasi Sistem): berkas yang ditagih sesudah perjalanan dipilih sendiri untuk tiap jalur pengajuan, dan berlaku serentak pada formulir dokumen, checklist, serta penagihan.</w:t>
+      </w:r>
+    </w:p>
+    <w:p>
+      <w:pPr>
+        <w:pStyle w:val="Heading2"/>
+      </w:pPr>
+      <w:r>
+        <w:t xml:space="preserve">Versi 2.5.5 — 1 Oktober 2026</w:t>
       </w:r>
     </w:p>
     <w:p>
@@ -12660,7 +12996,7 @@
         </w:numPr>
       </w:pPr>
       <w:r>
-        <w:t xml:space="preserve">Jalur supervisi kerja praktek / magang tidak memakai Surat Perjalanan Dinas: cukup surat tugas beserta nomornya, dan jenis kegiatannya terisi sendiri.</w:t>
+        <w:t xml:space="preserve">Pengajuan perjadin dimulai dengan memilih jalur: dalam kota, luar kota, atau supervisi kerja praktek / magang. Jalur itu menyaring kategori perjalanan dinas dari Master Data.</w:t>
       </w:r>
     </w:p>
     <w:p>
@@ -12672,7 +13008,7 @@
         </w:numPr>
       </w:pPr>
       <w:r>
-        <w:t xml:space="preserve">Kaki halaman SPD mengikuti cetakan terbaru — lambang Garuda Sertifikasi dilepas, alamat verifikasi menjadi tte.komdigi.go.id — dan butir V tidak lagi memuat penanda QR.</w:t>
+        <w:t xml:space="preserve">Jalur supervisi kerja praktek / magang tidak memakai Surat Perjalanan Dinas: cukup surat tugas beserta nomornya, dan jenis kegiatannya terisi sendiri.</w:t>
       </w:r>
     </w:p>
     <w:p>
@@ -12684,15 +13020,7 @@
         </w:numPr>
       </w:pPr>
       <w:r>
-        <w:t xml:space="preserve">Daftar Usulan Perjadin menyebut pelaksana perjalanan pada kolom pertama, menggantikan kolom Pemohon yang selalu kosong.</w:t>
-      </w:r>
-    </w:p>
-    <w:p>
-      <w:pPr>
-        <w:pStyle w:val="Heading2"/>
-      </w:pPr>
-      <w:r>
-        <w:t xml:space="preserve">Versi 2.5.4 — 30 September 2026</w:t>
+        <w:t xml:space="preserve">Kaki halaman SPD mengikuti cetakan terbaru — lambang Garuda Sertifikasi dilepas, alamat verifikasi menjadi tte.komdigi.go.id — dan butir V tidak lagi memuat penanda QR.</w:t>
       </w:r>
     </w:p>
     <w:p>
@@ -12704,7 +13032,15 @@
         </w:numPr>
       </w:pPr>
       <w:r>
-        <w:t xml:space="preserve">Dokumen Output (submenu Administrasi Sistem): tampilan empat dokumen cetak diatur dari aplikasi — ukuran kertas dan huruf, elemen yang ikut tercetak, serta teks bakunya. Tiap perubahan tercatat pada jejak audit dan dapat dikembalikan ke bawaan.</w:t>
+        <w:t xml:space="preserve">Daftar Usulan Perjadin menyebut pelaksana perjalanan pada kolom pertama, menggantikan kolom Pemohon yang selalu kosong.</w:t>
+      </w:r>
+    </w:p>
+    <w:p>
+      <w:pPr>
+        <w:pStyle w:val="Heading2"/>
+      </w:pPr>
+      <w:r>
+        <w:t xml:space="preserve">Versi 2.5.4 — 30 September 2026</w:t>
       </w:r>
     </w:p>
     <w:p>
@@ -12716,7 +13052,7 @@
         </w:numPr>
       </w:pPr>
       <w:r>
-        <w:t xml:space="preserve">Dokumen Output memuat pratinjau dokumen contoh yang ikut berubah mengikuti centangan elemen, lengkap dengan tombol buka di tab baru dan unduh contoh PDF.</w:t>
+        <w:t xml:space="preserve">Dokumen Output (submenu Administrasi Sistem): tampilan empat dokumen cetak diatur dari aplikasi — ukuran kertas dan huruf, elemen yang ikut tercetak, serta teks bakunya. Tiap perubahan tercatat pada jejak audit dan dapat dikembalikan ke bawaan.</w:t>
       </w:r>
     </w:p>
     <w:p>
@@ -12728,15 +13064,7 @@
         </w:numPr>
       </w:pPr>
       <w:r>
-        <w:t xml:space="preserve">Penanda tanda tangan elektronik SRIKANDI dan nomor naskah sengaja tidak dapat dimatikan, supaya surat tetap dapat ditandatangani secara elektronik.</w:t>
-      </w:r>
-    </w:p>
-    <w:p>
-      <w:pPr>
-        <w:pStyle w:val="Heading2"/>
-      </w:pPr>
-      <w:r>
-        <w:t xml:space="preserve">Versi 2.5.3 — 21 September 2026</w:t>
+        <w:t xml:space="preserve">Dokumen Output memuat pratinjau dokumen contoh yang ikut berubah mengikuti centangan elemen, lengkap dengan tombol buka di tab baru dan unduh contoh PDF.</w:t>
       </w:r>
     </w:p>
     <w:p>
@@ -12748,7 +13076,15 @@
         </w:numPr>
       </w:pPr>
       <w:r>
-        <w:t xml:space="preserve">Formulir SPD: surat tugas dilampirkan sejak SPD dibuat — nomor dan berkasnya diisi pada kartu Surat Tugas (tidak wajib). Usulan perjadin yang memilih SPD itu mengambil keduanya secara otomatis; berkas surat tugas tidak diunggah lagi dan nomornya tidak disalin ulang.</w:t>
+        <w:t xml:space="preserve">Penanda tanda tangan elektronik SRIKANDI dan nomor naskah sengaja tidak dapat dimatikan, supaya surat tetap dapat ditandatangani secara elektronik.</w:t>
+      </w:r>
+    </w:p>
+    <w:p>
+      <w:pPr>
+        <w:pStyle w:val="Heading2"/>
+      </w:pPr>
+      <w:r>
+        <w:t xml:space="preserve">Versi 2.5.3 — 21 September 2026</w:t>
       </w:r>
     </w:p>
     <w:p>
@@ -12760,7 +13096,7 @@
         </w:numPr>
       </w:pPr>
       <w:r>
-        <w:t xml:space="preserve">Formulir SPD: kolom Akun pembebanan dihapus — akun diisi PPK saat verifikasi dan tanda tangan, bukan oleh pembuat SPD.</w:t>
+        <w:t xml:space="preserve">Formulir SPD: surat tugas dilampirkan sejak SPD dibuat — nomor dan berkasnya diisi pada kartu Surat Tugas (tidak wajib). Usulan perjadin yang memilih SPD itu mengambil keduanya secara otomatis; berkas surat tugas tidak diunggah lagi dan nomornya tidak disalin ulang.</w:t>
       </w:r>
     </w:p>
     <w:p>
@@ -12772,7 +13108,7 @@
         </w:numPr>
       </w:pPr>
       <w:r>
-        <w:t xml:space="preserve">Berkas pertanggungjawaban: unggahan dan ceklist "Kuitansi" kini disebut "Kuitansi penyelenggara / hotel" agar jelas kuitansi mana yang dimaksud — dari penyelenggara kegiatan atau dari hotel tempat menginap.</w:t>
+        <w:t xml:space="preserve">Formulir SPD: kolom Akun pembebanan dihapus — akun diisi PPK saat verifikasi dan tanda tangan, bukan oleh pembuat SPD.</w:t>
       </w:r>
     </w:p>
     <w:p>
@@ -12784,7 +13120,7 @@
         </w:numPr>
       </w:pPr>
       <w:r>
-        <w:t xml:space="preserve">Jadwal Perjalanan kini bermenu: Jadwal Keberangkatan, Peta Dalam Kota &amp; Sekitarnya, dan Peta Luar Kota. Peta memperlihatkan kota-kota tujuan pegawai beserta jumlah perjalanan dan orang yang berangkat; klik penanda untuk rinciannya, saring per tahun. Dalam kota &amp; sekitarnya berarti tujuan di Sulawesi Utara. Kota-kota besar sudah dikenal sistem; kota lain diberi lintang-bujur pada Master Data → Lokasi Tujuan.</w:t>
+        <w:t xml:space="preserve">Berkas pertanggungjawaban: unggahan dan ceklist "Kuitansi" kini disebut "Kuitansi penyelenggara / hotel" agar jelas kuitansi mana yang dimaksud — dari penyelenggara kegiatan atau dari hotel tempat menginap.</w:t>
       </w:r>
     </w:p>
     <w:p>
@@ -12796,7 +13132,7 @@
         </w:numPr>
       </w:pPr>
       <w:r>
-        <w:t xml:space="preserve">Peran baru Mahasiswa, dapat dipilih saat membuat akun atau diimpor lewat kolom role bernilai "mahasiswa".</w:t>
+        <w:t xml:space="preserve">Jadwal Perjalanan kini bermenu: Jadwal Keberangkatan, Peta Dalam Kota &amp; Sekitarnya, dan Peta Luar Kota. Peta memperlihatkan kota-kota tujuan pegawai beserta jumlah perjalanan dan orang yang berangkat; klik penanda untuk rinciannya, saring per tahun. Dalam kota &amp; sekitarnya berarti tujuan di Sulawesi Utara. Kota-kota besar sudah dikenal sistem; kota lain diberi lintang-bujur pada Master Data → Lokasi Tujuan.</w:t>
       </w:r>
     </w:p>
     <w:p>
@@ -12808,7 +13144,7 @@
         </w:numPr>
       </w:pPr>
       <w:r>
-        <w:t xml:space="preserve">Peran &amp; Hak Akses (submenu Administrasi Sistem, super administrator): menambah peran baru dan mengatur, per menu, kemampuan yang boleh dilihat, diubah, dan dihapus tiap peran — termasuk peran bawaan. Perubahan berlaku seketika dan tercatat pada jejak audit; Super Administrator selalu memegang seluruh akses. Hak menghapus master data dan menghapus pengguna kini kemampuan tersendiri.</w:t>
+        <w:t xml:space="preserve">Peran baru Mahasiswa, dapat dipilih saat membuat akun atau diimpor lewat kolom role bernilai "mahasiswa".</w:t>
       </w:r>
     </w:p>
     <w:p>
@@ -12820,15 +13156,7 @@
         </w:numPr>
       </w:pPr>
       <w:r>
-        <w:t xml:space="preserve">Pegawai eksternal, mahasiswa, dan outsourcing: modul perjalanan dinasnya dikembangkan terpisah. Sementara itu, setelah masuk mereka melihat halaman pemberitahuan "fitur masih dikembangkan" dengan tombol keluar; menu lain belum dapat dibuka.</w:t>
-      </w:r>
-    </w:p>
-    <w:p>
-      <w:pPr>
-        <w:pStyle w:val="Heading2"/>
-      </w:pPr>
-      <w:r>
-        <w:t xml:space="preserve">Versi 2.5.2 — 15 September 2026</w:t>
+        <w:t xml:space="preserve">Peran &amp; Hak Akses (submenu Administrasi Sistem, super administrator): menambah peran baru dan mengatur, per menu, kemampuan yang boleh dilihat, diubah, dan dihapus tiap peran — termasuk peran bawaan. Perubahan berlaku seketika dan tercatat pada jejak audit; Super Administrator selalu memegang seluruh akses. Hak menghapus master data dan menghapus pengguna kini kemampuan tersendiri.</w:t>
       </w:r>
     </w:p>
     <w:p>
@@ -12840,7 +13168,15 @@
         </w:numPr>
       </w:pPr>
       <w:r>
-        <w:t xml:space="preserve">Impor pengguna: sel yang kosong pada berkas CSV tidak lagi menghapus surel, nomor HP, dan rekening yang sudah diisi pengguna, sehingga data pegawai aman diimpor ulang untuk menambah orang. Wakil Direktur II ditambahkan ke data pegawai bawaan.</w:t>
+        <w:t xml:space="preserve">Pegawai eksternal, mahasiswa, dan outsourcing: modul perjalanan dinasnya dikembangkan terpisah. Sementara itu, setelah masuk mereka melihat halaman pemberitahuan "fitur masih dikembangkan" dengan tombol keluar; menu lain belum dapat dibuka.</w:t>
+      </w:r>
+    </w:p>
+    <w:p>
+      <w:pPr>
+        <w:pStyle w:val="Heading2"/>
+      </w:pPr>
+      <w:r>
+        <w:t xml:space="preserve">Versi 2.5.2 — 15 September 2026</w:t>
       </w:r>
     </w:p>
     <w:p>
@@ -12852,7 +13188,7 @@
         </w:numPr>
       </w:pPr>
       <w:r>
-        <w:t xml:space="preserve">Integrasi Data (submenu Administrasi Sistem): token API dashboard eksekutif dibuat, diganti, atau dicabut langsung dari aplikasi tanpa menyunting .env di server, lengkap dengan alamat dan jalur API-nya; token yang berlaku dapat ditampilkan dan disalin.</w:t>
+        <w:t xml:space="preserve">Impor pengguna: sel yang kosong pada berkas CSV tidak lagi menghapus surel, nomor HP, dan rekening yang sudah diisi pengguna, sehingga data pegawai aman diimpor ulang untuk menambah orang. Wakil Direktur II ditambahkan ke data pegawai bawaan.</w:t>
       </w:r>
     </w:p>
     <w:p>
@@ -12864,7 +13200,7 @@
         </w:numPr>
       </w:pPr>
       <w:r>
-        <w:t xml:space="preserve">Integrasi Data: pemantauan setiap permintaan API yang masuk (alamat IP, jalur, token yang dibawa — hanya ujung-ujungnya — diterima atau ditolak) dan pengiriman data dashboard eksekutif terjadwal (tiap jam, harian, atau mingguan) ke aplikasi tujuan memakai token, lengkap dengan riwayat pengirimannya dan tombol Kirim Sekarang.</w:t>
+        <w:t xml:space="preserve">Integrasi Data (submenu Administrasi Sistem): token API dashboard eksekutif dibuat, diganti, atau dicabut langsung dari aplikasi tanpa menyunting .env di server, lengkap dengan alamat dan jalur API-nya; token yang berlaku dapat ditampilkan dan disalin.</w:t>
       </w:r>
     </w:p>
     <w:p>
@@ -12876,7 +13212,7 @@
         </w:numPr>
       </w:pPr>
       <w:r>
-        <w:t xml:space="preserve">Pengaturan Sistem: kunci API Anthropic untuk Wawasan AI dan agen tanya-jawab Dashboard Eksekutif dipasang, diganti, atau dihapus dari aplikasi — tersimpan terenkripsi, tanpa menyunting .env di server.</w:t>
+        <w:t xml:space="preserve">Integrasi Data: pemantauan setiap permintaan API yang masuk (alamat IP, jalur, token yang dibawa — hanya ujung-ujungnya — diterima atau ditolak) dan pengiriman data dashboard eksekutif terjadwal (tiap jam, harian, atau mingguan) ke aplikasi tujuan memakai token, lengkap dengan riwayat pengirimannya dan tombol Kirim Sekarang.</w:t>
       </w:r>
     </w:p>
     <w:p>
@@ -12888,7 +13224,7 @@
         </w:numPr>
       </w:pPr>
       <w:r>
-        <w:t xml:space="preserve">Membuka atau mengunci tanggal dikeluarkan SPD serta mengelola token API dan kunci AI kini melalui kotak konfirmasi.</w:t>
+        <w:t xml:space="preserve">Pengaturan Sistem: kunci API Anthropic untuk Wawasan AI dan agen tanya-jawab Dashboard Eksekutif dipasang, diganti, atau dihapus dari aplikasi — tersimpan terenkripsi, tanpa menyunting .env di server.</w:t>
       </w:r>
     </w:p>
     <w:p>
@@ -12900,7 +13236,7 @@
         </w:numPr>
       </w:pPr>
       <w:r>
-        <w:t xml:space="preserve">Nomor SPD pada usulan bersifat unik: nomor yang sudah dipakai usulan lain — milik siapa pun — ditolak saat mengajukan maupun menyunting, dengan pesan yang menyebut usulan mana yang memakainya, sehingga tidak ada usulan ganda atas SPD yang sama.</w:t>
+        <w:t xml:space="preserve">Membuka atau mengunci tanggal dikeluarkan SPD serta mengelola token API dan kunci AI kini melalui kotak konfirmasi.</w:t>
       </w:r>
     </w:p>
     <w:p>
@@ -12912,7 +13248,7 @@
         </w:numPr>
       </w:pPr>
       <w:r>
-        <w:t xml:space="preserve">Usulan perjadin tidak lagi mensyaratkan SPD dibuat lewat aplikasi lebih dulu: formulir usulan terbuka bagi semua, memilih SPD dari aplikasi hanya untuk mengisi otomatis. SPD bertanda tangan beserta nomornya tetap wajib diunggah sebagai dasar persetujuan PPK.</w:t>
+        <w:t xml:space="preserve">Nomor SPD pada usulan bersifat unik: nomor yang sudah dipakai usulan lain — milik siapa pun — ditolak saat mengajukan maupun menyunting, dengan pesan yang menyebut usulan mana yang memakainya, sehingga tidak ada usulan ganda atas SPD yang sama.</w:t>
       </w:r>
     </w:p>
     <w:p>
@@ -12924,15 +13260,7 @@
         </w:numPr>
       </w:pPr>
       <w:r>
-        <w:t xml:space="preserve">Rincian Saya: tiap berkas memuat panel Pemantauan Berkas — status seluruh tanda tangan (tim keuangan, pelaksana, PPK, konfirmasi Direktur, daftar nominatif) dan status pembayaran (uang muka, pelunasan, transport lokal) beserta tanggal dan kodenya.</w:t>
-      </w:r>
-    </w:p>
-    <w:p>
-      <w:pPr>
-        <w:pStyle w:val="Heading2"/>
-      </w:pPr>
-      <w:r>
-        <w:t xml:space="preserve">Versi 2.5.1 — 15 September 2026</w:t>
+        <w:t xml:space="preserve">Usulan perjadin tidak lagi mensyaratkan SPD dibuat lewat aplikasi lebih dulu: formulir usulan terbuka bagi semua, memilih SPD dari aplikasi hanya untuk mengisi otomatis. SPD bertanda tangan beserta nomornya tetap wajib diunggah sebagai dasar persetujuan PPK.</w:t>
       </w:r>
     </w:p>
     <w:p>
@@ -12944,7 +13272,15 @@
         </w:numPr>
       </w:pPr>
       <w:r>
-        <w:t xml:space="preserve">Administrasi Sistem: super administrator dapat membuka atau mengunci tanggal dikeluarkan SPD bagi seluruh peran untuk kasus tanggal mundur (backdate); bawaannya terkunci, tiap perubahan tercatat pada jejak audit.</w:t>
+        <w:t xml:space="preserve">Rincian Saya: tiap berkas memuat panel Pemantauan Berkas — status seluruh tanda tangan (tim keuangan, pelaksana, PPK, konfirmasi Direktur, daftar nominatif) dan status pembayaran (uang muka, pelunasan, transport lokal) beserta tanggal dan kodenya.</w:t>
+      </w:r>
+    </w:p>
+    <w:p>
+      <w:pPr>
+        <w:pStyle w:val="Heading2"/>
+      </w:pPr>
+      <w:r>
+        <w:t xml:space="preserve">Versi 2.5.1 — 15 September 2026</w:t>
       </w:r>
     </w:p>
     <w:p>
@@ -12956,15 +13292,7 @@
         </w:numPr>
       </w:pPr>
       <w:r>
-        <w:t xml:space="preserve">Administrasi Sistem dipecah menjadi tiga halaman bermenu — Pengguna, Impor &amp; Ekspor, Pengaturan Sistem — dengan submenu di sidebar dan navigasi di kepala halaman.</w:t>
-      </w:r>
-    </w:p>
-    <w:p>
-      <w:pPr>
-        <w:pStyle w:val="Heading2"/>
-      </w:pPr>
-      <w:r>
-        <w:t xml:space="preserve">Versi 2.5 — 12 September 2026</w:t>
+        <w:t xml:space="preserve">Administrasi Sistem: super administrator dapat membuka atau mengunci tanggal dikeluarkan SPD bagi seluruh peran untuk kasus tanggal mundur (backdate); bawaannya terkunci, tiap perubahan tercatat pada jejak audit.</w:t>
       </w:r>
     </w:p>
     <w:p>
@@ -12976,7 +13304,15 @@
         </w:numPr>
       </w:pPr>
       <w:r>
-        <w:t xml:space="preserve">Usulan wajib melampirkan SPD bertanda tangan beserta nomornya; persetujuan PPK tercatat otomatis. Pengajuan berkelompok dan tombol Salin dihapus.</w:t>
+        <w:t xml:space="preserve">Administrasi Sistem dipecah menjadi tiga halaman bermenu — Pengguna, Impor &amp; Ekspor, Pengaturan Sistem — dengan submenu di sidebar dan navigasi di kepala halaman.</w:t>
+      </w:r>
+    </w:p>
+    <w:p>
+      <w:pPr>
+        <w:pStyle w:val="Heading2"/>
+      </w:pPr>
+      <w:r>
+        <w:t xml:space="preserve">Versi 2.5 — 12 September 2026</w:t>
       </w:r>
     </w:p>
     <w:p>
@@ -12988,7 +13324,7 @@
         </w:numPr>
       </w:pPr>
       <w:r>
-        <w:t xml:space="preserve">Menu Laporan Perjadin bagi pimpinan: daftar laporan, status konfirmasi, tindak lanjut. Laporan dikirim ke pimpinan saat disimpan dan dikonfirmasi Direktur lewat QR; tempat kegiatan per hari.</w:t>
+        <w:t xml:space="preserve">Usulan wajib melampirkan SPD bertanda tangan beserta nomornya; persetujuan PPK tercatat otomatis. Pengajuan berkelompok dan tombol Salin dihapus.</w:t>
       </w:r>
     </w:p>
     <w:p>
@@ -13000,7 +13336,7 @@
         </w:numPr>
       </w:pPr>
       <w:r>
-        <w:t xml:space="preserve">Pelunasan hanya menunggu konfirmasi laporan oleh Direktur — bukan tanda tangan PPK maupun daftar nominatif.</w:t>
+        <w:t xml:space="preserve">Menu Laporan Perjadin bagi pimpinan: daftar laporan, status konfirmasi, tindak lanjut. Laporan dikirim ke pimpinan saat disimpan dan dikonfirmasi Direktur lewat QR; tempat kegiatan per hari.</w:t>
       </w:r>
     </w:p>
     <w:p>
@@ -13012,7 +13348,7 @@
         </w:numPr>
       </w:pPr>
       <w:r>
-        <w:t xml:space="preserve">Daftar nominatif terbit per surat tugas begitu satu pelaksana tuntas; yang belum tercantum disebut dan bertambah sendiri. List Daftar Nominatif memuat seluruh daftar beserta status tanda tangan tiap pelaksana.</w:t>
+        <w:t xml:space="preserve">Pelunasan hanya menunggu konfirmasi laporan oleh Direktur — bukan tanda tangan PPK maupun daftar nominatif.</w:t>
       </w:r>
     </w:p>
     <w:p>
@@ -13024,7 +13360,7 @@
         </w:numPr>
       </w:pPr>
       <w:r>
-        <w:t xml:space="preserve">Berkas terkirim otomatis ke pelaksana setelah seluruh validasi rampung; status Sudah Dicek Tim Keuangan; tombol tanda tangan pelaksana tetap ada setelah masa sanggah; popup konfirmasi pada validasi dan pencabutannya.</w:t>
+        <w:t xml:space="preserve">Daftar nominatif terbit per surat tugas begitu satu pelaksana tuntas; yang belum tercantum disebut dan bertambah sendiri. List Daftar Nominatif memuat seluruh daftar beserta status tanda tangan tiap pelaksana.</w:t>
       </w:r>
     </w:p>
     <w:p>
@@ -13036,7 +13372,7 @@
         </w:numPr>
       </w:pPr>
       <w:r>
-        <w:t xml:space="preserve">Biaya penyelenggaraan: ditanya ada atau tidak; bila ada, nominal, bukti bayar, dan nomor invoice; tercetak di bawah uang penginapan.</w:t>
+        <w:t xml:space="preserve">Berkas terkirim otomatis ke pelaksana setelah seluruh validasi rampung; status Sudah Dicek Tim Keuangan; tombol tanda tangan pelaksana tetap ada setelah masa sanggah; popup konfirmasi pada validasi dan pencabutannya.</w:t>
       </w:r>
     </w:p>
     <w:p>
@@ -13048,7 +13384,7 @@
         </w:numPr>
       </w:pPr>
       <w:r>
-        <w:t xml:space="preserve">Tiket membawa invoice; nota transport lokal hanya untuk ruas bernominal (transport lokal boleh tidak ada); dalam kota satu baris transport lokal; checklist kelengkapan mengikuti formulir.</w:t>
+        <w:t xml:space="preserve">Biaya penyelenggaraan: ditanya ada atau tidak; bila ada, nominal, bukti bayar, dan nomor invoice; tercetak di bawah uang penginapan.</w:t>
       </w:r>
     </w:p>
     <w:p>
@@ -13060,7 +13396,7 @@
         </w:numPr>
       </w:pPr>
       <w:r>
-        <w:t xml:space="preserve">Verifikasi PPK (rincian, daftar riil, nominatif) dan Arsip Rincian Lengkap dikelompokkan per bulan dan tahun; arsip tidak lagi menunggu nominatif; menu Keuangan bagi PPK dalam mode lihat saja.</w:t>
+        <w:t xml:space="preserve">Tiket membawa invoice; nota transport lokal hanya untuk ruas bernominal (transport lokal boleh tidak ada); dalam kota satu baris transport lokal; checklist kelengkapan mengikuti formulir.</w:t>
       </w:r>
     </w:p>
     <w:p>
@@ -13072,7 +13408,7 @@
         </w:numPr>
       </w:pPr>
       <w:r>
-        <w:t xml:space="preserve">Pembatalan penggantian transport lokal dengan alasan; nominatif memuat QR dan kode verifikasi PPK.</w:t>
+        <w:t xml:space="preserve">Verifikasi PPK (rincian, daftar riil, nominatif) dan Arsip Rincian Lengkap dikelompokkan per bulan dan tahun; arsip tidak lagi menunggu nominatif; menu Keuangan bagi PPK dalam mode lihat saja.</w:t>
       </w:r>
     </w:p>
     <w:p>
@@ -13084,7 +13420,7 @@
         </w:numPr>
       </w:pPr>
       <w:r>
-        <w:t xml:space="preserve">Seluruh dokumen cetak berukuran folio dan dirapikan: usulan sebagai dokumen resmi berkop, rincian satu halaman, tanggal berbahasa Indonesia, WITA.</w:t>
+        <w:t xml:space="preserve">Pembatalan penggantian transport lokal dengan alasan; nominatif memuat QR dan kode verifikasi PPK.</w:t>
       </w:r>
     </w:p>
     <w:p>
@@ -13096,15 +13432,7 @@
         </w:numPr>
       </w:pPr>
       <w:r>
-        <w:t xml:space="preserve">Pelacakan berkas: sepuluh tonggak dengan lama hari antar tahap; versi aplikasi tertera di halaman masuk.</w:t>
-      </w:r>
-    </w:p>
-    <w:p>
-      <w:pPr>
-        <w:pStyle w:val="Heading2"/>
-      </w:pPr>
-      <w:r>
-        <w:t xml:space="preserve">Versi 2.4 — 5 September 2026</w:t>
+        <w:t xml:space="preserve">Seluruh dokumen cetak berukuran folio dan dirapikan: usulan sebagai dokumen resmi berkop, rincian satu halaman, tanggal berbahasa Indonesia, WITA.</w:t>
       </w:r>
     </w:p>
     <w:p>
@@ -13116,6 +13444,26 @@
         </w:numPr>
       </w:pPr>
       <w:r>
+        <w:t xml:space="preserve">Pelacakan berkas: sepuluh tonggak dengan lama hari antar tahap; versi aplikasi tertera di halaman masuk.</w:t>
+      </w:r>
+    </w:p>
+    <w:p>
+      <w:pPr>
+        <w:pStyle w:val="Heading2"/>
+      </w:pPr>
+      <w:r>
+        <w:t xml:space="preserve">Versi 2.4 — 5 September 2026</w:t>
+      </w:r>
+    </w:p>
+    <w:p>
+      <w:pPr>
+        <w:pStyle w:val="ListParagraph"/>
+        <w:numPr>
+          <w:ilvl w:val="0"/>
+          <w:numId w:val="2"/>
+        </w:numPr>
+      </w:pPr>
+      <w:r>
         <w:t xml:space="preserve">Rilis dasar versi 2: Surat Perjalanan Dinas dengan nomor unik dan pengikut, pertanggungjawaban per pelaksana (tiket, nota, bill hotel, laporan), rincian biaya dan daftar riil dengan dua jalur tanda tangan, daftar nominatif, pembayaran beserta riwayatnya, pelacakan berkas, dan saluran bantuan.</w:t>
       </w:r>
     </w:p>
@@ -13137,7 +13485,7 @@
           <w:sz w:val="17"/>
           <w:szCs w:val="17"/>
         </w:rPr>
-        <w:t xml:space="preserve">Buku Panduan PANGI v2.5 — Politeknik Kesehatan Kemenkes Manado. Isi buku ini mengikuti sistem sebagaimana berjalan pada 6 Oktober 2026 (versi 2.5.13); bila tampilan di layar berbeda, yang berlaku adalah sistemnya, dan mohon laporkan selisihnya lewat menu Bantuan.</w:t>
+        <w:t xml:space="preserve">Buku Panduan PANGI v2.5 — Politeknik Kesehatan Kemenkes Manado. Isi buku ini mengikuti sistem sebagaimana berjalan pada 6 Oktober 2026 (versi 2.5.14); bila tampilan di layar berbeda, yang berlaku adalah sistemnya, dan mohon laporkan selisihnya lewat menu Bantuan.</w:t>
       </w:r>
     </w:p>
     <w:sectPr>

</xml_diff>

<commit_message>
Perbaikan galat 500 kategori Biaya Penyelenggaraan di MySQL (2.5.16)
Kolom rincian_biayas.kategori dibuat sebagai ENUM lima nilai sebelum
kategori Biaya Penyelenggaraan ada. MySQL menolak nilai "penyelenggaraan"
(Data truncated, galat 500 saat menyunting baris), dan nominal biaya
penyelenggaraan dari berkas pelaksana tidak pernah masuk rincian. SQLite
pada lokal dan pengujian tidak menegakkan ENUM-nya, sehingga tidak terlihat.

- Migrasi: kategori menjadi varchar(30); daftar sahnya dijaga KategoriBiaya.
- pangi:selaraskan-biaya menyusulkan nominal berkas yang tertinggal dari
  rincian biaya (rincian bertanda tangan dilewati).

Co-Authored-By: Claude Opus 5.5 <noreply@anthropic.com>
</commit_message>
<xml_diff>
--- a/resources/panduan/Buku-Panduan-PANGI-v2.5.docx
+++ b/resources/panduan/Buku-Panduan-PANGI-v2.5.docx
@@ -239,7 +239,7 @@
                 <w:sz w:val="19"/>
                 <w:szCs w:val="19"/>
               </w:rPr>
-              <w:t xml:space="preserve">2.5.15</w:t>
+              <w:t xml:space="preserve">2.5.16</w:t>
             </w:r>
           </w:p>
         </w:tc>
@@ -12769,6 +12769,26 @@
         <w:pStyle w:val="Heading2"/>
       </w:pPr>
       <w:r>
+        <w:t xml:space="preserve">Versi 2.5.16 — 8 Oktober 2026</w:t>
+      </w:r>
+    </w:p>
+    <w:p>
+      <w:pPr>
+        <w:pStyle w:val="ListParagraph"/>
+        <w:numPr>
+          <w:ilvl w:val="0"/>
+          <w:numId w:val="2"/>
+        </w:numPr>
+      </w:pPr>
+      <w:r>
+        <w:t xml:space="preserve">Perbaikan: menyunting baris rincian biaya ke kategori Biaya Penyelenggaraan tidak lagi berujung galat, dan nominal biaya penyelenggaraan dari berkas pelaksana kini masuk ke rincian biaya.</w:t>
+      </w:r>
+    </w:p>
+    <w:p>
+      <w:pPr>
+        <w:pStyle w:val="Heading2"/>
+      </w:pPr>
+      <w:r>
         <w:t xml:space="preserve">Versi 2.5.15 — 8 Oktober 2026</w:t>
       </w:r>
     </w:p>
@@ -13602,7 +13622,7 @@
           <w:sz w:val="17"/>
           <w:szCs w:val="17"/>
         </w:rPr>
-        <w:t xml:space="preserve">Buku Panduan PANGI v2.5 — Politeknik Kesehatan Kemenkes Manado. Isi buku ini mengikuti sistem sebagaimana berjalan pada 8 Oktober 2026 (versi 2.5.15); bila tampilan di layar berbeda, yang berlaku adalah sistemnya, dan mohon laporkan selisihnya lewat menu Bantuan.</w:t>
+        <w:t xml:space="preserve">Buku Panduan PANGI v2.5 — Politeknik Kesehatan Kemenkes Manado. Isi buku ini mengikuti sistem sebagaimana berjalan pada 8 Oktober 2026 (versi 2.5.16); bila tampilan di layar berbeda, yang berlaku adalah sistemnya, dan mohon laporkan selisihnya lewat menu Bantuan.</w:t>
       </w:r>
     </w:p>
     <w:sectPr>

</xml_diff>

<commit_message>
Surat tugas pelaksana di Input Rincian Biaya (2.5.20)
- Daftar Keuangan → Input Rincian Biaya menautkan surat tugas tiap usulan;
  halaman rincian biayanya menampilkan nomor surat tugas beserta tautan
  berkasnya, atau keterangan bila belum diunggah.
- Usulan::berkasSuratTugas(): dari berkas usulan, atau dari SPD untuk
  usulan lama.
- Panduan Penggunaan dan buku panduan 2.5.20.

Co-Authored-By: Claude Opus 5.5 <noreply@anthropic.com>
</commit_message>
<xml_diff>
--- a/resources/panduan/Buku-Panduan-PANGI-v2.5.docx
+++ b/resources/panduan/Buku-Panduan-PANGI-v2.5.docx
@@ -239,7 +239,7 @@
                 <w:sz w:val="19"/>
                 <w:szCs w:val="19"/>
               </w:rPr>
-              <w:t xml:space="preserve">2.5.19</w:t>
+              <w:t xml:space="preserve">2.5.20</w:t>
             </w:r>
           </w:p>
         </w:tc>
@@ -7591,7 +7591,7 @@
         <w:rPr>
           <w:color w:val="55616F"/>
         </w:rPr>
-        <w:t xml:space="preserve">  Nominal dari dokumen yang diunggah pelaksana sudah diselaraskan lebih dulu, jadi Anda memeriksa dan menyesuaikan — bukan mengetik dari nol. Satu komponen hanya dinominalkan satu pihak: tiket, bill hotel, atau biaya penyelenggaraan yang sudah diisi pelaksana beserta buktinya tidak dapat ditambahkan lagi, sedangkan nominal yang Anda tetapkan lebih dulu mengunci isian pelaksana. Baris transport menyebut tiket yang diwakilinya — pergi, pulang, keduanya (PP), atau bukan tiket pelaksana. Transport lokal tidak ditulis di sini karena berasal dari nota pelaksana.</w:t>
+        <w:t xml:space="preserve">  Nominal dari dokumen yang diunggah pelaksana sudah diselaraskan lebih dulu, jadi Anda memeriksa dan menyesuaikan — bukan mengetik dari nol. Tautan Surat tugas pada daftarnya — dan pada kotak keterangan di halaman rinciannya — membuka surat tugas pelaksana sebagai acuan lama perjalanan dan komponen yang dibiayai. Satu komponen hanya dinominalkan satu pihak: tiket, bill hotel, atau biaya penyelenggaraan yang sudah diisi pelaksana beserta buktinya tidak dapat ditambahkan lagi, sedangkan nominal yang Anda tetapkan lebih dulu mengunci isian pelaksana. Baris transport menyebut tiket yang diwakilinya — pergi, pulang, keduanya (PP), atau bukan tiket pelaksana. Transport lokal tidak ditulis di sini karena berasal dari nota pelaksana.</w:t>
       </w:r>
     </w:p>
     <w:p>
@@ -12769,6 +12769,26 @@
         <w:pStyle w:val="Heading2"/>
       </w:pPr>
       <w:r>
+        <w:t xml:space="preserve">Versi 2.5.20 — 8 Oktober 2026</w:t>
+      </w:r>
+    </w:p>
+    <w:p>
+      <w:pPr>
+        <w:pStyle w:val="ListParagraph"/>
+        <w:numPr>
+          <w:ilvl w:val="0"/>
+          <w:numId w:val="2"/>
+        </w:numPr>
+      </w:pPr>
+      <w:r>
+        <w:t xml:space="preserve">Keuangan → Input Rincian Biaya: surat tugas pelaksana dapat dibuka langsung dari daftar usulan maupun dari halaman rincian biayanya.</w:t>
+      </w:r>
+    </w:p>
+    <w:p>
+      <w:pPr>
+        <w:pStyle w:val="Heading2"/>
+      </w:pPr>
+      <w:r>
         <w:t xml:space="preserve">Versi 2.5.19 — 8 Oktober 2026</w:t>
       </w:r>
     </w:p>
@@ -13742,7 +13762,7 @@
           <w:sz w:val="17"/>
           <w:szCs w:val="17"/>
         </w:rPr>
-        <w:t xml:space="preserve">Buku Panduan PANGI v2.5 — Politeknik Kesehatan Kemenkes Manado. Isi buku ini mengikuti sistem sebagaimana berjalan pada 8 Oktober 2026 (versi 2.5.19); bila tampilan di layar berbeda, yang berlaku adalah sistemnya, dan mohon laporkan selisihnya lewat menu Bantuan.</w:t>
+        <w:t xml:space="preserve">Buku Panduan PANGI v2.5 — Politeknik Kesehatan Kemenkes Manado. Isi buku ini mengikuti sistem sebagaimana berjalan pada 8 Oktober 2026 (versi 2.5.20); bila tampilan di layar berbeda, yang berlaku adalah sistemnya, dan mohon laporkan selisihnya lewat menu Bantuan.</w:t>
       </w:r>
     </w:p>
     <w:sectPr>

</xml_diff>

<commit_message>
Nominal pelaksana selalu tampil dan koreksi keuangan bertahan (2.5.21)
- Penyalinan ulang berkas hanya menulis kolom yang diubah pelaksana sejak
  penyalinan terakhir (kolom baru rincian_biayas.isi_berkas); koreksi tim
  keuangan tidak lagi tertimpa saat pelaksana menyimpan seksi lain. Baris
  lama diadopsi apa adanya.
- Halaman rincian biaya menyalin ulang nominal berkas yang tertinggal dan
  memindah transport lokal tersembunyi saat dibuka (PemulihRincian, juga
  dipakai pangi:selaraskan-biaya).
- Baris dari berkas pelaksana tidak dapat dihapus; yang dikoreksi menyebut
  isian asli pelaksana.
- Panduan Penggunaan dan buku panduan 2.5.21.

Co-Authored-By: Claude Opus 5.5 <noreply@anthropic.com>
</commit_message>
<xml_diff>
--- a/resources/panduan/Buku-Panduan-PANGI-v2.5.docx
+++ b/resources/panduan/Buku-Panduan-PANGI-v2.5.docx
@@ -239,7 +239,7 @@
                 <w:sz w:val="19"/>
                 <w:szCs w:val="19"/>
               </w:rPr>
-              <w:t xml:space="preserve">2.5.20</w:t>
+              <w:t xml:space="preserve">2.5.21</w:t>
             </w:r>
           </w:p>
         </w:tc>
@@ -7613,7 +7613,7 @@
         <w:rPr>
           <w:color w:val="55616F"/>
         </w:rPr>
-        <w:t xml:space="preserve">  Tiap baris divalidasi sendiri-sendiri lewat kotak konfirmasi; mencabut validasi juga dikonfirmasi dan tercatat pada jejak audit.</w:t>
+        <w:t xml:space="preserve">  Nominal yang diisi pelaksana selalu tampil sebagai baris dan dapat dikoreksi lewat tombol ubah; koreksinya bertahan meski pelaksana menyimpan ulang berkasnya, kecuali pelaksana mengubah nominal itu sendiri. Baris dari berkas pelaksana tidak dihapus — beri nominal nol bila tidak dibayarkan. Tiap baris divalidasi sendiri-sendiri lewat kotak konfirmasi; mencabut validasi juga dikonfirmasi dan tercatat pada jejak audit.</w:t>
       </w:r>
     </w:p>
     <w:p>
@@ -12769,6 +12769,26 @@
         <w:pStyle w:val="Heading2"/>
       </w:pPr>
       <w:r>
+        <w:t xml:space="preserve">Versi 2.5.21 — 8 Oktober 2026</w:t>
+      </w:r>
+    </w:p>
+    <w:p>
+      <w:pPr>
+        <w:pStyle w:val="ListParagraph"/>
+        <w:numPr>
+          <w:ilvl w:val="0"/>
+          <w:numId w:val="2"/>
+        </w:numPr>
+      </w:pPr>
+      <w:r>
+        <w:t xml:space="preserve">Nominal pelaksana selalu tampil pada rincian biaya dan baris yang tertinggal disalin kembali; koreksi tim keuangan tidak lagi tertimpa saat pelaksana menyimpan ulang berkasnya.</w:t>
+      </w:r>
+    </w:p>
+    <w:p>
+      <w:pPr>
+        <w:pStyle w:val="Heading2"/>
+      </w:pPr>
+      <w:r>
         <w:t xml:space="preserve">Versi 2.5.20 — 8 Oktober 2026</w:t>
       </w:r>
     </w:p>
@@ -13762,7 +13782,7 @@
           <w:sz w:val="17"/>
           <w:szCs w:val="17"/>
         </w:rPr>
-        <w:t xml:space="preserve">Buku Panduan PANGI v2.5 — Politeknik Kesehatan Kemenkes Manado. Isi buku ini mengikuti sistem sebagaimana berjalan pada 8 Oktober 2026 (versi 2.5.20); bila tampilan di layar berbeda, yang berlaku adalah sistemnya, dan mohon laporkan selisihnya lewat menu Bantuan.</w:t>
+        <w:t xml:space="preserve">Buku Panduan PANGI v2.5 — Politeknik Kesehatan Kemenkes Manado. Isi buku ini mengikuti sistem sebagaimana berjalan pada 8 Oktober 2026 (versi 2.5.21); bila tampilan di layar berbeda, yang berlaku adalah sistemnya, dan mohon laporkan selisihnya lewat menu Bantuan.</w:t>
       </w:r>
     </w:p>
     <w:sectPr>

</xml_diff>

<commit_message>
SPD sekali pakai per usulan dan hapus satu pelaksana SPD bersama (2.5.23)
- Satu SPD hanya untuk satu usulan perjadin tiap pelaksana: SPD yang sudah
  dipakai tidak tampil lagi pada pilihan SPD formulir usulan dan ditolak bila
  dikirim. Usulan yang dibatalkan atau dihapus melepaskan SPD beserta nomor
  SPD-nya; usulan ditolak tetap memegangnya karena masih dapat direvisi.
- SPD bersama dapat dikurangi satu pelaksana saja, SPD dan pelaksana lainnya
  tetap. Pelaksana yang bukan pembuat hanya menghapus dirinya sendiri dan
  tidak lagi dapat menghapus SPD rekannya; pelaksana yang usulannya dari SPD
  itu masih berjalan tidak dihapus.

Co-Authored-By: Claude Opus 5.5 <noreply@anthropic.com>
</commit_message>
<xml_diff>
--- a/resources/panduan/Buku-Panduan-PANGI-v2.5.docx
+++ b/resources/panduan/Buku-Panduan-PANGI-v2.5.docx
@@ -239,7 +239,7 @@
                 <w:sz w:val="19"/>
                 <w:szCs w:val="19"/>
               </w:rPr>
-              <w:t xml:space="preserve">2.5.22</w:t>
+              <w:t xml:space="preserve">2.5.23</w:t>
             </w:r>
           </w:p>
         </w:tc>
@@ -264,7 +264,7 @@
                 <w:sz w:val="19"/>
                 <w:szCs w:val="19"/>
               </w:rPr>
-              <w:t xml:space="preserve">8 Oktober 2026</w:t>
+              <w:t xml:space="preserve">9 Oktober 2026</w:t>
             </w:r>
           </w:p>
         </w:tc>
@@ -5089,7 +5089,7 @@
         <w:spacing w:before="60" w:after="160"/>
       </w:pPr>
       <w:r>
-        <w:t xml:space="preserve">Halaman SPD yang baru disimpan memuat keterangan Langkah berikutnya: (1) tekan Unduh PDF — dokumennya sudah berformat SRIKANDI, jadi penanda ${nomor_naskah}, ${ttd_pengirim1}, dan ${ttd_pengirim2} jangan diubah atau dihapus; (2) masukkan dokumen itu ke SRIKANDI lewat Naskah Keluar → Registrasi Naskah Keluar dan ajukan tanda tangan kepada PPK (lembar pertama) dan Direktur (lembar kedua); (3) setelah selesai diproses, unduh SPD bertanda tangan dari SRIKANDI dan catat nomor naskahnya — nomor PJ-… di PANGI hanya nomor internal; (4) lanjutkan dengan mengajukan usulan perjalanan dinas memakai dokumen dan nomor itu (bagian 5.2).</w:t>
+        <w:t xml:space="preserve">Halaman SPD yang baru disimpan memuat keterangan Langkah berikutnya: (1) tekan Unduh PDF — dokumennya sudah berformat SRIKANDI, jadi penanda ${nomor_naskah}, ${ttd_pengirim1}, dan ${ttd_pengirim2} jangan diubah atau dihapus; (2) masukkan dokumen itu ke SRIKANDI lewat Naskah Keluar → Registrasi Naskah Keluar dan ajukan tanda tangan kepada PPK (lembar pertama) dan Direktur (lembar kedua); (3) setelah selesai diproses, unduh SPD bertanda tangan dari SRIKANDI dan catat nomor naskahnya — nomor PJ-… di PANGI hanya nomor internal; (4) lanjutkan dengan mengajukan usulan perjalanan dinas memakai dokumen dan nomor itu (bagian 5.2). SPD yang dibuat bersama pelaksana lain dapat dikurangi satu pelaksana saja lewat tombol Hapus pada daftar Pelaksana — SPD dan pelaksana lainnya tetap. Pembuat SPD dapat menghapus pelaksana mana pun atau SPD seluruhnya; pelaksana lain hanya menghapus dirinya sendiri lewat Hapus Saya dari SPD, setelah usulannya dari SPD itu dibatalkan atau dihapus bila sudah ada.</w:t>
       </w:r>
     </w:p>
     <w:p>
@@ -5538,7 +5538,7 @@
         <w:rPr>
           <w:color w:val="55616F"/>
         </w:rPr>
-        <w:t xml:space="preserve">  Bila ada, tujuan, tanggal, dan maksud terisi sendiri dari SPD yang dipilih. Nomor SPD sengaja tidak ikut terisi, karena yang diisi nomor naskah dari SRIKANDI. Bila SPD itu sudah melampirkan surat tugas, berkas dan nomor surat tugasnya ikut diambil — tidak perlu diunggah maupun disalin lagi. Bila tidak ada, lewati dan isi data perjalanan secara manual, termasuk mengunggah surat tugas beserta nomornya.</w:t>
+        <w:t xml:space="preserve">  Bila ada, tujuan, tanggal, dan maksud terisi sendiri dari SPD yang dipilih. Nomor SPD sengaja tidak ikut terisi, karena yang diisi nomor naskah dari SRIKANDI. Bila SPD itu sudah melampirkan surat tugas, berkas dan nomor surat tugasnya ikut diambil — tidak perlu diunggah maupun disalin lagi. Bila tidak ada, lewati dan isi data perjalanan secara manual, termasuk mengunggah surat tugas beserta nomornya. Satu SPD hanya untuk satu usulan: SPD yang sudah dipakai usulan Anda tidak tampil lagi pada daftarnya, dan muncul kembali setelah usulan itu dibatalkan atau dihapus.</w:t>
       </w:r>
     </w:p>
     <w:p>
@@ -12769,6 +12769,26 @@
         <w:pStyle w:val="Heading2"/>
       </w:pPr>
       <w:r>
+        <w:t xml:space="preserve">Versi 2.5.23 — 9 Oktober 2026</w:t>
+      </w:r>
+    </w:p>
+    <w:p>
+      <w:pPr>
+        <w:pStyle w:val="ListParagraph"/>
+        <w:numPr>
+          <w:ilvl w:val="0"/>
+          <w:numId w:val="2"/>
+        </w:numPr>
+      </w:pPr>
+      <w:r>
+        <w:t xml:space="preserve">Satu SPD hanya untuk satu usulan perjadin: SPD yang sudah dipakai tidak tampil lagi pada pilihan SPD, dan dapat dipakai kembali setelah usulannya dibatalkan atau dihapus. SPD bersama dapat dikurangi satu pelaksana saja; pelaksana lainnya tetap.</w:t>
+      </w:r>
+    </w:p>
+    <w:p>
+      <w:pPr>
+        <w:pStyle w:val="Heading2"/>
+      </w:pPr>
+      <w:r>
         <w:t xml:space="preserve">Versi 2.5.22 — 8 Oktober 2026</w:t>
       </w:r>
     </w:p>
@@ -13802,7 +13822,7 @@
           <w:sz w:val="17"/>
           <w:szCs w:val="17"/>
         </w:rPr>
-        <w:t xml:space="preserve">Buku Panduan PANGI v2.5 — Politeknik Kesehatan Kemenkes Manado. Isi buku ini mengikuti sistem sebagaimana berjalan pada 8 Oktober 2026 (versi 2.5.22); bila tampilan di layar berbeda, yang berlaku adalah sistemnya, dan mohon laporkan selisihnya lewat menu Bantuan.</w:t>
+        <w:t xml:space="preserve">Buku Panduan PANGI v2.5 — Politeknik Kesehatan Kemenkes Manado. Isi buku ini mengikuti sistem sebagaimana berjalan pada 9 Oktober 2026 (versi 2.5.23); bila tampilan di layar berbeda, yang berlaku adalah sistemnya, dan mohon laporkan selisihnya lewat menu Bantuan.</w:t>
       </w:r>
     </w:p>
     <w:sectPr>

</xml_diff>

<commit_message>
Jalur dalam kota tanpa SPD, luar kota dalam satu provinsi, laporan di detail keuangan (2.5.24)
- Jalur pengajuan kini empat: Perjalanan Dalam Kota Tidak Menggunakan SPD,
  Perjalanan Luar Kota Dalam Satu Provinsi (baru), Perjalanan Luar Kota
  Lintas Pulau (sebelumnya Perjalanan Luar Kota), dan Supervisi.
- Perjalanan dalam kota tidak lagi meminta SPD bertanda tangan maupun SPPD;
  cukup surat tugas. Nomor SPD usulan dalam kota lama tetap tersimpan saat
  disunting.
- Luar kota dalam satu provinsi memakai kategori luar kota kecuali Luar
  Negeri, dan secara bawaan tidak menagih tiket.
- Detail keuangan memuat kartu Laporan Perjalanan Dinas: tahap laporan
  pelaksana sampai konfirmasi atau pengembalian pimpinan, beserta tombol
  lihat dan unduh. Pemegang hak keuangan boleh membaca laporannya, tidak
  menyuntingnya.
- Gambar panduan pilihan jalur diperbarui dengan pengguna fiktif.

Co-Authored-By: Claude Opus 5.5 <noreply@anthropic.com>
</commit_message>
<xml_diff>
--- a/resources/panduan/Buku-Panduan-PANGI-v2.5.docx
+++ b/resources/panduan/Buku-Panduan-PANGI-v2.5.docx
@@ -239,7 +239,7 @@
                 <w:sz w:val="19"/>
                 <w:szCs w:val="19"/>
               </w:rPr>
-              <w:t xml:space="preserve">2.5.23</w:t>
+              <w:t xml:space="preserve">2.5.24</w:t>
             </w:r>
           </w:p>
         </w:tc>
@@ -264,7 +264,7 @@
                 <w:sz w:val="19"/>
                 <w:szCs w:val="19"/>
               </w:rPr>
-              <w:t xml:space="preserve">9 Oktober 2026</w:t>
+              <w:t xml:space="preserve">12 Oktober 2026</w:t>
             </w:r>
           </w:p>
         </w:tc>
@@ -5447,7 +5447,7 @@
         <w:rPr>
           <w:color w:val="55616F"/>
         </w:rPr>
-        <w:t xml:space="preserve">  Pertanyaan pertama adalah jalurnya: Perjalanan Dalam Kota, Perjalanan Luar Kota, atau Supervisi Kerja Praktek / Magang. Pilihan itu menyaring kategori perjalanan dinas pada formulir dan menentukan berkas yang diminta. Pada jalur supervisi, kebutuhan SPD mengikuti kategorinya: Supervisi Luar Kota tetap memakai SPD bertanda tangan beserta nomornya, sedangkan Supervisi Dalam Kota cukup surat tugas. Jenis kegiatannya terisi sendiri, dan formulir menyimpan sendiri isian Anda di peramban.</w:t>
+        <w:t xml:space="preserve">  Pertanyaan pertama adalah jalurnya: Perjalanan Dalam Kota Tidak Menggunakan SPD, Perjalanan Luar Kota Dalam Satu Provinsi, Perjalanan Luar Kota Lintas Pulau, atau Supervisi Kerja Praktek / Magang. Pilihan itu menyaring kategori perjalanan dinas pada formulir dan menentukan berkas yang diminta. Perjalanan dalam kota cukup surat tugas beserta nomornya, tanpa SPD. Kedua jalur luar kota memakai SPD bertanda tangan dan kategori luar kota yang sama — kecuali Luar Negeri, yang hanya ada pada jalur lintas pulau. Pada jalur supervisi, kebutuhan SPD mengikuti kategorinya: Supervisi Luar Kota tetap memakai SPD bertanda tangan beserta nomornya, sedangkan Supervisi Dalam Kota cukup surat tugas. Jenis kegiatannya terisi sendiri, dan formulir menyimpan sendiri isian Anda di peramban.</w:t>
       </w:r>
     </w:p>
     <w:p>
@@ -5516,7 +5516,7 @@
         <w:t xml:space="preserve">Gambar 5.10</w:t>
       </w:r>
       <w:r>
-        <w:t xml:space="preserve"> — Menu Buat Usulan Perjadin (1) membuka pilihan jalur; pilih yang sesuai, misalnya Perjalanan Luar Kota (2).</w:t>
+        <w:t xml:space="preserve"> — Menu Buat Usulan Perjadin (1) membuka pilihan jalur; pilih yang sesuai, misalnya Perjalanan Luar Kota Lintas Pulau (2).</w:t>
       </w:r>
     </w:p>
     <w:p>
@@ -5629,7 +5629,7 @@
         <w:rPr>
           <w:color w:val="55616F"/>
         </w:rPr>
-        <w:t xml:space="preserve">  Keduanya wajib sebelum usulan dikirim — kecuali pada supervisi di dalam kota, yang memang tidak menerbitkan SPD sehingga isiannya tidak ditampilkan. Tanda tangan PPK pada SPD itulah persetujuannya: tidak ada tombol setuju lagi di aplikasi, dan persetujuan PPK tercatat sendiri pada jejak audit saat usulan terkirim.</w:t>
+        <w:t xml:space="preserve">  Keduanya wajib sebelum usulan dikirim — kecuali pada perjalanan dalam kota dan supervisi di dalam kota, yang memang tidak menerbitkan SPD sehingga isiannya tidak ditampilkan. Tanda tangan PPK pada SPD itulah persetujuannya: tidak ada tombol setuju lagi di aplikasi, dan persetujuan PPK tercatat sendiri pada jejak audit saat usulan terkirim.</w:t>
       </w:r>
     </w:p>
     <w:p>
@@ -6309,7 +6309,7 @@
                 <w:sz w:val="19"/>
                 <w:szCs w:val="19"/>
               </w:rPr>
-              <w:t xml:space="preserve">Luar kota</w:t>
+              <w:t xml:space="preserve">Luar kota lintas pulau</w:t>
             </w:r>
           </w:p>
         </w:tc>
@@ -6361,7 +6361,7 @@
                 <w:sz w:val="19"/>
                 <w:szCs w:val="19"/>
               </w:rPr>
-              <w:t xml:space="preserve">Wajib</w:t>
+              <w:t xml:space="preserve">–</w:t>
             </w:r>
           </w:p>
         </w:tc>
@@ -6931,6 +6931,14 @@
         </w:tc>
       </w:tr>
     </w:tbl>
+    <w:p>
+      <w:pPr>
+        <w:spacing w:before="60" w:after="160"/>
+      </w:pPr>
+      <w:r>
+        <w:t xml:space="preserve">Luar kota dalam satu provinsi menagih berkas yang sama dengan luar kota lintas pulau, kecuali tiket pergi dan pulang — perjalanannya umumnya lewat darat.</w:t>
+      </w:r>
+    </w:p>
     <w:p>
       <w:pPr>
         <w:spacing w:after="160"/>
@@ -8106,7 +8114,7 @@
         <w:rPr>
           <w:color w:val="55616F"/>
         </w:rPr>
-        <w:t xml:space="preserve">  Terbuka setelah laporan perjalanan dinas dikonfirmasi Direktur lewat QR — tanda tangan pelaksana, PPK, maupun daftar nominatif tidak menahannya. Selisih uang muka terhadap nominal akhir terhitung sendiri.</w:t>
+        <w:t xml:space="preserve">  Terbuka setelah laporan perjalanan dinas dikonfirmasi Direktur lewat QR — tanda tangan pelaksana, PPK, maupun daftar nominatif tidak menahannya. Kartu Laporan Perjalanan Dinas pada detail keuangan memperlihatkan tahapnya — disusun pelaksana, dikirim, lalu dikonfirmasi atau dikembalikan pimpinan beserta catatannya — dengan tombol Lihat Laporan dan Unduh PDF. Selisih uang muka terhadap nominal akhir terhitung sendiri.</w:t>
       </w:r>
     </w:p>
     <w:p>
@@ -8874,7 +8882,7 @@
         </w:numPr>
       </w:pPr>
       <w:r>
-        <w:t xml:space="preserve">Administrasi Sistem → Berkas Pertanggungjawaban menentukan berkas apa saja yang ditagih sesudah perjalanan, terpisah untuk ketiga jalur pengajuan: dalam kota, luar kota, dan supervisi kerja praktek / magang.</w:t>
+        <w:t xml:space="preserve">Administrasi Sistem → Berkas Pertanggungjawaban menentukan berkas apa saja yang ditagih sesudah perjalanan, terpisah untuk keempat jalur pengajuan: dalam kota, luar kota dalam satu provinsi, luar kota lintas pulau, dan supervisi kerja praktek / magang. Bawaan luar kota dalam satu provinsi tidak menagih tiket karena umumnya lewat darat; centang bila perlu.</w:t>
       </w:r>
     </w:p>
     <w:p>
@@ -8922,7 +8930,7 @@
         </w:numPr>
       </w:pPr>
       <w:r>
-        <w:t xml:space="preserve">SPPD bertanda tangan gugur sendiri pada perjalanan yang memang tidak menerbitkan SPD — supervisi di dalam kota, misalnya — sekalipun jalurnya tetap mencentangnya.</w:t>
+        <w:t xml:space="preserve">SPPD bertanda tangan gugur sendiri pada perjalanan yang memang tidak menerbitkan SPD — perjalanan dalam kota dan supervisi di dalam kota — sekalipun jalurnya tetap mencentangnya.</w:t>
       </w:r>
     </w:p>
     <w:p>
@@ -12769,6 +12777,26 @@
         <w:pStyle w:val="Heading2"/>
       </w:pPr>
       <w:r>
+        <w:t xml:space="preserve">Versi 2.5.24 — 12 Oktober 2026</w:t>
+      </w:r>
+    </w:p>
+    <w:p>
+      <w:pPr>
+        <w:pStyle w:val="ListParagraph"/>
+        <w:numPr>
+          <w:ilvl w:val="0"/>
+          <w:numId w:val="2"/>
+        </w:numPr>
+      </w:pPr>
+      <w:r>
+        <w:t xml:space="preserve">Empat jalur pengajuan: dalam kota tanpa SPD, luar kota dalam satu provinsi (baru), luar kota lintas pulau, dan supervisi; detail keuangan memuat tahap laporan perjalanan dinas sampai konfirmasi pimpinan.</w:t>
+      </w:r>
+    </w:p>
+    <w:p>
+      <w:pPr>
+        <w:pStyle w:val="Heading2"/>
+      </w:pPr>
+      <w:r>
         <w:t xml:space="preserve">Versi 2.5.23 — 9 Oktober 2026</w:t>
       </w:r>
     </w:p>
@@ -13822,7 +13850,7 @@
           <w:sz w:val="17"/>
           <w:szCs w:val="17"/>
         </w:rPr>
-        <w:t xml:space="preserve">Buku Panduan PANGI v2.5 — Politeknik Kesehatan Kemenkes Manado. Isi buku ini mengikuti sistem sebagaimana berjalan pada 9 Oktober 2026 (versi 2.5.23); bila tampilan di layar berbeda, yang berlaku adalah sistemnya, dan mohon laporkan selisihnya lewat menu Bantuan.</w:t>
+        <w:t xml:space="preserve">Buku Panduan PANGI v2.5 — Politeknik Kesehatan Kemenkes Manado. Isi buku ini mengikuti sistem sebagaimana berjalan pada 12 Oktober 2026 (versi 2.5.24); bila tampilan di layar berbeda, yang berlaku adalah sistemnya, dan mohon laporkan selisihnya lewat menu Bantuan.</w:t>
       </w:r>
     </w:p>
     <w:sectPr>

</xml_diff>

<commit_message>
Cara bayar tiga pilihan, transport lokal di cetak rincian, koreksi nominal transport (2.5.25)
- Cara bayar tiap komponen, termasuk uang harian: Sudah dibayarkan (penuh
  lewat uang muka), Baru dibayarkan 80% (20% saat pelunasan), atau
  Penggantian; dikonfirmasi tim keuangan per komponen.
- Kartu pembayaran menampilkan uang harian 100% dengan benar, serta komponen
  yang sudah dibayarkan penuh dan yang baru dibayarkan 80%.
- Cetakan rincian biaya kembali memuat transport lokal dari daftar riil,
  ikut terjumlah; transport lokal yang diganti saat pelunasan terhitung
  sudah dibayarkan.
- Periksa Transport Lokal: tim keuangan mengoreksi nominal tiap ruas selama
  daftar riil terbuka; angka nota disimpan sebagai pembanding sehingga
  koreksinya bertahan sampai pelaksana mengubah notanya.
- Dokumen Perdin menampilkan pelaksana bagi super administrator.

Co-Authored-By: Claude Opus 5.5 <noreply@anthropic.com>
</commit_message>
<xml_diff>
--- a/resources/panduan/Buku-Panduan-PANGI-v2.5.docx
+++ b/resources/panduan/Buku-Panduan-PANGI-v2.5.docx
@@ -239,7 +239,7 @@
                 <w:sz w:val="19"/>
                 <w:szCs w:val="19"/>
               </w:rPr>
-              <w:t xml:space="preserve">2.5.24</w:t>
+              <w:t xml:space="preserve">2.5.25</w:t>
             </w:r>
           </w:p>
         </w:tc>
@@ -7298,7 +7298,7 @@
                 <w:sz w:val="19"/>
                 <w:szCs w:val="19"/>
               </w:rPr>
-              <w:t xml:space="preserve">Tiket, uang harian, uang penginapan, biaya penyelenggaraan, biaya lainnya</w:t>
+              <w:t xml:space="preserve">Tiket, uang harian, uang penginapan, biaya penyelenggaraan, biaya lainnya, ditambah transport lokal dari daftar riil</w:t>
             </w:r>
           </w:p>
         </w:tc>
@@ -7621,7 +7621,7 @@
         <w:rPr>
           <w:color w:val="55616F"/>
         </w:rPr>
-        <w:t xml:space="preserve">  Nominal yang diisi pelaksana selalu tampil sebagai baris dan dapat dikoreksi lewat tombol ubah; koreksinya bertahan meski pelaksana menyimpan ulang berkasnya, kecuali pelaksana mengubah nominal itu sendiri. Hanya baris tulisan tim keuangan dan nominal pelaksana yang sudah divalidasi yang terhitung pada total, uang muka, sisa bayar, dan cetakan rincian biaya. Komponen yang tidak dibayarkan dapat dihapus oleh peran berhak Menghapus komponen rincian biaya; nominal berkas pelaksana yang dihapus tidak tersalin lagi kecuali pelaksana mengubahnya, dan dapat dikembalikan dari daftar di bawah tabel. Tiap baris divalidasi sendiri-sendiri lewat kotak konfirmasi; mencabut validasi juga dikonfirmasi dan tercatat pada jejak audit. Pada tabel Status Pembayaran Komponen, konfirmasi cara bayar tiap komponen: lewat uang muka, atau dibayar pelaksana dahulu sehingga diganti saat pelunasan dan masuk sisa bayar.</w:t>
+        <w:t xml:space="preserve">  Nominal yang diisi pelaksana selalu tampil sebagai baris dan dapat dikoreksi lewat tombol ubah; koreksinya bertahan meski pelaksana menyimpan ulang berkasnya, kecuali pelaksana mengubah nominal itu sendiri. Hanya baris tulisan tim keuangan dan nominal pelaksana yang sudah divalidasi yang terhitung pada total, uang muka, sisa bayar, dan cetakan rincian biaya. Komponen yang tidak dibayarkan dapat dihapus oleh peran berhak Menghapus komponen rincian biaya; nominal berkas pelaksana yang dihapus tidak tersalin lagi kecuali pelaksana mengubahnya, dan dapat dikembalikan dari daftar di bawah tabel. Tiap baris divalidasi sendiri-sendiri lewat kotak konfirmasi; mencabut validasi juga dikonfirmasi dan tercatat pada jejak audit. Pada tabel Status Pembayaran Komponen, konfirmasi cara bayar tiap komponen, termasuk uang harian: Sudah dibayarkan (penuh lewat uang muka), Baru dibayarkan 80% (20% sisanya saat pelunasan), atau Penggantian (dibayar pelaksana dahulu, diganti seluruhnya saat pelunasan). Selama belum dikonfirmasi, uang harian dihitung 80% dan komponen lain dibayarkan penuh.</w:t>
       </w:r>
     </w:p>
     <w:p>
@@ -7643,7 +7643,7 @@
         <w:rPr>
           <w:color w:val="55616F"/>
         </w:rPr>
-        <w:t xml:space="preserve">  Submenu Periksa Transport Lokal memuat biaya yang dinyatakan pelaksana pada daftar riilnya, beserta buktinya. Transport lokal yang Anda catat sendiri — kategori Transport Lokal pada Tambah Komponen, atau memindah baris yang terlanjur ditulis sebagai Transport — masuk ke tabel Transport Lokal (Daftar Pengeluaran Riil), bukan ke rincian biaya, dan dapat dihapus bila keliru.</w:t>
+        <w:t xml:space="preserve">  Submenu Periksa Transport Lokal memuat biaya yang dinyatakan pelaksana pada daftar riilnya, beserta buktinya. Transport lokal yang Anda catat sendiri — kategori Transport Lokal pada Tambah Komponen, atau memindah baris yang terlanjur ditulis sebagai Transport — masuk ke tabel Transport Lokal (Daftar Pengeluaran Riil), bukan ke rincian biaya, dan dapat dihapus bila keliru. Nominal tiap ruas dapat dikoreksi lewat tombol Ubah selama daftar riilnya belum disetujui pelaksana maupun disahkan PPK; angka nota pelaksana tetap disebut, dan koreksinya bertahan sampai pelaksana mengubah notanya sendiri.</w:t>
       </w:r>
     </w:p>
     <w:p>
@@ -8092,7 +8092,7 @@
         <w:rPr>
           <w:color w:val="55616F"/>
         </w:rPr>
-        <w:t xml:space="preserve">  Isi tanggal transfer dan unggah buktinya. Kelengkapan berkas pelaksana tampil di tiap baris, sehingga terlihat mana yang belum boleh dilunasi. Kartu di atas formulirnya merinci uang harian, komponen lewat uang muka, penggantian saat pelunasan, transport lokal, dan nominal yang menunggu validasi. Sesudah dicatat, uang muka tidak bergeser lagi: komponen atau koreksi yang menyusul masuk sisa bayar.</w:t>
+        <w:t xml:space="preserve">  Isi tanggal transfer dan unggah buktinya. Kelengkapan berkas pelaksana tampil di tiap baris, sehingga terlihat mana yang belum boleh dilunasi. Kartu di atas formulirnya merinci uang harian (termasuk bila dibayarkan penuh 100%), komponen yang sudah dibayarkan penuh, yang baru dibayarkan 80%, penggantian saat pelunasan, transport lokal, dan nominal yang menunggu validasi. Sesudah dicatat, uang muka tidak bergeser lagi: komponen atau koreksi yang menyusul masuk sisa bayar.</w:t>
       </w:r>
     </w:p>
     <w:p>
@@ -11259,7 +11259,7 @@
                 <w:sz w:val="19"/>
                 <w:szCs w:val="19"/>
               </w:rPr>
-              <w:t xml:space="preserve">Daftar Pengeluaran Riil — Lampiran IX</w:t>
+              <w:t xml:space="preserve">Daftar Pengeluaran Riil — Lampiran IX, juga tercantum pada Rincian Biaya</w:t>
             </w:r>
           </w:p>
         </w:tc>
@@ -12777,6 +12777,26 @@
         <w:pStyle w:val="Heading2"/>
       </w:pPr>
       <w:r>
+        <w:t xml:space="preserve">Versi 2.5.25 — 12 Oktober 2026</w:t>
+      </w:r>
+    </w:p>
+    <w:p>
+      <w:pPr>
+        <w:pStyle w:val="ListParagraph"/>
+        <w:numPr>
+          <w:ilvl w:val="0"/>
+          <w:numId w:val="2"/>
+        </w:numPr>
+      </w:pPr>
+      <w:r>
+        <w:t xml:space="preserve">Cara bayar tiga pilihan untuk tiap komponen termasuk uang harian; kartu pembayaran untuk uang harian 100%; transport lokal kembali pada cetakan rincian biaya; koreksi nominal transport lokal oleh tim keuangan; pelaksana tampil pada Dokumen Perdin bagi super administrator.</w:t>
+      </w:r>
+    </w:p>
+    <w:p>
+      <w:pPr>
+        <w:pStyle w:val="Heading2"/>
+      </w:pPr>
+      <w:r>
         <w:t xml:space="preserve">Versi 2.5.24 — 12 Oktober 2026</w:t>
       </w:r>
     </w:p>
@@ -13850,7 +13870,7 @@
           <w:sz w:val="17"/>
           <w:szCs w:val="17"/>
         </w:rPr>
-        <w:t xml:space="preserve">Buku Panduan PANGI v2.5 — Politeknik Kesehatan Kemenkes Manado. Isi buku ini mengikuti sistem sebagaimana berjalan pada 12 Oktober 2026 (versi 2.5.24); bila tampilan di layar berbeda, yang berlaku adalah sistemnya, dan mohon laporkan selisihnya lewat menu Bantuan.</w:t>
+        <w:t xml:space="preserve">Buku Panduan PANGI v2.5 — Politeknik Kesehatan Kemenkes Manado. Isi buku ini mengikuti sistem sebagaimana berjalan pada 12 Oktober 2026 (versi 2.5.25); bila tampilan di layar berbeda, yang berlaku adalah sistemnya, dan mohon laporkan selisihnya lewat menu Bantuan.</w:t>
       </w:r>
     </w:p>
     <w:sectPr>

</xml_diff>

<commit_message>
Golongan PPPK I sampai XVII (2.5.26)
- Golongan PPPK I-XVII dikenali di samping golongan PNS: dipilih pada
  formulir tambah/sunting pengguna di Administrasi Sistem, mengisi kolom
  Pangkat dan Golongan SPD ("Golongan IX (PPPK)"), dan terbaca saat impor.
- Data pegawai: golongan Christian Makatipu diisi IX.

Co-Authored-By: Claude Opus 5.5 <noreply@anthropic.com>
</commit_message>
<xml_diff>
--- a/resources/panduan/Buku-Panduan-PANGI-v2.5.docx
+++ b/resources/panduan/Buku-Panduan-PANGI-v2.5.docx
@@ -239,7 +239,7 @@
                 <w:sz w:val="19"/>
                 <w:szCs w:val="19"/>
               </w:rPr>
-              <w:t xml:space="preserve">2.5.25</w:t>
+              <w:t xml:space="preserve">2.5.26</w:t>
             </w:r>
           </w:p>
         </w:tc>
@@ -4579,7 +4579,7 @@
         <w:rPr>
           <w:color w:val="55616F"/>
         </w:rPr>
-        <w:t xml:space="preserve">  Isi kota tempat SPD dikeluarkan (1); tanggalnya mengikuti hari pembuatan. Pelaksana pertama terisi sendiri dari akun Anda (2), dan nomor suratnya terbit sendiri berpola PJ-[unit]-[tahun]-[bulan]-[urut] — tidak perlu diketik; nomor resmi diisi SRIKANDI saat surat diregistrasi. Bila berangkat bersama rekan, tekan Tambah Pelaksana (3) lalu pilih namanya dari daftar pegawai: nama, NIP, pangkat, dan jabatannya terisi sendiri. Satu SPD memuat paling banyak lima pelaksana.</w:t>
+        <w:t xml:space="preserve">  Isi kota tempat SPD dikeluarkan (1); tanggalnya mengikuti hari pembuatan. Pelaksana pertama terisi sendiri dari akun Anda (2), dan nomor suratnya terbit sendiri berpola PJ-[unit]-[tahun]-[bulan]-[urut] — tidak perlu diketik; nomor resmi diisi SRIKANDI saat surat diregistrasi. Bila berangkat bersama rekan, tekan Tambah Pelaksana (3) lalu pilih namanya dari daftar pegawai: nama, NIP, pangkat, dan jabatannya terisi sendiri. Pegawai PPPK tercantum dengan golongannya, misalnya Golongan IX (PPPK). Satu SPD memuat paling banyak lima pelaksana.</w:t>
       </w:r>
     </w:p>
     <w:p>
@@ -8254,7 +8254,7 @@
         </w:numPr>
       </w:pPr>
       <w:r>
-        <w:t xml:space="preserve">Menu Administrasi Sistem memuat seluruh pengguna beserta peran, unit kerja, dan atasannya. Saat menambah atau menyunting pengguna, nomor handphone (WhatsApp) dapat diisi langsung — nomor itulah yang dipakai tim keuangan menagih berkas.</w:t>
+        <w:t xml:space="preserve">Menu Administrasi Sistem memuat seluruh pengguna beserta peran, unit kerja, dan atasannya. Saat menambah atau menyunting pengguna, nomor handphone (WhatsApp) dapat diisi langsung — nomor itulah yang dipakai tim keuangan menagih berkas. Pangkat dan Golongan dipilih dari golongan PNS (I/a sampai IV/e) atau golongan PPPK (I sampai XVII), dan mengisi sendiri kolom pangkat pada SPD.</w:t>
       </w:r>
     </w:p>
     <w:p>
@@ -12777,6 +12777,26 @@
         <w:pStyle w:val="Heading2"/>
       </w:pPr>
       <w:r>
+        <w:t xml:space="preserve">Versi 2.5.26 — 12 Oktober 2026</w:t>
+      </w:r>
+    </w:p>
+    <w:p>
+      <w:pPr>
+        <w:pStyle w:val="ListParagraph"/>
+        <w:numPr>
+          <w:ilvl w:val="0"/>
+          <w:numId w:val="2"/>
+        </w:numPr>
+      </w:pPr>
+      <w:r>
+        <w:t xml:space="preserve">Golongan PPPK I sampai XVII dikenali pada formulir pengguna, kolom Pangkat dan Golongan SPD, dan impor data pegawai.</w:t>
+      </w:r>
+    </w:p>
+    <w:p>
+      <w:pPr>
+        <w:pStyle w:val="Heading2"/>
+      </w:pPr>
+      <w:r>
         <w:t xml:space="preserve">Versi 2.5.25 — 12 Oktober 2026</w:t>
       </w:r>
     </w:p>
@@ -13870,7 +13890,7 @@
           <w:sz w:val="17"/>
           <w:szCs w:val="17"/>
         </w:rPr>
-        <w:t xml:space="preserve">Buku Panduan PANGI v2.5 — Politeknik Kesehatan Kemenkes Manado. Isi buku ini mengikuti sistem sebagaimana berjalan pada 12 Oktober 2026 (versi 2.5.25); bila tampilan di layar berbeda, yang berlaku adalah sistemnya, dan mohon laporkan selisihnya lewat menu Bantuan.</w:t>
+        <w:t xml:space="preserve">Buku Panduan PANGI v2.5 — Politeknik Kesehatan Kemenkes Manado. Isi buku ini mengikuti sistem sebagaimana berjalan pada 12 Oktober 2026 (versi 2.5.26); bila tampilan di layar berbeda, yang berlaku adalah sistemnya, dan mohon laporkan selisihnya lewat menu Bantuan.</w:t>
       </w:r>
     </w:p>
     <w:sectPr>

</xml_diff>

<commit_message>
Submenu Format WhatsApp di Administrasi Sistem (2.5.27)
- Kalimat pesan WhatsApp yang disusun aplikasi dapat diubah dari
  Administrasi Sistem -> Format WhatsApp: penagihan berkas kepada
  pelaksana, serta peringatan, pengingat, kabar pulih, dan uji pemantau
  server.
- Format memakai penanda berkurung kurawal ({nama}, {daftar_berkas}, ...);
  penanda yang tidak dikenal ditolak, penanda wajib tidak boleh hilang,
  pratinjau memakai data contoh, dan tiap format dapat dikembalikan ke
  bawaan. Bawaannya sama persis dengan pesan sebelumnya.
- Format dicerminkan ke folder pemantau sehingga pesan server tetap memakai
  format yang diubah meski basis data terputus.
- Hak akses baru: Mengatur format pesan WhatsApp (Administrasi Sistem).

Co-Authored-By: Claude Opus 5.5 <noreply@anthropic.com>
</commit_message>
<xml_diff>
--- a/resources/panduan/Buku-Panduan-PANGI-v2.5.docx
+++ b/resources/panduan/Buku-Panduan-PANGI-v2.5.docx
@@ -239,7 +239,7 @@
                 <w:sz w:val="19"/>
                 <w:szCs w:val="19"/>
               </w:rPr>
-              <w:t xml:space="preserve">2.5.26</w:t>
+              <w:t xml:space="preserve">2.5.27</w:t>
             </w:r>
           </w:p>
         </w:tc>
@@ -8894,6 +8894,18 @@
         </w:numPr>
       </w:pPr>
       <w:r>
+        <w:t xml:space="preserve">Administrasi Sistem → Format WhatsApp memuat kalimat pesan WhatsApp yang disusun aplikasi: penagihan berkas kepada pelaksana, serta peringatan pemantau server, pengingatnya, kabar pulih, dan pesan uji. Tulis kalimatnya bebas lalu sisipkan penanda berkurung kurawal — misalnya {nama} atau {daftar_berkas} — yang diganti isinya saat pesan disusun; pratinjau di bawah tiap kolom memakai data contoh. Penanda yang salah ketik ditolak, penanda wajib tidak boleh dihapus, dan tiap format dapat dikembalikan ke bawaan.</w:t>
+      </w:r>
+    </w:p>
+    <w:p>
+      <w:pPr>
+        <w:pStyle w:val="ListParagraph"/>
+        <w:numPr>
+          <w:ilvl w:val="0"/>
+          <w:numId w:val="2"/>
+        </w:numPr>
+      </w:pPr>
+      <w:r>
         <w:t xml:space="preserve">Pilihannya: SPPD bertanda tangan, tiket pergi dan pulang, nota transportasi lokal, bill hotel, kuitansi penyelenggara / hotel, bukti biaya penyelenggaraan, dan laporan perjalanan dinas.</w:t>
       </w:r>
     </w:p>
@@ -12777,6 +12789,26 @@
         <w:pStyle w:val="Heading2"/>
       </w:pPr>
       <w:r>
+        <w:t xml:space="preserve">Versi 2.5.27 — 12 Oktober 2026</w:t>
+      </w:r>
+    </w:p>
+    <w:p>
+      <w:pPr>
+        <w:pStyle w:val="ListParagraph"/>
+        <w:numPr>
+          <w:ilvl w:val="0"/>
+          <w:numId w:val="2"/>
+        </w:numPr>
+      </w:pPr>
+      <w:r>
+        <w:t xml:space="preserve">Submenu Format WhatsApp: kalimat pesan penagihan berkas dan pesan pemantau server dapat diubah dengan penanda isian, lengkap dengan pratinjau dan tombol kembali ke bawaan.</w:t>
+      </w:r>
+    </w:p>
+    <w:p>
+      <w:pPr>
+        <w:pStyle w:val="Heading2"/>
+      </w:pPr>
+      <w:r>
         <w:t xml:space="preserve">Versi 2.5.26 — 12 Oktober 2026</w:t>
       </w:r>
     </w:p>
@@ -13890,7 +13922,7 @@
           <w:sz w:val="17"/>
           <w:szCs w:val="17"/>
         </w:rPr>
-        <w:t xml:space="preserve">Buku Panduan PANGI v2.5 — Politeknik Kesehatan Kemenkes Manado. Isi buku ini mengikuti sistem sebagaimana berjalan pada 12 Oktober 2026 (versi 2.5.26); bila tampilan di layar berbeda, yang berlaku adalah sistemnya, dan mohon laporkan selisihnya lewat menu Bantuan.</w:t>
+        <w:t xml:space="preserve">Buku Panduan PANGI v2.5 — Politeknik Kesehatan Kemenkes Manado. Isi buku ini mengikuti sistem sebagaimana berjalan pada 12 Oktober 2026 (versi 2.5.27); bila tampilan di layar berbeda, yang berlaku adalah sistemnya, dan mohon laporkan selisihnya lewat menu Bantuan.</w:t>
       </w:r>
     </w:p>
     <w:sectPr>

</xml_diff>

<commit_message>
Submenu Usulan Perjadin Saya (2.5.28)
- Peran yang berhak melihat seluruh usulan mendapat submenu Usulan
  Perjadin -> Usulan Perjadin Saya: daftar yang sama, disaring ke usulan
  yang diajukan untuk diri sendiri, lengkap dengan saringan dan hitungan
  statusnya.
- Setelah mengirim usulan, peran itu kembali ke Usulan Perjadin Saya.

Co-Authored-By: Claude Opus 5.5 <noreply@anthropic.com>
</commit_message>
<xml_diff>
--- a/resources/panduan/Buku-Panduan-PANGI-v2.5.docx
+++ b/resources/panduan/Buku-Panduan-PANGI-v2.5.docx
@@ -239,7 +239,7 @@
                 <w:sz w:val="19"/>
                 <w:szCs w:val="19"/>
               </w:rPr>
-              <w:t xml:space="preserve">2.5.27</w:t>
+              <w:t xml:space="preserve">2.5.28</w:t>
             </w:r>
           </w:p>
         </w:tc>
@@ -6056,7 +6056,7 @@
         <w:spacing w:before="60" w:after="160"/>
       </w:pPr>
       <w:r>
-        <w:t xml:space="preserve">Usulan yang terkirim langsung tampil pada Daftar Usulan Perjadin berstatus Konfirmasi, beserta tahap berikutnya yang sedang ditunggu — biasanya pembayaran uang muka. Usulan yang terkirim dua kali — pelaksana, tanggal, dan surat tugas atau SPD-nya sama — ditandai Duplikat; hapus salah satunya sendiri, walau sudah diajukan, selama belum ada pembayaran dan belum ditandatangani PPK.</w:t>
+        <w:t xml:space="preserve">Usulan yang terkirim langsung tampil pada Daftar Usulan Perjadin berstatus Konfirmasi, beserta tahap berikutnya yang sedang ditunggu — biasanya pembayaran uang muka. Usulan yang terkirim dua kali — pelaksana, tanggal, dan surat tugas atau SPD-nya sama — ditandai Duplikat; hapus salah satunya sendiri, walau sudah diajukan, selama belum ada pembayaran dan belum ditandatangani PPK. Peran yang melihat usulan semua pegawai — misalnya pimpinan dan PPK — menemukan usulan yang diajukannya untuk diri sendiri pada submenu Usulan Perjadin Saya.</w:t>
       </w:r>
     </w:p>
     <w:p>
@@ -12789,6 +12789,26 @@
         <w:pStyle w:val="Heading2"/>
       </w:pPr>
       <w:r>
+        <w:t xml:space="preserve">Versi 2.5.28 — 12 Oktober 2026</w:t>
+      </w:r>
+    </w:p>
+    <w:p>
+      <w:pPr>
+        <w:pStyle w:val="ListParagraph"/>
+        <w:numPr>
+          <w:ilvl w:val="0"/>
+          <w:numId w:val="2"/>
+        </w:numPr>
+      </w:pPr>
+      <w:r>
+        <w:t xml:space="preserve">Submenu Usulan Perjadin Saya bagi peran yang melihat seluruh usulan: hanya memuat usulan yang diajukan untuk diri sendiri.</w:t>
+      </w:r>
+    </w:p>
+    <w:p>
+      <w:pPr>
+        <w:pStyle w:val="Heading2"/>
+      </w:pPr>
+      <w:r>
         <w:t xml:space="preserve">Versi 2.5.27 — 12 Oktober 2026</w:t>
       </w:r>
     </w:p>
@@ -13922,7 +13942,7 @@
           <w:sz w:val="17"/>
           <w:szCs w:val="17"/>
         </w:rPr>
-        <w:t xml:space="preserve">Buku Panduan PANGI v2.5 — Politeknik Kesehatan Kemenkes Manado. Isi buku ini mengikuti sistem sebagaimana berjalan pada 12 Oktober 2026 (versi 2.5.27); bila tampilan di layar berbeda, yang berlaku adalah sistemnya, dan mohon laporkan selisihnya lewat menu Bantuan.</w:t>
+        <w:t xml:space="preserve">Buku Panduan PANGI v2.5 — Politeknik Kesehatan Kemenkes Manado. Isi buku ini mengikuti sistem sebagaimana berjalan pada 12 Oktober 2026 (versi 2.5.28); bila tampilan di layar berbeda, yang berlaku adalah sistemnya, dan mohon laporkan selisihnya lewat menu Bantuan.</w:t>
       </w:r>
     </w:p>
     <w:sectPr>

</xml_diff>

<commit_message>
Daftar Usulan Perjadin khusus peran lihat semua, urutan dan saringan daftar (2.5.29)
- Submenu Daftar Usulan Perjadin hanya bagi peran yang berhak melihat
  seluruh usulan; pelaksana lain memakai Usulan Perjadin Saya, dan tautan
  lama ke daftar diarahkan ke sana beserta saringannya.
- Daftar usulan dapat diurutkan (tanggal berangkat, tanggal dibuat, nomor,
  tujuan, nama pelaksana) lewat pilihan Urutkan maupun judul kolom,
  disaring menurut jalur dan unit kerja, dicari menurut nama atau NIP
  pelaksana, dan memuat 10/25/50 baris per halaman.
- Nomor baris berlanjut antarhalaman, halaman pertama/terakhir selalu
  terjangkau, dan daftar kosong diberi keterangan.
- Panduan, riwayat, gambar usulan-07-daftar, dan buku panduan v2.5.29.

Co-Authored-By: Claude Opus 5.5 <noreply@anthropic.com>
</commit_message>
<xml_diff>
--- a/resources/panduan/Buku-Panduan-PANGI-v2.5.docx
+++ b/resources/panduan/Buku-Panduan-PANGI-v2.5.docx
@@ -239,7 +239,7 @@
                 <w:sz w:val="19"/>
                 <w:szCs w:val="19"/>
               </w:rPr>
-              <w:t xml:space="preserve">2.5.28</w:t>
+              <w:t xml:space="preserve">2.5.29</w:t>
             </w:r>
           </w:p>
         </w:tc>
@@ -6056,7 +6056,7 @@
         <w:spacing w:before="60" w:after="160"/>
       </w:pPr>
       <w:r>
-        <w:t xml:space="preserve">Usulan yang terkirim langsung tampil pada Daftar Usulan Perjadin berstatus Konfirmasi, beserta tahap berikutnya yang sedang ditunggu — biasanya pembayaran uang muka. Usulan yang terkirim dua kali — pelaksana, tanggal, dan surat tugas atau SPD-nya sama — ditandai Duplikat; hapus salah satunya sendiri, walau sudah diajukan, selama belum ada pembayaran dan belum ditandatangani PPK. Peran yang melihat usulan semua pegawai — misalnya pimpinan dan PPK — menemukan usulan yang diajukannya untuk diri sendiri pada submenu Usulan Perjadin Saya.</w:t>
+        <w:t xml:space="preserve">Usulan yang terkirim langsung tampil pada submenu Usulan Perjadin Saya berstatus Konfirmasi, beserta tahap berikutnya yang sedang ditunggu — biasanya pembayaran uang muka. Usulan yang terkirim dua kali — pelaksana, tanggal, dan surat tugas atau SPD-nya sama — ditandai Duplikat; hapus salah satunya sendiri, walau sudah diajukan, selama belum ada pembayaran dan belum ditandatangani PPK. Saring daftarnya menurut jalur, urutkan menurut tanggal berangkat, tanggal dibuat, nomor, atau tujuan, dan pilih 10, 25, atau 50 baris per halaman; judul kolom berpanah juga mengurutkan daftar bila diklik, dan klik kedua membalik arahnya. Submenu Daftar Usulan Perjadin memuat usulan semua pegawai dan hanya tampil bagi peran yang berhak melihat seluruh usulan — misalnya pimpinan dan PPK — dengan tambahan saringan unit kerja, pencarian nama atau NIP pelaksana, dan urutan menurut nama pelaksana.</w:t>
       </w:r>
     </w:p>
     <w:p>
@@ -6068,7 +6068,7 @@
       <w:r>
         <w:drawing>
           <wp:inline distT="0" distB="0" distL="0" distR="0">
-            <wp:extent cx="5400000" cy="3466800"/>
+            <wp:extent cx="5400000" cy="3247500"/>
             <wp:effectExtent l="0" t="0" r="0" b="0"/>
             <wp:docPr id="216" name="usulan-07-daftar"/>
             <wp:cNvGraphicFramePr>
@@ -6090,7 +6090,7 @@
                   <pic:spPr>
                     <a:xfrm>
                       <a:off x="0" y="0"/>
-                      <a:ext cx="5400000" cy="3466800"/>
+                      <a:ext cx="5400000" cy="3247500"/>
                     </a:xfrm>
                     <a:prstGeom prst="rect">
                       <a:avLst/>
@@ -6125,7 +6125,7 @@
         <w:t xml:space="preserve">Gambar 5.17</w:t>
       </w:r>
       <w:r>
-        <w:t xml:space="preserve"> — Pesan berhasil (1), nomor usulan (2), dan statusnya (3) pada Daftar Usulan Perjadin.</w:t>
+        <w:t xml:space="preserve"> — Submenu Usulan Perjadin Saya (1), saringan jalur, urutan, dan banyak baris (2), judul kolom berpanah untuk mengurutkan (3), serta nomor usulan (4) dan statusnya (5).</w:t>
       </w:r>
     </w:p>
     <w:p>
@@ -8758,7 +8758,7 @@
         </w:numPr>
       </w:pPr>
       <w:r>
-        <w:t xml:space="preserve">Administrasi Sistem → Peran &amp; Hak Akses memuat seluruh peran, bawaan maupun buatan, beserta matriks menu: tiap kemampuan berada pada kolom Lihat, Ubah, atau Hapus menunya. Centang yang diizinkan lalu simpan; perubahan berlaku seketika bagi semua pengguna berperan itu dan tercatat pada jejak audit. Pengguna berperan itu menerima notifikasi berisi hak akses yang ditambahkan dan dicabut beserta menunya. Hak Melihat seluruh usulan membuka daftar Usulan Perjadin semua pegawai; menyunting dan menghapus tetap hanya bagi pelaksana, pembuat, atau peserta usulannya. Hak Menghapus komponen rincian biaya (Keuangan → Hapus) mengatur tombol hapus pada detail keuangan, dan hak Melihat persetujuan (Persetujuan → Lihat) membuka menu Persetujuan tanpa ikut menandatangani.</w:t>
+        <w:t xml:space="preserve">Administrasi Sistem → Peran &amp; Hak Akses memuat seluruh peran, bawaan maupun buatan, beserta matriks menu: tiap kemampuan berada pada kolom Lihat, Ubah, atau Hapus menunya. Centang yang diizinkan lalu simpan; perubahan berlaku seketika bagi semua pengguna berperan itu dan tercatat pada jejak audit. Pengguna berperan itu menerima notifikasi berisi hak akses yang ditambahkan dan dicabut beserta menunya. Hak Melihat seluruh usulan membuka submenu Daftar Usulan Perjadin berisi usulan semua pegawai — tanpa hak itu pengguna hanya mendapati Usulan Perjadin Saya; menyunting dan menghapus tetap hanya bagi pelaksana, pembuat, atau peserta usulannya. Hak Menghapus komponen rincian biaya (Keuangan → Hapus) mengatur tombol hapus pada detail keuangan, dan hak Melihat persetujuan (Persetujuan → Lihat) membuka menu Persetujuan tanpa ikut menandatangani.</w:t>
       </w:r>
     </w:p>
     <w:p>
@@ -12789,6 +12789,38 @@
         <w:pStyle w:val="Heading2"/>
       </w:pPr>
       <w:r>
+        <w:t xml:space="preserve">Versi 2.5.29 — 12 Oktober 2026</w:t>
+      </w:r>
+    </w:p>
+    <w:p>
+      <w:pPr>
+        <w:pStyle w:val="ListParagraph"/>
+        <w:numPr>
+          <w:ilvl w:val="0"/>
+          <w:numId w:val="2"/>
+        </w:numPr>
+      </w:pPr>
+      <w:r>
+        <w:t xml:space="preserve">Daftar Usulan Perjadin khusus peran yang melihat seluruh usulan; pelaksana lain memantau usulannya lewat Usulan Perjadin Saya.</w:t>
+      </w:r>
+    </w:p>
+    <w:p>
+      <w:pPr>
+        <w:pStyle w:val="ListParagraph"/>
+        <w:numPr>
+          <w:ilvl w:val="0"/>
+          <w:numId w:val="2"/>
+        </w:numPr>
+      </w:pPr>
+      <w:r>
+        <w:t xml:space="preserve">Daftar usulan dapat diurutkan — lewat pilihan Urutkan maupun judul kolom — disaring menurut jalur dan unit kerja, dicari menurut nama atau NIP pelaksana, dan memuat 10, 25, atau 50 baris per halaman.</w:t>
+      </w:r>
+    </w:p>
+    <w:p>
+      <w:pPr>
+        <w:pStyle w:val="Heading2"/>
+      </w:pPr>
+      <w:r>
         <w:t xml:space="preserve">Versi 2.5.28 — 12 Oktober 2026</w:t>
       </w:r>
     </w:p>
@@ -13942,7 +13974,7 @@
           <w:sz w:val="17"/>
           <w:szCs w:val="17"/>
         </w:rPr>
-        <w:t xml:space="preserve">Buku Panduan PANGI v2.5 — Politeknik Kesehatan Kemenkes Manado. Isi buku ini mengikuti sistem sebagaimana berjalan pada 12 Oktober 2026 (versi 2.5.28); bila tampilan di layar berbeda, yang berlaku adalah sistemnya, dan mohon laporkan selisihnya lewat menu Bantuan.</w:t>
+        <w:t xml:space="preserve">Buku Panduan PANGI v2.5 — Politeknik Kesehatan Kemenkes Manado. Isi buku ini mengikuti sistem sebagaimana berjalan pada 12 Oktober 2026 (versi 2.5.29); bila tampilan di layar berbeda, yang berlaku adalah sistemnya, dan mohon laporkan selisihnya lewat menu Bantuan.</w:t>
       </w:r>
     </w:p>
     <w:sectPr>

</xml_diff>

<commit_message>
Perbaikan galat saat membatalkan pencatatan pelunasan (2.5.30)
- Status lunas hasil Koreksi Status administrator tidak membawa tanggal
  pelunasan, sehingga pembatalannya berakhir dengan galat 500. Jurnal
  pembatalan kini memakai pelunasan terakhir yang tercatat, atau hari ini.
- Usulan yang sudah selesai kembali berstatus disetujui saat pelunasannya
  dibatalkan, sehingga diproses lagi sampai dilunasi.
- Panduan, riwayat, dan buku panduan v2.5.30.

Co-Authored-By: Claude Opus 5.5 <noreply@anthropic.com>
</commit_message>
<xml_diff>
--- a/resources/panduan/Buku-Panduan-PANGI-v2.5.docx
+++ b/resources/panduan/Buku-Panduan-PANGI-v2.5.docx
@@ -239,7 +239,7 @@
                 <w:sz w:val="19"/>
                 <w:szCs w:val="19"/>
               </w:rPr>
-              <w:t xml:space="preserve">2.5.29</w:t>
+              <w:t xml:space="preserve">2.5.30</w:t>
             </w:r>
           </w:p>
         </w:tc>
@@ -264,7 +264,7 @@
                 <w:sz w:val="19"/>
                 <w:szCs w:val="19"/>
               </w:rPr>
-              <w:t xml:space="preserve">12 Oktober 2026</w:t>
+              <w:t xml:space="preserve">13 Oktober 2026</w:t>
             </w:r>
           </w:p>
         </w:tc>
@@ -8218,7 +8218,7 @@
                 <w:sz w:val="20"/>
                 <w:szCs w:val="20"/>
               </w:rPr>
-              <w:t xml:space="preserve">Pembayaran yang telanjur salah dapat dibatalkan, dan pembatalannya ikut tercatat di riwayat sebagai nilai negatif. Rekapitulasi keuangan harus dapat ditelusuri, termasuk kekeliruannya.</w:t>
+              <w:t xml:space="preserve">Pembayaran yang telanjur salah dapat dibatalkan, dan pembatalannya ikut tercatat di riwayat sebagai nilai negatif. Rekapitulasi keuangan harus dapat ditelusuri, termasuk kekeliruannya. Usulan yang sudah selesai kembali diproses bila pelunasannya dibatalkan, sampai dilunasi lagi.</w:t>
             </w:r>
           </w:p>
         </w:tc>
@@ -12789,6 +12789,38 @@
         <w:pStyle w:val="Heading2"/>
       </w:pPr>
       <w:r>
+        <w:t xml:space="preserve">Versi 2.5.30 — 13 Oktober 2026</w:t>
+      </w:r>
+    </w:p>
+    <w:p>
+      <w:pPr>
+        <w:pStyle w:val="ListParagraph"/>
+        <w:numPr>
+          <w:ilvl w:val="0"/>
+          <w:numId w:val="2"/>
+        </w:numPr>
+      </w:pPr>
+      <w:r>
+        <w:t xml:space="preserve">Perbaikan: pembatalan pencatatan pelunasan tidak lagi berakhir dengan halaman galat bila status lunasnya hasil koreksi administrator tanpa tanggal pelunasan.</w:t>
+      </w:r>
+    </w:p>
+    <w:p>
+      <w:pPr>
+        <w:pStyle w:val="ListParagraph"/>
+        <w:numPr>
+          <w:ilvl w:val="0"/>
+          <w:numId w:val="2"/>
+        </w:numPr>
+      </w:pPr>
+      <w:r>
+        <w:t xml:space="preserve">Usulan yang sudah selesai kembali berstatus disetujui saat pelunasannya dibatalkan.</w:t>
+      </w:r>
+    </w:p>
+    <w:p>
+      <w:pPr>
+        <w:pStyle w:val="Heading2"/>
+      </w:pPr>
+      <w:r>
         <w:t xml:space="preserve">Versi 2.5.29 — 12 Oktober 2026</w:t>
       </w:r>
     </w:p>
@@ -13974,7 +14006,7 @@
           <w:sz w:val="17"/>
           <w:szCs w:val="17"/>
         </w:rPr>
-        <w:t xml:space="preserve">Buku Panduan PANGI v2.5 — Politeknik Kesehatan Kemenkes Manado. Isi buku ini mengikuti sistem sebagaimana berjalan pada 12 Oktober 2026 (versi 2.5.29); bila tampilan di layar berbeda, yang berlaku adalah sistemnya, dan mohon laporkan selisihnya lewat menu Bantuan.</w:t>
+        <w:t xml:space="preserve">Buku Panduan PANGI v2.5 — Politeknik Kesehatan Kemenkes Manado. Isi buku ini mengikuti sistem sebagaimana berjalan pada 13 Oktober 2026 (versi 2.5.30); bila tampilan di layar berbeda, yang berlaku adalah sistemnya, dan mohon laporkan selisihnya lewat menu Bantuan.</w:t>
       </w:r>
     </w:p>
     <w:sectPr>

</xml_diff>

<commit_message>
Pembatalan lunas hasil Koreksi Status tanpa jurnal negatif (2.5.31)
- Status lunas hasil Koreksi Status administrator tidak menulis pelunasan
  ke riwayat pembayaran. Pembatalannya kini hanya dijurnal bila masih ada
  pelunasan tercatat yang belum dibatalkan, sehingga rekap tidak memuat
  pengurangan tanpa pembayaran asalnya.
- Pelunasan tercatat yang tanggalnya terhapus koreksi tetap diimbangi
  pembatalannya pada tanggal pelunasan itu.
- Riwayat dan buku panduan v2.5.31.

Co-Authored-By: Claude Opus 5.5 <noreply@anthropic.com>
</commit_message>
<xml_diff>
--- a/resources/panduan/Buku-Panduan-PANGI-v2.5.docx
+++ b/resources/panduan/Buku-Panduan-PANGI-v2.5.docx
@@ -239,7 +239,7 @@
                 <w:sz w:val="19"/>
                 <w:szCs w:val="19"/>
               </w:rPr>
-              <w:t xml:space="preserve">2.5.30</w:t>
+              <w:t xml:space="preserve">2.5.31</w:t>
             </w:r>
           </w:p>
         </w:tc>
@@ -12789,6 +12789,26 @@
         <w:pStyle w:val="Heading2"/>
       </w:pPr>
       <w:r>
+        <w:t xml:space="preserve">Versi 2.5.31 — 13 Oktober 2026</w:t>
+      </w:r>
+    </w:p>
+    <w:p>
+      <w:pPr>
+        <w:pStyle w:val="ListParagraph"/>
+        <w:numPr>
+          <w:ilvl w:val="0"/>
+          <w:numId w:val="2"/>
+        </w:numPr>
+      </w:pPr>
+      <w:r>
+        <w:t xml:space="preserve">Pembatalan status lunas hasil Koreksi Status tidak menulis pengurangan pada riwayat pembayaran, karena pelunasannya belum pernah tercatat di sana.</w:t>
+      </w:r>
+    </w:p>
+    <w:p>
+      <w:pPr>
+        <w:pStyle w:val="Heading2"/>
+      </w:pPr>
+      <w:r>
         <w:t xml:space="preserve">Versi 2.5.30 — 13 Oktober 2026</w:t>
       </w:r>
     </w:p>
@@ -14006,7 +14026,7 @@
           <w:sz w:val="17"/>
           <w:szCs w:val="17"/>
         </w:rPr>
-        <w:t xml:space="preserve">Buku Panduan PANGI v2.5 — Politeknik Kesehatan Kemenkes Manado. Isi buku ini mengikuti sistem sebagaimana berjalan pada 13 Oktober 2026 (versi 2.5.30); bila tampilan di layar berbeda, yang berlaku adalah sistemnya, dan mohon laporkan selisihnya lewat menu Bantuan.</w:t>
+        <w:t xml:space="preserve">Buku Panduan PANGI v2.5 — Politeknik Kesehatan Kemenkes Manado. Isi buku ini mengikuti sistem sebagaimana berjalan pada 13 Oktober 2026 (versi 2.5.31); bila tampilan di layar berbeda, yang berlaku adalah sistemnya, dan mohon laporkan selisihnya lewat menu Bantuan.</w:t>
       </w:r>
     </w:p>
     <w:sectPr>

</xml_diff>

<commit_message>
Koreksi Status ke Lunas mewajibkan tanggal pelunasan (2.5.32)
- Koreksi Status ke Lunas meminta tanggal pelunasan; kolomnya muncul saat
  Lunas dipilih. Koreksi tetap tidak menulis riwayat pembayaran.
- Mencatat pelunasan atas usulan yang lunas tanpa tanggal kini ditolak
  dengan pesan, bukan galat 500.
- Panduan, riwayat, dan buku panduan v2.5.32.

Co-Authored-By: Claude Opus 5.5 <noreply@anthropic.com>
</commit_message>
<xml_diff>
--- a/resources/panduan/Buku-Panduan-PANGI-v2.5.docx
+++ b/resources/panduan/Buku-Panduan-PANGI-v2.5.docx
@@ -239,7 +239,7 @@
                 <w:sz w:val="19"/>
                 <w:szCs w:val="19"/>
               </w:rPr>
-              <w:t xml:space="preserve">2.5.31</w:t>
+              <w:t xml:space="preserve">2.5.32</w:t>
             </w:r>
           </w:p>
         </w:tc>
@@ -8218,7 +8218,7 @@
                 <w:sz w:val="20"/>
                 <w:szCs w:val="20"/>
               </w:rPr>
-              <w:t xml:space="preserve">Pembayaran yang telanjur salah dapat dibatalkan, dan pembatalannya ikut tercatat di riwayat sebagai nilai negatif. Rekapitulasi keuangan harus dapat ditelusuri, termasuk kekeliruannya. Usulan yang sudah selesai kembali diproses bila pelunasannya dibatalkan, sampai dilunasi lagi.</w:t>
+              <w:t xml:space="preserve">Pembayaran yang telanjur salah dapat dibatalkan, dan pembatalannya ikut tercatat di riwayat sebagai nilai negatif. Rekapitulasi keuangan harus dapat ditelusuri, termasuk kekeliruannya. Usulan yang sudah selesai kembali diproses bila pelunasannya dibatalkan, sampai dilunasi lagi. Koreksi Status ke Lunas oleh administrator meminta tanggal pelunasan dan tidak menambah riwayat pembayaran — pembayaran sebenarnya tetap dicatat bendahara.</w:t>
             </w:r>
           </w:p>
         </w:tc>
@@ -12789,6 +12789,38 @@
         <w:pStyle w:val="Heading2"/>
       </w:pPr>
       <w:r>
+        <w:t xml:space="preserve">Versi 2.5.32 — 13 Oktober 2026</w:t>
+      </w:r>
+    </w:p>
+    <w:p>
+      <w:pPr>
+        <w:pStyle w:val="ListParagraph"/>
+        <w:numPr>
+          <w:ilvl w:val="0"/>
+          <w:numId w:val="2"/>
+        </w:numPr>
+      </w:pPr>
+      <w:r>
+        <w:t xml:space="preserve">Koreksi Status ke Lunas mewajibkan tanggal pelunasan, sehingga dokumen cetak tidak lagi menganggap sisa bayarnya belum dibayar.</w:t>
+      </w:r>
+    </w:p>
+    <w:p>
+      <w:pPr>
+        <w:pStyle w:val="ListParagraph"/>
+        <w:numPr>
+          <w:ilvl w:val="0"/>
+          <w:numId w:val="2"/>
+        </w:numPr>
+      </w:pPr>
+      <w:r>
+        <w:t xml:space="preserve">Perbaikan: mencatat pelunasan atas usulan yang lunas tanpa tanggal ditolak dengan pesan, bukan halaman galat.</w:t>
+      </w:r>
+    </w:p>
+    <w:p>
+      <w:pPr>
+        <w:pStyle w:val="Heading2"/>
+      </w:pPr>
+      <w:r>
         <w:t xml:space="preserve">Versi 2.5.31 — 13 Oktober 2026</w:t>
       </w:r>
     </w:p>
@@ -14026,7 +14058,7 @@
           <w:sz w:val="17"/>
           <w:szCs w:val="17"/>
         </w:rPr>
-        <w:t xml:space="preserve">Buku Panduan PANGI v2.5 — Politeknik Kesehatan Kemenkes Manado. Isi buku ini mengikuti sistem sebagaimana berjalan pada 13 Oktober 2026 (versi 2.5.31); bila tampilan di layar berbeda, yang berlaku adalah sistemnya, dan mohon laporkan selisihnya lewat menu Bantuan.</w:t>
+        <w:t xml:space="preserve">Buku Panduan PANGI v2.5 — Politeknik Kesehatan Kemenkes Manado. Isi buku ini mengikuti sistem sebagaimana berjalan pada 13 Oktober 2026 (versi 2.5.32); bila tampilan di layar berbeda, yang berlaku adalah sistemnya, dan mohon laporkan selisihnya lewat menu Bantuan.</w:t>
       </w:r>
     </w:p>
     <w:sectPr>

</xml_diff>

<commit_message>
Popup cara memasukkan SPD ke SRIKANDI sebelum unduh, klasifikasi KU.02.05 (2.5.33)
- Unduh PDF pada detail dan daftar SPD membuka jendela cara memasukkan SPD
  ke SRIKANDI beserta catatan agar mengajukan usulan perjadin setelah SPD
  ditandatangani. PDF baru terunduh setelah pelaksana mencentang "Saya
  sudah mengerti" dan menekan Mengerti, Unduh PDF.
- Klasifikasi SPD di SRIKANDI kini KU.02.05 pada contoh pengisian
  Registrasi Naskah Keluar, contoh nomor SPD, Panduan, dan buku.
- Riwayat dan buku panduan v2.5.33.

Co-Authored-By: Claude Opus 5.5 <noreply@anthropic.com>
</commit_message>
<xml_diff>
--- a/resources/panduan/Buku-Panduan-PANGI-v2.5.docx
+++ b/resources/panduan/Buku-Panduan-PANGI-v2.5.docx
@@ -239,7 +239,7 @@
                 <w:sz w:val="19"/>
                 <w:szCs w:val="19"/>
               </w:rPr>
-              <w:t xml:space="preserve">2.5.32</w:t>
+              <w:t xml:space="preserve">2.5.33</w:t>
             </w:r>
           </w:p>
         </w:tc>
@@ -5089,7 +5089,7 @@
         <w:spacing w:before="60" w:after="160"/>
       </w:pPr>
       <w:r>
-        <w:t xml:space="preserve">Halaman SPD yang baru disimpan memuat keterangan Langkah berikutnya: (1) tekan Unduh PDF — dokumennya sudah berformat SRIKANDI, jadi penanda ${nomor_naskah}, ${ttd_pengirim1}, dan ${ttd_pengirim2} jangan diubah atau dihapus; (2) masukkan dokumen itu ke SRIKANDI lewat Naskah Keluar → Registrasi Naskah Keluar dan ajukan tanda tangan kepada PPK (lembar pertama) dan Direktur (lembar kedua); (3) setelah selesai diproses, unduh SPD bertanda tangan dari SRIKANDI dan catat nomor naskahnya — nomor PJ-… di PANGI hanya nomor internal; (4) lanjutkan dengan mengajukan usulan perjalanan dinas memakai dokumen dan nomor itu (bagian 5.2). SPD yang dibuat bersama pelaksana lain dapat dikurangi satu pelaksana saja lewat tombol Hapus pada daftar Pelaksana — SPD dan pelaksana lainnya tetap. Pembuat SPD dapat menghapus pelaksana mana pun atau SPD seluruhnya; pelaksana lain hanya menghapus dirinya sendiri lewat Hapus Saya dari SPD, setelah usulannya dari SPD itu dibatalkan atau dihapus bila sudah ada.</w:t>
+        <w:t xml:space="preserve">Halaman SPD yang baru disimpan memuat keterangan Langkah berikutnya: (1) tekan Unduh PDF — sebelum terunduh, muncul jendela berisi cara memasukkan SPD ke SRIKANDI dan pengingat mengajukan usulan perjadin setelah SPD ditandatangani; centang Saya sudah mengerti, lalu tekan Mengerti, Unduh PDF. Dokumennya sudah berformat SRIKANDI, jadi penanda ${nomor_naskah}, ${ttd_pengirim1}, dan ${ttd_pengirim2} jangan diubah atau dihapus; (2) masukkan dokumen itu ke SRIKANDI lewat Naskah Keluar → Registrasi Naskah Keluar dan ajukan tanda tangan kepada PPK (lembar pertama) dan Direktur (lembar kedua); (3) setelah selesai diproses, unduh SPD bertanda tangan dari SRIKANDI dan catat nomor naskahnya — nomor PJ-… di PANGI hanya nomor internal; (4) lanjutkan dengan mengajukan usulan perjalanan dinas memakai dokumen dan nomor itu (bagian 5.2). SPD yang dibuat bersama pelaksana lain dapat dikurangi satu pelaksana saja lewat tombol Hapus pada daftar Pelaksana — SPD dan pelaksana lainnya tetap. Pembuat SPD dapat menghapus pelaksana mana pun atau SPD seluruhnya; pelaksana lain hanya menghapus dirinya sendiri lewat Hapus Saya dari SPD, setelah usulannya dari SPD itu dibatalkan atau dihapus bila sudah ada.</w:t>
       </w:r>
     </w:p>
     <w:p>
@@ -5167,7 +5167,7 @@
         <w:t xml:space="preserve">Klasifikasi: </w:t>
       </w:r>
       <w:r>
-        <w:t xml:space="preserve">KU.02.04 – Belanja Modal</w:t>
+        <w:t xml:space="preserve">KU.02.05</w:t>
       </w:r>
     </w:p>
     <w:p>
@@ -5348,7 +5348,7 @@
         <w:t xml:space="preserve">Gambar 5.8</w:t>
       </w:r>
       <w:r>
-        <w:t xml:space="preserve"> — Registrasi Naskah Keluar di SRIKANDI: Tipe Form Naskah Keluar (1), dikirim melalui PPK (2), Naskah Dinas bersifat Biasa (3), klasifikasi KU.02.04 (4), Ambil Nomor (5), Hal dan Isi Ringkas (6), lalu berkas SPD (7).</w:t>
+        <w:t xml:space="preserve"> — Registrasi Naskah Keluar di SRIKANDI: Tipe Form Naskah Keluar (1), dikirim melalui PPK (2), Naskah Dinas bersifat Biasa (3), klasifikasi (4) — pilih KU.02.05, Ambil Nomor (5), Hal dan Isi Ringkas (6), lalu berkas SPD (7).</w:t>
       </w:r>
     </w:p>
     <w:p>
@@ -11809,7 +11809,7 @@
                 <w:sz w:val="19"/>
                 <w:szCs w:val="19"/>
               </w:rPr>
-              <w:t xml:space="preserve">KU.02.04/F.XXX.8/[urut]/[tahun]</w:t>
+              <w:t xml:space="preserve">KU.02.05/F.XXX.8/[urut]/[tahun]</w:t>
             </w:r>
           </w:p>
         </w:tc>
@@ -12789,6 +12789,38 @@
         <w:pStyle w:val="Heading2"/>
       </w:pPr>
       <w:r>
+        <w:t xml:space="preserve">Versi 2.5.33 — 13 Oktober 2026</w:t>
+      </w:r>
+    </w:p>
+    <w:p>
+      <w:pPr>
+        <w:pStyle w:val="ListParagraph"/>
+        <w:numPr>
+          <w:ilvl w:val="0"/>
+          <w:numId w:val="2"/>
+        </w:numPr>
+      </w:pPr>
+      <w:r>
+        <w:t xml:space="preserve">Unduh PDF pada SPD menampilkan jendela cara memasukkan SPD ke SRIKANDI beserta pengingat mengajukan usulan perjadin; PDF baru terunduh setelah pelaksana menyatakan sudah mengerti.</w:t>
+      </w:r>
+    </w:p>
+    <w:p>
+      <w:pPr>
+        <w:pStyle w:val="ListParagraph"/>
+        <w:numPr>
+          <w:ilvl w:val="0"/>
+          <w:numId w:val="2"/>
+        </w:numPr>
+      </w:pPr>
+      <w:r>
+        <w:t xml:space="preserve">Klasifikasi SPD di SRIKANDI kini KU.02.05, menggantikan KU.02.04.</w:t>
+      </w:r>
+    </w:p>
+    <w:p>
+      <w:pPr>
+        <w:pStyle w:val="Heading2"/>
+      </w:pPr>
+      <w:r>
         <w:t xml:space="preserve">Versi 2.5.32 — 13 Oktober 2026</w:t>
       </w:r>
     </w:p>
@@ -14058,7 +14090,7 @@
           <w:sz w:val="17"/>
           <w:szCs w:val="17"/>
         </w:rPr>
-        <w:t xml:space="preserve">Buku Panduan PANGI v2.5 — Politeknik Kesehatan Kemenkes Manado. Isi buku ini mengikuti sistem sebagaimana berjalan pada 13 Oktober 2026 (versi 2.5.32); bila tampilan di layar berbeda, yang berlaku adalah sistemnya, dan mohon laporkan selisihnya lewat menu Bantuan.</w:t>
+        <w:t xml:space="preserve">Buku Panduan PANGI v2.5 — Politeknik Kesehatan Kemenkes Manado. Isi buku ini mengikuti sistem sebagaimana berjalan pada 13 Oktober 2026 (versi 2.5.33); bila tampilan di layar berbeda, yang berlaku adalah sistemnya, dan mohon laporkan selisihnya lewat menu Bantuan.</w:t>
       </w:r>
     </w:p>
     <w:sectPr>

</xml_diff>

<commit_message>
Pagu per kode akun dan realisasinya, pagu TA 2026 terbaru (2.5.34)
- Tabel pagu_akun: pagu maksimal tiap kode akun per tahun anggaran beserta
  sumber dananya, dikelola di Master Data -> Tahun Anggaran -> Pagu per
  akun. Pagu tahun anggaran menjadi jumlah pagu akunnya.
- Migrasi data pagu TA 2026 menurut Rincian Kertas Kerja Satker:
  Rp 2.375.475.000 (524111 RM 437.132.000, 524119 RM 144.048.000,
  525115 Belanja Perjalanan BLU 1.794.295.000); akun 525115 ditambahkan.
- Dashboard Eksekutif dan Master Data menampilkan pagu dan realisasi per
  kode akun (dibebankan menurut akun pada daftar nominatif) serta rekap
  per sumber dana; akun yang melebihi pagu ditandai merah.
- Realisasi Master Data memakai hitungan Dashboard Eksekutif.
- Panduan, riwayat, dan buku panduan v2.5.34.

Co-Authored-By: Claude Opus 5.5 <noreply@anthropic.com>
</commit_message>
<xml_diff>
--- a/resources/panduan/Buku-Panduan-PANGI-v2.5.docx
+++ b/resources/panduan/Buku-Panduan-PANGI-v2.5.docx
@@ -239,7 +239,7 @@
                 <w:sz w:val="19"/>
                 <w:szCs w:val="19"/>
               </w:rPr>
-              <w:t xml:space="preserve">2.5.33</w:t>
+              <w:t xml:space="preserve">2.5.34</w:t>
             </w:r>
           </w:p>
         </w:tc>
@@ -264,7 +264,7 @@
                 <w:sz w:val="19"/>
                 <w:szCs w:val="19"/>
               </w:rPr>
-              <w:t xml:space="preserve">13 Oktober 2026</w:t>
+              <w:t xml:space="preserve">14 Oktober 2026</w:t>
             </w:r>
           </w:p>
         </w:tc>
@@ -8686,7 +8686,7 @@
                 <w:sz w:val="19"/>
                 <w:szCs w:val="19"/>
               </w:rPr>
-              <w:t xml:space="preserve">Periode yang tersedia pada laporan dan rekap</w:t>
+              <w:t xml:space="preserve">Periode laporan dan rekap, serta pagu per kode akun beserta sumber dananya (tombol Pagu per akun); pagu tahun anggaran menjadi jumlahnya</w:t>
             </w:r>
           </w:p>
         </w:tc>
@@ -9050,7 +9050,7 @@
         </w:numPr>
       </w:pPr>
       <w:r>
-        <w:t xml:space="preserve">Dashboard Eksekutif → Dashboard Utama — realisasi anggaran per kategori dan per bulan, pergerakan pegawai per unit kerja, serta siapa yang akan berangkat, sedang berjalan, dan belum melapor. Tahun anggarannya dapat dipilih. Bila super administrator sudah memasang kunci API Anthropic di Pengaturan Sistem, panel Wawasan AI dan agen tanya-jawab ikut aktif di halaman ini.</w:t>
+        <w:t xml:space="preserve">Dashboard Eksekutif → Dashboard Utama — realisasi anggaran per kategori dan per bulan, pergerakan pegawai per unit kerja, serta siapa yang akan berangkat, sedang berjalan, dan belum melapor. Tahun anggarannya dapat dipilih. Kartu Pagu dan Realisasi per Kode Akun membandingkan pagu tiap akun dengan realisasinya — dibebankan menurut akun pada daftar nominatif — lengkap dengan sisa, serapan, akun yang melebihi pagu, dan rekap per sumber dana (RM dan BLU). Bila super administrator sudah memasang kunci API Anthropic di Pengaturan Sistem, panel Wawasan AI dan agen tanya-jawab ikut aktif di halaman ini.</w:t>
       </w:r>
     </w:p>
     <w:p>
@@ -12789,6 +12789,50 @@
         <w:pStyle w:val="Heading2"/>
       </w:pPr>
       <w:r>
+        <w:t xml:space="preserve">Versi 2.5.34 — 14 Oktober 2026</w:t>
+      </w:r>
+    </w:p>
+    <w:p>
+      <w:pPr>
+        <w:pStyle w:val="ListParagraph"/>
+        <w:numPr>
+          <w:ilvl w:val="0"/>
+          <w:numId w:val="2"/>
+        </w:numPr>
+      </w:pPr>
+      <w:r>
+        <w:t xml:space="preserve">Pagu per kode akun pada Master Data → Tahun Anggaran → Pagu per akun, beserta sumber dananya; pagu tahun anggaran menjadi jumlahnya.</w:t>
+      </w:r>
+    </w:p>
+    <w:p>
+      <w:pPr>
+        <w:pStyle w:val="ListParagraph"/>
+        <w:numPr>
+          <w:ilvl w:val="0"/>
+          <w:numId w:val="2"/>
+        </w:numPr>
+      </w:pPr>
+      <w:r>
+        <w:t xml:space="preserve">Pagu TA 2026 menurut Rincian Kertas Kerja Satker: Rp 2.375.475.000 — 524111 Rp 437.132.000 (RM), 524119 Rp 144.048.000 (RM), 525115 Rp 1.794.295.000 (BLU).</w:t>
+      </w:r>
+    </w:p>
+    <w:p>
+      <w:pPr>
+        <w:pStyle w:val="ListParagraph"/>
+        <w:numPr>
+          <w:ilvl w:val="0"/>
+          <w:numId w:val="2"/>
+        </w:numPr>
+      </w:pPr>
+      <w:r>
+        <w:t xml:space="preserve">Dashboard Eksekutif dan Master Data menampilkan pagu dan realisasi per kode akun serta rekap per sumber dana; akun yang melebihi pagu ditandai merah.</w:t>
+      </w:r>
+    </w:p>
+    <w:p>
+      <w:pPr>
+        <w:pStyle w:val="Heading2"/>
+      </w:pPr>
+      <w:r>
         <w:t xml:space="preserve">Versi 2.5.33 — 13 Oktober 2026</w:t>
       </w:r>
     </w:p>
@@ -14090,7 +14134,7 @@
           <w:sz w:val="17"/>
           <w:szCs w:val="17"/>
         </w:rPr>
-        <w:t xml:space="preserve">Buku Panduan PANGI v2.5 — Politeknik Kesehatan Kemenkes Manado. Isi buku ini mengikuti sistem sebagaimana berjalan pada 13 Oktober 2026 (versi 2.5.33); bila tampilan di layar berbeda, yang berlaku adalah sistemnya, dan mohon laporkan selisihnya lewat menu Bantuan.</w:t>
+        <w:t xml:space="preserve">Buku Panduan PANGI v2.5 — Politeknik Kesehatan Kemenkes Manado. Isi buku ini mengikuti sistem sebagaimana berjalan pada 14 Oktober 2026 (versi 2.5.34); bila tampilan di layar berbeda, yang berlaku adalah sistemnya, dan mohon laporkan selisihnya lewat menu Bantuan.</w:t>
       </w:r>
     </w:p>
     <w:sectPr>

</xml_diff>

<commit_message>
Rincian biaya bertanda tangan bendahara bersisa nol (2.5.35)
- Perhitungan SPD Rampung pada cetakan rincian biaya: setelah pembayaran
  dikonfirmasi bendahara, yang telah dibayarkan sama dengan jumlah yang
  ditetapkan sehingga sisa kurang / lebih Rp 0 — juga untuk lunas hasil
  Koreksi Status yang tidak membawa tanggal pelunasan.
- Riwayat dan buku panduan v2.5.35.

Co-Authored-By: Claude Opus 5.5 <noreply@anthropic.com>
</commit_message>
<xml_diff>
--- a/resources/panduan/Buku-Panduan-PANGI-v2.5.docx
+++ b/resources/panduan/Buku-Panduan-PANGI-v2.5.docx
@@ -239,7 +239,7 @@
                 <w:sz w:val="19"/>
                 <w:szCs w:val="19"/>
               </w:rPr>
-              <w:t xml:space="preserve">2.5.34</w:t>
+              <w:t xml:space="preserve">2.5.35</w:t>
             </w:r>
           </w:p>
         </w:tc>
@@ -12789,6 +12789,26 @@
         <w:pStyle w:val="Heading2"/>
       </w:pPr>
       <w:r>
+        <w:t xml:space="preserve">Versi 2.5.35 — 14 Oktober 2026</w:t>
+      </w:r>
+    </w:p>
+    <w:p>
+      <w:pPr>
+        <w:pStyle w:val="ListParagraph"/>
+        <w:numPr>
+          <w:ilvl w:val="0"/>
+          <w:numId w:val="2"/>
+        </w:numPr>
+      </w:pPr>
+      <w:r>
+        <w:t xml:space="preserve">Perbaikan: rincian biaya yang sudah ditandatangani bendahara mencatat seluruh jumlahnya sebagai telah dibayarkan, sehingga sisa pada Perhitungan SPD Rampung menjadi Rp 0.</w:t>
+      </w:r>
+    </w:p>
+    <w:p>
+      <w:pPr>
+        <w:pStyle w:val="Heading2"/>
+      </w:pPr>
+      <w:r>
         <w:t xml:space="preserve">Versi 2.5.34 — 14 Oktober 2026</w:t>
       </w:r>
     </w:p>
@@ -14134,7 +14154,7 @@
           <w:sz w:val="17"/>
           <w:szCs w:val="17"/>
         </w:rPr>
-        <w:t xml:space="preserve">Buku Panduan PANGI v2.5 — Politeknik Kesehatan Kemenkes Manado. Isi buku ini mengikuti sistem sebagaimana berjalan pada 14 Oktober 2026 (versi 2.5.34); bila tampilan di layar berbeda, yang berlaku adalah sistemnya, dan mohon laporkan selisihnya lewat menu Bantuan.</w:t>
+        <w:t xml:space="preserve">Buku Panduan PANGI v2.5 — Politeknik Kesehatan Kemenkes Manado. Isi buku ini mengikuti sistem sebagaimana berjalan pada 14 Oktober 2026 (versi 2.5.35); bila tampilan di layar berbeda, yang berlaku adalah sistemnya, dan mohon laporkan selisihnya lewat menu Bantuan.</w:t>
       </w:r>
     </w:p>
     <w:sectPr>

</xml_diff>

<commit_message>
Verifikator SPD di SRIKANDI cukup Wakil Direktur II dan Sekretaris (2.5.36)
- Contoh pengisian Registrasi Naskah Keluar (detail SPD, popup unduh SPD,
  dan Panduan): Kepala Sub Bagian Administrasi Umum tidak lagi menjadi
  verifikator.
- Panduan, riwayat, dan buku panduan v2.5.36.

Co-Authored-By: Claude Opus 5.5 <noreply@anthropic.com>
</commit_message>
<xml_diff>
--- a/resources/panduan/Buku-Panduan-PANGI-v2.5.docx
+++ b/resources/panduan/Buku-Panduan-PANGI-v2.5.docx
@@ -239,7 +239,7 @@
                 <w:sz w:val="19"/>
                 <w:szCs w:val="19"/>
               </w:rPr>
-              <w:t xml:space="preserve">2.5.35</w:t>
+              <w:t xml:space="preserve">2.5.36</w:t>
             </w:r>
           </w:p>
         </w:tc>
@@ -5247,7 +5247,7 @@
         <w:t xml:space="preserve">Verifikator: </w:t>
       </w:r>
       <w:r>
-        <w:t xml:space="preserve">Kepala Sub Bagian Administrasi Umum, Wakil Direktur II, dan Sekretaris</w:t>
+        <w:t xml:space="preserve">Wakil Direktur II dan Sekretaris</w:t>
       </w:r>
     </w:p>
     <w:p>
@@ -5417,7 +5417,7 @@
         <w:t xml:space="preserve">Gambar 5.9</w:t>
       </w:r>
       <w:r>
-        <w:t xml:space="preserve"> — Unggah PDF SPD (1), pelaksana sebagai tujuan utama (2), verifikator (3), penandatangan PPK lalu Direktur (4), tanda tangan elektronik ber-QR 3x3 (5), lalu Simpan (6).</w:t>
+        <w:t xml:space="preserve"> — Unggah PDF SPD (1), pelaksana sebagai tujuan utama (2), verifikator (3) — kini cukup Wakil Direktur II dan Sekretaris, penandatangan PPK lalu Direktur (4), tanda tangan elektronik ber-QR 3x3 (5), lalu Simpan (6).</w:t>
       </w:r>
     </w:p>
     <w:p>
@@ -12789,6 +12789,26 @@
         <w:pStyle w:val="Heading2"/>
       </w:pPr>
       <w:r>
+        <w:t xml:space="preserve">Versi 2.5.36 — 14 Oktober 2026</w:t>
+      </w:r>
+    </w:p>
+    <w:p>
+      <w:pPr>
+        <w:pStyle w:val="ListParagraph"/>
+        <w:numPr>
+          <w:ilvl w:val="0"/>
+          <w:numId w:val="2"/>
+        </w:numPr>
+      </w:pPr>
+      <w:r>
+        <w:t xml:space="preserve">Verifikator SPD di SRIKANDI kini cukup Wakil Direktur II dan Sekretaris.</w:t>
+      </w:r>
+    </w:p>
+    <w:p>
+      <w:pPr>
+        <w:pStyle w:val="Heading2"/>
+      </w:pPr>
+      <w:r>
         <w:t xml:space="preserve">Versi 2.5.35 — 14 Oktober 2026</w:t>
       </w:r>
     </w:p>
@@ -14154,7 +14174,7 @@
           <w:sz w:val="17"/>
           <w:szCs w:val="17"/>
         </w:rPr>
-        <w:t xml:space="preserve">Buku Panduan PANGI v2.5 — Politeknik Kesehatan Kemenkes Manado. Isi buku ini mengikuti sistem sebagaimana berjalan pada 14 Oktober 2026 (versi 2.5.35); bila tampilan di layar berbeda, yang berlaku adalah sistemnya, dan mohon laporkan selisihnya lewat menu Bantuan.</w:t>
+        <w:t xml:space="preserve">Buku Panduan PANGI v2.5 — Politeknik Kesehatan Kemenkes Manado. Isi buku ini mengikuti sistem sebagaimana berjalan pada 14 Oktober 2026 (versi 2.5.36); bila tampilan di layar berbeda, yang berlaku adalah sistemnya, dan mohon laporkan selisihnya lewat menu Bantuan.</w:t>
       </w:r>
     </w:p>
     <w:sectPr>

</xml_diff>

<commit_message>
Cek nomor surat tugas dan pakai ulang berkasnya, daftar surat tugas di Jejak Audit (2.5.37)
- Tombol Cek Nomor Surat Tugas pada formulir buat/ubah usulan dan SPD.
  Nomor dibandingkan tanpa membedakan huruf besar-kecil dan spasi. Bila
  surat tugas bernomor sama sudah pernah diunggah (usulan atau SPD lain),
  berkasnya disalin otomatis dan unggahan tidak diwajibkan; bila belum,
  berkas tetap wajib diunggah. Server memakai aturan yang sama walau
  tombol Cek tidak ditekan.
- Formulir usulan kini meminta nomor surat tugas sebelum berkasnya.
- Jejak Audit -> Surat Tugas & Dokumen: tiap nomor surat tugas beserta
  berkasnya, pengunggah pertama, serta usulan dan SPD yang memakainya.
- Panduan, riwayat, dan buku panduan v2.5.37.

Co-Authored-By: Claude Opus 5.5 <noreply@anthropic.com>
</commit_message>
<xml_diff>
--- a/resources/panduan/Buku-Panduan-PANGI-v2.5.docx
+++ b/resources/panduan/Buku-Panduan-PANGI-v2.5.docx
@@ -239,7 +239,7 @@
                 <w:sz w:val="19"/>
                 <w:szCs w:val="19"/>
               </w:rPr>
-              <w:t xml:space="preserve">2.5.36</w:t>
+              <w:t xml:space="preserve">2.5.37</w:t>
             </w:r>
           </w:p>
         </w:tc>
@@ -4830,7 +4830,7 @@
         <w:rPr>
           <w:color w:val="55616F"/>
         </w:rPr>
-        <w:t xml:space="preserve">  Pada kartu Surat Tugas, unggah berkasnya (PDF, JPG, atau PNG, maks. 5 MB) dan salin nomornya persis seperti tertulis. Tidak wajib, tetapi bila diisi di sini, usulan perjadin yang memilih SPD ini tidak perlu mengunggah dan menyalin nomornya lagi — keduanya diambil dari SPD. Saat menyunting, biarkan kolom berkasnya kosong untuk mempertahankan yang sudah ada.</w:t>
+        <w:t xml:space="preserve">  Pada kartu Surat Tugas, unggah berkasnya (PDF, JPG, atau PNG, maks. 5 MB) dan salin nomornya persis seperti tertulis. Tidak wajib, tetapi bila diisi di sini, usulan perjadin yang memilih SPD ini tidak perlu mengunggah dan menyalin nomornya lagi — keduanya diambil dari SPD. Tombol Cek Nomor Surat Tugas memeriksa apakah nomornya sudah pernah diunggah; bila sudah dan kolom berkasnya dibiarkan kosong, berkas itulah yang dipakai. Saat menyunting, biarkan kolom berkasnya kosong untuk mempertahankan yang sudah ada.</w:t>
       </w:r>
     </w:p>
     <w:p>
@@ -5538,7 +5538,7 @@
         <w:rPr>
           <w:color w:val="55616F"/>
         </w:rPr>
-        <w:t xml:space="preserve">  Bila ada, tujuan, tanggal, dan maksud terisi sendiri dari SPD yang dipilih. Nomor SPD sengaja tidak ikut terisi, karena yang diisi nomor naskah dari SRIKANDI. Bila SPD itu sudah melampirkan surat tugas, berkas dan nomor surat tugasnya ikut diambil — tidak perlu diunggah maupun disalin lagi. Bila tidak ada, lewati dan isi data perjalanan secara manual, termasuk mengunggah surat tugas beserta nomornya. Satu SPD hanya untuk satu usulan: SPD yang sudah dipakai usulan Anda tidak tampil lagi pada daftarnya, dan muncul kembali setelah usulan itu dibatalkan atau dihapus.</w:t>
+        <w:t xml:space="preserve">  Bila ada, tujuan, tanggal, dan maksud terisi sendiri dari SPD yang dipilih. Nomor SPD sengaja tidak ikut terisi, karena yang diisi nomor naskah dari SRIKANDI. Bila SPD itu sudah melampirkan surat tugas, berkas dan nomor surat tugasnya ikut diambil — tidak perlu diunggah maupun disalin lagi. Bila tidak ada, lewati dan isi data perjalanan secara manual, termasuk mengunggah surat tugas beserta nomornya. Ketik nomor surat tugasnya lalu tekan Cek Nomor Surat Tugas: bila surat tugas bernomor sama sudah pernah diunggah rekan seperjalanan — pada usulan maupun SPD — berkasnya dipakai otomatis; bila belum, unggah berkasnya. Satu SPD hanya untuk satu usulan: SPD yang sudah dipakai usulan Anda tidak tampil lagi pada daftarnya, dan muncul kembali setelah usulan itu dibatalkan atau dihapus.</w:t>
       </w:r>
     </w:p>
     <w:p>
@@ -8738,7 +8738,7 @@
         </w:numPr>
       </w:pPr>
       <w:r>
-        <w:t xml:space="preserve">Jejak Audit mencatat setiap tindakan yang mengubah data beserta pelakunya dan waktunya, pada submenu Semua Aktivitas. Submenu Penghapusan Usulan &amp; SPD memuat usulan perjadin dan SPD yang dihapus lengkap dengan isinya — nomor, pelaksana, tujuan, tanggal perjalanan — serta siapa yang menghapus, kapan, dan dari alamat mana. Submenu Nomor Surat mendaftar nomor SPD aplikasi, nomor SPD bertanda tangan, dan nomor surat tugas per bulan dan tahun, dan dapat diekspor ke Excel untuk dicocokkan arsiparis dengan buku agenda surat keluar.</w:t>
+        <w:t xml:space="preserve">Jejak Audit mencatat setiap tindakan yang mengubah data beserta pelakunya dan waktunya, pada submenu Semua Aktivitas. Submenu Penghapusan Usulan &amp; SPD memuat usulan perjadin dan SPD yang dihapus lengkap dengan isinya — nomor, pelaksana, tujuan, tanggal perjalanan — serta siapa yang menghapus, kapan, dan dari alamat mana. Submenu Nomor Surat mendaftar nomor SPD aplikasi, nomor SPD bertanda tangan, dan nomor surat tugas per bulan dan tahun, dan dapat diekspor ke Excel untuk dicocokkan arsiparis dengan buku agenda surat keluar. Submenu Surat Tugas &amp; Dokumen mendaftar tiap nomor surat tugas beserta berkasnya, siapa yang pertama mengunggah, dan usulan serta SPD yang memakainya.</w:t>
       </w:r>
     </w:p>
     <w:p>
@@ -12789,6 +12789,38 @@
         <w:pStyle w:val="Heading2"/>
       </w:pPr>
       <w:r>
+        <w:t xml:space="preserve">Versi 2.5.37 — 14 Oktober 2026</w:t>
+      </w:r>
+    </w:p>
+    <w:p>
+      <w:pPr>
+        <w:pStyle w:val="ListParagraph"/>
+        <w:numPr>
+          <w:ilvl w:val="0"/>
+          <w:numId w:val="2"/>
+        </w:numPr>
+      </w:pPr>
+      <w:r>
+        <w:t xml:space="preserve">Tombol Cek Nomor Surat Tugas pada formulir usulan perjadin dan SPD: surat tugas bernomor sama yang sudah pernah diunggah dipakai otomatis tanpa unggah ulang.</w:t>
+      </w:r>
+    </w:p>
+    <w:p>
+      <w:pPr>
+        <w:pStyle w:val="ListParagraph"/>
+        <w:numPr>
+          <w:ilvl w:val="0"/>
+          <w:numId w:val="2"/>
+        </w:numPr>
+      </w:pPr>
+      <w:r>
+        <w:t xml:space="preserve">Jejak Audit → Surat Tugas &amp; Dokumen: tiap nomor surat tugas beserta berkasnya, pengunggah pertama, serta usulan dan SPD yang memakainya.</w:t>
+      </w:r>
+    </w:p>
+    <w:p>
+      <w:pPr>
+        <w:pStyle w:val="Heading2"/>
+      </w:pPr>
+      <w:r>
         <w:t xml:space="preserve">Versi 2.5.36 — 14 Oktober 2026</w:t>
       </w:r>
     </w:p>
@@ -14174,7 +14206,7 @@
           <w:sz w:val="17"/>
           <w:szCs w:val="17"/>
         </w:rPr>
-        <w:t xml:space="preserve">Buku Panduan PANGI v2.5 — Politeknik Kesehatan Kemenkes Manado. Isi buku ini mengikuti sistem sebagaimana berjalan pada 14 Oktober 2026 (versi 2.5.36); bila tampilan di layar berbeda, yang berlaku adalah sistemnya, dan mohon laporkan selisihnya lewat menu Bantuan.</w:t>
+        <w:t xml:space="preserve">Buku Panduan PANGI v2.5 — Politeknik Kesehatan Kemenkes Manado. Isi buku ini mengikuti sistem sebagaimana berjalan pada 14 Oktober 2026 (versi 2.5.37); bila tampilan di layar berbeda, yang berlaku adalah sistemnya, dan mohon laporkan selisihnya lewat menu Bantuan.</w:t>
       </w:r>
     </w:p>
     <w:sectPr>

</xml_diff>

<commit_message>
Nota transport hanya untuk luar kota lintas pulau (2.5.38)
- Susunan bawaan berkas pertanggungjawaban: nota / bukti biaya
  transportasi hanya ditagih pada jalur luar kota lintas pulau. Jalur
  dalam kota, luar kota dalam satu provinsi, dan supervisi tidak lagi
  menagihnya, sehingga daftar pengeluaran riilnya kosong dan berkasnya
  langsung dapat masuk daftar nominatif.
- Bagian nota pada dokumen pertanggungjawaban hanya tampil bila jalurnya
  menagih nota; nota bernominal yang telanjur tersimpan tetap tampil.
- Migrasi data melepaskan nota_transport dari pengaturan berkas yang
  sudah tersimpan untuk jalur selain lintas pulau.
- Panduan, riwayat, dan buku panduan v2.5.38.

Co-Authored-By: Claude Opus 5.5 <noreply@anthropic.com>
</commit_message>
<xml_diff>
--- a/resources/panduan/Buku-Panduan-PANGI-v2.5.docx
+++ b/resources/panduan/Buku-Panduan-PANGI-v2.5.docx
@@ -239,7 +239,7 @@
                 <w:sz w:val="19"/>
                 <w:szCs w:val="19"/>
               </w:rPr>
-              <w:t xml:space="preserve">2.5.37</w:t>
+              <w:t xml:space="preserve">2.5.38</w:t>
             </w:r>
           </w:p>
         </w:tc>
@@ -6592,7 +6592,7 @@
                 <w:sz w:val="19"/>
                 <w:szCs w:val="19"/>
               </w:rPr>
-              <w:t xml:space="preserve">Bila ada biaya</w:t>
+              <w:t xml:space="preserve">–</w:t>
             </w:r>
           </w:p>
         </w:tc>
@@ -6936,7 +6936,7 @@
         <w:spacing w:before="60" w:after="160"/>
       </w:pPr>
       <w:r>
-        <w:t xml:space="preserve">Luar kota dalam satu provinsi menagih berkas yang sama dengan luar kota lintas pulau, kecuali tiket pergi dan pulang — perjalanannya umumnya lewat darat.</w:t>
+        <w:t xml:space="preserve">Luar kota dalam satu provinsi menagih berkas yang sama dengan luar kota lintas pulau, kecuali tiket pergi dan pulang serta nota transport lokal — perjalanannya umumnya lewat darat. Nota / bukti transport lokal hanya ditagih pada perjalanan luar kota lintas pulau; jalur lain tidak memiliki transport lokal, sehingga daftar pengeluaran riilnya kosong, tidak perlu ditandatangani, dan berkasnya langsung dapat masuk daftar nominatif.</w:t>
       </w:r>
     </w:p>
     <w:p>
@@ -6996,7 +6996,7 @@
                 <w:sz w:val="20"/>
                 <w:szCs w:val="20"/>
               </w:rPr>
-              <w:t xml:space="preserve">Nota hanya ditagih untuk ruas yang bernominal; ruas tanpa biaya dikosongkan, dan perjalanan tanpa transport lokal sama sekali tetap dapat selesai. Dalam kota cukup satu baris transport lokal. Biaya penyelenggaraan (kontribusi atau registrasi kegiatan) ditanya dulu ada atau tidak — bila ada, nominal dan bukti bayarnya wajib, nomor invoice bila diterbitkan penyelenggara — dan tercantum pada rincian biaya di bawah uang penginapan. Bila biaya itu sudah termasuk hotel, centang Sudah termasuk penginapan (hotel): bill hotel tidak perlu diunggah dan uang penginapan tidak dibayarkan terpisah.</w:t>
+              <w:t xml:space="preserve">Nota hanya ditagih pada perjalanan luar kota lintas pulau, dan hanya untuk ruas yang bernominal; ruas tanpa biaya dikosongkan, dan perjalanan tanpa transport lokal sama sekali tetap dapat selesai. Biaya penyelenggaraan (kontribusi atau registrasi kegiatan) ditanya dulu ada atau tidak — bila ada, nominal dan bukti bayarnya wajib, nomor invoice bila diterbitkan penyelenggara — dan tercantum pada rincian biaya di bawah uang penginapan. Bila biaya itu sudah termasuk hotel, centang Sudah termasuk penginapan (hotel): bill hotel tidak perlu diunggah dan uang penginapan tidak dibayarkan terpisah.</w:t>
             </w:r>
           </w:p>
         </w:tc>
@@ -8930,7 +8930,7 @@
         </w:numPr>
       </w:pPr>
       <w:r>
-        <w:t xml:space="preserve">Nota transportasi dan bukti biaya penyelenggaraan bersifat bersyarat: hanya ditagih bila memang ada nominalnya. Tiap jalur dapat dikembalikan ke bawaan dengan satu tombol.</w:t>
+        <w:t xml:space="preserve">Nota transportasi dan bukti biaya penyelenggaraan bersifat bersyarat: hanya ditagih bila memang ada nominalnya. Secara bawaan nota transportasi hanya ditagih pada jalur luar kota lintas pulau. Tiap jalur dapat dikembalikan ke bawaan dengan satu tombol.</w:t>
       </w:r>
     </w:p>
     <w:p>
@@ -12789,6 +12789,26 @@
         <w:pStyle w:val="Heading2"/>
       </w:pPr>
       <w:r>
+        <w:t xml:space="preserve">Versi 2.5.38 — 14 Oktober 2026</w:t>
+      </w:r>
+    </w:p>
+    <w:p>
+      <w:pPr>
+        <w:pStyle w:val="ListParagraph"/>
+        <w:numPr>
+          <w:ilvl w:val="0"/>
+          <w:numId w:val="2"/>
+        </w:numPr>
+      </w:pPr>
+      <w:r>
+        <w:t xml:space="preserve">Nota / bukti biaya transportasi hanya diminta pada perjalanan luar kota lintas pulau; jalur lain langsung dapat masuk daftar nominatif tanpa daftar pengeluaran riil.</w:t>
+      </w:r>
+    </w:p>
+    <w:p>
+      <w:pPr>
+        <w:pStyle w:val="Heading2"/>
+      </w:pPr>
+      <w:r>
         <w:t xml:space="preserve">Versi 2.5.37 — 14 Oktober 2026</w:t>
       </w:r>
     </w:p>
@@ -14206,7 +14226,7 @@
           <w:sz w:val="17"/>
           <w:szCs w:val="17"/>
         </w:rPr>
-        <w:t xml:space="preserve">Buku Panduan PANGI v2.5 — Politeknik Kesehatan Kemenkes Manado. Isi buku ini mengikuti sistem sebagaimana berjalan pada 14 Oktober 2026 (versi 2.5.37); bila tampilan di layar berbeda, yang berlaku adalah sistemnya, dan mohon laporkan selisihnya lewat menu Bantuan.</w:t>
+        <w:t xml:space="preserve">Buku Panduan PANGI v2.5 — Politeknik Kesehatan Kemenkes Manado. Isi buku ini mengikuti sistem sebagaimana berjalan pada 14 Oktober 2026 (versi 2.5.38); bila tampilan di layar berbeda, yang berlaku adalah sistemnya, dan mohon laporkan selisihnya lewat menu Bantuan.</w:t>
       </w:r>
     </w:p>
     <w:sectPr>

</xml_diff>

<commit_message>
Cek nomor tiket, transaksi hotel, dan invoice penyelenggaraan pada dokumen (2.5.39)
- Tombol Cek Nomor Tiket: invoice tiket yang sudah diunggah rekan
  serombongan dipakai, dan kota asal, kota tujuan, serta kode booking
  diisikan. Harga tiket dan boarding pass tetap masing-masing.
- Tombol Cek Nomor Transaksi: bill hotel dan kuitansi penyelenggara /
  hotel milik rekan dipakai; nominal tetap masing-masing.
- Tombol Cek Nomor Invoice: bukti bayar biaya penyelenggaraan dipakai.
- Berkas disalin, bukan dipakai bersama, dan server memakai aturan yang
  sama walau tombol Cek tidak ditekan. Nomor baru tetap wajib diunggah.
- Panduan, riwayat, dan buku panduan v2.5.39.

Co-Authored-By: Claude Opus 5.5 <noreply@anthropic.com>
</commit_message>
<xml_diff>
--- a/resources/panduan/Buku-Panduan-PANGI-v2.5.docx
+++ b/resources/panduan/Buku-Panduan-PANGI-v2.5.docx
@@ -239,7 +239,7 @@
                 <w:sz w:val="19"/>
                 <w:szCs w:val="19"/>
               </w:rPr>
-              <w:t xml:space="preserve">2.5.38</w:t>
+              <w:t xml:space="preserve">2.5.39</w:t>
             </w:r>
           </w:p>
         </w:tc>
@@ -6214,6 +6214,11 @@
         <w:t xml:space="preserve">Bila nominal sebuah komponen — tiket pergi, tiket pulang, bill hotel, atau biaya penyelenggaraan — sudah ditetapkan tim keuangan, kolom nominalnya terkunci pada angka itu dan Anda cukup mengunggah buktinya. Dengan begitu satu komponen tidak tercatat dua kali pada rincian biaya; bila angkanya berbeda dengan bukti Anda, sampaikan kepada tim keuangan. Nota transport lokal yang diunggah wajib diisi nominalnya — tanpa nominal, nota itu tidak masuk transport lokal dan tidak diganti. Nota yang salah unggah dapat dihapus lewat centang Hapus nota ruas ini.</w:t>
       </w:r>
     </w:p>
+    <w:p>
+      <w:r>
+        <w:t xml:space="preserve">Berkas rombongan cukup diunggah sekali: ketik nomor tiket, nomor transaksi hotel, atau nomor invoice biaya penyelenggaraan lalu tekan tombol Cek. Bila rekan sudah mengunggahnya, invoice tiket — beserta kota asal, kota tujuan, dan kode booking — bill hotel dan kuitansinya, atau bukti bayar penyelenggaraan dipakai otomatis. Harga tiket, nominal, dan boarding pass tetap diisi masing-masing; bila nomornya belum ada, unggah berkasnya seperti biasa.</w:t>
+      </w:r>
+    </w:p>
     <w:tbl>
       <w:tblPr>
         <w:tblW w:type="dxa" w:w="9026"/>
@@ -12789,6 +12794,26 @@
         <w:pStyle w:val="Heading2"/>
       </w:pPr>
       <w:r>
+        <w:t xml:space="preserve">Versi 2.5.39 — 14 Oktober 2026</w:t>
+      </w:r>
+    </w:p>
+    <w:p>
+      <w:pPr>
+        <w:pStyle w:val="ListParagraph"/>
+        <w:numPr>
+          <w:ilvl w:val="0"/>
+          <w:numId w:val="2"/>
+        </w:numPr>
+      </w:pPr>
+      <w:r>
+        <w:t xml:space="preserve">Tombol Cek Nomor Tiket, Cek Nomor Transaksi, dan Cek Nomor Invoice pada dokumen pertanggungjawaban memakai berkas rombongan yang sudah diunggah rekan; harga, nominal, dan boarding pass tetap masing-masing.</w:t>
+      </w:r>
+    </w:p>
+    <w:p>
+      <w:pPr>
+        <w:pStyle w:val="Heading2"/>
+      </w:pPr>
+      <w:r>
         <w:t xml:space="preserve">Versi 2.5.38 — 14 Oktober 2026</w:t>
       </w:r>
     </w:p>
@@ -14226,7 +14251,7 @@
           <w:sz w:val="17"/>
           <w:szCs w:val="17"/>
         </w:rPr>
-        <w:t xml:space="preserve">Buku Panduan PANGI v2.5 — Politeknik Kesehatan Kemenkes Manado. Isi buku ini mengikuti sistem sebagaimana berjalan pada 14 Oktober 2026 (versi 2.5.38); bila tampilan di layar berbeda, yang berlaku adalah sistemnya, dan mohon laporkan selisihnya lewat menu Bantuan.</w:t>
+        <w:t xml:space="preserve">Buku Panduan PANGI v2.5 — Politeknik Kesehatan Kemenkes Manado. Isi buku ini mengikuti sistem sebagaimana berjalan pada 14 Oktober 2026 (versi 2.5.39); bila tampilan di layar berbeda, yang berlaku adalah sistemnya, dan mohon laporkan selisihnya lewat menu Bantuan.</w:t>
       </w:r>
     </w:p>
     <w:sectPr>

</xml_diff>

<commit_message>
Kunci unggahan berkas yang ditemukan tombol Cek (2.5.40)
- Surat tugas, invoice tiket, bill hotel dan kuitansi, serta bukti bayar
  biaya penyelenggaraan yang ditemukan tombol Cek mengunci kolom
  unggahnya di formulir; pemeriksaannya berjalan sendiri saat formulir
  dibuka dengan nomor terisi.
- Server mengabaikan unggahan lain selama nomornya cocok dengan berkas
  rombongan, kecuali bagi pengunggah aslinya. Salinan bertanda awalan
  "bersama-" pada nama berkasnya, dan berkas asli diutamakan.
- Panduan, riwayat, dan buku panduan v2.5.40.

Co-Authored-By: Claude Opus 5.5 <noreply@anthropic.com>
</commit_message>
<xml_diff>
--- a/resources/panduan/Buku-Panduan-PANGI-v2.5.docx
+++ b/resources/panduan/Buku-Panduan-PANGI-v2.5.docx
@@ -239,7 +239,7 @@
                 <w:sz w:val="19"/>
                 <w:szCs w:val="19"/>
               </w:rPr>
-              <w:t xml:space="preserve">2.5.39</w:t>
+              <w:t xml:space="preserve">2.5.40</w:t>
             </w:r>
           </w:p>
         </w:tc>
@@ -5538,7 +5538,7 @@
         <w:rPr>
           <w:color w:val="55616F"/>
         </w:rPr>
-        <w:t xml:space="preserve">  Bila ada, tujuan, tanggal, dan maksud terisi sendiri dari SPD yang dipilih. Nomor SPD sengaja tidak ikut terisi, karena yang diisi nomor naskah dari SRIKANDI. Bila SPD itu sudah melampirkan surat tugas, berkas dan nomor surat tugasnya ikut diambil — tidak perlu diunggah maupun disalin lagi. Bila tidak ada, lewati dan isi data perjalanan secara manual, termasuk mengunggah surat tugas beserta nomornya. Ketik nomor surat tugasnya lalu tekan Cek Nomor Surat Tugas: bila surat tugas bernomor sama sudah pernah diunggah rekan seperjalanan — pada usulan maupun SPD — berkasnya dipakai otomatis; bila belum, unggah berkasnya. Satu SPD hanya untuk satu usulan: SPD yang sudah dipakai usulan Anda tidak tampil lagi pada daftarnya, dan muncul kembali setelah usulan itu dibatalkan atau dihapus.</w:t>
+        <w:t xml:space="preserve">  Bila ada, tujuan, tanggal, dan maksud terisi sendiri dari SPD yang dipilih. Nomor SPD sengaja tidak ikut terisi, karena yang diisi nomor naskah dari SRIKANDI. Bila SPD itu sudah melampirkan surat tugas, berkas dan nomor surat tugasnya ikut diambil — tidak perlu diunggah maupun disalin lagi. Bila tidak ada, lewati dan isi data perjalanan secara manual, termasuk mengunggah surat tugas beserta nomornya. Ketik nomor surat tugasnya lalu tekan Cek Nomor Surat Tugas: bila surat tugas bernomor sama sudah pernah diunggah rekan seperjalanan — pada usulan maupun SPD — berkasnya dipakai otomatis; bila belum, unggah berkasnya. Surat tugas yang ditemukan mengunci kolom unggahnya supaya tidak tertimpa berkas lain. Satu SPD hanya untuk satu usulan: SPD yang sudah dipakai usulan Anda tidak tampil lagi pada daftarnya, dan muncul kembali setelah usulan itu dibatalkan atau dihapus.</w:t>
       </w:r>
     </w:p>
     <w:p>
@@ -6216,7 +6216,7 @@
     </w:p>
     <w:p>
       <w:r>
-        <w:t xml:space="preserve">Berkas rombongan cukup diunggah sekali: ketik nomor tiket, nomor transaksi hotel, atau nomor invoice biaya penyelenggaraan lalu tekan tombol Cek. Bila rekan sudah mengunggahnya, invoice tiket — beserta kota asal, kota tujuan, dan kode booking — bill hotel dan kuitansinya, atau bukti bayar penyelenggaraan dipakai otomatis. Harga tiket, nominal, dan boarding pass tetap diisi masing-masing; bila nomornya belum ada, unggah berkasnya seperti biasa.</w:t>
+        <w:t xml:space="preserve">Berkas rombongan cukup diunggah sekali: ketik nomor tiket, nomor transaksi hotel, atau nomor invoice biaya penyelenggaraan lalu tekan tombol Cek. Bila rekan sudah mengunggahnya, invoice tiket — beserta kota asal, kota tujuan, dan kode booking — bill hotel dan kuitansinya, atau bukti bayar penyelenggaraan dipakai otomatis. Harga tiket, nominal, dan boarding pass tetap diisi masing-masing; bila nomornya belum ada, unggah berkasnya seperti biasa. Begitu berkasnya ditemukan, kolom unggahnya dikunci supaya berkas rombongan tidak tertimpa berkas lain — kecuali bagi pengunggah aslinya, yang tetap dapat membetulkan berkasnya sendiri. Ubah nomornya bila berkas Anda memang berbeda.</w:t>
       </w:r>
     </w:p>
     <w:tbl>
@@ -12794,6 +12794,26 @@
         <w:pStyle w:val="Heading2"/>
       </w:pPr>
       <w:r>
+        <w:t xml:space="preserve">Versi 2.5.40 — 14 Oktober 2026</w:t>
+      </w:r>
+    </w:p>
+    <w:p>
+      <w:pPr>
+        <w:pStyle w:val="ListParagraph"/>
+        <w:numPr>
+          <w:ilvl w:val="0"/>
+          <w:numId w:val="2"/>
+        </w:numPr>
+      </w:pPr>
+      <w:r>
+        <w:t xml:space="preserve">Berkas yang ditemukan tombol Cek mengunci kolom unggahnya supaya berkas rombongan tidak tertimpa berkas lain; pengunggah aslinya tetap dapat membetulkan berkasnya sendiri.</w:t>
+      </w:r>
+    </w:p>
+    <w:p>
+      <w:pPr>
+        <w:pStyle w:val="Heading2"/>
+      </w:pPr>
+      <w:r>
         <w:t xml:space="preserve">Versi 2.5.39 — 14 Oktober 2026</w:t>
       </w:r>
     </w:p>
@@ -14251,7 +14271,7 @@
           <w:sz w:val="17"/>
           <w:szCs w:val="17"/>
         </w:rPr>
-        <w:t xml:space="preserve">Buku Panduan PANGI v2.5 — Politeknik Kesehatan Kemenkes Manado. Isi buku ini mengikuti sistem sebagaimana berjalan pada 14 Oktober 2026 (versi 2.5.39); bila tampilan di layar berbeda, yang berlaku adalah sistemnya, dan mohon laporkan selisihnya lewat menu Bantuan.</w:t>
+        <w:t xml:space="preserve">Buku Panduan PANGI v2.5 — Politeknik Kesehatan Kemenkes Manado. Isi buku ini mengikuti sistem sebagaimana berjalan pada 14 Oktober 2026 (versi 2.5.40); bila tampilan di layar berbeda, yang berlaku adalah sistemnya, dan mohon laporkan selisihnya lewat menu Bantuan.</w:t>
       </w:r>
     </w:p>
     <w:sectPr>

</xml_diff>

<commit_message>
Unggahan berkas laporan perjalanan dinas yang opsional (2.5.41)
- Formulir laporan perjalanan dinas memuat kolom Berkas laporan
  (opsional; PDF, Word, JPG, PNG, maks. 10 MB) untuk laporan lengkap yang
  sudah disusun pelaksana. Berkas dapat diganti atau dihapus selama laporan
  belum dikirim; isian formulir tetap diisi karena itulah yang dikonfirmasi
  pimpinan.
- Berkasnya terbuka pada halaman Lihat Laporan dan kartu laporan di detail
  keuangan.
- Migrasi kolom laporan_perjadin.berkas_laporan.
- Panduan, riwayat, dan buku panduan v2.5.41.

Co-Authored-By: Claude Opus 5.5 <noreply@anthropic.com>
</commit_message>
<xml_diff>
--- a/resources/panduan/Buku-Panduan-PANGI-v2.5.docx
+++ b/resources/panduan/Buku-Panduan-PANGI-v2.5.docx
@@ -239,7 +239,7 @@
                 <w:sz w:val="19"/>
                 <w:szCs w:val="19"/>
               </w:rPr>
-              <w:t xml:space="preserve">2.5.40</w:t>
+              <w:t xml:space="preserve">2.5.41</w:t>
             </w:r>
           </w:p>
         </w:tc>
@@ -264,7 +264,7 @@
                 <w:sz w:val="19"/>
                 <w:szCs w:val="19"/>
               </w:rPr>
-              <w:t xml:space="preserve">14 Oktober 2026</w:t>
+              <w:t xml:space="preserve">15 Oktober 2026</w:t>
             </w:r>
           </w:p>
         </w:tc>
@@ -7066,7 +7066,7 @@
         <w:rPr>
           <w:color w:val="55616F"/>
         </w:rPr>
-        <w:t xml:space="preserve">  Tindak lanjut memuat penanggung jawab, target selesai, dan statusnya.</w:t>
+        <w:t xml:space="preserve">  Tindak lanjut memuat penanggung jawab, target selesai, dan statusnya. Laporan lengkap yang sudah Anda susun — misalnya berfoto — dapat diunggah pada kolom Berkas laporan (opsional; PDF, Word, JPG, atau PNG, maks. 10 MB); isian formulir tetap diisi karena itulah yang dikonfirmasi pimpinan.</w:t>
       </w:r>
     </w:p>
     <w:p>
@@ -12794,6 +12794,26 @@
         <w:pStyle w:val="Heading2"/>
       </w:pPr>
       <w:r>
+        <w:t xml:space="preserve">Versi 2.5.41 — 15 Oktober 2026</w:t>
+      </w:r>
+    </w:p>
+    <w:p>
+      <w:pPr>
+        <w:pStyle w:val="ListParagraph"/>
+        <w:numPr>
+          <w:ilvl w:val="0"/>
+          <w:numId w:val="2"/>
+        </w:numPr>
+      </w:pPr>
+      <w:r>
+        <w:t xml:space="preserve">Laporan perjalanan dinas dapat dilengkapi berkas laporan yang diunggah (opsional), terbuka pada halaman laporan dan detail keuangan.</w:t>
+      </w:r>
+    </w:p>
+    <w:p>
+      <w:pPr>
+        <w:pStyle w:val="Heading2"/>
+      </w:pPr>
+      <w:r>
         <w:t xml:space="preserve">Versi 2.5.40 — 14 Oktober 2026</w:t>
       </w:r>
     </w:p>
@@ -14271,7 +14291,7 @@
           <w:sz w:val="17"/>
           <w:szCs w:val="17"/>
         </w:rPr>
-        <w:t xml:space="preserve">Buku Panduan PANGI v2.5 — Politeknik Kesehatan Kemenkes Manado. Isi buku ini mengikuti sistem sebagaimana berjalan pada 14 Oktober 2026 (versi 2.5.40); bila tampilan di layar berbeda, yang berlaku adalah sistemnya, dan mohon laporkan selisihnya lewat menu Bantuan.</w:t>
+        <w:t xml:space="preserve">Buku Panduan PANGI v2.5 — Politeknik Kesehatan Kemenkes Manado. Isi buku ini mengikuti sistem sebagaimana berjalan pada 15 Oktober 2026 (versi 2.5.41); bila tampilan di layar berbeda, yang berlaku adalah sistemnya, dan mohon laporkan selisihnya lewat menu Bantuan.</w:t>
       </w:r>
     </w:p>
     <w:sectPr>

</xml_diff>

<commit_message>
Hak akses menu Dokumen: lihat seluruh perjadin dan bantu unggah (2.5.42)
- Kemampuan baru Melihat dokumen seluruh perjalanan dinas (Dokumen → Lihat)
  dan Membantu mengunggah dokumen pertanggungjawaban (Dokumen → Ubah) pada
  matriks Peran & Hak Akses; yang membantu mengunggah otomatis boleh melihat.
- Dokumen Perdin dan List Laporan Perjadin menampilkan semua pegawai beserta
  pelaksananya bagi pemegang hak lihat; formulir dokumen terkunci (mode lihat
  saja) bagi yang tidak berhak mengunggah.
- Unggahan atas nama pelaksana tercatat di jejak audit dengan nama
  pengunggahnya dan dikabarkan ke pelaksana lewat notifikasi. Isi laporan
  perjalanan dinas tetap disusun pelaksananya.

Co-Authored-By: Claude Opus 5.5 <noreply@anthropic.com>
</commit_message>
<xml_diff>
--- a/resources/panduan/Buku-Panduan-PANGI-v2.5.docx
+++ b/resources/panduan/Buku-Panduan-PANGI-v2.5.docx
@@ -239,7 +239,7 @@
                 <w:sz w:val="19"/>
                 <w:szCs w:val="19"/>
               </w:rPr>
-              <w:t xml:space="preserve">2.5.41</w:t>
+              <w:t xml:space="preserve">2.5.42</w:t>
             </w:r>
           </w:p>
         </w:tc>
@@ -6206,7 +6206,7 @@
     </w:p>
     <w:p>
       <w:r>
-        <w:t xml:space="preserve">Berkas yang ditagih berbeda menurut wilayah perjalanannya. Formulir dokumen sudah menyesuaikan diri — bagian yang tidak berlaku tidak ditampilkan — dan checklist kelengkapannya mengikuti isian formulir itu persis.</w:t>
+        <w:t xml:space="preserve">Berkas yang ditagih berbeda menurut wilayah perjalanannya. Formulir dokumen sudah menyesuaikan diri — bagian yang tidak berlaku tidak ditampilkan — dan checklist kelengkapannya mengikuti isian formulir itu persis. Petugas yang diberi hak membantu mengunggah dapat mengunggahkan berkas Anda; setiap kali itu terjadi Anda menerima notifikasi, dan jejak audit mencatat nama pengunggahnya.</w:t>
       </w:r>
     </w:p>
     <w:p>
@@ -8763,7 +8763,7 @@
         </w:numPr>
       </w:pPr>
       <w:r>
-        <w:t xml:space="preserve">Administrasi Sistem → Peran &amp; Hak Akses memuat seluruh peran, bawaan maupun buatan, beserta matriks menu: tiap kemampuan berada pada kolom Lihat, Ubah, atau Hapus menunya. Centang yang diizinkan lalu simpan; perubahan berlaku seketika bagi semua pengguna berperan itu dan tercatat pada jejak audit. Pengguna berperan itu menerima notifikasi berisi hak akses yang ditambahkan dan dicabut beserta menunya. Hak Melihat seluruh usulan membuka submenu Daftar Usulan Perjadin berisi usulan semua pegawai — tanpa hak itu pengguna hanya mendapati Usulan Perjadin Saya; menyunting dan menghapus tetap hanya bagi pelaksana, pembuat, atau peserta usulannya. Hak Menghapus komponen rincian biaya (Keuangan → Hapus) mengatur tombol hapus pada detail keuangan, dan hak Melihat persetujuan (Persetujuan → Lihat) membuka menu Persetujuan tanpa ikut menandatangani.</w:t>
+        <w:t xml:space="preserve">Administrasi Sistem → Peran &amp; Hak Akses memuat seluruh peran, bawaan maupun buatan, beserta matriks menu: tiap kemampuan berada pada kolom Lihat, Ubah, atau Hapus menunya. Centang yang diizinkan lalu simpan; perubahan berlaku seketika bagi semua pengguna berperan itu dan tercatat pada jejak audit. Pengguna berperan itu menerima notifikasi berisi hak akses yang ditambahkan dan dicabut beserta menunya. Hak Melihat seluruh usulan membuka submenu Daftar Usulan Perjadin berisi usulan semua pegawai — tanpa hak itu pengguna hanya mendapati Usulan Perjadin Saya; menyunting dan menghapus tetap hanya bagi pelaksana, pembuat, atau peserta usulannya. Hak Menghapus komponen rincian biaya (Keuangan → Hapus) mengatur tombol hapus pada detail keuangan, dan hak Melihat persetujuan (Persetujuan → Lihat) membuka menu Persetujuan tanpa ikut menandatangani. Hak Melihat dokumen seluruh perjalanan dinas (Dokumen → Lihat) membuka Dokumen Perdin dan List Laporan Perjadin semua pegawai dalam mode lihat saja, sedangkan hak Membantu mengunggah dokumen pertanggungjawaban (Dokumen → Ubah) membolehkan mengunggah berkas atas nama pelaksana — pelaksana menerima notifikasi dan jejak audit mencatat nama pengunggahnya; laporan perjalanan dinas tetap disusun pelaksananya.</w:t>
       </w:r>
     </w:p>
     <w:p>
@@ -12794,6 +12794,26 @@
         <w:pStyle w:val="Heading2"/>
       </w:pPr>
       <w:r>
+        <w:t xml:space="preserve">Versi 2.5.42 — 15 Oktober 2026</w:t>
+      </w:r>
+    </w:p>
+    <w:p>
+      <w:pPr>
+        <w:pStyle w:val="ListParagraph"/>
+        <w:numPr>
+          <w:ilvl w:val="0"/>
+          <w:numId w:val="2"/>
+        </w:numPr>
+      </w:pPr>
+      <w:r>
+        <w:t xml:space="preserve">Hak akses baru pada menu Dokumen: melihat dokumen seluruh perjalanan dinas (mode lihat saja) dan membantu mengunggah dokumen pertanggungjawaban atas nama pelaksana, dengan notifikasi kepada pelaksana dan catatan jejak audit.</w:t>
+      </w:r>
+    </w:p>
+    <w:p>
+      <w:pPr>
+        <w:pStyle w:val="Heading2"/>
+      </w:pPr>
+      <w:r>
         <w:t xml:space="preserve">Versi 2.5.41 — 15 Oktober 2026</w:t>
       </w:r>
     </w:p>
@@ -14291,7 +14311,7 @@
           <w:sz w:val="17"/>
           <w:szCs w:val="17"/>
         </w:rPr>
-        <w:t xml:space="preserve">Buku Panduan PANGI v2.5 — Politeknik Kesehatan Kemenkes Manado. Isi buku ini mengikuti sistem sebagaimana berjalan pada 15 Oktober 2026 (versi 2.5.41); bila tampilan di layar berbeda, yang berlaku adalah sistemnya, dan mohon laporkan selisihnya lewat menu Bantuan.</w:t>
+        <w:t xml:space="preserve">Buku Panduan PANGI v2.5 — Politeknik Kesehatan Kemenkes Manado. Isi buku ini mengikuti sistem sebagaimana berjalan pada 15 Oktober 2026 (versi 2.5.42); bila tampilan di layar berbeda, yang berlaku adalah sistemnya, dan mohon laporkan selisihnya lewat menu Bantuan.</w:t>
       </w:r>
     </w:p>
     <w:sectPr>

</xml_diff>

<commit_message>
Dokumen yang diunggah tampil saat pimpinan memeriksa laporan perjadin (2.5.43)
- Halaman periksa Laporan Perjadin pimpinan memuat kartu Dokumen yang
  Diunggah: surat tugas, lalu baris checklist yang sama dengan milik tim
  keuangan (SPPD, tiket, nota, bill hotel, kuitansi, bukti biaya
  penyelenggaraan), serta berkas laporan pelaksana bila diunggah.
- Tiap berkas terbuka di tab baru; yang belum diunggah ditandai.

Co-Authored-By: Claude Opus 5.5 <noreply@anthropic.com>
</commit_message>
<xml_diff>
--- a/resources/panduan/Buku-Panduan-PANGI-v2.5.docx
+++ b/resources/panduan/Buku-Panduan-PANGI-v2.5.docx
@@ -239,7 +239,7 @@
                 <w:sz w:val="19"/>
                 <w:szCs w:val="19"/>
               </w:rPr>
-              <w:t xml:space="preserve">2.5.42</w:t>
+              <w:t xml:space="preserve">2.5.43</w:t>
             </w:r>
           </w:p>
         </w:tc>
@@ -264,7 +264,7 @@
                 <w:sz w:val="19"/>
                 <w:szCs w:val="19"/>
               </w:rPr>
-              <w:t xml:space="preserve">15 Oktober 2026</w:t>
+              <w:t xml:space="preserve">19 Oktober 2026</w:t>
             </w:r>
           </w:p>
         </w:tc>
@@ -9115,7 +9115,7 @@
         </w:numPr>
       </w:pPr>
       <w:r>
-        <w:t xml:space="preserve">Laporan Perjadin — daftar laporan yang masuk, status konfirmasinya, dan tindak lanjut yang dijanjikan. Direktur mengonfirmasi dan menandatangani laporan lewat QR atau mengembalikannya untuk direvisi; konfirmasi ini syarat pelunasan.</w:t>
+        <w:t xml:space="preserve">Laporan Perjadin — daftar laporan yang masuk, status konfirmasinya, dan tindak lanjut yang dijanjikan. Direktur mengonfirmasi dan menandatangani laporan lewat QR atau mengembalikannya untuk direvisi; konfirmasi ini syarat pelunasan. Halaman periksanya memuat kartu Dokumen yang Diunggah — surat tugas, SPPD, tiket, nota, bill hotel, kuitansi, bukti biaya penyelenggaraan, dan berkas laporan pelaksana — masing-masing terbuka di tab baru; yang belum diunggah ditandai.</w:t>
       </w:r>
     </w:p>
     <w:p>
@@ -12794,6 +12794,26 @@
         <w:pStyle w:val="Heading2"/>
       </w:pPr>
       <w:r>
+        <w:t xml:space="preserve">Versi 2.5.43 — 19 Oktober 2026</w:t>
+      </w:r>
+    </w:p>
+    <w:p>
+      <w:pPr>
+        <w:pStyle w:val="ListParagraph"/>
+        <w:numPr>
+          <w:ilvl w:val="0"/>
+          <w:numId w:val="2"/>
+        </w:numPr>
+      </w:pPr>
+      <w:r>
+        <w:t xml:space="preserve">Halaman periksa Laporan Perjadin pimpinan memuat kartu Dokumen yang Diunggah berisi berkas pertanggungjawaban pelaksana, masing-masing terbuka di tab baru.</w:t>
+      </w:r>
+    </w:p>
+    <w:p>
+      <w:pPr>
+        <w:pStyle w:val="Heading2"/>
+      </w:pPr>
+      <w:r>
         <w:t xml:space="preserve">Versi 2.5.42 — 15 Oktober 2026</w:t>
       </w:r>
     </w:p>
@@ -14311,7 +14331,7 @@
           <w:sz w:val="17"/>
           <w:szCs w:val="17"/>
         </w:rPr>
-        <w:t xml:space="preserve">Buku Panduan PANGI v2.5 — Politeknik Kesehatan Kemenkes Manado. Isi buku ini mengikuti sistem sebagaimana berjalan pada 15 Oktober 2026 (versi 2.5.42); bila tampilan di layar berbeda, yang berlaku adalah sistemnya, dan mohon laporkan selisihnya lewat menu Bantuan.</w:t>
+        <w:t xml:space="preserve">Buku Panduan PANGI v2.5 — Politeknik Kesehatan Kemenkes Manado. Isi buku ini mengikuti sistem sebagaimana berjalan pada 19 Oktober 2026 (versi 2.5.43); bila tampilan di layar berbeda, yang berlaku adalah sistemnya, dan mohon laporkan selisihnya lewat menu Bantuan.</w:t>
       </w:r>
     </w:p>
     <w:sectPr>

</xml_diff>

<commit_message>
Luar kota dalam provinsi ditanya ada atau tidaknya biaya penginapan (2.5.44)
- Bagian Akomodasi dokumen pertanggungjawaban jalur luar kota dalam satu
  provinsi menanyakan "Apakah ada biaya penginapan?" (Tidak ada / Ada).
- Tidak ada: bill hotel dan kuitansinya tidak ditagih; bill hotel, nomor
  transaksi, dan nominal yang tersimpan dikosongkan sehingga uang
  penginapan keluar dari rincian biaya. Tanpa jawaban dianggap ada.
- Kolom dokumen.penginapan_ada (migrasi).

Co-Authored-By: Claude Opus 5.5 <noreply@anthropic.com>
</commit_message>
<xml_diff>
--- a/resources/panduan/Buku-Panduan-PANGI-v2.5.docx
+++ b/resources/panduan/Buku-Panduan-PANGI-v2.5.docx
@@ -239,7 +239,7 @@
                 <w:sz w:val="19"/>
                 <w:szCs w:val="19"/>
               </w:rPr>
-              <w:t xml:space="preserve">2.5.43</w:t>
+              <w:t xml:space="preserve">2.5.44</w:t>
             </w:r>
           </w:p>
         </w:tc>
@@ -6941,7 +6941,7 @@
         <w:spacing w:before="60" w:after="160"/>
       </w:pPr>
       <w:r>
-        <w:t xml:space="preserve">Luar kota dalam satu provinsi menagih berkas yang sama dengan luar kota lintas pulau, kecuali tiket pergi dan pulang serta nota transport lokal — perjalanannya umumnya lewat darat. Nota / bukti transport lokal hanya ditagih pada perjalanan luar kota lintas pulau; jalur lain tidak memiliki transport lokal, sehingga daftar pengeluaran riilnya kosong, tidak perlu ditandatangani, dan berkasnya langsung dapat masuk daftar nominatif.</w:t>
+        <w:t xml:space="preserve">Luar kota dalam satu provinsi menagih berkas yang sama dengan luar kota lintas pulau, kecuali tiket pergi dan pulang serta nota transport lokal — perjalanannya umumnya lewat darat. Bagian Akomodasi menanyakan dulu apakah ada biaya penginapan; bila tidak ada, bill hotel dan kuitansinya tidak ditagih dan uang penginapan tidak masuk rincian biaya. Nota / bukti transport lokal hanya ditagih pada perjalanan luar kota lintas pulau; jalur lain tidak memiliki transport lokal, sehingga daftar pengeluaran riilnya kosong, tidak perlu ditandatangani, dan berkasnya langsung dapat masuk daftar nominatif.</w:t>
       </w:r>
     </w:p>
     <w:p>
@@ -12794,6 +12794,26 @@
         <w:pStyle w:val="Heading2"/>
       </w:pPr>
       <w:r>
+        <w:t xml:space="preserve">Versi 2.5.44 — 19 Oktober 2026</w:t>
+      </w:r>
+    </w:p>
+    <w:p>
+      <w:pPr>
+        <w:pStyle w:val="ListParagraph"/>
+        <w:numPr>
+          <w:ilvl w:val="0"/>
+          <w:numId w:val="2"/>
+        </w:numPr>
+      </w:pPr>
+      <w:r>
+        <w:t xml:space="preserve">Perjalanan luar kota dalam satu provinsi ditanya dulu apakah ada biaya penginapan; bila tidak ada, bill hotel dan kuitansinya tidak ditagih.</w:t>
+      </w:r>
+    </w:p>
+    <w:p>
+      <w:pPr>
+        <w:pStyle w:val="Heading2"/>
+      </w:pPr>
+      <w:r>
         <w:t xml:space="preserve">Versi 2.5.43 — 19 Oktober 2026</w:t>
       </w:r>
     </w:p>
@@ -14331,7 +14351,7 @@
           <w:sz w:val="17"/>
           <w:szCs w:val="17"/>
         </w:rPr>
-        <w:t xml:space="preserve">Buku Panduan PANGI v2.5 — Politeknik Kesehatan Kemenkes Manado. Isi buku ini mengikuti sistem sebagaimana berjalan pada 19 Oktober 2026 (versi 2.5.43); bila tampilan di layar berbeda, yang berlaku adalah sistemnya, dan mohon laporkan selisihnya lewat menu Bantuan.</w:t>
+        <w:t xml:space="preserve">Buku Panduan PANGI v2.5 — Politeknik Kesehatan Kemenkes Manado. Isi buku ini mengikuti sistem sebagaimana berjalan pada 19 Oktober 2026 (versi 2.5.44); bila tampilan di layar berbeda, yang berlaku adalah sistemnya, dan mohon laporkan selisihnya lewat menu Bantuan.</w:t>
       </w:r>
     </w:p>
     <w:sectPr>

</xml_diff>

<commit_message>
Hak akses mengubah jalur perjadin dari detail usulan (2.5.45)
- Kemampuan baru Mengubah jalur perjalanan dinas (Usulan Perjadin → Ubah),
  bawaannya super administrator dan dapat diberikan lewat matriks peran.
- Tombol Ubah Jalur Perjadin pada detail usulan: pilih jalur baru dan
  kategori yang sah untuk jalur itu, alasan wajib; tercatat pada jejak
  audit dan dikabarkan kepada pelaksana. Berkas pertanggungjawaban yang
  ditagih mengikuti jalur baru.
- Detail usulan menampilkan jalur pengajuan dan pesan flash.

Co-Authored-By: Claude Opus 5.5 <noreply@anthropic.com>
</commit_message>
<xml_diff>
--- a/resources/panduan/Buku-Panduan-PANGI-v2.5.docx
+++ b/resources/panduan/Buku-Panduan-PANGI-v2.5.docx
@@ -239,7 +239,7 @@
                 <w:sz w:val="19"/>
                 <w:szCs w:val="19"/>
               </w:rPr>
-              <w:t xml:space="preserve">2.5.44</w:t>
+              <w:t xml:space="preserve">2.5.45</w:t>
             </w:r>
           </w:p>
         </w:tc>
@@ -264,7 +264,7 @@
                 <w:sz w:val="19"/>
                 <w:szCs w:val="19"/>
               </w:rPr>
-              <w:t xml:space="preserve">19 Oktober 2026</w:t>
+              <w:t xml:space="preserve">22 Oktober 2026</w:t>
             </w:r>
           </w:p>
         </w:tc>
@@ -8763,7 +8763,7 @@
         </w:numPr>
       </w:pPr>
       <w:r>
-        <w:t xml:space="preserve">Administrasi Sistem → Peran &amp; Hak Akses memuat seluruh peran, bawaan maupun buatan, beserta matriks menu: tiap kemampuan berada pada kolom Lihat, Ubah, atau Hapus menunya. Centang yang diizinkan lalu simpan; perubahan berlaku seketika bagi semua pengguna berperan itu dan tercatat pada jejak audit. Pengguna berperan itu menerima notifikasi berisi hak akses yang ditambahkan dan dicabut beserta menunya. Hak Melihat seluruh usulan membuka submenu Daftar Usulan Perjadin berisi usulan semua pegawai — tanpa hak itu pengguna hanya mendapati Usulan Perjadin Saya; menyunting dan menghapus tetap hanya bagi pelaksana, pembuat, atau peserta usulannya. Hak Menghapus komponen rincian biaya (Keuangan → Hapus) mengatur tombol hapus pada detail keuangan, dan hak Melihat persetujuan (Persetujuan → Lihat) membuka menu Persetujuan tanpa ikut menandatangani. Hak Melihat dokumen seluruh perjalanan dinas (Dokumen → Lihat) membuka Dokumen Perdin dan List Laporan Perjadin semua pegawai dalam mode lihat saja, sedangkan hak Membantu mengunggah dokumen pertanggungjawaban (Dokumen → Ubah) membolehkan mengunggah berkas atas nama pelaksana — pelaksana menerima notifikasi dan jejak audit mencatat nama pengunggahnya; laporan perjalanan dinas tetap disusun pelaksananya.</w:t>
+        <w:t xml:space="preserve">Administrasi Sistem → Peran &amp; Hak Akses memuat seluruh peran, bawaan maupun buatan, beserta matriks menu: tiap kemampuan berada pada kolom Lihat, Ubah, atau Hapus menunya. Centang yang diizinkan lalu simpan; perubahan berlaku seketika bagi semua pengguna berperan itu dan tercatat pada jejak audit. Pengguna berperan itu menerima notifikasi berisi hak akses yang ditambahkan dan dicabut beserta menunya. Hak Melihat seluruh usulan membuka submenu Daftar Usulan Perjadin berisi usulan semua pegawai — tanpa hak itu pengguna hanya mendapati Usulan Perjadin Saya; menyunting dan menghapus tetap hanya bagi pelaksana, pembuat, atau peserta usulannya. Hak Menghapus komponen rincian biaya (Keuangan → Hapus) mengatur tombol hapus pada detail keuangan, dan hak Melihat persetujuan (Persetujuan → Lihat) membuka menu Persetujuan tanpa ikut menandatangani. Hak Melihat dokumen seluruh perjalanan dinas (Dokumen → Lihat) membuka Dokumen Perdin dan List Laporan Perjadin semua pegawai dalam mode lihat saja, sedangkan hak Membantu mengunggah dokumen pertanggungjawaban (Dokumen → Ubah) membolehkan mengunggah berkas atas nama pelaksana — pelaksana menerima notifikasi dan jejak audit mencatat nama pengunggahnya; laporan perjalanan dinas tetap disusun pelaksananya. Hak Mengubah jalur perjalanan dinas (Usulan Perjadin → Ubah) memunculkan tombol Ubah Jalur Perjadin pada detail usulan untuk memindahkan usulan yang salah jalur — misalnya lintas pulau yang terlanjur diajukan lewat jalur dalam satu provinsi — beserta kategorinya; alasannya wajib, tercatat pada jejak audit, dan dikabarkan kepada pelaksana.</w:t>
       </w:r>
     </w:p>
     <w:p>
@@ -12794,6 +12794,26 @@
         <w:pStyle w:val="Heading2"/>
       </w:pPr>
       <w:r>
+        <w:t xml:space="preserve">Versi 2.5.45 — 22 Oktober 2026</w:t>
+      </w:r>
+    </w:p>
+    <w:p>
+      <w:pPr>
+        <w:pStyle w:val="ListParagraph"/>
+        <w:numPr>
+          <w:ilvl w:val="0"/>
+          <w:numId w:val="2"/>
+        </w:numPr>
+      </w:pPr>
+      <w:r>
+        <w:t xml:space="preserve">Hak akses Mengubah jalur perjalanan dinas: tombol Ubah Jalur Perjadin pada detail usulan memindahkan usulan yang salah jalur beserta kategorinya, dengan alasan yang tercatat dan dikabarkan kepada pelaksana.</w:t>
+      </w:r>
+    </w:p>
+    <w:p>
+      <w:pPr>
+        <w:pStyle w:val="Heading2"/>
+      </w:pPr>
+      <w:r>
         <w:t xml:space="preserve">Versi 2.5.44 — 19 Oktober 2026</w:t>
       </w:r>
     </w:p>
@@ -14351,7 +14371,7 @@
           <w:sz w:val="17"/>
           <w:szCs w:val="17"/>
         </w:rPr>
-        <w:t xml:space="preserve">Buku Panduan PANGI v2.5 — Politeknik Kesehatan Kemenkes Manado. Isi buku ini mengikuti sistem sebagaimana berjalan pada 19 Oktober 2026 (versi 2.5.44); bila tampilan di layar berbeda, yang berlaku adalah sistemnya, dan mohon laporkan selisihnya lewat menu Bantuan.</w:t>
+        <w:t xml:space="preserve">Buku Panduan PANGI v2.5 — Politeknik Kesehatan Kemenkes Manado. Isi buku ini mengikuti sistem sebagaimana berjalan pada 22 Oktober 2026 (versi 2.5.45); bila tampilan di layar berbeda, yang berlaku adalah sistemnya, dan mohon laporkan selisihnya lewat menu Bantuan.</w:t>
       </w:r>
     </w:p>
     <w:sectPr>

</xml_diff>

<commit_message>
Pangkat & golongan sebagai master data, tambah Outsourcing (2.5.46)
- Tabel pangkat_golongan (kode, tulisan pada SPD, kelompok, urutan), diisi
  daftar PNS I/a–IV/e, PPPK I–XVII, dan Outsourcing (kode OS, kelompok
  Non-ASN).
- Master Data → Pangkat & Golongan: tambah, ubah (kode yang diganti ikut
  diganti pada pegawai), hapus bila tidak dipakai pegawai.
- Formulir pengguna, kolom Pangkat dan Golongan SPD, dan impor pengguna
  membaca pilihan dari master data; validasi golongan pengguna memakai
  kode yang terdaftar.

Co-Authored-By: Claude Opus 5.5 <noreply@anthropic.com>
</commit_message>
<xml_diff>
--- a/resources/panduan/Buku-Panduan-PANGI-v2.5.docx
+++ b/resources/panduan/Buku-Panduan-PANGI-v2.5.docx
@@ -239,7 +239,7 @@
                 <w:sz w:val="19"/>
                 <w:szCs w:val="19"/>
               </w:rPr>
-              <w:t xml:space="preserve">2.5.45</w:t>
+              <w:t xml:space="preserve">2.5.46</w:t>
             </w:r>
           </w:p>
         </w:tc>
@@ -8259,7 +8259,7 @@
         </w:numPr>
       </w:pPr>
       <w:r>
-        <w:t xml:space="preserve">Menu Administrasi Sistem memuat seluruh pengguna beserta peran, unit kerja, dan atasannya. Saat menambah atau menyunting pengguna, nomor handphone (WhatsApp) dapat diisi langsung — nomor itulah yang dipakai tim keuangan menagih berkas. Pangkat dan Golongan dipilih dari golongan PNS (I/a sampai IV/e) atau golongan PPPK (I sampai XVII), dan mengisi sendiri kolom pangkat pada SPD.</w:t>
+        <w:t xml:space="preserve">Menu Administrasi Sistem memuat seluruh pengguna beserta peran, unit kerja, dan atasannya. Saat menambah atau menyunting pengguna, nomor handphone (WhatsApp) dapat diisi langsung — nomor itulah yang dipakai tim keuangan menagih berkas. Pangkat dan Golongan dipilih dari master data Pangkat &amp; Golongan — golongan PNS (I/a sampai IV/e), PPPK (I sampai XVII), Outsourcing, atau pilihan yang ditambahkan sendiri — dan mengisi sendiri kolom pangkat pada SPD.</w:t>
       </w:r>
     </w:p>
     <w:p>
@@ -8640,6 +8640,58 @@
                 <w:szCs w:val="19"/>
               </w:rPr>
               <w:t xml:space="preserve">Sebaran pegawai pada dashboard eksekutif</w:t>
+            </w:r>
+          </w:p>
+        </w:tc>
+      </w:tr>
+      <w:tr>
+        <w:tc>
+          <w:tcPr>
+            <w:tcW w:type="dxa" w:w="2888"/>
+            <w:tcMar>
+              <w:top w:type="dxa" w:w="80"/>
+              <w:left w:type="dxa" w:w="120"/>
+              <w:bottom w:type="dxa" w:w="80"/>
+              <w:right w:type="dxa" w:w="120"/>
+            </w:tcMar>
+          </w:tcPr>
+          <w:p>
+            <w:pPr>
+              <w:spacing w:after="0"/>
+            </w:pPr>
+            <w:r>
+              <w:rPr>
+                <w:b w:val="false"/>
+                <w:bCs w:val="false"/>
+                <w:sz w:val="19"/>
+                <w:szCs w:val="19"/>
+              </w:rPr>
+              <w:t xml:space="preserve">Pangkat dan golongan</w:t>
+            </w:r>
+          </w:p>
+        </w:tc>
+        <w:tc>
+          <w:tcPr>
+            <w:tcW w:type="dxa" w:w="6138"/>
+            <w:tcMar>
+              <w:top w:type="dxa" w:w="80"/>
+              <w:left w:type="dxa" w:w="120"/>
+              <w:bottom w:type="dxa" w:w="80"/>
+              <w:right w:type="dxa" w:w="120"/>
+            </w:tcMar>
+          </w:tcPr>
+          <w:p>
+            <w:pPr>
+              <w:spacing w:after="0"/>
+            </w:pPr>
+            <w:r>
+              <w:rPr>
+                <w:b w:val="false"/>
+                <w:bCs w:val="false"/>
+                <w:sz w:val="19"/>
+                <w:szCs w:val="19"/>
+              </w:rPr>
+              <w:t xml:space="preserve">Pilihan pada data pegawai dan kolom Pangkat dan Golongan SPD; tambahkan sendiri, misalnya outsourcing atau honorer</w:t>
             </w:r>
           </w:p>
         </w:tc>
@@ -12794,6 +12846,26 @@
         <w:pStyle w:val="Heading2"/>
       </w:pPr>
       <w:r>
+        <w:t xml:space="preserve">Versi 2.5.46 — 22 Oktober 2026</w:t>
+      </w:r>
+    </w:p>
+    <w:p>
+      <w:pPr>
+        <w:pStyle w:val="ListParagraph"/>
+        <w:numPr>
+          <w:ilvl w:val="0"/>
+          <w:numId w:val="2"/>
+        </w:numPr>
+      </w:pPr>
+      <w:r>
+        <w:t xml:space="preserve">Pangkat dan golongan kini master data: Outsourcing ditambahkan, dan pilihan lain dapat ditambah sendiri lewat Master Data → Pangkat &amp; Golongan.</w:t>
+      </w:r>
+    </w:p>
+    <w:p>
+      <w:pPr>
+        <w:pStyle w:val="Heading2"/>
+      </w:pPr>
+      <w:r>
         <w:t xml:space="preserve">Versi 2.5.45 — 22 Oktober 2026</w:t>
       </w:r>
     </w:p>
@@ -14371,7 +14443,7 @@
           <w:sz w:val="17"/>
           <w:szCs w:val="17"/>
         </w:rPr>
-        <w:t xml:space="preserve">Buku Panduan PANGI v2.5 — Politeknik Kesehatan Kemenkes Manado. Isi buku ini mengikuti sistem sebagaimana berjalan pada 22 Oktober 2026 (versi 2.5.45); bila tampilan di layar berbeda, yang berlaku adalah sistemnya, dan mohon laporkan selisihnya lewat menu Bantuan.</w:t>
+        <w:t xml:space="preserve">Buku Panduan PANGI v2.5 — Politeknik Kesehatan Kemenkes Manado. Isi buku ini mengikuti sistem sebagaimana berjalan pada 22 Oktober 2026 (versi 2.5.46); bila tampilan di layar berbeda, yang berlaku adalah sistemnya, dan mohon laporkan selisihnya lewat menu Bantuan.</w:t>
       </w:r>
     </w:p>
     <w:sectPr>

</xml_diff>

<commit_message>
Outsourcing sementara memakai modul perjalanan dinas yang sekarang (2.5.47)
- Peran Outsourcing tidak lagi ditahan di halaman "fitur masih
  dikembangkan"; ia memakai modul pelaksana yang sekarang dengan hak
  akses bawaannya (mengajukan perjalanan dinas sendiri), sama dengan
  Dosen / Tendik.
- Pegawai Kemenkes Eksternal dan mahasiswa tetap menunggu modulnya.

Co-Authored-By: Claude Opus 5.5 <noreply@anthropic.com>
</commit_message>
<xml_diff>
--- a/resources/panduan/Buku-Panduan-PANGI-v2.5.docx
+++ b/resources/panduan/Buku-Panduan-PANGI-v2.5.docx
@@ -239,7 +239,7 @@
                 <w:sz w:val="19"/>
                 <w:szCs w:val="19"/>
               </w:rPr>
-              <w:t xml:space="preserve">2.5.46</w:t>
+              <w:t xml:space="preserve">2.5.47</w:t>
             </w:r>
           </w:p>
         </w:tc>
@@ -1152,7 +1152,7 @@
     </w:p>
     <w:p>
       <w:r>
-        <w:t xml:space="preserve">Seluruh peran berhak mengajukan perjalanan dinas untuk dirinya sendiri. Yang membedakan adalah kewenangan di atasnya. Modul bagi Pegawai Kemenkes Eksternal dan mahasiswa/outsourcing dikembangkan terpisah dan belum tersedia: setelah masuk, mereka melihat halaman pemberitahuan "fitur masih dikembangkan" dengan tombol keluar, tanpa menu lain. Tabel ini memuat hak akses bawaan; super administrator dapat mengubahnya per peran — atau menambah peran baru — lewat Administrasi Sistem → Peran &amp; Hak Akses (Bab 9.4).</w:t>
+        <w:t xml:space="preserve">Seluruh peran berhak mengajukan perjalanan dinas untuk dirinya sendiri. Yang membedakan adalah kewenangan di atasnya. Modul bagi Pegawai Kemenkes Eksternal dan mahasiswa dikembangkan terpisah dan belum tersedia: setelah masuk, mereka melihat halaman pemberitahuan "fitur masih dikembangkan" dengan tombol keluar, tanpa menu lain. Outsourcing sementara memakai modul yang sekarang, sama dengan Dosen / Tendik. Tabel ini memuat hak akses bawaan; super administrator dapat mengubahnya per peran — atau menambah peran baru — lewat Administrasi Sistem → Peran &amp; Hak Akses (Bab 9.4).</w:t>
       </w:r>
     </w:p>
     <w:tbl>
@@ -12846,6 +12846,26 @@
         <w:pStyle w:val="Heading2"/>
       </w:pPr>
       <w:r>
+        <w:t xml:space="preserve">Versi 2.5.47 — 22 Oktober 2026</w:t>
+      </w:r>
+    </w:p>
+    <w:p>
+      <w:pPr>
+        <w:pStyle w:val="ListParagraph"/>
+        <w:numPr>
+          <w:ilvl w:val="0"/>
+          <w:numId w:val="2"/>
+        </w:numPr>
+      </w:pPr>
+      <w:r>
+        <w:t xml:space="preserve">Pengguna berperan Outsourcing sementara memakai modul perjalanan dinas yang sekarang, sama dengan Dosen / Tendik; Pegawai Kemenkes Eksternal dan mahasiswa masih menunggu modulnya sendiri.</w:t>
+      </w:r>
+    </w:p>
+    <w:p>
+      <w:pPr>
+        <w:pStyle w:val="Heading2"/>
+      </w:pPr>
+      <w:r>
         <w:t xml:space="preserve">Versi 2.5.46 — 22 Oktober 2026</w:t>
       </w:r>
     </w:p>
@@ -14443,7 +14463,7 @@
           <w:sz w:val="17"/>
           <w:szCs w:val="17"/>
         </w:rPr>
-        <w:t xml:space="preserve">Buku Panduan PANGI v2.5 — Politeknik Kesehatan Kemenkes Manado. Isi buku ini mengikuti sistem sebagaimana berjalan pada 22 Oktober 2026 (versi 2.5.46); bila tampilan di layar berbeda, yang berlaku adalah sistemnya, dan mohon laporkan selisihnya lewat menu Bantuan.</w:t>
+        <w:t xml:space="preserve">Buku Panduan PANGI v2.5 — Politeknik Kesehatan Kemenkes Manado. Isi buku ini mengikuti sistem sebagaimana berjalan pada 22 Oktober 2026 (versi 2.5.47); bila tampilan di layar berbeda, yang berlaku adalah sistemnya, dan mohon laporkan selisihnya lewat menu Bantuan.</w:t>
       </w:r>
     </w:p>
     <w:sectPr>

</xml_diff>

<commit_message>
News feed: tanpa tindak lanjut lewat tenggat, dengan komentar dan reaksi (2.5.48)
- Tindak lanjut yang sudah lewat tenggat tidak lagi tampil pada news feed
  dashboard eksekutif, termasuk kotak ringkasan "Lewat tenggat".
- Tiap kartu news feed (perjalanan dan tindak lanjut) dapat diberi reaksi
  — Suka, Apresiasi, Semangat, Doakan, Selamat; satu reaksi per orang,
  memilih yang sama lagi mencabutnya — dan komentar yang dapat dihapus
  penulisnya atau super administrator. Tabel kabar_komentar dan
  kabar_reaksi (migrasi).

Co-Authored-By: Claude Opus 5.5 <noreply@anthropic.com>
</commit_message>
<xml_diff>
--- a/resources/panduan/Buku-Panduan-PANGI-v2.5.docx
+++ b/resources/panduan/Buku-Panduan-PANGI-v2.5.docx
@@ -239,7 +239,7 @@
                 <w:sz w:val="19"/>
                 <w:szCs w:val="19"/>
               </w:rPr>
-              <w:t xml:space="preserve">2.5.47</w:t>
+              <w:t xml:space="preserve">2.5.48</w:t>
             </w:r>
           </w:p>
         </w:tc>
@@ -9119,7 +9119,7 @@
         </w:numPr>
       </w:pPr>
       <w:r>
-        <w:t xml:space="preserve">Dashboard Eksekutif → News Feed — lini masa seperti media sosial: siapa yang akan dan sedang melakukan perjalanan dinas, ke mana dan bersama siapa, serta tindak lanjut hasil perjalanan yang dijadwalkan. Tindak lanjut yang melewati tenggat ditaruh paling atas. Saring menurut jenis kabar dan rentang 7, 30, atau 90 hari ke depan.</w:t>
+        <w:t xml:space="preserve">Dashboard Eksekutif → News Feed — lini masa seperti media sosial: siapa yang akan dan sedang melakukan perjalanan dinas, ke mana dan bersama siapa, serta tindak lanjut hasil perjalanan yang dijadwalkan. Tindak lanjut yang sudah lewat tenggat tidak ditampilkan. Saring menurut jenis kabar dan rentang 7, 30, atau 90 hari ke depan. Tiap kartu dapat diberi reaksi — Suka, Apresiasi, Semangat, Doakan, atau Selamat; memilih yang sama sekali lagi mencabutnya — dan komentar, yang dapat dihapus penulisnya.</w:t>
       </w:r>
     </w:p>
     <w:p>
@@ -12846,6 +12846,26 @@
         <w:pStyle w:val="Heading2"/>
       </w:pPr>
       <w:r>
+        <w:t xml:space="preserve">Versi 2.5.48 — 22 Oktober 2026</w:t>
+      </w:r>
+    </w:p>
+    <w:p>
+      <w:pPr>
+        <w:pStyle w:val="ListParagraph"/>
+        <w:numPr>
+          <w:ilvl w:val="0"/>
+          <w:numId w:val="2"/>
+        </w:numPr>
+      </w:pPr>
+      <w:r>
+        <w:t xml:space="preserve">News Feed tidak lagi menampilkan tindak lanjut yang lewat tenggat, dan tiap kartunya dapat diberi reaksi dan komentar.</w:t>
+      </w:r>
+    </w:p>
+    <w:p>
+      <w:pPr>
+        <w:pStyle w:val="Heading2"/>
+      </w:pPr>
+      <w:r>
         <w:t xml:space="preserve">Versi 2.5.47 — 22 Oktober 2026</w:t>
       </w:r>
     </w:p>
@@ -14463,7 +14483,7 @@
           <w:sz w:val="17"/>
           <w:szCs w:val="17"/>
         </w:rPr>
-        <w:t xml:space="preserve">Buku Panduan PANGI v2.5 — Politeknik Kesehatan Kemenkes Manado. Isi buku ini mengikuti sistem sebagaimana berjalan pada 22 Oktober 2026 (versi 2.5.47); bila tampilan di layar berbeda, yang berlaku adalah sistemnya, dan mohon laporkan selisihnya lewat menu Bantuan.</w:t>
+        <w:t xml:space="preserve">Buku Panduan PANGI v2.5 — Politeknik Kesehatan Kemenkes Manado. Isi buku ini mengikuti sistem sebagaimana berjalan pada 22 Oktober 2026 (versi 2.5.48); bila tampilan di layar berbeda, yang berlaku adalah sistemnya, dan mohon laporkan selisihnya lewat menu Bantuan.</w:t>
       </w:r>
     </w:p>
     <w:sectPr>

</xml_diff>

<commit_message>
Akomodasi satu berkas, status dokumen, saringan keuangan/pembayaran, tampilan neumorphism (2.5.49)
- Bill hotel dan kuitansi hotel satu berkas pada bagian Akomodasi; kuitansi
  lama yang diunggah terpisah tetap memenuhi, tampil, dan ikut dipanggil.
- Nomor transaksi milik rekan menanyakan: pakai berkas yang sama, atau
  unggah berkas sendiri (bill_hotel_sendiri); salinan rekan dapat diganti.
- Daftar Dokumen Perdin menampilkan status dokumen: berkas yang belum
  diunggah, atau Dokumen lengkap.
- Keuangan: Daftar Input Rincian Biaya dengan saringan nama pelaksana,
  tujuan, periode, dan tahap pembayaran.
- Daftar Pembayaran: saringan status, pelaksana, perjalanan, anggaran, dan
  urutan lewat pilihan maupun judul kolom.
- Tampilan neumorphism dan animasi masuk halaman (resources/css/app.css,
  kelas tampilan-lembut); logo baru di halaman masuk.

Co-Authored-By: Claude Opus 5.5 <noreply@anthropic.com>
</commit_message>
<xml_diff>
--- a/resources/panduan/Buku-Panduan-PANGI-v2.5.docx
+++ b/resources/panduan/Buku-Panduan-PANGI-v2.5.docx
@@ -239,7 +239,7 @@
                 <w:sz w:val="19"/>
                 <w:szCs w:val="19"/>
               </w:rPr>
-              <w:t xml:space="preserve">2.5.48</w:t>
+              <w:t xml:space="preserve">2.5.49</w:t>
             </w:r>
           </w:p>
         </w:tc>
@@ -264,7 +264,7 @@
                 <w:sz w:val="19"/>
                 <w:szCs w:val="19"/>
               </w:rPr>
-              <w:t xml:space="preserve">22 Oktober 2026</w:t>
+              <w:t xml:space="preserve">28 Oktober 2026</w:t>
             </w:r>
           </w:p>
         </w:tc>
@@ -6206,7 +6206,7 @@
     </w:p>
     <w:p>
       <w:r>
-        <w:t xml:space="preserve">Berkas yang ditagih berbeda menurut wilayah perjalanannya. Formulir dokumen sudah menyesuaikan diri — bagian yang tidak berlaku tidak ditampilkan — dan checklist kelengkapannya mengikuti isian formulir itu persis. Petugas yang diberi hak membantu mengunggah dapat mengunggahkan berkas Anda; setiap kali itu terjadi Anda menerima notifikasi, dan jejak audit mencatat nama pengunggahnya.</w:t>
+        <w:t xml:space="preserve">Berkas yang ditagih berbeda menurut wilayah perjalanannya. Formulir dokumen sudah menyesuaikan diri — bagian yang tidak berlaku tidak ditampilkan — dan checklist kelengkapannya mengikuti isian formulir itu persis. Kolom Status Dokumen pada daftar Dokumen Perdin menyebut berkas yang belum diunggah, atau Dokumen lengkap. Petugas yang diberi hak membantu mengunggah dapat mengunggahkan berkas Anda; setiap kali itu terjadi Anda menerima notifikasi, dan jejak audit mencatat nama pengunggahnya.</w:t>
       </w:r>
     </w:p>
     <w:p>
@@ -6216,7 +6216,7 @@
     </w:p>
     <w:p>
       <w:r>
-        <w:t xml:space="preserve">Berkas rombongan cukup diunggah sekali: ketik nomor tiket, nomor transaksi hotel, atau nomor invoice biaya penyelenggaraan lalu tekan tombol Cek. Bila rekan sudah mengunggahnya, invoice tiket — beserta kota asal, kota tujuan, dan kode booking — bill hotel dan kuitansinya, atau bukti bayar penyelenggaraan dipakai otomatis. Harga tiket, nominal, dan boarding pass tetap diisi masing-masing; bila nomornya belum ada, unggah berkasnya seperti biasa. Begitu berkasnya ditemukan, kolom unggahnya dikunci supaya berkas rombongan tidak tertimpa berkas lain — kecuali bagi pengunggah aslinya, yang tetap dapat membetulkan berkasnya sendiri. Ubah nomornya bila berkas Anda memang berbeda.</w:t>
+        <w:t xml:space="preserve">Berkas rombongan cukup diunggah sekali: ketik nomor tiket, nomor transaksi hotel, atau nomor invoice biaya penyelenggaraan lalu tekan tombol Cek. Bila rekan sudah mengunggahnya, invoice tiket — beserta kota asal, kota tujuan, dan kode booking — atau bukti bayar penyelenggaraan dipakai otomatis. Bill hotel dan kuitansi hotel kini satu berkas; bila nomor transaksinya ditemukan, Anda ditanya apakah berkasnya sama dengan milik rekan — pakai berkas yang sama, atau unggah berkas sendiri. Kuitansi yang dulu diunggah terpisah tetap tampil dan ikut dipanggil. Harga tiket, nominal, dan boarding pass tetap diisi masing-masing; bila nomornya belum ada, unggah berkasnya seperti biasa. Begitu berkasnya ditemukan, kolom unggahnya dikunci supaya berkas rombongan tidak tertimpa berkas lain — kecuali bagi pengunggah aslinya, yang tetap dapat membetulkan berkasnya sendiri. Ubah nomornya bila berkas Anda memang berbeda.</w:t>
       </w:r>
     </w:p>
     <w:tbl>
@@ -6649,84 +6649,7 @@
                 <w:sz w:val="19"/>
                 <w:szCs w:val="19"/>
               </w:rPr>
-              <w:t xml:space="preserve">Bill hotel beserta nomor transaksi dan nominalnya</w:t>
-            </w:r>
-          </w:p>
-        </w:tc>
-        <w:tc>
-          <w:tcPr>
-            <w:tcW w:type="dxa" w:w="1773"/>
-            <w:tcMar>
-              <w:top w:type="dxa" w:w="80"/>
-              <w:left w:type="dxa" w:w="120"/>
-              <w:bottom w:type="dxa" w:w="80"/>
-              <w:right w:type="dxa" w:w="120"/>
-            </w:tcMar>
-          </w:tcPr>
-          <w:p>
-            <w:pPr>
-              <w:spacing w:after="0"/>
-            </w:pPr>
-            <w:r>
-              <w:rPr>
-                <w:b w:val="false"/>
-                <w:bCs w:val="false"/>
-                <w:sz w:val="19"/>
-                <w:szCs w:val="19"/>
-              </w:rPr>
-              <w:t xml:space="preserve">–</w:t>
-            </w:r>
-          </w:p>
-        </w:tc>
-        <w:tc>
-          <w:tcPr>
-            <w:tcW w:type="dxa" w:w="1773"/>
-            <w:tcMar>
-              <w:top w:type="dxa" w:w="80"/>
-              <w:left w:type="dxa" w:w="120"/>
-              <w:bottom w:type="dxa" w:w="80"/>
-              <w:right w:type="dxa" w:w="120"/>
-            </w:tcMar>
-          </w:tcPr>
-          <w:p>
-            <w:pPr>
-              <w:spacing w:after="0"/>
-            </w:pPr>
-            <w:r>
-              <w:rPr>
-                <w:b w:val="false"/>
-                <w:bCs w:val="false"/>
-                <w:sz w:val="19"/>
-                <w:szCs w:val="19"/>
-              </w:rPr>
-              <w:t xml:space="preserve">Wajib</w:t>
-            </w:r>
-          </w:p>
-        </w:tc>
-      </w:tr>
-      <w:tr>
-        <w:tc>
-          <w:tcPr>
-            <w:tcW w:type="dxa" w:w="5480"/>
-            <w:tcMar>
-              <w:top w:type="dxa" w:w="80"/>
-              <w:left w:type="dxa" w:w="120"/>
-              <w:bottom w:type="dxa" w:w="80"/>
-              <w:right w:type="dxa" w:w="120"/>
-            </w:tcMar>
-          </w:tcPr>
-          <w:p>
-            <w:pPr>
-              <w:spacing w:after="0"/>
-            </w:pPr>
-            <w:r>
-              <w:rPr>
-                <w:b w:val="false"/>
-                <w:bCs w:val="false"/>
-                <w:sz w:val="19"/>
-                <w:szCs w:val="19"/>
-              </w:rPr>
-              <w:t xml:space="preserve">Kuitansi penyelenggara / hotel</w:t>
+              <w:t xml:space="preserve">Bill hotel / kuitansi hotel beserta nomor transaksi dan nominalnya</w:t>
             </w:r>
           </w:p>
         </w:tc>
@@ -7598,13 +7521,13 @@
           <w:b/>
           <w:bCs/>
         </w:rPr>
-        <w:t xml:space="preserve">Buka Keuangan lalu Input Rincian Biaya.</w:t>
+        <w:t xml:space="preserve">Buka Keuangan lalu Daftar Input Rincian Biaya.</w:t>
       </w:r>
       <w:r>
         <w:rPr>
           <w:color w:val="55616F"/>
         </w:rPr>
-        <w:t xml:space="preserve">  Nominal dari dokumen yang diunggah pelaksana sudah diselaraskan lebih dulu, jadi Anda memeriksa dan menyesuaikan — bukan mengetik dari nol. Tautan Surat tugas pada daftarnya — dan pada kotak keterangan di halaman rinciannya — membuka surat tugas pelaksana sebagai acuan lama perjalanan dan komponen yang dibiayai. Satu komponen hanya dinominalkan satu pihak: tiket, bill hotel, atau biaya penyelenggaraan yang sudah diisi pelaksana beserta buktinya tidak dapat ditambahkan lagi, sedangkan nominal yang Anda tetapkan lebih dulu mengunci isian pelaksana. Baris transport menyebut tiket yang diwakilinya — pergi, pulang, keduanya (PP), atau bukan tiket pelaksana. Transport lokal tidak ditulis di sini karena berasal dari nota pelaksana. Tab Sedang Diproses, Dikirim ke Pelaksana, Proses Pembayaran, dan Selesai memilah perjadin menurut tahapnya; pilihan urutan mengurutkannya menurut tanggal usulan, tanggal berangkat, atau nomor usulan.</w:t>
+        <w:t xml:space="preserve">  Nominal dari dokumen yang diunggah pelaksana sudah diselaraskan lebih dulu, jadi Anda memeriksa dan menyesuaikan — bukan mengetik dari nol. Saringan di atas daftarnya mempersempit menurut nama pelaksana, tujuan, periode, dan tahap pembayaran. Tautan Surat tugas pada daftarnya — dan pada kotak keterangan di halaman rinciannya — membuka surat tugas pelaksana sebagai acuan lama perjalanan dan komponen yang dibiayai. Satu komponen hanya dinominalkan satu pihak: tiket, bill hotel, atau biaya penyelenggaraan yang sudah diisi pelaksana beserta buktinya tidak dapat ditambahkan lagi, sedangkan nominal yang Anda tetapkan lebih dulu mengunci isian pelaksana. Baris transport menyebut tiket yang diwakilinya — pergi, pulang, keduanya (PP), atau bukan tiket pelaksana. Transport lokal tidak ditulis di sini karena berasal dari nota pelaksana. Tab Sedang Diproses, Dikirim ke Pelaksana, Proses Pembayaran, dan Selesai memilah perjadin menurut tahapnya; pilihan urutan mengurutkannya menurut tanggal usulan, tanggal berangkat, atau nomor usulan.</w:t>
       </w:r>
     </w:p>
     <w:p>
@@ -8075,7 +7998,7 @@
         <w:rPr>
           <w:color w:val="55616F"/>
         </w:rPr>
-        <w:t xml:space="preserve">  Tab bawaannya Menunggu Pembayaran: perjalanan yang sudah berlaku tetapi uang mukanya belum ditransfer.</w:t>
+        <w:t xml:space="preserve">  Tab bawaannya Menunggu Pembayaran: perjalanan yang sudah berlaku tetapi uang mukanya belum ditransfer. Saring daftarnya menurut status, nama pelaksana, perjalanan, dan rentang anggaran; urutkan lewat pilihan Urutkan atau judul kolom.</w:t>
       </w:r>
     </w:p>
     <w:p>
@@ -12846,6 +12769,50 @@
         <w:pStyle w:val="Heading2"/>
       </w:pPr>
       <w:r>
+        <w:t xml:space="preserve">Versi 2.5.49 — 28 Oktober 2026</w:t>
+      </w:r>
+    </w:p>
+    <w:p>
+      <w:pPr>
+        <w:pStyle w:val="ListParagraph"/>
+        <w:numPr>
+          <w:ilvl w:val="0"/>
+          <w:numId w:val="2"/>
+        </w:numPr>
+      </w:pPr>
+      <w:r>
+        <w:t xml:space="preserve">Bill hotel dan kuitansi hotel satu berkas; nomor transaksi milik rekan menawarkan pilihan pakai berkas yang sama atau unggah sendiri; kuitansi atau bill hotel yang sudah pernah diunggah tetap tampil dan dapat dipanggil.</w:t>
+      </w:r>
+    </w:p>
+    <w:p>
+      <w:pPr>
+        <w:pStyle w:val="ListParagraph"/>
+        <w:numPr>
+          <w:ilvl w:val="0"/>
+          <w:numId w:val="2"/>
+        </w:numPr>
+      </w:pPr>
+      <w:r>
+        <w:t xml:space="preserve">Status dokumen pada daftar Dokumen Perdin; saringan baru pada Daftar Input Rincian Biaya dan Daftar Pembayaran.</w:t>
+      </w:r>
+    </w:p>
+    <w:p>
+      <w:pPr>
+        <w:pStyle w:val="ListParagraph"/>
+        <w:numPr>
+          <w:ilvl w:val="0"/>
+          <w:numId w:val="2"/>
+        </w:numPr>
+      </w:pPr>
+      <w:r>
+        <w:t xml:space="preserve">Tampilan neumorphism dengan animasi halaman, dan logo baru di halaman masuk.</w:t>
+      </w:r>
+    </w:p>
+    <w:p>
+      <w:pPr>
+        <w:pStyle w:val="Heading2"/>
+      </w:pPr>
+      <w:r>
         <w:t xml:space="preserve">Versi 2.5.48 — 22 Oktober 2026</w:t>
       </w:r>
     </w:p>
@@ -14483,7 +14450,7 @@
           <w:sz w:val="17"/>
           <w:szCs w:val="17"/>
         </w:rPr>
-        <w:t xml:space="preserve">Buku Panduan PANGI v2.5 — Politeknik Kesehatan Kemenkes Manado. Isi buku ini mengikuti sistem sebagaimana berjalan pada 22 Oktober 2026 (versi 2.5.48); bila tampilan di layar berbeda, yang berlaku adalah sistemnya, dan mohon laporkan selisihnya lewat menu Bantuan.</w:t>
+        <w:t xml:space="preserve">Buku Panduan PANGI v2.5 — Politeknik Kesehatan Kemenkes Manado. Isi buku ini mengikuti sistem sebagaimana berjalan pada 28 Oktober 2026 (versi 2.5.49); bila tampilan di layar berbeda, yang berlaku adalah sistemnya, dan mohon laporkan selisihnya lewat menu Bantuan.</w:t>
       </w:r>
     </w:p>
     <w:sectPr>

</xml_diff>

<commit_message>
Logo terbaru pada layar pemuat dan sidebar (2.5.50)
- Layar pemuat halaman masuk memakai logo terbaru berlatar tembus pandang.
- Sidebar memakai varian latar gelap (pangi-logo-gelap.webp) dengan
  semboyan yang dicerahkan agar terbaca.

Co-Authored-By: Claude Opus 5.5 <noreply@anthropic.com>
</commit_message>
<xml_diff>
--- a/resources/panduan/Buku-Panduan-PANGI-v2.5.docx
+++ b/resources/panduan/Buku-Panduan-PANGI-v2.5.docx
@@ -239,7 +239,7 @@
                 <w:sz w:val="19"/>
                 <w:szCs w:val="19"/>
               </w:rPr>
-              <w:t xml:space="preserve">2.5.49</w:t>
+              <w:t xml:space="preserve">2.5.50</w:t>
             </w:r>
           </w:p>
         </w:tc>
@@ -12769,6 +12769,26 @@
         <w:pStyle w:val="Heading2"/>
       </w:pPr>
       <w:r>
+        <w:t xml:space="preserve">Versi 2.5.50 — 28 Oktober 2026</w:t>
+      </w:r>
+    </w:p>
+    <w:p>
+      <w:pPr>
+        <w:pStyle w:val="ListParagraph"/>
+        <w:numPr>
+          <w:ilvl w:val="0"/>
+          <w:numId w:val="2"/>
+        </w:numPr>
+      </w:pPr>
+      <w:r>
+        <w:t xml:space="preserve">Logo PANGI terbaru juga dipakai pada layar pemuat dan sidebar, dengan varian latar gelap di sidebar.</w:t>
+      </w:r>
+    </w:p>
+    <w:p>
+      <w:pPr>
+        <w:pStyle w:val="Heading2"/>
+      </w:pPr>
+      <w:r>
         <w:t xml:space="preserve">Versi 2.5.49 — 28 Oktober 2026</w:t>
       </w:r>
     </w:p>
@@ -14450,7 +14470,7 @@
           <w:sz w:val="17"/>
           <w:szCs w:val="17"/>
         </w:rPr>
-        <w:t xml:space="preserve">Buku Panduan PANGI v2.5 — Politeknik Kesehatan Kemenkes Manado. Isi buku ini mengikuti sistem sebagaimana berjalan pada 28 Oktober 2026 (versi 2.5.49); bila tampilan di layar berbeda, yang berlaku adalah sistemnya, dan mohon laporkan selisihnya lewat menu Bantuan.</w:t>
+        <w:t xml:space="preserve">Buku Panduan PANGI v2.5 — Politeknik Kesehatan Kemenkes Manado. Isi buku ini mengikuti sistem sebagaimana berjalan pada 28 Oktober 2026 (versi 2.5.50); bila tampilan di layar berbeda, yang berlaku adalah sistemnya, dan mohon laporkan selisihnya lewat menu Bantuan.</w:t>
       </w:r>
     </w:p>
     <w:sectPr>

</xml_diff>

<commit_message>
Saringan dan kolom jalur perjadin pada Daftar Input Rincian Biaya (2.5.52)
- Saringan Jalur perjadin (dalam kota, luar kota dalam provinsi, luar kota
  lintas pulau, supervisi) memakai scope padaJalur, sehingga usulan lama
  tanpa jalur tersimpan disimpulkan dari kategorinya; ikut memengaruhi
  angka tab tahap.
- Kolom Jalur Perjadin pada tabel, dengan nama pendek JenisPerjadin::labelSingkat()
  dan nama lengkap sebagai title.
- Uji saringan pelaksana/tujuan/periode yang sesekali gagal karena isian
  acak usulan bawaan kini dipatok.
- Panduan, riwayat perubahan, dan buku panduan diperbarui.

Co-Authored-By: Claude Opus 5.5 <noreply@anthropic.com>
</commit_message>
<xml_diff>
--- a/resources/panduan/Buku-Panduan-PANGI-v2.5.docx
+++ b/resources/panduan/Buku-Panduan-PANGI-v2.5.docx
@@ -239,7 +239,7 @@
                 <w:sz w:val="19"/>
                 <w:szCs w:val="19"/>
               </w:rPr>
-              <w:t xml:space="preserve">2.5.51</w:t>
+              <w:t xml:space="preserve">2.5.52</w:t>
             </w:r>
           </w:p>
         </w:tc>
@@ -7527,7 +7527,7 @@
         <w:rPr>
           <w:color w:val="55616F"/>
         </w:rPr>
-        <w:t xml:space="preserve">  Nominal dari dokumen yang diunggah pelaksana sudah diselaraskan lebih dulu, jadi Anda memeriksa dan menyesuaikan — bukan mengetik dari nol. Saringan di atas daftarnya mempersempit menurut nama pelaksana, tujuan, periode, dan tahap pembayaran. Tautan Surat tugas pada daftarnya — dan pada kotak keterangan di halaman rinciannya — membuka surat tugas pelaksana sebagai acuan lama perjalanan dan komponen yang dibiayai. Satu komponen hanya dinominalkan satu pihak: tiket, bill hotel, atau biaya penyelenggaraan yang sudah diisi pelaksana beserta buktinya tidak dapat ditambahkan lagi, sedangkan nominal yang Anda tetapkan lebih dulu mengunci isian pelaksana. Baris transport menyebut tiket yang diwakilinya — pergi, pulang, keduanya (PP), atau bukan tiket pelaksana. Transport lokal tidak ditulis di sini karena berasal dari nota pelaksana. Tab Sedang Diproses, Dikirim ke Pelaksana, Proses Pembayaran, dan Selesai memilah perjadin menurut tahapnya; pilihan urutan mengurutkannya menurut tanggal usulan, tanggal berangkat, atau nomor usulan.</w:t>
+        <w:t xml:space="preserve">  Nominal dari dokumen yang diunggah pelaksana sudah diselaraskan lebih dulu, jadi Anda memeriksa dan menyesuaikan — bukan mengetik dari nol. Saringan di atas daftarnya mempersempit menurut jalur perjadin, nama pelaksana, tujuan, periode, dan tahap pembayaran; kolom Jalur Perjadin menunjukkan jalur tiap perjalanan. Tautan Surat tugas pada daftarnya — dan pada kotak keterangan di halaman rinciannya — membuka surat tugas pelaksana sebagai acuan lama perjalanan dan komponen yang dibiayai. Satu komponen hanya dinominalkan satu pihak: tiket, bill hotel, atau biaya penyelenggaraan yang sudah diisi pelaksana beserta buktinya tidak dapat ditambahkan lagi, sedangkan nominal yang Anda tetapkan lebih dulu mengunci isian pelaksana. Baris transport menyebut tiket yang diwakilinya — pergi, pulang, keduanya (PP), atau bukan tiket pelaksana. Transport lokal tidak ditulis di sini karena berasal dari nota pelaksana. Tab Sedang Diproses, Dikirim ke Pelaksana, Proses Pembayaran, dan Selesai memilah perjadin menurut tahapnya; pilihan urutan mengurutkannya menurut tanggal usulan, tanggal berangkat, atau nomor usulan.</w:t>
       </w:r>
     </w:p>
     <w:p>
@@ -12769,6 +12769,26 @@
         <w:pStyle w:val="Heading2"/>
       </w:pPr>
       <w:r>
+        <w:t xml:space="preserve">Versi 2.5.52 — 29 Oktober 2026</w:t>
+      </w:r>
+    </w:p>
+    <w:p>
+      <w:pPr>
+        <w:pStyle w:val="ListParagraph"/>
+        <w:numPr>
+          <w:ilvl w:val="0"/>
+          <w:numId w:val="2"/>
+        </w:numPr>
+      </w:pPr>
+      <w:r>
+        <w:t xml:space="preserve">Daftar Input Rincian Biaya dapat disaring menurut jalur perjadin, dan tabelnya memuat kolom Jalur Perjadin.</w:t>
+      </w:r>
+    </w:p>
+    <w:p>
+      <w:pPr>
+        <w:pStyle w:val="Heading2"/>
+      </w:pPr>
+      <w:r>
         <w:t xml:space="preserve">Versi 2.5.51 — 29 Oktober 2026</w:t>
       </w:r>
     </w:p>
@@ -14490,7 +14510,7 @@
           <w:sz w:val="17"/>
           <w:szCs w:val="17"/>
         </w:rPr>
-        <w:t xml:space="preserve">Buku Panduan PANGI v2.5 — Politeknik Kesehatan Kemenkes Manado. Isi buku ini mengikuti sistem sebagaimana berjalan pada 29 Oktober 2026 (versi 2.5.51); bila tampilan di layar berbeda, yang berlaku adalah sistemnya, dan mohon laporkan selisihnya lewat menu Bantuan.</w:t>
+        <w:t xml:space="preserve">Buku Panduan PANGI v2.5 — Politeknik Kesehatan Kemenkes Manado. Isi buku ini mengikuti sistem sebagaimana berjalan pada 29 Oktober 2026 (versi 2.5.52); bila tampilan di layar berbeda, yang berlaku adalah sistemnya, dan mohon laporkan selisihnya lewat menu Bantuan.</w:t>
       </w:r>
     </w:p>
     <w:sectPr>

</xml_diff>